<commit_message>
atualizamos a pagina da barbearia
</commit_message>
<xml_diff>
--- a/Apostila/Projeto Space For Men.docx
+++ b/Apostila/Projeto Space For Men.docx
@@ -244,6 +244,9 @@
         <w:jc w:val="center"/>
       </w:pPr>
       <w:r>
+        <w:rPr>
+          <w:noProof/>
+        </w:rPr>
         <w:drawing>
           <wp:inline distT="0" distB="0" distL="0" distR="0" wp14:anchorId="2A2E5DBA" wp14:editId="36EAF9CD">
             <wp:extent cx="2133600" cy="1656575"/>
@@ -314,6 +317,9 @@
         <w:t xml:space="preserve"> </w:t>
       </w:r>
       <w:r>
+        <w:rPr>
+          <w:noProof/>
+        </w:rPr>
         <w:drawing>
           <wp:inline distT="0" distB="0" distL="0" distR="0" wp14:anchorId="42C03E11" wp14:editId="3DFC7053">
             <wp:extent cx="5400040" cy="163830"/>
@@ -369,6 +375,9 @@
         <w:jc w:val="center"/>
       </w:pPr>
       <w:r>
+        <w:rPr>
+          <w:noProof/>
+        </w:rPr>
         <w:drawing>
           <wp:inline distT="0" distB="0" distL="0" distR="0" wp14:anchorId="31E1F7DC" wp14:editId="50791E00">
             <wp:extent cx="1895475" cy="549301"/>
@@ -438,6 +447,9 @@
         <w:t xml:space="preserve"> </w:t>
       </w:r>
       <w:r>
+        <w:rPr>
+          <w:noProof/>
+        </w:rPr>
         <w:drawing>
           <wp:inline distT="0" distB="0" distL="0" distR="0" wp14:anchorId="5E09BC1E" wp14:editId="45D006B8">
             <wp:extent cx="4286848" cy="219106"/>
@@ -826,8 +838,391 @@
           <w:noProof/>
         </w:rPr>
       </w:pPr>
+      <w:r>
+        <w:rPr>
+          <w:noProof/>
+        </w:rPr>
+        <w:t>9 – Nos itens da lista adicionamos class com mesmo nome para que o comportamento se repita para todos os itens da lista.</w:t>
+      </w:r>
+    </w:p>
+    <w:p>
+      <w:pPr>
+        <w:rPr>
+          <w:noProof/>
+        </w:rPr>
+      </w:pPr>
+      <w:r>
+        <w:rPr>
+          <w:noProof/>
+        </w:rPr>
+        <w:t>(Os itens todos ficaram em itálico)</w:t>
+      </w:r>
+      <w:r>
+        <w:rPr>
+          <w:noProof/>
+        </w:rPr>
+        <w:t xml:space="preserve"> </w:t>
+      </w:r>
+      <w:r>
+        <w:rPr>
+          <w:noProof/>
+        </w:rPr>
+        <w:drawing>
+          <wp:inline distT="0" distB="0" distL="0" distR="0" wp14:anchorId="738EB0D2" wp14:editId="3832870B">
+            <wp:extent cx="3486150" cy="953520"/>
+            <wp:effectExtent l="0" t="0" r="0" b="0"/>
+            <wp:docPr id="4" name="Imagem 4"/>
+            <wp:cNvGraphicFramePr>
+              <a:graphicFrameLocks xmlns:a="http://schemas.openxmlformats.org/drawingml/2006/main" noChangeAspect="1"/>
+            </wp:cNvGraphicFramePr>
+            <a:graphic xmlns:a="http://schemas.openxmlformats.org/drawingml/2006/main">
+              <a:graphicData uri="http://schemas.openxmlformats.org/drawingml/2006/picture">
+                <pic:pic xmlns:pic="http://schemas.openxmlformats.org/drawingml/2006/picture">
+                  <pic:nvPicPr>
+                    <pic:cNvPr id="1" name=""/>
+                    <pic:cNvPicPr/>
+                  </pic:nvPicPr>
+                  <pic:blipFill>
+                    <a:blip r:embed="rId17"/>
+                    <a:stretch>
+                      <a:fillRect/>
+                    </a:stretch>
+                  </pic:blipFill>
+                  <pic:spPr>
+                    <a:xfrm>
+                      <a:off x="0" y="0"/>
+                      <a:ext cx="3872802" cy="1059276"/>
+                    </a:xfrm>
+                    <a:prstGeom prst="rect">
+                      <a:avLst/>
+                    </a:prstGeom>
+                  </pic:spPr>
+                </pic:pic>
+              </a:graphicData>
+            </a:graphic>
+          </wp:inline>
+        </w:drawing>
+      </w:r>
+      <w:r>
+        <w:rPr>
+          <w:noProof/>
+        </w:rPr>
+        <w:drawing>
+          <wp:inline distT="0" distB="0" distL="0" distR="0" wp14:anchorId="06925DD4" wp14:editId="382631AF">
+            <wp:extent cx="1690254" cy="581025"/>
+            <wp:effectExtent l="0" t="0" r="5715" b="0"/>
+            <wp:docPr id="8" name="Imagem 8"/>
+            <wp:cNvGraphicFramePr>
+              <a:graphicFrameLocks xmlns:a="http://schemas.openxmlformats.org/drawingml/2006/main" noChangeAspect="1"/>
+            </wp:cNvGraphicFramePr>
+            <a:graphic xmlns:a="http://schemas.openxmlformats.org/drawingml/2006/main">
+              <a:graphicData uri="http://schemas.openxmlformats.org/drawingml/2006/picture">
+                <pic:pic xmlns:pic="http://schemas.openxmlformats.org/drawingml/2006/picture">
+                  <pic:nvPicPr>
+                    <pic:cNvPr id="1" name=""/>
+                    <pic:cNvPicPr/>
+                  </pic:nvPicPr>
+                  <pic:blipFill>
+                    <a:blip r:embed="rId18"/>
+                    <a:stretch>
+                      <a:fillRect/>
+                    </a:stretch>
+                  </pic:blipFill>
+                  <pic:spPr>
+                    <a:xfrm>
+                      <a:off x="0" y="0"/>
+                      <a:ext cx="1810990" cy="622528"/>
+                    </a:xfrm>
+                    <a:prstGeom prst="rect">
+                      <a:avLst/>
+                    </a:prstGeom>
+                  </pic:spPr>
+                </pic:pic>
+              </a:graphicData>
+            </a:graphic>
+          </wp:inline>
+        </w:drawing>
+      </w:r>
+    </w:p>
+    <w:p>
+      <w:pPr>
+        <w:rPr>
+          <w:noProof/>
+        </w:rPr>
+      </w:pPr>
+      <w:r>
+        <w:rPr>
+          <w:noProof/>
+        </w:rPr>
+        <w:t>10 – Dividimos a nossa página em duas:</w:t>
+      </w:r>
+    </w:p>
+    <w:p>
+      <w:pPr>
+        <w:rPr>
+          <w:noProof/>
+        </w:rPr>
+      </w:pPr>
+      <w:r>
+        <w:rPr>
+          <w:noProof/>
+        </w:rPr>
+        <w:t>Primeira parte sendo a principal onde adicionamos uma div que iniciou acima do header e fechou abaixo do nosso último parágrafo .</w:t>
+      </w:r>
+    </w:p>
+    <w:p>
+      <w:pPr>
+        <w:rPr>
+          <w:noProof/>
+        </w:rPr>
+      </w:pPr>
+      <w:r>
+        <w:rPr>
+          <w:noProof/>
+        </w:rPr>
+        <w:t>E deixamos o fundo dessa divisão com a cor branca.</w:t>
+      </w:r>
+      <w:r>
+        <w:rPr>
+          <w:noProof/>
+        </w:rPr>
+        <w:t xml:space="preserve"> </w:t>
+      </w:r>
+      <w:r>
+        <w:rPr>
+          <w:noProof/>
+        </w:rPr>
+        <w:drawing>
+          <wp:inline distT="0" distB="0" distL="0" distR="0" wp14:anchorId="7ABA0DFC" wp14:editId="684F3916">
+            <wp:extent cx="4773148" cy="1590675"/>
+            <wp:effectExtent l="0" t="0" r="8890" b="0"/>
+            <wp:docPr id="13" name="Imagem 13"/>
+            <wp:cNvGraphicFramePr>
+              <a:graphicFrameLocks xmlns:a="http://schemas.openxmlformats.org/drawingml/2006/main" noChangeAspect="1"/>
+            </wp:cNvGraphicFramePr>
+            <a:graphic xmlns:a="http://schemas.openxmlformats.org/drawingml/2006/main">
+              <a:graphicData uri="http://schemas.openxmlformats.org/drawingml/2006/picture">
+                <pic:pic xmlns:pic="http://schemas.openxmlformats.org/drawingml/2006/picture">
+                  <pic:nvPicPr>
+                    <pic:cNvPr id="1" name=""/>
+                    <pic:cNvPicPr/>
+                  </pic:nvPicPr>
+                  <pic:blipFill>
+                    <a:blip r:embed="rId19"/>
+                    <a:stretch>
+                      <a:fillRect/>
+                    </a:stretch>
+                  </pic:blipFill>
+                  <pic:spPr>
+                    <a:xfrm>
+                      <a:off x="0" y="0"/>
+                      <a:ext cx="4798023" cy="1598965"/>
+                    </a:xfrm>
+                    <a:prstGeom prst="rect">
+                      <a:avLst/>
+                    </a:prstGeom>
+                  </pic:spPr>
+                </pic:pic>
+              </a:graphicData>
+            </a:graphic>
+          </wp:inline>
+        </w:drawing>
+      </w:r>
+      <w:r>
+        <w:rPr>
+          <w:noProof/>
+        </w:rPr>
+        <w:drawing>
+          <wp:inline distT="0" distB="0" distL="0" distR="0">
+            <wp:extent cx="2495550" cy="552450"/>
+            <wp:effectExtent l="0" t="0" r="0" b="0"/>
+            <wp:docPr id="20" name="Imagem 20"/>
+            <wp:cNvGraphicFramePr>
+              <a:graphicFrameLocks xmlns:a="http://schemas.openxmlformats.org/drawingml/2006/main" noChangeAspect="1"/>
+            </wp:cNvGraphicFramePr>
+            <a:graphic xmlns:a="http://schemas.openxmlformats.org/drawingml/2006/main">
+              <a:graphicData uri="http://schemas.openxmlformats.org/drawingml/2006/picture">
+                <pic:pic xmlns:pic="http://schemas.openxmlformats.org/drawingml/2006/picture">
+                  <pic:nvPicPr>
+                    <pic:cNvPr id="0" name="Picture 2"/>
+                    <pic:cNvPicPr>
+                      <a:picLocks noChangeAspect="1" noChangeArrowheads="1"/>
+                    </pic:cNvPicPr>
+                  </pic:nvPicPr>
+                  <pic:blipFill>
+                    <a:blip r:embed="rId20">
+                      <a:extLst>
+                        <a:ext uri="{28A0092B-C50C-407E-A947-70E740481C1C}">
+                          <a14:useLocalDpi xmlns:a14="http://schemas.microsoft.com/office/drawing/2010/main" val="0"/>
+                        </a:ext>
+                      </a:extLst>
+                    </a:blip>
+                    <a:srcRect/>
+                    <a:stretch>
+                      <a:fillRect/>
+                    </a:stretch>
+                  </pic:blipFill>
+                  <pic:spPr bwMode="auto">
+                    <a:xfrm>
+                      <a:off x="0" y="0"/>
+                      <a:ext cx="2495550" cy="552450"/>
+                    </a:xfrm>
+                    <a:prstGeom prst="rect">
+                      <a:avLst/>
+                    </a:prstGeom>
+                    <a:noFill/>
+                    <a:ln>
+                      <a:noFill/>
+                    </a:ln>
+                  </pic:spPr>
+                </pic:pic>
+              </a:graphicData>
+            </a:graphic>
+          </wp:inline>
+        </w:drawing>
+      </w:r>
+    </w:p>
+    <w:p>
+      <w:pPr>
+        <w:rPr>
+          <w:noProof/>
+        </w:rPr>
+      </w:pPr>
+      <w:r>
+        <w:rPr>
+          <w:noProof/>
+        </w:rPr>
+        <w:lastRenderedPageBreak/>
+        <w:t>11 – A segunda div sendo acima do segundo título “benefícios” e fechando abaixo da última lista não-ordenada.</w:t>
+      </w:r>
+    </w:p>
+    <w:p>
+      <w:pPr>
+        <w:rPr>
+          <w:noProof/>
+        </w:rPr>
+      </w:pPr>
+      <w:r>
+        <w:rPr>
+          <w:noProof/>
+        </w:rPr>
+        <w:t>E adicionamos a cor de fundo cinza claro.</w:t>
+      </w:r>
+      <w:r>
+        <w:rPr>
+          <w:noProof/>
+        </w:rPr>
+        <w:t xml:space="preserve"> </w:t>
+      </w:r>
+      <w:r>
+        <w:rPr>
+          <w:noProof/>
+        </w:rPr>
+        <w:drawing>
+          <wp:inline distT="0" distB="0" distL="0" distR="0" wp14:anchorId="428E1BE1" wp14:editId="54E5F699">
+            <wp:extent cx="4124901" cy="2029108"/>
+            <wp:effectExtent l="0" t="0" r="9525" b="9525"/>
+            <wp:docPr id="18" name="Imagem 18"/>
+            <wp:cNvGraphicFramePr>
+              <a:graphicFrameLocks xmlns:a="http://schemas.openxmlformats.org/drawingml/2006/main" noChangeAspect="1"/>
+            </wp:cNvGraphicFramePr>
+            <a:graphic xmlns:a="http://schemas.openxmlformats.org/drawingml/2006/main">
+              <a:graphicData uri="http://schemas.openxmlformats.org/drawingml/2006/picture">
+                <pic:pic xmlns:pic="http://schemas.openxmlformats.org/drawingml/2006/picture">
+                  <pic:nvPicPr>
+                    <pic:cNvPr id="1" name=""/>
+                    <pic:cNvPicPr/>
+                  </pic:nvPicPr>
+                  <pic:blipFill>
+                    <a:blip r:embed="rId21"/>
+                    <a:stretch>
+                      <a:fillRect/>
+                    </a:stretch>
+                  </pic:blipFill>
+                  <pic:spPr>
+                    <a:xfrm>
+                      <a:off x="0" y="0"/>
+                      <a:ext cx="4124901" cy="2029108"/>
+                    </a:xfrm>
+                    <a:prstGeom prst="rect">
+                      <a:avLst/>
+                    </a:prstGeom>
+                  </pic:spPr>
+                </pic:pic>
+              </a:graphicData>
+            </a:graphic>
+          </wp:inline>
+        </w:drawing>
+      </w:r>
+      <w:r>
+        <w:rPr>
+          <w:noProof/>
+        </w:rPr>
+        <w:drawing>
+          <wp:inline distT="0" distB="0" distL="0" distR="0">
+            <wp:extent cx="2428875" cy="561975"/>
+            <wp:effectExtent l="0" t="0" r="9525" b="9525"/>
+            <wp:docPr id="19" name="Imagem 19"/>
+            <wp:cNvGraphicFramePr>
+              <a:graphicFrameLocks xmlns:a="http://schemas.openxmlformats.org/drawingml/2006/main" noChangeAspect="1"/>
+            </wp:cNvGraphicFramePr>
+            <a:graphic xmlns:a="http://schemas.openxmlformats.org/drawingml/2006/main">
+              <a:graphicData uri="http://schemas.openxmlformats.org/drawingml/2006/picture">
+                <pic:pic xmlns:pic="http://schemas.openxmlformats.org/drawingml/2006/picture">
+                  <pic:nvPicPr>
+                    <pic:cNvPr id="0" name="Picture 1"/>
+                    <pic:cNvPicPr>
+                      <a:picLocks noChangeAspect="1" noChangeArrowheads="1"/>
+                    </pic:cNvPicPr>
+                  </pic:nvPicPr>
+                  <pic:blipFill>
+                    <a:blip r:embed="rId22">
+                      <a:extLst>
+                        <a:ext uri="{28A0092B-C50C-407E-A947-70E740481C1C}">
+                          <a14:useLocalDpi xmlns:a14="http://schemas.microsoft.com/office/drawing/2010/main" val="0"/>
+                        </a:ext>
+                      </a:extLst>
+                    </a:blip>
+                    <a:srcRect/>
+                    <a:stretch>
+                      <a:fillRect/>
+                    </a:stretch>
+                  </pic:blipFill>
+                  <pic:spPr bwMode="auto">
+                    <a:xfrm>
+                      <a:off x="0" y="0"/>
+                      <a:ext cx="2428875" cy="561975"/>
+                    </a:xfrm>
+                    <a:prstGeom prst="rect">
+                      <a:avLst/>
+                    </a:prstGeom>
+                    <a:noFill/>
+                    <a:ln>
+                      <a:noFill/>
+                    </a:ln>
+                  </pic:spPr>
+                </pic:pic>
+              </a:graphicData>
+            </a:graphic>
+          </wp:inline>
+        </w:drawing>
+      </w:r>
       <w:bookmarkStart w:id="0" w:name="_GoBack"/>
       <w:bookmarkEnd w:id="0"/>
+    </w:p>
+    <w:p>
+      <w:pPr>
+        <w:rPr>
+          <w:noProof/>
+        </w:rPr>
+      </w:pPr>
+    </w:p>
+    <w:p>
+      <w:pPr>
+        <w:rPr>
+          <w:noProof/>
+        </w:rPr>
+      </w:pPr>
     </w:p>
     <w:p>
       <w:pPr>

</xml_diff>

<commit_message>
melhoramos o site e criamos outras duas paginas
</commit_message>
<xml_diff>
--- a/Apostila/Projeto Space For Men.docx
+++ b/Apostila/Projeto Space For Men.docx
@@ -150,7 +150,7 @@
       <w:r>
         <w:t>https://github.com/</w:t>
       </w:r>
-      <w:hyperlink r:id="rId5" w:history="1">
+      <w:hyperlink r:id="rId6" w:history="1">
         <w:r>
           <w:rPr>
             <w:rStyle w:val="Hyperlink"/>
@@ -178,7 +178,7 @@
                     <pic:cNvPicPr/>
                   </pic:nvPicPr>
                   <pic:blipFill>
-                    <a:blip r:embed="rId6"/>
+                    <a:blip r:embed="rId7"/>
                     <a:stretch>
                       <a:fillRect/>
                     </a:stretch>
@@ -218,7 +218,7 @@
       <w:r>
         <w:t>https://github.com/</w:t>
       </w:r>
-      <w:hyperlink r:id="rId7" w:history="1">
+      <w:hyperlink r:id="rId8" w:history="1">
         <w:r>
           <w:rPr>
             <w:rStyle w:val="Hyperlink"/>
@@ -253,79 +253,6 @@
             <wp:extent cx="2133600" cy="1656575"/>
             <wp:effectExtent l="0" t="0" r="0" b="1270"/>
             <wp:docPr id="5" name="Imagem 5"/>
-            <wp:cNvGraphicFramePr>
-              <a:graphicFrameLocks xmlns:a="http://schemas.openxmlformats.org/drawingml/2006/main" noChangeAspect="1"/>
-            </wp:cNvGraphicFramePr>
-            <a:graphic xmlns:a="http://schemas.openxmlformats.org/drawingml/2006/main">
-              <a:graphicData uri="http://schemas.openxmlformats.org/drawingml/2006/picture">
-                <pic:pic xmlns:pic="http://schemas.openxmlformats.org/drawingml/2006/picture">
-                  <pic:nvPicPr>
-                    <pic:cNvPr id="1" name=""/>
-                    <pic:cNvPicPr/>
-                  </pic:nvPicPr>
-                  <pic:blipFill>
-                    <a:blip r:embed="rId8"/>
-                    <a:stretch>
-                      <a:fillRect/>
-                    </a:stretch>
-                  </pic:blipFill>
-                  <pic:spPr>
-                    <a:xfrm>
-                      <a:off x="0" y="0"/>
-                      <a:ext cx="2188154" cy="1698932"/>
-                    </a:xfrm>
-                    <a:prstGeom prst="rect">
-                      <a:avLst/>
-                    </a:prstGeom>
-                  </pic:spPr>
-                </pic:pic>
-              </a:graphicData>
-            </a:graphic>
-          </wp:inline>
-        </w:drawing>
-      </w:r>
-    </w:p>
-    <w:p>
-      <w:pPr>
-        <w:rPr>
-          <w:noProof/>
-        </w:rPr>
-      </w:pPr>
-      <w:r>
-        <w:t xml:space="preserve">3 </w:t>
-      </w:r>
-      <w:r>
-        <w:t>–</w:t>
-      </w:r>
-      <w:r>
-        <w:t xml:space="preserve"> </w:t>
-      </w:r>
-      <w:r>
-        <w:t xml:space="preserve">No texto do index.html utilizamos </w:t>
-      </w:r>
-      <w:proofErr w:type="spellStart"/>
-      <w:r>
-        <w:t>tags</w:t>
-      </w:r>
-      <w:proofErr w:type="spellEnd"/>
-      <w:r>
-        <w:t xml:space="preserve"> alinhadas tendo como regra a primeira que abre é a última que fecha, conforme imagem abaixo:</w:t>
-      </w:r>
-      <w:r>
-        <w:rPr>
-          <w:noProof/>
-        </w:rPr>
-        <w:t xml:space="preserve"> </w:t>
-      </w:r>
-      <w:r>
-        <w:rPr>
-          <w:noProof/>
-        </w:rPr>
-        <w:drawing>
-          <wp:inline distT="0" distB="0" distL="0" distR="0" wp14:anchorId="42C03E11" wp14:editId="3DFC7053">
-            <wp:extent cx="5400040" cy="163830"/>
-            <wp:effectExtent l="0" t="0" r="0" b="7620"/>
-            <wp:docPr id="2" name="Imagem 2"/>
             <wp:cNvGraphicFramePr>
               <a:graphicFrameLocks xmlns:a="http://schemas.openxmlformats.org/drawingml/2006/main" noChangeAspect="1"/>
             </wp:cNvGraphicFramePr>
@@ -345,7 +272,7 @@
                   <pic:spPr>
                     <a:xfrm>
                       <a:off x="0" y="0"/>
-                      <a:ext cx="5400040" cy="163830"/>
+                      <a:ext cx="2188154" cy="1698932"/>
                     </a:xfrm>
                     <a:prstGeom prst="rect">
                       <a:avLst/>
@@ -359,31 +286,46 @@
       </w:r>
     </w:p>
     <w:p>
-      <w:r>
-        <w:t xml:space="preserve">4 – Colocamos a cor vermelha utilizando o </w:t>
+      <w:pPr>
+        <w:rPr>
+          <w:noProof/>
+        </w:rPr>
+      </w:pPr>
+      <w:r>
+        <w:t xml:space="preserve">3 </w:t>
+      </w:r>
+      <w:r>
+        <w:t>–</w:t>
+      </w:r>
+      <w:r>
+        <w:t xml:space="preserve"> </w:t>
+      </w:r>
+      <w:r>
+        <w:t xml:space="preserve">No texto do index.html utilizamos </w:t>
       </w:r>
       <w:proofErr w:type="spellStart"/>
       <w:r>
-        <w:t>css</w:t>
+        <w:t>tags</w:t>
       </w:r>
       <w:proofErr w:type="spellEnd"/>
       <w:r>
-        <w:t xml:space="preserve"> através de referência conforme o código:</w:t>
-      </w:r>
-    </w:p>
-    <w:p>
-      <w:pPr>
-        <w:jc w:val="center"/>
-      </w:pPr>
+        <w:t xml:space="preserve"> alinhadas tendo como regra a primeira que abre é a última que fecha, conforme imagem abaixo:</w:t>
+      </w:r>
+      <w:r>
+        <w:rPr>
+          <w:noProof/>
+        </w:rPr>
+        <w:t xml:space="preserve"> </w:t>
+      </w:r>
       <w:r>
         <w:rPr>
           <w:noProof/>
         </w:rPr>
         <w:drawing>
-          <wp:inline distT="0" distB="0" distL="0" distR="0" wp14:anchorId="31E1F7DC" wp14:editId="50791E00">
-            <wp:extent cx="1895475" cy="549301"/>
-            <wp:effectExtent l="0" t="0" r="0" b="3175"/>
-            <wp:docPr id="6" name="Imagem 6"/>
+          <wp:inline distT="0" distB="0" distL="0" distR="0" wp14:anchorId="42C03E11" wp14:editId="3DFC7053">
+            <wp:extent cx="5400040" cy="163830"/>
+            <wp:effectExtent l="0" t="0" r="0" b="7620"/>
+            <wp:docPr id="2" name="Imagem 2"/>
             <wp:cNvGraphicFramePr>
               <a:graphicFrameLocks xmlns:a="http://schemas.openxmlformats.org/drawingml/2006/main" noChangeAspect="1"/>
             </wp:cNvGraphicFramePr>
@@ -403,7 +345,7 @@
                   <pic:spPr>
                     <a:xfrm>
                       <a:off x="0" y="0"/>
-                      <a:ext cx="1925694" cy="558058"/>
+                      <a:ext cx="5400040" cy="163830"/>
                     </a:xfrm>
                     <a:prstGeom prst="rect">
                       <a:avLst/>
@@ -417,45 +359,31 @@
       </w:r>
     </w:p>
     <w:p>
-      <w:pPr>
-        <w:rPr>
-          <w:noProof/>
-        </w:rPr>
-      </w:pPr>
-      <w:r>
-        <w:t xml:space="preserve">5 – No </w:t>
+      <w:r>
+        <w:t xml:space="preserve">4 – Colocamos a cor vermelha utilizando o </w:t>
       </w:r>
       <w:proofErr w:type="spellStart"/>
       <w:r>
-        <w:t>html</w:t>
+        <w:t>css</w:t>
       </w:r>
       <w:proofErr w:type="spellEnd"/>
       <w:r>
-        <w:t xml:space="preserve"> inserimos uma imagem utilizando o seguinte código e adicionamos uma </w:t>
-      </w:r>
-      <w:proofErr w:type="spellStart"/>
-      <w:r>
-        <w:t>class</w:t>
-      </w:r>
-      <w:proofErr w:type="spellEnd"/>
-      <w:r>
-        <w:t>:</w:t>
-      </w:r>
-      <w:r>
-        <w:rPr>
-          <w:noProof/>
-        </w:rPr>
-        <w:t xml:space="preserve"> </w:t>
-      </w:r>
+        <w:t xml:space="preserve"> através de referência conforme o código:</w:t>
+      </w:r>
+    </w:p>
+    <w:p>
+      <w:pPr>
+        <w:jc w:val="center"/>
+      </w:pPr>
       <w:r>
         <w:rPr>
           <w:noProof/>
         </w:rPr>
         <w:drawing>
-          <wp:inline distT="0" distB="0" distL="0" distR="0" wp14:anchorId="5E09BC1E" wp14:editId="45D006B8">
-            <wp:extent cx="4286848" cy="219106"/>
-            <wp:effectExtent l="0" t="0" r="0" b="9525"/>
-            <wp:docPr id="7" name="Imagem 7"/>
+          <wp:inline distT="0" distB="0" distL="0" distR="0" wp14:anchorId="31E1F7DC" wp14:editId="50791E00">
+            <wp:extent cx="1895475" cy="549301"/>
+            <wp:effectExtent l="0" t="0" r="0" b="3175"/>
+            <wp:docPr id="6" name="Imagem 6"/>
             <wp:cNvGraphicFramePr>
               <a:graphicFrameLocks xmlns:a="http://schemas.openxmlformats.org/drawingml/2006/main" noChangeAspect="1"/>
             </wp:cNvGraphicFramePr>
@@ -475,7 +403,7 @@
                   <pic:spPr>
                     <a:xfrm>
                       <a:off x="0" y="0"/>
-                      <a:ext cx="4286848" cy="219106"/>
+                      <a:ext cx="1925694" cy="558058"/>
                     </a:xfrm>
                     <a:prstGeom prst="rect">
                       <a:avLst/>
@@ -495,10 +423,23 @@
         </w:rPr>
       </w:pPr>
       <w:r>
-        <w:rPr>
-          <w:noProof/>
-        </w:rPr>
-        <w:t>No css definimos que nossa imagem ocupasse 100% do tamanho da nossa tela:</w:t>
+        <w:t xml:space="preserve">5 – No </w:t>
+      </w:r>
+      <w:proofErr w:type="spellStart"/>
+      <w:r>
+        <w:t>html</w:t>
+      </w:r>
+      <w:proofErr w:type="spellEnd"/>
+      <w:r>
+        <w:t xml:space="preserve"> inserimos uma imagem utilizando o seguinte código e adicionamos uma </w:t>
+      </w:r>
+      <w:proofErr w:type="spellStart"/>
+      <w:r>
+        <w:t>class</w:t>
+      </w:r>
+      <w:proofErr w:type="spellEnd"/>
+      <w:r>
+        <w:t>:</w:t>
       </w:r>
       <w:r>
         <w:rPr>
@@ -506,23 +447,15 @@
         </w:rPr>
         <w:t xml:space="preserve"> </w:t>
       </w:r>
-    </w:p>
-    <w:p>
-      <w:pPr>
-        <w:jc w:val="center"/>
-        <w:rPr>
-          <w:noProof/>
-        </w:rPr>
-      </w:pPr>
       <w:r>
         <w:rPr>
           <w:noProof/>
         </w:rPr>
         <w:drawing>
-          <wp:inline distT="0" distB="0" distL="0" distR="0" wp14:anchorId="042FD27A" wp14:editId="1467B735">
-            <wp:extent cx="1590675" cy="642807"/>
-            <wp:effectExtent l="0" t="0" r="0" b="5080"/>
-            <wp:docPr id="9" name="Imagem 9"/>
+          <wp:inline distT="0" distB="0" distL="0" distR="0" wp14:anchorId="5E09BC1E" wp14:editId="45D006B8">
+            <wp:extent cx="4286848" cy="219106"/>
+            <wp:effectExtent l="0" t="0" r="0" b="9525"/>
+            <wp:docPr id="7" name="Imagem 7"/>
             <wp:cNvGraphicFramePr>
               <a:graphicFrameLocks xmlns:a="http://schemas.openxmlformats.org/drawingml/2006/main" noChangeAspect="1"/>
             </wp:cNvGraphicFramePr>
@@ -542,7 +475,7 @@
                   <pic:spPr>
                     <a:xfrm>
                       <a:off x="0" y="0"/>
-                      <a:ext cx="1621814" cy="655391"/>
+                      <a:ext cx="4286848" cy="219106"/>
                     </a:xfrm>
                     <a:prstGeom prst="rect">
                       <a:avLst/>
@@ -565,8 +498,7 @@
         <w:rPr>
           <w:noProof/>
         </w:rPr>
-        <w:lastRenderedPageBreak/>
-        <w:t>6 – No css centralizamos o nosso titulo h1:</w:t>
+        <w:t>No css definimos que nossa imagem ocupasse 100% do tamanho da nossa tela:</w:t>
       </w:r>
       <w:r>
         <w:rPr>
@@ -587,10 +519,10 @@
           <w:noProof/>
         </w:rPr>
         <w:drawing>
-          <wp:inline distT="0" distB="0" distL="0" distR="0" wp14:anchorId="4435FDB8" wp14:editId="3FB93BDD">
-            <wp:extent cx="1952898" cy="581106"/>
-            <wp:effectExtent l="0" t="0" r="9525" b="9525"/>
-            <wp:docPr id="11" name="Imagem 11"/>
+          <wp:inline distT="0" distB="0" distL="0" distR="0" wp14:anchorId="042FD27A" wp14:editId="1467B735">
+            <wp:extent cx="1590675" cy="642807"/>
+            <wp:effectExtent l="0" t="0" r="0" b="5080"/>
+            <wp:docPr id="9" name="Imagem 9"/>
             <wp:cNvGraphicFramePr>
               <a:graphicFrameLocks xmlns:a="http://schemas.openxmlformats.org/drawingml/2006/main" noChangeAspect="1"/>
             </wp:cNvGraphicFramePr>
@@ -610,7 +542,7 @@
                   <pic:spPr>
                     <a:xfrm>
                       <a:off x="0" y="0"/>
-                      <a:ext cx="1952898" cy="581106"/>
+                      <a:ext cx="1621814" cy="655391"/>
                     </a:xfrm>
                     <a:prstGeom prst="rect">
                       <a:avLst/>
@@ -633,13 +565,8 @@
         <w:rPr>
           <w:noProof/>
         </w:rPr>
-        <w:t xml:space="preserve">7 </w:t>
-      </w:r>
-      <w:r>
-        <w:rPr>
-          <w:noProof/>
-        </w:rPr>
-        <w:t>–</w:t>
+        <w:lastRenderedPageBreak/>
+        <w:t>6 – No css centralizamos o nosso titulo h1:</w:t>
       </w:r>
       <w:r>
         <w:rPr>
@@ -647,27 +574,23 @@
         </w:rPr>
         <w:t xml:space="preserve"> </w:t>
       </w:r>
-      <w:r>
-        <w:rPr>
-          <w:noProof/>
-        </w:rPr>
-        <w:t>No parágrafo “a Missão” queremos que ele fique com uma fonte maior, ou seja aumentando o tamanho dele utilizando font-size. E no html incluímos uma class para trabalhar com o parágrafo especifico.</w:t>
-      </w:r>
-      <w:r>
-        <w:rPr>
-          <w:noProof/>
-        </w:rPr>
-        <w:t xml:space="preserve"> </w:t>
-      </w:r>
+    </w:p>
+    <w:p>
+      <w:pPr>
+        <w:jc w:val="center"/>
+        <w:rPr>
+          <w:noProof/>
+        </w:rPr>
+      </w:pPr>
       <w:r>
         <w:rPr>
           <w:noProof/>
         </w:rPr>
         <w:drawing>
-          <wp:inline distT="0" distB="0" distL="0" distR="0" wp14:anchorId="4EAC42CA" wp14:editId="2EAE6E67">
-            <wp:extent cx="5400040" cy="134620"/>
-            <wp:effectExtent l="0" t="0" r="0" b="0"/>
-            <wp:docPr id="12" name="Imagem 12"/>
+          <wp:inline distT="0" distB="0" distL="0" distR="0" wp14:anchorId="4435FDB8" wp14:editId="3FB93BDD">
+            <wp:extent cx="1952898" cy="581106"/>
+            <wp:effectExtent l="0" t="0" r="9525" b="9525"/>
+            <wp:docPr id="11" name="Imagem 11"/>
             <wp:cNvGraphicFramePr>
               <a:graphicFrameLocks xmlns:a="http://schemas.openxmlformats.org/drawingml/2006/main" noChangeAspect="1"/>
             </wp:cNvGraphicFramePr>
@@ -687,7 +610,7 @@
                   <pic:spPr>
                     <a:xfrm>
                       <a:off x="0" y="0"/>
-                      <a:ext cx="5400040" cy="134620"/>
+                      <a:ext cx="1952898" cy="581106"/>
                     </a:xfrm>
                     <a:prstGeom prst="rect">
                       <a:avLst/>
@@ -699,29 +622,52 @@
           </wp:inline>
         </w:drawing>
       </w:r>
+    </w:p>
+    <w:p>
+      <w:pPr>
+        <w:rPr>
+          <w:noProof/>
+        </w:rPr>
+      </w:pPr>
+      <w:r>
+        <w:rPr>
+          <w:noProof/>
+        </w:rPr>
+        <w:t xml:space="preserve">7 </w:t>
+      </w:r>
+      <w:r>
+        <w:rPr>
+          <w:noProof/>
+        </w:rPr>
+        <w:t>–</w:t>
+      </w:r>
       <w:r>
         <w:rPr>
           <w:noProof/>
         </w:rPr>
         <w:t xml:space="preserve"> </w:t>
       </w:r>
-    </w:p>
-    <w:p>
-      <w:pPr>
-        <w:jc w:val="center"/>
-        <w:rPr>
-          <w:noProof/>
-        </w:rPr>
-      </w:pPr>
+      <w:r>
+        <w:rPr>
+          <w:noProof/>
+        </w:rPr>
+        <w:t>No parágrafo “a Missão” queremos que ele fique com uma fonte maior, ou seja aumentando o tamanho dele utilizando font-size. E no html incluímos uma class para trabalhar com o parágrafo especifico.</w:t>
+      </w:r>
+      <w:r>
+        <w:rPr>
+          <w:noProof/>
+        </w:rPr>
+        <w:t xml:space="preserve"> </w:t>
+      </w:r>
       <w:r>
         <w:rPr>
           <w:noProof/>
         </w:rPr>
         <w:drawing>
-          <wp:inline distT="0" distB="0" distL="0" distR="0" wp14:anchorId="46631F48" wp14:editId="050B34D5">
-            <wp:extent cx="1638529" cy="571580"/>
+          <wp:inline distT="0" distB="0" distL="0" distR="0" wp14:anchorId="4EAC42CA" wp14:editId="2EAE6E67">
+            <wp:extent cx="5400040" cy="134620"/>
             <wp:effectExtent l="0" t="0" r="0" b="0"/>
-            <wp:docPr id="14" name="Imagem 14"/>
+            <wp:docPr id="12" name="Imagem 12"/>
             <wp:cNvGraphicFramePr>
               <a:graphicFrameLocks xmlns:a="http://schemas.openxmlformats.org/drawingml/2006/main" noChangeAspect="1"/>
             </wp:cNvGraphicFramePr>
@@ -741,7 +687,7 @@
                   <pic:spPr>
                     <a:xfrm>
                       <a:off x="0" y="0"/>
-                      <a:ext cx="1638529" cy="571580"/>
+                      <a:ext cx="5400040" cy="134620"/>
                     </a:xfrm>
                     <a:prstGeom prst="rect">
                       <a:avLst/>
@@ -753,37 +699,12 @@
           </wp:inline>
         </w:drawing>
       </w:r>
-    </w:p>
-    <w:p>
-      <w:pPr>
-        <w:rPr>
-          <w:noProof/>
-        </w:rPr>
-      </w:pPr>
-      <w:r>
-        <w:rPr>
-          <w:noProof/>
-        </w:rPr>
-        <w:t xml:space="preserve">8 </w:t>
-      </w:r>
-      <w:r>
-        <w:rPr>
-          <w:noProof/>
-        </w:rPr>
-        <w:t>–</w:t>
-      </w:r>
       <w:r>
         <w:rPr>
           <w:noProof/>
         </w:rPr>
         <w:t xml:space="preserve"> </w:t>
       </w:r>
-      <w:r>
-        <w:rPr>
-          <w:noProof/>
-        </w:rPr>
-        <w:t>No html inserimos um subtítulo e criamos uma lista não-ordenada.</w:t>
-      </w:r>
     </w:p>
     <w:p>
       <w:pPr>
@@ -797,10 +718,10 @@
           <w:noProof/>
         </w:rPr>
         <w:drawing>
-          <wp:inline distT="0" distB="0" distL="0" distR="0" wp14:anchorId="12B206FE" wp14:editId="1F3C3C55">
-            <wp:extent cx="2439520" cy="1066800"/>
+          <wp:inline distT="0" distB="0" distL="0" distR="0" wp14:anchorId="46631F48" wp14:editId="050B34D5">
+            <wp:extent cx="1638529" cy="571580"/>
             <wp:effectExtent l="0" t="0" r="0" b="0"/>
-            <wp:docPr id="15" name="Imagem 15"/>
+            <wp:docPr id="14" name="Imagem 14"/>
             <wp:cNvGraphicFramePr>
               <a:graphicFrameLocks xmlns:a="http://schemas.openxmlformats.org/drawingml/2006/main" noChangeAspect="1"/>
             </wp:cNvGraphicFramePr>
@@ -820,7 +741,7 @@
                   <pic:spPr>
                     <a:xfrm>
                       <a:off x="0" y="0"/>
-                      <a:ext cx="2448013" cy="1070514"/>
+                      <a:ext cx="1638529" cy="571580"/>
                     </a:xfrm>
                     <a:prstGeom prst="rect">
                       <a:avLst/>
@@ -843,20 +764,13 @@
         <w:rPr>
           <w:noProof/>
         </w:rPr>
-        <w:t>9 – Nos itens da lista adicionamos class com mesmo nome para que o comportamento se repita para todos os itens da lista.</w:t>
-      </w:r>
-    </w:p>
-    <w:p>
-      <w:pPr>
-        <w:rPr>
-          <w:noProof/>
-        </w:rPr>
-      </w:pPr>
-      <w:r>
-        <w:rPr>
-          <w:noProof/>
-        </w:rPr>
-        <w:t>(Os itens todos ficaram em itálico)</w:t>
+        <w:t xml:space="preserve">8 </w:t>
+      </w:r>
+      <w:r>
+        <w:rPr>
+          <w:noProof/>
+        </w:rPr>
+        <w:t>–</w:t>
       </w:r>
       <w:r>
         <w:rPr>
@@ -868,11 +782,25 @@
         <w:rPr>
           <w:noProof/>
         </w:rPr>
+        <w:t>No html inserimos um subtítulo e criamos uma lista não-ordenada.</w:t>
+      </w:r>
+    </w:p>
+    <w:p>
+      <w:pPr>
+        <w:jc w:val="center"/>
+        <w:rPr>
+          <w:noProof/>
+        </w:rPr>
+      </w:pPr>
+      <w:r>
+        <w:rPr>
+          <w:noProof/>
+        </w:rPr>
         <w:drawing>
-          <wp:inline distT="0" distB="0" distL="0" distR="0" wp14:anchorId="738EB0D2" wp14:editId="3832870B">
-            <wp:extent cx="3486150" cy="953520"/>
+          <wp:inline distT="0" distB="0" distL="0" distR="0" wp14:anchorId="12B206FE" wp14:editId="1F3C3C55">
+            <wp:extent cx="2439520" cy="1066800"/>
             <wp:effectExtent l="0" t="0" r="0" b="0"/>
-            <wp:docPr id="4" name="Imagem 4"/>
+            <wp:docPr id="15" name="Imagem 15"/>
             <wp:cNvGraphicFramePr>
               <a:graphicFrameLocks xmlns:a="http://schemas.openxmlformats.org/drawingml/2006/main" noChangeAspect="1"/>
             </wp:cNvGraphicFramePr>
@@ -892,7 +820,7 @@
                   <pic:spPr>
                     <a:xfrm>
                       <a:off x="0" y="0"/>
-                      <a:ext cx="3872802" cy="1059276"/>
+                      <a:ext cx="2448013" cy="1070514"/>
                     </a:xfrm>
                     <a:prstGeom prst="rect">
                       <a:avLst/>
@@ -904,15 +832,47 @@
           </wp:inline>
         </w:drawing>
       </w:r>
+    </w:p>
+    <w:p>
+      <w:pPr>
+        <w:rPr>
+          <w:noProof/>
+        </w:rPr>
+      </w:pPr>
+      <w:r>
+        <w:rPr>
+          <w:noProof/>
+        </w:rPr>
+        <w:t>9 – Nos itens da lista adicionamos class com mesmo nome para que o comportamento se repita para todos os itens da lista.</w:t>
+      </w:r>
+    </w:p>
+    <w:p>
+      <w:pPr>
+        <w:rPr>
+          <w:noProof/>
+        </w:rPr>
+      </w:pPr>
+      <w:r>
+        <w:rPr>
+          <w:noProof/>
+        </w:rPr>
+        <w:t>(Os itens todos ficaram em itálico)</w:t>
+      </w:r>
+      <w:r>
+        <w:rPr>
+          <w:noProof/>
+        </w:rPr>
+        <w:t xml:space="preserve"> </w:t>
+      </w:r>
       <w:r>
         <w:rPr>
           <w:noProof/>
         </w:rPr>
         <w:drawing>
-          <wp:inline distT="0" distB="0" distL="0" distR="0" wp14:anchorId="06925DD4" wp14:editId="382631AF">
-            <wp:extent cx="1690254" cy="581025"/>
-            <wp:effectExtent l="0" t="0" r="5715" b="0"/>
-            <wp:docPr id="8" name="Imagem 8"/>
+          <wp:inline distT="0" distB="0" distL="0" distR="0" wp14:anchorId="738EB0D2" wp14:editId="3832870B">
+            <wp:extent cx="3486150" cy="953520"/>
+            <wp:effectExtent l="0" t="0" r="0" b="0"/>
+            <wp:docPr id="4" name="Imagem 4"/>
             <wp:cNvGraphicFramePr>
               <a:graphicFrameLocks xmlns:a="http://schemas.openxmlformats.org/drawingml/2006/main" noChangeAspect="1"/>
             </wp:cNvGraphicFramePr>
@@ -932,7 +892,7 @@
                   <pic:spPr>
                     <a:xfrm>
                       <a:off x="0" y="0"/>
-                      <a:ext cx="1810990" cy="622528"/>
+                      <a:ext cx="3872802" cy="1059276"/>
                     </a:xfrm>
                     <a:prstGeom prst="rect">
                       <a:avLst/>
@@ -944,60 +904,15 @@
           </wp:inline>
         </w:drawing>
       </w:r>
-    </w:p>
-    <w:p>
-      <w:pPr>
-        <w:rPr>
-          <w:noProof/>
-        </w:rPr>
-      </w:pPr>
-      <w:r>
-        <w:rPr>
-          <w:noProof/>
-        </w:rPr>
-        <w:t>10 – Dividimos a nossa página em duas:</w:t>
-      </w:r>
-    </w:p>
-    <w:p>
-      <w:pPr>
-        <w:rPr>
-          <w:noProof/>
-        </w:rPr>
-      </w:pPr>
-      <w:r>
-        <w:rPr>
-          <w:noProof/>
-        </w:rPr>
-        <w:t>Primeira parte sendo a principal onde adicionamos uma div que iniciou acima do header e fechou abaixo do nosso último parágrafo .</w:t>
-      </w:r>
-    </w:p>
-    <w:p>
-      <w:pPr>
-        <w:rPr>
-          <w:noProof/>
-        </w:rPr>
-      </w:pPr>
-      <w:r>
-        <w:rPr>
-          <w:noProof/>
-        </w:rPr>
-        <w:t>E deixamos o fundo dessa divisão com a cor branca.</w:t>
-      </w:r>
-      <w:r>
-        <w:rPr>
-          <w:noProof/>
-        </w:rPr>
-        <w:t xml:space="preserve"> </w:t>
-      </w:r>
       <w:r>
         <w:rPr>
           <w:noProof/>
         </w:rPr>
         <w:drawing>
-          <wp:inline distT="0" distB="0" distL="0" distR="0" wp14:anchorId="7ABA0DFC" wp14:editId="684F3916">
-            <wp:extent cx="4773148" cy="1590675"/>
-            <wp:effectExtent l="0" t="0" r="8890" b="0"/>
-            <wp:docPr id="13" name="Imagem 13"/>
+          <wp:inline distT="0" distB="0" distL="0" distR="0" wp14:anchorId="06925DD4" wp14:editId="382631AF">
+            <wp:extent cx="1690254" cy="581025"/>
+            <wp:effectExtent l="0" t="0" r="5715" b="0"/>
+            <wp:docPr id="8" name="Imagem 8"/>
             <wp:cNvGraphicFramePr>
               <a:graphicFrameLocks xmlns:a="http://schemas.openxmlformats.org/drawingml/2006/main" noChangeAspect="1"/>
             </wp:cNvGraphicFramePr>
@@ -1017,6 +932,91 @@
                   <pic:spPr>
                     <a:xfrm>
                       <a:off x="0" y="0"/>
+                      <a:ext cx="1810990" cy="622528"/>
+                    </a:xfrm>
+                    <a:prstGeom prst="rect">
+                      <a:avLst/>
+                    </a:prstGeom>
+                  </pic:spPr>
+                </pic:pic>
+              </a:graphicData>
+            </a:graphic>
+          </wp:inline>
+        </w:drawing>
+      </w:r>
+    </w:p>
+    <w:p>
+      <w:pPr>
+        <w:rPr>
+          <w:noProof/>
+        </w:rPr>
+      </w:pPr>
+      <w:r>
+        <w:rPr>
+          <w:noProof/>
+        </w:rPr>
+        <w:t>10 – Dividimos a nossa página em duas:</w:t>
+      </w:r>
+    </w:p>
+    <w:p>
+      <w:pPr>
+        <w:rPr>
+          <w:noProof/>
+        </w:rPr>
+      </w:pPr>
+      <w:r>
+        <w:rPr>
+          <w:noProof/>
+        </w:rPr>
+        <w:t>Primeira parte sendo a principal onde adicionamos uma div que iniciou acima do header e fechou abaixo do nosso último parágrafo .</w:t>
+      </w:r>
+    </w:p>
+    <w:p>
+      <w:pPr>
+        <w:rPr>
+          <w:noProof/>
+        </w:rPr>
+      </w:pPr>
+      <w:r>
+        <w:rPr>
+          <w:noProof/>
+        </w:rPr>
+        <w:t>E deixamos o fundo dessa divisão com a cor branca.</w:t>
+      </w:r>
+      <w:r>
+        <w:rPr>
+          <w:noProof/>
+        </w:rPr>
+        <w:t xml:space="preserve"> </w:t>
+      </w:r>
+      <w:r>
+        <w:rPr>
+          <w:noProof/>
+        </w:rPr>
+        <w:drawing>
+          <wp:inline distT="0" distB="0" distL="0" distR="0" wp14:anchorId="7ABA0DFC" wp14:editId="684F3916">
+            <wp:extent cx="4773148" cy="1590675"/>
+            <wp:effectExtent l="0" t="0" r="8890" b="0"/>
+            <wp:docPr id="13" name="Imagem 13"/>
+            <wp:cNvGraphicFramePr>
+              <a:graphicFrameLocks xmlns:a="http://schemas.openxmlformats.org/drawingml/2006/main" noChangeAspect="1"/>
+            </wp:cNvGraphicFramePr>
+            <a:graphic xmlns:a="http://schemas.openxmlformats.org/drawingml/2006/main">
+              <a:graphicData uri="http://schemas.openxmlformats.org/drawingml/2006/picture">
+                <pic:pic xmlns:pic="http://schemas.openxmlformats.org/drawingml/2006/picture">
+                  <pic:nvPicPr>
+                    <pic:cNvPr id="1" name=""/>
+                    <pic:cNvPicPr/>
+                  </pic:nvPicPr>
+                  <pic:blipFill>
+                    <a:blip r:embed="rId20"/>
+                    <a:stretch>
+                      <a:fillRect/>
+                    </a:stretch>
+                  </pic:blipFill>
+                  <pic:spPr>
+                    <a:xfrm>
+                      <a:off x="0" y="0"/>
                       <a:ext cx="4798023" cy="1598965"/>
                     </a:xfrm>
                     <a:prstGeom prst="rect">
@@ -1051,7 +1051,7 @@
                     </pic:cNvPicPr>
                   </pic:nvPicPr>
                   <pic:blipFill>
-                    <a:blip r:embed="rId20">
+                    <a:blip r:embed="rId21">
                       <a:extLst>
                         <a:ext uri="{28A0092B-C50C-407E-A947-70E740481C1C}">
                           <a14:useLocalDpi xmlns:a14="http://schemas.microsoft.com/office/drawing/2010/main" val="0"/>
@@ -1135,7 +1135,7 @@
                     <pic:cNvPicPr/>
                   </pic:nvPicPr>
                   <pic:blipFill>
-                    <a:blip r:embed="rId21"/>
+                    <a:blip r:embed="rId22"/>
                     <a:stretch>
                       <a:fillRect/>
                     </a:stretch>
@@ -1177,7 +1177,7 @@
                     </pic:cNvPicPr>
                   </pic:nvPicPr>
                   <pic:blipFill>
-                    <a:blip r:embed="rId22">
+                    <a:blip r:embed="rId23">
                       <a:extLst>
                         <a:ext uri="{28A0092B-C50C-407E-A947-70E740481C1C}">
                           <a14:useLocalDpi xmlns:a14="http://schemas.microsoft.com/office/drawing/2010/main" val="0"/>
@@ -1247,7 +1247,7 @@
                     <pic:cNvPicPr/>
                   </pic:nvPicPr>
                   <pic:blipFill>
-                    <a:blip r:embed="rId23"/>
+                    <a:blip r:embed="rId24"/>
                     <a:stretch>
                       <a:fillRect/>
                     </a:stretch>
@@ -1284,73 +1284,6 @@
             <wp:extent cx="1505160" cy="514422"/>
             <wp:effectExtent l="0" t="0" r="0" b="0"/>
             <wp:docPr id="23" name="Imagem 23"/>
-            <wp:cNvGraphicFramePr>
-              <a:graphicFrameLocks xmlns:a="http://schemas.openxmlformats.org/drawingml/2006/main" noChangeAspect="1"/>
-            </wp:cNvGraphicFramePr>
-            <a:graphic xmlns:a="http://schemas.openxmlformats.org/drawingml/2006/main">
-              <a:graphicData uri="http://schemas.openxmlformats.org/drawingml/2006/picture">
-                <pic:pic xmlns:pic="http://schemas.openxmlformats.org/drawingml/2006/picture">
-                  <pic:nvPicPr>
-                    <pic:cNvPr id="1" name=""/>
-                    <pic:cNvPicPr/>
-                  </pic:nvPicPr>
-                  <pic:blipFill>
-                    <a:blip r:embed="rId24"/>
-                    <a:stretch>
-                      <a:fillRect/>
-                    </a:stretch>
-                  </pic:blipFill>
-                  <pic:spPr>
-                    <a:xfrm>
-                      <a:off x="0" y="0"/>
-                      <a:ext cx="1505160" cy="514422"/>
-                    </a:xfrm>
-                    <a:prstGeom prst="rect">
-                      <a:avLst/>
-                    </a:prstGeom>
-                  </pic:spPr>
-                </pic:pic>
-              </a:graphicData>
-            </a:graphic>
-          </wp:inline>
-        </w:drawing>
-      </w:r>
-    </w:p>
-    <w:p>
-      <w:pPr>
-        <w:rPr>
-          <w:noProof/>
-        </w:rPr>
-      </w:pPr>
-      <w:r>
-        <w:rPr>
-          <w:noProof/>
-        </w:rPr>
-        <w:t>13 – Colocamos a lista ao lado da imagem, mudando a natureza da lista utilizando “display: inline-block;” conforme imagem abaixo:</w:t>
-      </w:r>
-      <w:r>
-        <w:rPr>
-          <w:noProof/>
-        </w:rPr>
-        <w:t xml:space="preserve"> </w:t>
-      </w:r>
-    </w:p>
-    <w:p>
-      <w:pPr>
-        <w:jc w:val="center"/>
-        <w:rPr>
-          <w:noProof/>
-        </w:rPr>
-      </w:pPr>
-      <w:r>
-        <w:rPr>
-          <w:noProof/>
-        </w:rPr>
-        <w:drawing>
-          <wp:inline distT="0" distB="0" distL="0" distR="0" wp14:anchorId="6C6DA4EB" wp14:editId="1BB393F4">
-            <wp:extent cx="4819650" cy="2692634"/>
-            <wp:effectExtent l="0" t="0" r="0" b="0"/>
-            <wp:docPr id="26" name="Imagem 26"/>
             <wp:cNvGraphicFramePr>
               <a:graphicFrameLocks xmlns:a="http://schemas.openxmlformats.org/drawingml/2006/main" noChangeAspect="1"/>
             </wp:cNvGraphicFramePr>
@@ -1370,7 +1303,7 @@
                   <pic:spPr>
                     <a:xfrm>
                       <a:off x="0" y="0"/>
-                      <a:ext cx="4848540" cy="2708774"/>
+                      <a:ext cx="1505160" cy="514422"/>
                     </a:xfrm>
                     <a:prstGeom prst="rect">
                       <a:avLst/>
@@ -1382,15 +1315,42 @@
           </wp:inline>
         </w:drawing>
       </w:r>
+    </w:p>
+    <w:p>
+      <w:pPr>
+        <w:rPr>
+          <w:noProof/>
+        </w:rPr>
+      </w:pPr>
+      <w:r>
+        <w:rPr>
+          <w:noProof/>
+        </w:rPr>
+        <w:t>13 – Colocamos a lista ao lado da imagem, mudando a natureza da lista utilizando “display: inline-block;” conforme imagem abaixo:</w:t>
+      </w:r>
+      <w:r>
+        <w:rPr>
+          <w:noProof/>
+        </w:rPr>
+        <w:t xml:space="preserve"> </w:t>
+      </w:r>
+    </w:p>
+    <w:p>
+      <w:pPr>
+        <w:jc w:val="center"/>
+        <w:rPr>
+          <w:noProof/>
+        </w:rPr>
+      </w:pPr>
       <w:r>
         <w:rPr>
           <w:noProof/>
         </w:rPr>
         <w:drawing>
-          <wp:inline distT="0" distB="0" distL="0" distR="0" wp14:anchorId="010A1E3A" wp14:editId="06F307F7">
-            <wp:extent cx="2668150" cy="733425"/>
+          <wp:inline distT="0" distB="0" distL="0" distR="0" wp14:anchorId="6C6DA4EB" wp14:editId="1BB393F4">
+            <wp:extent cx="4819650" cy="2692634"/>
             <wp:effectExtent l="0" t="0" r="0" b="0"/>
-            <wp:docPr id="25" name="Imagem 25"/>
+            <wp:docPr id="26" name="Imagem 26"/>
             <wp:cNvGraphicFramePr>
               <a:graphicFrameLocks xmlns:a="http://schemas.openxmlformats.org/drawingml/2006/main" noChangeAspect="1"/>
             </wp:cNvGraphicFramePr>
@@ -1410,6 +1370,46 @@
                   <pic:spPr>
                     <a:xfrm>
                       <a:off x="0" y="0"/>
+                      <a:ext cx="4848540" cy="2708774"/>
+                    </a:xfrm>
+                    <a:prstGeom prst="rect">
+                      <a:avLst/>
+                    </a:prstGeom>
+                  </pic:spPr>
+                </pic:pic>
+              </a:graphicData>
+            </a:graphic>
+          </wp:inline>
+        </w:drawing>
+      </w:r>
+      <w:r>
+        <w:rPr>
+          <w:noProof/>
+        </w:rPr>
+        <w:drawing>
+          <wp:inline distT="0" distB="0" distL="0" distR="0" wp14:anchorId="010A1E3A" wp14:editId="06F307F7">
+            <wp:extent cx="2668150" cy="733425"/>
+            <wp:effectExtent l="0" t="0" r="0" b="0"/>
+            <wp:docPr id="25" name="Imagem 25"/>
+            <wp:cNvGraphicFramePr>
+              <a:graphicFrameLocks xmlns:a="http://schemas.openxmlformats.org/drawingml/2006/main" noChangeAspect="1"/>
+            </wp:cNvGraphicFramePr>
+            <a:graphic xmlns:a="http://schemas.openxmlformats.org/drawingml/2006/main">
+              <a:graphicData uri="http://schemas.openxmlformats.org/drawingml/2006/picture">
+                <pic:pic xmlns:pic="http://schemas.openxmlformats.org/drawingml/2006/picture">
+                  <pic:nvPicPr>
+                    <pic:cNvPr id="1" name=""/>
+                    <pic:cNvPicPr/>
+                  </pic:nvPicPr>
+                  <pic:blipFill>
+                    <a:blip r:embed="rId27"/>
+                    <a:stretch>
+                      <a:fillRect/>
+                    </a:stretch>
+                  </pic:blipFill>
+                  <pic:spPr>
+                    <a:xfrm>
+                      <a:off x="0" y="0"/>
                       <a:ext cx="2676714" cy="735779"/>
                     </a:xfrm>
                     <a:prstGeom prst="rect">
@@ -1468,7 +1468,7 @@
                     <pic:cNvPicPr/>
                   </pic:nvPicPr>
                   <pic:blipFill>
-                    <a:blip r:embed="rId27"/>
+                    <a:blip r:embed="rId28"/>
                     <a:stretch>
                       <a:fillRect/>
                     </a:stretch>
@@ -1588,7 +1588,7 @@
                     <pic:cNvPicPr/>
                   </pic:nvPicPr>
                   <pic:blipFill>
-                    <a:blip r:embed="rId28"/>
+                    <a:blip r:embed="rId29"/>
                     <a:stretch>
                       <a:fillRect/>
                     </a:stretch>
@@ -1783,7 +1783,7 @@
                     <pic:cNvPicPr/>
                   </pic:nvPicPr>
                   <pic:blipFill>
-                    <a:blip r:embed="rId29"/>
+                    <a:blip r:embed="rId30"/>
                     <a:stretch>
                       <a:fillRect/>
                     </a:stretch>
@@ -1804,72 +1804,14 @@
         </w:drawing>
       </w:r>
       <w:r>
+        <w:rPr>
+          <w:noProof/>
+        </w:rPr>
         <w:drawing>
           <wp:inline distT="0" distB="0" distL="0" distR="0" wp14:anchorId="02336E9A" wp14:editId="0A54D463">
             <wp:extent cx="2000529" cy="1086002"/>
             <wp:effectExtent l="0" t="0" r="0" b="0"/>
             <wp:docPr id="32" name="Imagem 32"/>
-            <wp:cNvGraphicFramePr>
-              <a:graphicFrameLocks xmlns:a="http://schemas.openxmlformats.org/drawingml/2006/main" noChangeAspect="1"/>
-            </wp:cNvGraphicFramePr>
-            <a:graphic xmlns:a="http://schemas.openxmlformats.org/drawingml/2006/main">
-              <a:graphicData uri="http://schemas.openxmlformats.org/drawingml/2006/picture">
-                <pic:pic xmlns:pic="http://schemas.openxmlformats.org/drawingml/2006/picture">
-                  <pic:nvPicPr>
-                    <pic:cNvPr id="1" name=""/>
-                    <pic:cNvPicPr/>
-                  </pic:nvPicPr>
-                  <pic:blipFill>
-                    <a:blip r:embed="rId30"/>
-                    <a:stretch>
-                      <a:fillRect/>
-                    </a:stretch>
-                  </pic:blipFill>
-                  <pic:spPr>
-                    <a:xfrm>
-                      <a:off x="0" y="0"/>
-                      <a:ext cx="2000529" cy="1086002"/>
-                    </a:xfrm>
-                    <a:prstGeom prst="rect">
-                      <a:avLst/>
-                    </a:prstGeom>
-                  </pic:spPr>
-                </pic:pic>
-              </a:graphicData>
-            </a:graphic>
-          </wp:inline>
-        </w:drawing>
-      </w:r>
-    </w:p>
-    <w:p>
-      <w:pPr>
-        <w:rPr>
-          <w:noProof/>
-        </w:rPr>
-      </w:pPr>
-      <w:r>
-        <w:rPr>
-          <w:noProof/>
-        </w:rPr>
-        <w:t>16 – Na div “benefícios” centralizamos o subtítulo h2:</w:t>
-      </w:r>
-    </w:p>
-    <w:p>
-      <w:pPr>
-        <w:jc w:val="center"/>
-        <w:rPr>
-          <w:noProof/>
-        </w:rPr>
-      </w:pPr>
-      <w:r>
-        <w:rPr>
-          <w:noProof/>
-        </w:rPr>
-        <w:drawing>
-          <wp:inline distT="0" distB="0" distL="0" distR="0" wp14:anchorId="611E85C9" wp14:editId="579D71D8">
-            <wp:extent cx="1838582" cy="628738"/>
-            <wp:effectExtent l="0" t="0" r="9525" b="0"/>
-            <wp:docPr id="39" name="Imagem 39"/>
             <wp:cNvGraphicFramePr>
               <a:graphicFrameLocks xmlns:a="http://schemas.openxmlformats.org/drawingml/2006/main" noChangeAspect="1"/>
             </wp:cNvGraphicFramePr>
@@ -1889,6 +1831,67 @@
                   <pic:spPr>
                     <a:xfrm>
                       <a:off x="0" y="0"/>
+                      <a:ext cx="2000529" cy="1086002"/>
+                    </a:xfrm>
+                    <a:prstGeom prst="rect">
+                      <a:avLst/>
+                    </a:prstGeom>
+                  </pic:spPr>
+                </pic:pic>
+              </a:graphicData>
+            </a:graphic>
+          </wp:inline>
+        </w:drawing>
+      </w:r>
+    </w:p>
+    <w:p>
+      <w:pPr>
+        <w:rPr>
+          <w:noProof/>
+        </w:rPr>
+      </w:pPr>
+      <w:r>
+        <w:rPr>
+          <w:noProof/>
+        </w:rPr>
+        <w:t>16 – Na div “benefícios” centralizamos o subtítulo h2:</w:t>
+      </w:r>
+    </w:p>
+    <w:p>
+      <w:pPr>
+        <w:jc w:val="center"/>
+        <w:rPr>
+          <w:noProof/>
+        </w:rPr>
+      </w:pPr>
+      <w:r>
+        <w:rPr>
+          <w:noProof/>
+        </w:rPr>
+        <w:drawing>
+          <wp:inline distT="0" distB="0" distL="0" distR="0" wp14:anchorId="611E85C9" wp14:editId="579D71D8">
+            <wp:extent cx="1838582" cy="628738"/>
+            <wp:effectExtent l="0" t="0" r="9525" b="0"/>
+            <wp:docPr id="39" name="Imagem 39"/>
+            <wp:cNvGraphicFramePr>
+              <a:graphicFrameLocks xmlns:a="http://schemas.openxmlformats.org/drawingml/2006/main" noChangeAspect="1"/>
+            </wp:cNvGraphicFramePr>
+            <a:graphic xmlns:a="http://schemas.openxmlformats.org/drawingml/2006/main">
+              <a:graphicData uri="http://schemas.openxmlformats.org/drawingml/2006/picture">
+                <pic:pic xmlns:pic="http://schemas.openxmlformats.org/drawingml/2006/picture">
+                  <pic:nvPicPr>
+                    <pic:cNvPr id="1" name=""/>
+                    <pic:cNvPicPr/>
+                  </pic:nvPicPr>
+                  <pic:blipFill>
+                    <a:blip r:embed="rId32"/>
+                    <a:stretch>
+                      <a:fillRect/>
+                    </a:stretch>
+                  </pic:blipFill>
+                  <pic:spPr>
+                    <a:xfrm>
+                      <a:off x="0" y="0"/>
                       <a:ext cx="1838582" cy="628738"/>
                     </a:xfrm>
                     <a:prstGeom prst="rect">
@@ -1947,7 +1950,7 @@
                     <pic:cNvPicPr/>
                   </pic:nvPicPr>
                   <pic:blipFill>
-                    <a:blip r:embed="rId32"/>
+                    <a:blip r:embed="rId33"/>
                     <a:stretch>
                       <a:fillRect/>
                     </a:stretch>
@@ -2069,7 +2072,7 @@
                     <pic:cNvPicPr/>
                   </pic:nvPicPr>
                   <pic:blipFill>
-                    <a:blip r:embed="rId33"/>
+                    <a:blip r:embed="rId34"/>
                     <a:stretch>
                       <a:fillRect/>
                     </a:stretch>
@@ -2124,46 +2127,6 @@
             <wp:extent cx="1743318" cy="485843"/>
             <wp:effectExtent l="0" t="0" r="0" b="9525"/>
             <wp:docPr id="46" name="Imagem 46"/>
-            <wp:cNvGraphicFramePr>
-              <a:graphicFrameLocks xmlns:a="http://schemas.openxmlformats.org/drawingml/2006/main" noChangeAspect="1"/>
-            </wp:cNvGraphicFramePr>
-            <a:graphic xmlns:a="http://schemas.openxmlformats.org/drawingml/2006/main">
-              <a:graphicData uri="http://schemas.openxmlformats.org/drawingml/2006/picture">
-                <pic:pic xmlns:pic="http://schemas.openxmlformats.org/drawingml/2006/picture">
-                  <pic:nvPicPr>
-                    <pic:cNvPr id="1" name=""/>
-                    <pic:cNvPicPr/>
-                  </pic:nvPicPr>
-                  <pic:blipFill>
-                    <a:blip r:embed="rId34"/>
-                    <a:stretch>
-                      <a:fillRect/>
-                    </a:stretch>
-                  </pic:blipFill>
-                  <pic:spPr>
-                    <a:xfrm>
-                      <a:off x="0" y="0"/>
-                      <a:ext cx="1743318" cy="485843"/>
-                    </a:xfrm>
-                    <a:prstGeom prst="rect">
-                      <a:avLst/>
-                    </a:prstGeom>
-                  </pic:spPr>
-                </pic:pic>
-              </a:graphicData>
-            </a:graphic>
-          </wp:inline>
-        </w:drawing>
-      </w:r>
-      <w:r>
-        <w:rPr>
-          <w:noProof/>
-        </w:rPr>
-        <w:drawing>
-          <wp:inline distT="0" distB="0" distL="0" distR="0" wp14:anchorId="18E936A8" wp14:editId="17DC2EB4">
-            <wp:extent cx="3543795" cy="257211"/>
-            <wp:effectExtent l="0" t="0" r="0" b="9525"/>
-            <wp:docPr id="48" name="Imagem 48"/>
             <wp:cNvGraphicFramePr>
               <a:graphicFrameLocks xmlns:a="http://schemas.openxmlformats.org/drawingml/2006/main" noChangeAspect="1"/>
             </wp:cNvGraphicFramePr>
@@ -2183,7 +2146,7 @@
                   <pic:spPr>
                     <a:xfrm>
                       <a:off x="0" y="0"/>
-                      <a:ext cx="3543795" cy="257211"/>
+                      <a:ext cx="1743318" cy="485843"/>
                     </a:xfrm>
                     <a:prstGeom prst="rect">
                       <a:avLst/>
@@ -2200,10 +2163,10 @@
           <w:noProof/>
         </w:rPr>
         <w:drawing>
-          <wp:inline distT="0" distB="0" distL="0" distR="0" wp14:anchorId="47D080B7" wp14:editId="3ED7064D">
-            <wp:extent cx="5400040" cy="228600"/>
-            <wp:effectExtent l="0" t="0" r="0" b="0"/>
-            <wp:docPr id="47" name="Imagem 47"/>
+          <wp:inline distT="0" distB="0" distL="0" distR="0" wp14:anchorId="18E936A8" wp14:editId="17DC2EB4">
+            <wp:extent cx="3543795" cy="257211"/>
+            <wp:effectExtent l="0" t="0" r="0" b="9525"/>
+            <wp:docPr id="48" name="Imagem 48"/>
             <wp:cNvGraphicFramePr>
               <a:graphicFrameLocks xmlns:a="http://schemas.openxmlformats.org/drawingml/2006/main" noChangeAspect="1"/>
             </wp:cNvGraphicFramePr>
@@ -2223,6 +2186,46 @@
                   <pic:spPr>
                     <a:xfrm>
                       <a:off x="0" y="0"/>
+                      <a:ext cx="3543795" cy="257211"/>
+                    </a:xfrm>
+                    <a:prstGeom prst="rect">
+                      <a:avLst/>
+                    </a:prstGeom>
+                  </pic:spPr>
+                </pic:pic>
+              </a:graphicData>
+            </a:graphic>
+          </wp:inline>
+        </w:drawing>
+      </w:r>
+      <w:r>
+        <w:rPr>
+          <w:noProof/>
+        </w:rPr>
+        <w:drawing>
+          <wp:inline distT="0" distB="0" distL="0" distR="0" wp14:anchorId="47D080B7" wp14:editId="3ED7064D">
+            <wp:extent cx="5400040" cy="228600"/>
+            <wp:effectExtent l="0" t="0" r="0" b="0"/>
+            <wp:docPr id="47" name="Imagem 47"/>
+            <wp:cNvGraphicFramePr>
+              <a:graphicFrameLocks xmlns:a="http://schemas.openxmlformats.org/drawingml/2006/main" noChangeAspect="1"/>
+            </wp:cNvGraphicFramePr>
+            <a:graphic xmlns:a="http://schemas.openxmlformats.org/drawingml/2006/main">
+              <a:graphicData uri="http://schemas.openxmlformats.org/drawingml/2006/picture">
+                <pic:pic xmlns:pic="http://schemas.openxmlformats.org/drawingml/2006/picture">
+                  <pic:nvPicPr>
+                    <pic:cNvPr id="1" name=""/>
+                    <pic:cNvPicPr/>
+                  </pic:nvPicPr>
+                  <pic:blipFill>
+                    <a:blip r:embed="rId37"/>
+                    <a:stretch>
+                      <a:fillRect/>
+                    </a:stretch>
+                  </pic:blipFill>
+                  <pic:spPr>
+                    <a:xfrm>
+                      <a:off x="0" y="0"/>
                       <a:ext cx="5400040" cy="228600"/>
                     </a:xfrm>
                     <a:prstGeom prst="rect">
@@ -2252,10 +2255,1475 @@
         <w:rPr>
           <w:noProof/>
         </w:rPr>
-        <w:t xml:space="preserve">19 - </w:t>
+        <w:t xml:space="preserve">19 </w:t>
+      </w:r>
+      <w:r>
+        <w:rPr>
+          <w:noProof/>
+        </w:rPr>
+        <w:t>–</w:t>
+      </w:r>
+      <w:r>
+        <w:rPr>
+          <w:noProof/>
+        </w:rPr>
+        <w:t xml:space="preserve"> </w:t>
+      </w:r>
+      <w:r>
+        <w:rPr>
+          <w:noProof/>
+        </w:rPr>
+        <w:t>Criamos dois arquivos no projeto</w:t>
+      </w:r>
+      <w:r>
+        <w:rPr>
+          <w:noProof/>
+        </w:rPr>
+        <w:t>, “produtos.html” e “produtos.css” e ligamos o css no produtos.html.</w:t>
+      </w:r>
+    </w:p>
+    <w:p>
+      <w:pPr>
+        <w:jc w:val="center"/>
+        <w:rPr>
+          <w:noProof/>
+        </w:rPr>
+      </w:pPr>
+      <w:r>
+        <w:rPr>
+          <w:noProof/>
+        </w:rPr>
+        <w:drawing>
+          <wp:inline distT="0" distB="0" distL="0" distR="0" wp14:anchorId="136F294C" wp14:editId="2A900873">
+            <wp:extent cx="4467225" cy="856779"/>
+            <wp:effectExtent l="0" t="0" r="0" b="635"/>
+            <wp:docPr id="17" name="Imagem 17"/>
+            <wp:cNvGraphicFramePr>
+              <a:graphicFrameLocks xmlns:a="http://schemas.openxmlformats.org/drawingml/2006/main" noChangeAspect="1"/>
+            </wp:cNvGraphicFramePr>
+            <a:graphic xmlns:a="http://schemas.openxmlformats.org/drawingml/2006/main">
+              <a:graphicData uri="http://schemas.openxmlformats.org/drawingml/2006/picture">
+                <pic:pic xmlns:pic="http://schemas.openxmlformats.org/drawingml/2006/picture">
+                  <pic:nvPicPr>
+                    <pic:cNvPr id="1" name=""/>
+                    <pic:cNvPicPr/>
+                  </pic:nvPicPr>
+                  <pic:blipFill>
+                    <a:blip r:embed="rId38"/>
+                    <a:stretch>
+                      <a:fillRect/>
+                    </a:stretch>
+                  </pic:blipFill>
+                  <pic:spPr>
+                    <a:xfrm>
+                      <a:off x="0" y="0"/>
+                      <a:ext cx="4559384" cy="874454"/>
+                    </a:xfrm>
+                    <a:prstGeom prst="rect">
+                      <a:avLst/>
+                    </a:prstGeom>
+                  </pic:spPr>
+                </pic:pic>
+              </a:graphicData>
+            </a:graphic>
+          </wp:inline>
+        </w:drawing>
+      </w:r>
+      <w:r>
+        <w:rPr>
+          <w:noProof/>
+        </w:rPr>
+        <w:drawing>
+          <wp:inline distT="0" distB="0" distL="0" distR="0" wp14:anchorId="43E19985" wp14:editId="53D02411">
+            <wp:extent cx="1304544" cy="1219200"/>
+            <wp:effectExtent l="0" t="0" r="0" b="0"/>
+            <wp:docPr id="16" name="Imagem 16"/>
+            <wp:cNvGraphicFramePr>
+              <a:graphicFrameLocks xmlns:a="http://schemas.openxmlformats.org/drawingml/2006/main" noChangeAspect="1"/>
+            </wp:cNvGraphicFramePr>
+            <a:graphic xmlns:a="http://schemas.openxmlformats.org/drawingml/2006/main">
+              <a:graphicData uri="http://schemas.openxmlformats.org/drawingml/2006/picture">
+                <pic:pic xmlns:pic="http://schemas.openxmlformats.org/drawingml/2006/picture">
+                  <pic:nvPicPr>
+                    <pic:cNvPr id="1" name=""/>
+                    <pic:cNvPicPr/>
+                  </pic:nvPicPr>
+                  <pic:blipFill>
+                    <a:blip r:embed="rId39"/>
+                    <a:stretch>
+                      <a:fillRect/>
+                    </a:stretch>
+                  </pic:blipFill>
+                  <pic:spPr>
+                    <a:xfrm>
+                      <a:off x="0" y="0"/>
+                      <a:ext cx="1317440" cy="1231252"/>
+                    </a:xfrm>
+                    <a:prstGeom prst="rect">
+                      <a:avLst/>
+                    </a:prstGeom>
+                  </pic:spPr>
+                </pic:pic>
+              </a:graphicData>
+            </a:graphic>
+          </wp:inline>
+        </w:drawing>
+      </w:r>
+    </w:p>
+    <w:p>
+      <w:pPr>
+        <w:rPr>
+          <w:noProof/>
+        </w:rPr>
+      </w:pPr>
+      <w:r>
+        <w:rPr>
+          <w:noProof/>
+        </w:rPr>
+        <w:t xml:space="preserve">20 </w:t>
+      </w:r>
+      <w:r>
+        <w:rPr>
+          <w:noProof/>
+        </w:rPr>
+        <w:t>–</w:t>
+      </w:r>
+      <w:r>
+        <w:rPr>
+          <w:noProof/>
+        </w:rPr>
+        <w:t xml:space="preserve"> </w:t>
+      </w:r>
+      <w:r>
+        <w:rPr>
+          <w:noProof/>
+        </w:rPr>
+        <w:t>Na página dos produtos.html, estruturamos, colocando header, main e footer. Dentro do header inserimos uma imagem que será o logo do site e criamos uma lista não-ordenada para que mais tarde ela seja o menu do nosso site.</w:t>
+      </w:r>
+      <w:r>
+        <w:rPr>
+          <w:noProof/>
+        </w:rPr>
+        <w:t xml:space="preserve"> </w:t>
+      </w:r>
+      <w:r>
+        <w:rPr>
+          <w:noProof/>
+        </w:rPr>
+        <w:drawing>
+          <wp:inline distT="0" distB="0" distL="0" distR="0" wp14:anchorId="2B1B0049" wp14:editId="419D80B7">
+            <wp:extent cx="3209925" cy="1270935"/>
+            <wp:effectExtent l="0" t="0" r="0" b="5715"/>
+            <wp:docPr id="22" name="Imagem 22"/>
+            <wp:cNvGraphicFramePr>
+              <a:graphicFrameLocks xmlns:a="http://schemas.openxmlformats.org/drawingml/2006/main" noChangeAspect="1"/>
+            </wp:cNvGraphicFramePr>
+            <a:graphic xmlns:a="http://schemas.openxmlformats.org/drawingml/2006/main">
+              <a:graphicData uri="http://schemas.openxmlformats.org/drawingml/2006/picture">
+                <pic:pic xmlns:pic="http://schemas.openxmlformats.org/drawingml/2006/picture">
+                  <pic:nvPicPr>
+                    <pic:cNvPr id="1" name=""/>
+                    <pic:cNvPicPr/>
+                  </pic:nvPicPr>
+                  <pic:blipFill>
+                    <a:blip r:embed="rId40"/>
+                    <a:stretch>
+                      <a:fillRect/>
+                    </a:stretch>
+                  </pic:blipFill>
+                  <pic:spPr>
+                    <a:xfrm>
+                      <a:off x="0" y="0"/>
+                      <a:ext cx="3284161" cy="1300328"/>
+                    </a:xfrm>
+                    <a:prstGeom prst="rect">
+                      <a:avLst/>
+                    </a:prstGeom>
+                  </pic:spPr>
+                </pic:pic>
+              </a:graphicData>
+            </a:graphic>
+          </wp:inline>
+        </w:drawing>
+      </w:r>
+    </w:p>
+    <w:p>
+      <w:pPr>
+        <w:rPr>
+          <w:noProof/>
+        </w:rPr>
+      </w:pPr>
+      <w:r>
+        <w:rPr>
+          <w:noProof/>
+        </w:rPr>
+        <w:lastRenderedPageBreak/>
+        <w:t xml:space="preserve">21 </w:t>
+      </w:r>
+      <w:r>
+        <w:rPr>
+          <w:noProof/>
+        </w:rPr>
+        <w:t>–</w:t>
+      </w:r>
+      <w:r>
+        <w:rPr>
+          <w:noProof/>
+        </w:rPr>
+        <w:t xml:space="preserve"> </w:t>
+      </w:r>
+      <w:r>
+        <w:rPr>
+          <w:noProof/>
+        </w:rPr>
+        <w:t>No produtos.css inserimos uma cor de fundo no header e no html adicionamos a tag “nav” que significa navegação, ou seja, nossa lista se tornou um menu para navegar entre as páginas.</w:t>
+      </w:r>
+    </w:p>
+    <w:p>
+      <w:pPr>
+        <w:rPr>
+          <w:noProof/>
+        </w:rPr>
+      </w:pPr>
+      <w:r>
+        <w:rPr>
+          <w:noProof/>
+        </w:rPr>
+        <w:drawing>
+          <wp:inline distT="0" distB="0" distL="0" distR="0" wp14:anchorId="670F65F9" wp14:editId="54C7EC9B">
+            <wp:extent cx="2200275" cy="1181469"/>
+            <wp:effectExtent l="0" t="0" r="0" b="0"/>
+            <wp:docPr id="36" name="Imagem 36"/>
+            <wp:cNvGraphicFramePr>
+              <a:graphicFrameLocks xmlns:a="http://schemas.openxmlformats.org/drawingml/2006/main" noChangeAspect="1"/>
+            </wp:cNvGraphicFramePr>
+            <a:graphic xmlns:a="http://schemas.openxmlformats.org/drawingml/2006/main">
+              <a:graphicData uri="http://schemas.openxmlformats.org/drawingml/2006/picture">
+                <pic:pic xmlns:pic="http://schemas.openxmlformats.org/drawingml/2006/picture">
+                  <pic:nvPicPr>
+                    <pic:cNvPr id="1" name=""/>
+                    <pic:cNvPicPr/>
+                  </pic:nvPicPr>
+                  <pic:blipFill>
+                    <a:blip r:embed="rId41"/>
+                    <a:stretch>
+                      <a:fillRect/>
+                    </a:stretch>
+                  </pic:blipFill>
+                  <pic:spPr>
+                    <a:xfrm>
+                      <a:off x="0" y="0"/>
+                      <a:ext cx="2215027" cy="1189390"/>
+                    </a:xfrm>
+                    <a:prstGeom prst="rect">
+                      <a:avLst/>
+                    </a:prstGeom>
+                  </pic:spPr>
+                </pic:pic>
+              </a:graphicData>
+            </a:graphic>
+          </wp:inline>
+        </w:drawing>
+      </w:r>
+      <w:r>
+        <w:rPr>
+          <w:noProof/>
+        </w:rPr>
+        <w:drawing>
+          <wp:inline distT="0" distB="0" distL="0" distR="0" wp14:anchorId="345B4371" wp14:editId="4258EFA0">
+            <wp:extent cx="2581275" cy="551794"/>
+            <wp:effectExtent l="0" t="0" r="0" b="1270"/>
+            <wp:docPr id="27" name="Imagem 27"/>
+            <wp:cNvGraphicFramePr>
+              <a:graphicFrameLocks xmlns:a="http://schemas.openxmlformats.org/drawingml/2006/main" noChangeAspect="1"/>
+            </wp:cNvGraphicFramePr>
+            <a:graphic xmlns:a="http://schemas.openxmlformats.org/drawingml/2006/main">
+              <a:graphicData uri="http://schemas.openxmlformats.org/drawingml/2006/picture">
+                <pic:pic xmlns:pic="http://schemas.openxmlformats.org/drawingml/2006/picture">
+                  <pic:nvPicPr>
+                    <pic:cNvPr id="1" name=""/>
+                    <pic:cNvPicPr/>
+                  </pic:nvPicPr>
+                  <pic:blipFill>
+                    <a:blip r:embed="rId42"/>
+                    <a:stretch>
+                      <a:fillRect/>
+                    </a:stretch>
+                  </pic:blipFill>
+                  <pic:spPr>
+                    <a:xfrm>
+                      <a:off x="0" y="0"/>
+                      <a:ext cx="2585022" cy="552595"/>
+                    </a:xfrm>
+                    <a:prstGeom prst="rect">
+                      <a:avLst/>
+                    </a:prstGeom>
+                  </pic:spPr>
+                </pic:pic>
+              </a:graphicData>
+            </a:graphic>
+          </wp:inline>
+        </w:drawing>
+      </w:r>
+    </w:p>
+    <w:p>
+      <w:pPr>
+        <w:rPr>
+          <w:noProof/>
+        </w:rPr>
+      </w:pPr>
+      <w:r>
+        <w:rPr>
+          <w:noProof/>
+        </w:rPr>
+        <w:t xml:space="preserve">22 </w:t>
+      </w:r>
+      <w:r>
+        <w:rPr>
+          <w:noProof/>
+        </w:rPr>
+        <w:t>–</w:t>
+      </w:r>
+      <w:r>
+        <w:rPr>
+          <w:noProof/>
+        </w:rPr>
+        <w:t xml:space="preserve"> </w:t>
+      </w:r>
+      <w:r>
+        <w:rPr>
+          <w:noProof/>
+        </w:rPr>
+        <w:t>Na lista-ordenada incluímos uma ancora, a tag: “a”, para criar os links entre as páginas conforme imagem:</w:t>
+      </w:r>
+    </w:p>
+    <w:p>
+      <w:pPr>
+        <w:jc w:val="center"/>
+        <w:rPr>
+          <w:noProof/>
+        </w:rPr>
+      </w:pPr>
+      <w:r>
+        <w:rPr>
+          <w:noProof/>
+        </w:rPr>
+        <w:drawing>
+          <wp:inline distT="0" distB="0" distL="0" distR="0" wp14:anchorId="793A9FF9" wp14:editId="6E8526C5">
+            <wp:extent cx="3514725" cy="490234"/>
+            <wp:effectExtent l="0" t="0" r="0" b="5080"/>
+            <wp:docPr id="38" name="Imagem 38"/>
+            <wp:cNvGraphicFramePr>
+              <a:graphicFrameLocks xmlns:a="http://schemas.openxmlformats.org/drawingml/2006/main" noChangeAspect="1"/>
+            </wp:cNvGraphicFramePr>
+            <a:graphic xmlns:a="http://schemas.openxmlformats.org/drawingml/2006/main">
+              <a:graphicData uri="http://schemas.openxmlformats.org/drawingml/2006/picture">
+                <pic:pic xmlns:pic="http://schemas.openxmlformats.org/drawingml/2006/picture">
+                  <pic:nvPicPr>
+                    <pic:cNvPr id="1" name=""/>
+                    <pic:cNvPicPr/>
+                  </pic:nvPicPr>
+                  <pic:blipFill>
+                    <a:blip r:embed="rId43"/>
+                    <a:stretch>
+                      <a:fillRect/>
+                    </a:stretch>
+                  </pic:blipFill>
+                  <pic:spPr>
+                    <a:xfrm>
+                      <a:off x="0" y="0"/>
+                      <a:ext cx="3592150" cy="501033"/>
+                    </a:xfrm>
+                    <a:prstGeom prst="rect">
+                      <a:avLst/>
+                    </a:prstGeom>
+                  </pic:spPr>
+                </pic:pic>
+              </a:graphicData>
+            </a:graphic>
+          </wp:inline>
+        </w:drawing>
+      </w:r>
+    </w:p>
+    <w:p>
+      <w:pPr>
+        <w:rPr>
+          <w:noProof/>
+        </w:rPr>
+      </w:pPr>
+      <w:r>
+        <w:rPr>
+          <w:noProof/>
+        </w:rPr>
+        <w:t xml:space="preserve">23 – Para colocar a nossa lista </w:t>
+      </w:r>
+      <w:r>
+        <w:rPr>
+          <w:noProof/>
+        </w:rPr>
+        <w:t>(</w:t>
+      </w:r>
+      <w:r>
+        <w:rPr>
+          <w:noProof/>
+        </w:rPr>
+        <w:t>os itens</w:t>
+      </w:r>
+      <w:r>
+        <w:rPr>
+          <w:noProof/>
+        </w:rPr>
+        <w:t>)</w:t>
+      </w:r>
+      <w:r>
+        <w:rPr>
+          <w:noProof/>
+        </w:rPr>
+        <w:t xml:space="preserve"> um do lado do outro</w:t>
+      </w:r>
+      <w:r>
+        <w:rPr>
+          <w:noProof/>
+        </w:rPr>
+        <w:t>,</w:t>
+      </w:r>
+      <w:r>
+        <w:rPr>
+          <w:noProof/>
+        </w:rPr>
+        <w:t xml:space="preserve"> para q</w:t>
+      </w:r>
+      <w:r>
+        <w:rPr>
+          <w:noProof/>
+        </w:rPr>
+        <w:t>u</w:t>
+      </w:r>
+      <w:r>
+        <w:rPr>
+          <w:noProof/>
+        </w:rPr>
+        <w:t xml:space="preserve">e assim possamos ter um menu horizontal, utilizamos o css por referência, ou seja, </w:t>
+      </w:r>
+      <w:r>
+        <w:rPr>
+          <w:noProof/>
+        </w:rPr>
+        <w:t>n</w:t>
+      </w:r>
+      <w:r>
+        <w:rPr>
+          <w:noProof/>
+        </w:rPr>
+        <w:t>o nosso site</w:t>
+      </w:r>
+      <w:r>
+        <w:rPr>
+          <w:noProof/>
+        </w:rPr>
+        <w:t>,</w:t>
+      </w:r>
+      <w:r>
+        <w:rPr>
+          <w:noProof/>
+        </w:rPr>
+        <w:t xml:space="preserve"> onde tiver </w:t>
+      </w:r>
+      <w:r>
+        <w:rPr>
+          <w:noProof/>
+        </w:rPr>
+        <w:t>“</w:t>
+      </w:r>
+      <w:r>
+        <w:rPr>
+          <w:noProof/>
+        </w:rPr>
+        <w:t>nav</w:t>
+      </w:r>
+      <w:r>
+        <w:rPr>
+          <w:noProof/>
+        </w:rPr>
+        <w:t>”</w:t>
+      </w:r>
+      <w:r>
+        <w:rPr>
+          <w:noProof/>
+        </w:rPr>
+        <w:t xml:space="preserve"> e</w:t>
+      </w:r>
+      <w:r>
+        <w:rPr>
+          <w:noProof/>
+        </w:rPr>
+        <w:t>”</w:t>
+      </w:r>
+      <w:r>
+        <w:rPr>
+          <w:noProof/>
+        </w:rPr>
+        <w:t>li</w:t>
+      </w:r>
+      <w:r>
+        <w:rPr>
+          <w:noProof/>
+        </w:rPr>
+        <w:t>”</w:t>
+      </w:r>
+      <w:r>
+        <w:rPr>
+          <w:noProof/>
+        </w:rPr>
+        <w:t xml:space="preserve"> </w:t>
+      </w:r>
+      <w:r>
+        <w:rPr>
+          <w:noProof/>
+        </w:rPr>
+        <w:t xml:space="preserve">vamos </w:t>
+      </w:r>
+      <w:r>
+        <w:rPr>
+          <w:noProof/>
+        </w:rPr>
+        <w:t>deixar a natureza (display)</w:t>
+      </w:r>
+      <w:r>
+        <w:rPr>
+          <w:noProof/>
+        </w:rPr>
+        <w:t>,</w:t>
+      </w:r>
+      <w:r>
+        <w:rPr>
+          <w:noProof/>
+        </w:rPr>
+        <w:t xml:space="preserve"> de forma </w:t>
+      </w:r>
+      <w:r>
+        <w:rPr>
+          <w:noProof/>
+        </w:rPr>
+        <w:t>“</w:t>
+      </w:r>
+      <w:r>
+        <w:rPr>
+          <w:noProof/>
+        </w:rPr>
+        <w:t>inline</w:t>
+      </w:r>
+      <w:r>
+        <w:rPr>
+          <w:noProof/>
+        </w:rPr>
+        <w:t>”</w:t>
+      </w:r>
+      <w:r>
+        <w:rPr>
+          <w:noProof/>
+        </w:rPr>
+        <w:t xml:space="preserve"> em linha.</w:t>
+      </w:r>
+      <w:r>
+        <w:rPr>
+          <w:noProof/>
+        </w:rPr>
+        <w:t xml:space="preserve"> </w:t>
+      </w:r>
+    </w:p>
+    <w:p>
+      <w:pPr>
+        <w:jc w:val="center"/>
+        <w:rPr>
+          <w:noProof/>
+        </w:rPr>
+      </w:pPr>
+      <w:r>
+        <w:rPr>
+          <w:noProof/>
+        </w:rPr>
+        <w:drawing>
+          <wp:inline distT="0" distB="0" distL="0" distR="0" wp14:anchorId="388B4677" wp14:editId="521B1FFE">
+            <wp:extent cx="1964416" cy="1990725"/>
+            <wp:effectExtent l="0" t="0" r="0" b="0"/>
+            <wp:docPr id="49" name="Imagem 49"/>
+            <wp:cNvGraphicFramePr>
+              <a:graphicFrameLocks xmlns:a="http://schemas.openxmlformats.org/drawingml/2006/main" noChangeAspect="1"/>
+            </wp:cNvGraphicFramePr>
+            <a:graphic xmlns:a="http://schemas.openxmlformats.org/drawingml/2006/main">
+              <a:graphicData uri="http://schemas.openxmlformats.org/drawingml/2006/picture">
+                <pic:pic xmlns:pic="http://schemas.openxmlformats.org/drawingml/2006/picture">
+                  <pic:nvPicPr>
+                    <pic:cNvPr id="1" name=""/>
+                    <pic:cNvPicPr/>
+                  </pic:nvPicPr>
+                  <pic:blipFill>
+                    <a:blip r:embed="rId44"/>
+                    <a:stretch>
+                      <a:fillRect/>
+                    </a:stretch>
+                  </pic:blipFill>
+                  <pic:spPr>
+                    <a:xfrm>
+                      <a:off x="0" y="0"/>
+                      <a:ext cx="1967316" cy="1993663"/>
+                    </a:xfrm>
+                    <a:prstGeom prst="rect">
+                      <a:avLst/>
+                    </a:prstGeom>
+                  </pic:spPr>
+                </pic:pic>
+              </a:graphicData>
+            </a:graphic>
+          </wp:inline>
+        </w:drawing>
+      </w:r>
+      <w:r>
+        <w:rPr>
+          <w:noProof/>
+        </w:rPr>
+        <w:drawing>
+          <wp:inline distT="0" distB="0" distL="0" distR="0" wp14:anchorId="6BE8D055" wp14:editId="5D8D376D">
+            <wp:extent cx="1648055" cy="562053"/>
+            <wp:effectExtent l="0" t="0" r="9525" b="9525"/>
+            <wp:docPr id="42" name="Imagem 42"/>
+            <wp:cNvGraphicFramePr>
+              <a:graphicFrameLocks xmlns:a="http://schemas.openxmlformats.org/drawingml/2006/main" noChangeAspect="1"/>
+            </wp:cNvGraphicFramePr>
+            <a:graphic xmlns:a="http://schemas.openxmlformats.org/drawingml/2006/main">
+              <a:graphicData uri="http://schemas.openxmlformats.org/drawingml/2006/picture">
+                <pic:pic xmlns:pic="http://schemas.openxmlformats.org/drawingml/2006/picture">
+                  <pic:nvPicPr>
+                    <pic:cNvPr id="1" name=""/>
+                    <pic:cNvPicPr/>
+                  </pic:nvPicPr>
+                  <pic:blipFill>
+                    <a:blip r:embed="rId45"/>
+                    <a:stretch>
+                      <a:fillRect/>
+                    </a:stretch>
+                  </pic:blipFill>
+                  <pic:spPr>
+                    <a:xfrm>
+                      <a:off x="0" y="0"/>
+                      <a:ext cx="1648055" cy="562053"/>
+                    </a:xfrm>
+                    <a:prstGeom prst="rect">
+                      <a:avLst/>
+                    </a:prstGeom>
+                  </pic:spPr>
+                </pic:pic>
+              </a:graphicData>
+            </a:graphic>
+          </wp:inline>
+        </w:drawing>
+      </w:r>
+    </w:p>
+    <w:p>
+      <w:pPr>
+        <w:rPr>
+          <w:noProof/>
+        </w:rPr>
+      </w:pPr>
+      <w:r>
+        <w:rPr>
+          <w:noProof/>
+        </w:rPr>
+        <w:t xml:space="preserve">24 </w:t>
+      </w:r>
+      <w:r>
+        <w:rPr>
+          <w:noProof/>
+        </w:rPr>
+        <w:t>–</w:t>
+      </w:r>
+      <w:r>
+        <w:rPr>
+          <w:noProof/>
+        </w:rPr>
+        <w:t xml:space="preserve"> </w:t>
+      </w:r>
+      <w:r>
+        <w:rPr>
+          <w:noProof/>
+        </w:rPr>
+        <w:t>Adicionamos a nossa lista a tag “uppercase” para que todo o texto fique em letras maiúsculas e, utilizamos a referência do “nav a”, que é os textos dos nossos links e, definimos que a cor do texto seria preta.</w:t>
+      </w:r>
+    </w:p>
+    <w:p>
+      <w:pPr>
+        <w:rPr>
+          <w:noProof/>
+        </w:rPr>
+      </w:pPr>
+      <w:r>
+        <w:rPr>
+          <w:noProof/>
+        </w:rPr>
+        <w:drawing>
+          <wp:inline distT="0" distB="0" distL="0" distR="0" wp14:anchorId="639557F7" wp14:editId="7ECB714A">
+            <wp:extent cx="2381582" cy="714475"/>
+            <wp:effectExtent l="0" t="0" r="0" b="9525"/>
+            <wp:docPr id="51" name="Imagem 51"/>
+            <wp:cNvGraphicFramePr>
+              <a:graphicFrameLocks xmlns:a="http://schemas.openxmlformats.org/drawingml/2006/main" noChangeAspect="1"/>
+            </wp:cNvGraphicFramePr>
+            <a:graphic xmlns:a="http://schemas.openxmlformats.org/drawingml/2006/main">
+              <a:graphicData uri="http://schemas.openxmlformats.org/drawingml/2006/picture">
+                <pic:pic xmlns:pic="http://schemas.openxmlformats.org/drawingml/2006/picture">
+                  <pic:nvPicPr>
+                    <pic:cNvPr id="1" name=""/>
+                    <pic:cNvPicPr/>
+                  </pic:nvPicPr>
+                  <pic:blipFill>
+                    <a:blip r:embed="rId46"/>
+                    <a:stretch>
+                      <a:fillRect/>
+                    </a:stretch>
+                  </pic:blipFill>
+                  <pic:spPr>
+                    <a:xfrm>
+                      <a:off x="0" y="0"/>
+                      <a:ext cx="2381582" cy="714475"/>
+                    </a:xfrm>
+                    <a:prstGeom prst="rect">
+                      <a:avLst/>
+                    </a:prstGeom>
+                  </pic:spPr>
+                </pic:pic>
+              </a:graphicData>
+            </a:graphic>
+          </wp:inline>
+        </w:drawing>
+      </w:r>
+    </w:p>
+    <w:p>
+      <w:pPr>
+        <w:rPr>
+          <w:noProof/>
+        </w:rPr>
+      </w:pPr>
+    </w:p>
+    <w:p>
+      <w:pPr>
+        <w:rPr>
+          <w:noProof/>
+        </w:rPr>
+      </w:pPr>
+    </w:p>
+    <w:p>
+      <w:pPr>
+        <w:rPr>
+          <w:noProof/>
+        </w:rPr>
+      </w:pPr>
+    </w:p>
+    <w:p>
+      <w:pPr>
+        <w:rPr>
+          <w:noProof/>
+        </w:rPr>
+      </w:pPr>
+    </w:p>
+    <w:p>
+      <w:pPr>
+        <w:rPr>
+          <w:noProof/>
+        </w:rPr>
+      </w:pPr>
+    </w:p>
+    <w:p>
+      <w:pPr>
+        <w:rPr>
+          <w:noProof/>
+        </w:rPr>
+      </w:pPr>
+    </w:p>
+    <w:p>
+      <w:pPr>
+        <w:rPr>
+          <w:noProof/>
+        </w:rPr>
+      </w:pPr>
+      <w:r>
+        <w:rPr>
+          <w:noProof/>
+        </w:rPr>
+        <w:lastRenderedPageBreak/>
+        <mc:AlternateContent>
+          <mc:Choice Requires="wps">
+            <w:drawing>
+              <wp:anchor distT="0" distB="0" distL="114300" distR="114300" simplePos="0" relativeHeight="251667456" behindDoc="0" locked="0" layoutInCell="1" allowOverlap="1">
+                <wp:simplePos x="0" y="0"/>
+                <wp:positionH relativeFrom="column">
+                  <wp:posOffset>520065</wp:posOffset>
+                </wp:positionH>
+                <wp:positionV relativeFrom="paragraph">
+                  <wp:posOffset>-604520</wp:posOffset>
+                </wp:positionV>
+                <wp:extent cx="3343275" cy="2571750"/>
+                <wp:effectExtent l="0" t="0" r="0" b="0"/>
+                <wp:wrapNone/>
+                <wp:docPr id="58" name="Arco 58"/>
+                <wp:cNvGraphicFramePr/>
+                <a:graphic xmlns:a="http://schemas.openxmlformats.org/drawingml/2006/main">
+                  <a:graphicData uri="http://schemas.microsoft.com/office/word/2010/wordprocessingShape">
+                    <wps:wsp>
+                      <wps:cNvSpPr/>
+                      <wps:spPr>
+                        <a:xfrm rot="10800000">
+                          <a:off x="0" y="0"/>
+                          <a:ext cx="3343275" cy="2571750"/>
+                        </a:xfrm>
+                        <a:prstGeom prst="arc">
+                          <a:avLst>
+                            <a:gd name="adj1" fmla="val 17342348"/>
+                            <a:gd name="adj2" fmla="val 21179833"/>
+                          </a:avLst>
+                        </a:prstGeom>
+                        <a:ln>
+                          <a:solidFill>
+                            <a:srgbClr val="FF0000"/>
+                          </a:solidFill>
+                        </a:ln>
+                      </wps:spPr>
+                      <wps:style>
+                        <a:lnRef idx="1">
+                          <a:schemeClr val="accent1"/>
+                        </a:lnRef>
+                        <a:fillRef idx="0">
+                          <a:schemeClr val="accent1"/>
+                        </a:fillRef>
+                        <a:effectRef idx="0">
+                          <a:schemeClr val="accent1"/>
+                        </a:effectRef>
+                        <a:fontRef idx="minor">
+                          <a:schemeClr val="tx1"/>
+                        </a:fontRef>
+                      </wps:style>
+                      <wps:bodyPr rot="0" spcFirstLastPara="0" vertOverflow="overflow" horzOverflow="overflow" vert="horz" wrap="square" lIns="91440" tIns="45720" rIns="91440" bIns="45720" numCol="1" spcCol="0" rtlCol="0" fromWordArt="0" anchor="ctr" anchorCtr="0" forceAA="0" compatLnSpc="1">
+                        <a:prstTxWarp prst="textNoShape">
+                          <a:avLst/>
+                        </a:prstTxWarp>
+                        <a:noAutofit/>
+                      </wps:bodyPr>
+                    </wps:wsp>
+                  </a:graphicData>
+                </a:graphic>
+                <wp14:sizeRelH relativeFrom="margin">
+                  <wp14:pctWidth>0</wp14:pctWidth>
+                </wp14:sizeRelH>
+                <wp14:sizeRelV relativeFrom="margin">
+                  <wp14:pctHeight>0</wp14:pctHeight>
+                </wp14:sizeRelV>
+              </wp:anchor>
+            </w:drawing>
+          </mc:Choice>
+          <mc:Fallback>
+            <w:pict>
+              <v:shape w14:anchorId="725B1D9E" id="Arco 58" o:spid="_x0000_s1026" style="position:absolute;margin-left:40.95pt;margin-top:-47.6pt;width:263.25pt;height:202.5pt;rotation:180;z-index:251667456;visibility:visible;mso-wrap-style:square;mso-width-percent:0;mso-height-percent:0;mso-wrap-distance-left:9pt;mso-wrap-distance-top:0;mso-wrap-distance-right:9pt;mso-wrap-distance-bottom:0;mso-position-horizontal:absolute;mso-position-horizontal-relative:text;mso-position-vertical:absolute;mso-position-vertical-relative:text;mso-width-percent:0;mso-height-percent:0;mso-width-relative:margin;mso-height-relative:margin;v-text-anchor:middle" coordsize="3343275,2571750" o:gfxdata="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" path="m2100528,43044nsc2739265,173472,3218153,581118,3322362,1083111l1671638,1285875,2100528,43044xem2100528,43044nfc2739265,173472,3218153,581118,3322362,1083111e" filled="f" strokecolor="red" strokeweight=".5pt">
+                <v:stroke joinstyle="miter"/>
+                <v:path arrowok="t" o:connecttype="custom" o:connectlocs="2100528,43044;3322362,1083111" o:connectangles="0,0"/>
+              </v:shape>
+            </w:pict>
+          </mc:Fallback>
+        </mc:AlternateContent>
+      </w:r>
+      <w:r>
+        <w:rPr>
+          <w:noProof/>
+        </w:rPr>
+        <mc:AlternateContent>
+          <mc:Choice Requires="wps">
+            <w:drawing>
+              <wp:anchor distT="0" distB="0" distL="114300" distR="114300" simplePos="0" relativeHeight="251666432" behindDoc="0" locked="0" layoutInCell="1" allowOverlap="1">
+                <wp:simplePos x="0" y="0"/>
+                <wp:positionH relativeFrom="column">
+                  <wp:posOffset>624839</wp:posOffset>
+                </wp:positionH>
+                <wp:positionV relativeFrom="paragraph">
+                  <wp:posOffset>-575945</wp:posOffset>
+                </wp:positionV>
+                <wp:extent cx="2219325" cy="2143125"/>
+                <wp:effectExtent l="0" t="0" r="0" b="28575"/>
+                <wp:wrapNone/>
+                <wp:docPr id="57" name="Arco 57"/>
+                <wp:cNvGraphicFramePr/>
+                <a:graphic xmlns:a="http://schemas.openxmlformats.org/drawingml/2006/main">
+                  <a:graphicData uri="http://schemas.microsoft.com/office/word/2010/wordprocessingShape">
+                    <wps:wsp>
+                      <wps:cNvSpPr/>
+                      <wps:spPr>
+                        <a:xfrm rot="10800000">
+                          <a:off x="0" y="0"/>
+                          <a:ext cx="2219325" cy="2143125"/>
+                        </a:xfrm>
+                        <a:prstGeom prst="arc">
+                          <a:avLst/>
+                        </a:prstGeom>
+                        <a:ln>
+                          <a:solidFill>
+                            <a:srgbClr val="00B0F0"/>
+                          </a:solidFill>
+                        </a:ln>
+                      </wps:spPr>
+                      <wps:style>
+                        <a:lnRef idx="1">
+                          <a:schemeClr val="accent1"/>
+                        </a:lnRef>
+                        <a:fillRef idx="0">
+                          <a:schemeClr val="accent1"/>
+                        </a:fillRef>
+                        <a:effectRef idx="0">
+                          <a:schemeClr val="accent1"/>
+                        </a:effectRef>
+                        <a:fontRef idx="minor">
+                          <a:schemeClr val="tx1"/>
+                        </a:fontRef>
+                      </wps:style>
+                      <wps:bodyPr rot="0" spcFirstLastPara="0" vertOverflow="overflow" horzOverflow="overflow" vert="horz" wrap="square" lIns="91440" tIns="45720" rIns="91440" bIns="45720" numCol="1" spcCol="0" rtlCol="0" fromWordArt="0" anchor="ctr" anchorCtr="0" forceAA="0" compatLnSpc="1">
+                        <a:prstTxWarp prst="textNoShape">
+                          <a:avLst/>
+                        </a:prstTxWarp>
+                        <a:noAutofit/>
+                      </wps:bodyPr>
+                    </wps:wsp>
+                  </a:graphicData>
+                </a:graphic>
+                <wp14:sizeRelH relativeFrom="margin">
+                  <wp14:pctWidth>0</wp14:pctWidth>
+                </wp14:sizeRelH>
+                <wp14:sizeRelV relativeFrom="margin">
+                  <wp14:pctHeight>0</wp14:pctHeight>
+                </wp14:sizeRelV>
+              </wp:anchor>
+            </w:drawing>
+          </mc:Choice>
+          <mc:Fallback>
+            <w:pict>
+              <v:shape w14:anchorId="48C4F1F5" id="Arco 57" o:spid="_x0000_s1026" style="position:absolute;margin-left:49.2pt;margin-top:-45.35pt;width:174.75pt;height:168.75pt;rotation:180;z-index:251666432;visibility:visible;mso-wrap-style:square;mso-width-percent:0;mso-height-percent:0;mso-wrap-distance-left:9pt;mso-wrap-distance-top:0;mso-wrap-distance-right:9pt;mso-wrap-distance-bottom:0;mso-position-horizontal:absolute;mso-position-horizontal-relative:text;mso-position-vertical:absolute;mso-position-vertical-relative:text;mso-width-percent:0;mso-height-percent:0;mso-width-relative:margin;mso-height-relative:margin;v-text-anchor:middle" coordsize="2219325,2143125" o:gfxdata="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" path="m1109662,nsc1722512,,2219325,479755,2219325,1071563r-1109662,c1109663,714375,1109662,357188,1109662,xem1109662,nfc1722512,,2219325,479755,2219325,1071563e" filled="f" strokecolor="#00b0f0" strokeweight=".5pt">
+                <v:stroke joinstyle="miter"/>
+                <v:path arrowok="t" o:connecttype="custom" o:connectlocs="1109662,0;2219325,1071563" o:connectangles="0,0"/>
+              </v:shape>
+            </w:pict>
+          </mc:Fallback>
+        </mc:AlternateContent>
+      </w:r>
+      <w:r>
+        <w:rPr>
+          <w:noProof/>
+        </w:rPr>
+        <mc:AlternateContent>
+          <mc:Choice Requires="wps">
+            <w:drawing>
+              <wp:anchor distT="0" distB="0" distL="114300" distR="114300" simplePos="0" relativeHeight="251665408" behindDoc="0" locked="0" layoutInCell="1" allowOverlap="1">
+                <wp:simplePos x="0" y="0"/>
+                <wp:positionH relativeFrom="column">
+                  <wp:posOffset>1043940</wp:posOffset>
+                </wp:positionH>
+                <wp:positionV relativeFrom="paragraph">
+                  <wp:posOffset>-366395</wp:posOffset>
+                </wp:positionV>
+                <wp:extent cx="1457325" cy="2114550"/>
+                <wp:effectExtent l="0" t="0" r="0" b="19050"/>
+                <wp:wrapNone/>
+                <wp:docPr id="56" name="Arco 56"/>
+                <wp:cNvGraphicFramePr/>
+                <a:graphic xmlns:a="http://schemas.openxmlformats.org/drawingml/2006/main">
+                  <a:graphicData uri="http://schemas.microsoft.com/office/word/2010/wordprocessingShape">
+                    <wps:wsp>
+                      <wps:cNvSpPr/>
+                      <wps:spPr>
+                        <a:xfrm rot="10800000">
+                          <a:off x="0" y="0"/>
+                          <a:ext cx="1457325" cy="2114550"/>
+                        </a:xfrm>
+                        <a:prstGeom prst="arc">
+                          <a:avLst>
+                            <a:gd name="adj1" fmla="val 16347451"/>
+                            <a:gd name="adj2" fmla="val 101829"/>
+                          </a:avLst>
+                        </a:prstGeom>
+                        <a:ln>
+                          <a:solidFill>
+                            <a:srgbClr val="7030A0"/>
+                          </a:solidFill>
+                        </a:ln>
+                      </wps:spPr>
+                      <wps:style>
+                        <a:lnRef idx="1">
+                          <a:schemeClr val="accent1"/>
+                        </a:lnRef>
+                        <a:fillRef idx="0">
+                          <a:schemeClr val="accent1"/>
+                        </a:fillRef>
+                        <a:effectRef idx="0">
+                          <a:schemeClr val="accent1"/>
+                        </a:effectRef>
+                        <a:fontRef idx="minor">
+                          <a:schemeClr val="tx1"/>
+                        </a:fontRef>
+                      </wps:style>
+                      <wps:bodyPr rot="0" spcFirstLastPara="0" vertOverflow="overflow" horzOverflow="overflow" vert="horz" wrap="square" lIns="91440" tIns="45720" rIns="91440" bIns="45720" numCol="1" spcCol="0" rtlCol="0" fromWordArt="0" anchor="ctr" anchorCtr="0" forceAA="0" compatLnSpc="1">
+                        <a:prstTxWarp prst="textNoShape">
+                          <a:avLst/>
+                        </a:prstTxWarp>
+                        <a:noAutofit/>
+                      </wps:bodyPr>
+                    </wps:wsp>
+                  </a:graphicData>
+                </a:graphic>
+                <wp14:sizeRelH relativeFrom="margin">
+                  <wp14:pctWidth>0</wp14:pctWidth>
+                </wp14:sizeRelH>
+                <wp14:sizeRelV relativeFrom="margin">
+                  <wp14:pctHeight>0</wp14:pctHeight>
+                </wp14:sizeRelV>
+              </wp:anchor>
+            </w:drawing>
+          </mc:Choice>
+          <mc:Fallback>
+            <w:pict>
+              <v:shape w14:anchorId="07FD3B86" id="Arco 56" o:spid="_x0000_s1026" style="position:absolute;margin-left:82.2pt;margin-top:-28.85pt;width:114.75pt;height:166.5pt;rotation:180;z-index:251665408;visibility:visible;mso-wrap-style:square;mso-width-percent:0;mso-height-percent:0;mso-wrap-distance-left:9pt;mso-wrap-distance-top:0;mso-wrap-distance-right:9pt;mso-wrap-distance-bottom:0;mso-position-horizontal:absolute;mso-position-horizontal-relative:text;mso-position-vertical:absolute;mso-position-vertical-relative:text;mso-width-percent:0;mso-height-percent:0;mso-width-relative:margin;mso-height-relative:margin;v-text-anchor:middle" coordsize="1457325,2114550" o:gfxdata="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" path="m773951,2044nsc1163788,37269,1465148,512237,1457174,1078860l728663,1057275,773951,2044xem773951,2044nfc1163788,37269,1465148,512237,1457174,1078860e" filled="f" strokecolor="#7030a0" strokeweight=".5pt">
+                <v:stroke joinstyle="miter"/>
+                <v:path arrowok="t" o:connecttype="custom" o:connectlocs="773951,2044;1457174,1078860" o:connectangles="0,0"/>
+              </v:shape>
+            </w:pict>
+          </mc:Fallback>
+        </mc:AlternateContent>
+      </w:r>
+      <w:r>
+        <w:rPr>
+          <w:noProof/>
+        </w:rPr>
+        <w:t xml:space="preserve">25 – Ainda trabalhando com o “nav a”, inserimos os seguintes comandos: </w:t>
+      </w:r>
+    </w:p>
+    <w:p>
+      <w:pPr>
+        <w:pStyle w:val="PargrafodaLista"/>
+        <w:numPr>
+          <w:ilvl w:val="0"/>
+          <w:numId w:val="1"/>
+        </w:numPr>
+        <w:rPr>
+          <w:noProof/>
+        </w:rPr>
+      </w:pPr>
+      <w:r>
+        <w:rPr>
+          <w:noProof/>
+        </w:rPr>
+        <w:t>Deixamos o texto mais encorpado;</w:t>
+      </w:r>
+    </w:p>
+    <w:p>
+      <w:pPr>
+        <w:pStyle w:val="PargrafodaLista"/>
+        <w:numPr>
+          <w:ilvl w:val="0"/>
+          <w:numId w:val="1"/>
+        </w:numPr>
+        <w:rPr>
+          <w:noProof/>
+        </w:rPr>
+      </w:pPr>
+      <w:r>
+        <w:rPr>
+          <w:noProof/>
+        </w:rPr>
+        <w:t>Aumentamos o tamnho da fonte;</w:t>
+      </w:r>
+    </w:p>
+    <w:p>
+      <w:pPr>
+        <w:pStyle w:val="PargrafodaLista"/>
+        <w:numPr>
+          <w:ilvl w:val="0"/>
+          <w:numId w:val="1"/>
+        </w:numPr>
+        <w:rPr>
+          <w:noProof/>
+        </w:rPr>
+      </w:pPr>
+      <w:r>
+        <w:rPr>
+          <w:noProof/>
+        </w:rPr>
+        <w:t>Tiramos o sublinhado do texto.</w:t>
+      </w:r>
+    </w:p>
+    <w:p>
+      <w:pPr>
+        <w:jc w:val="center"/>
+        <w:rPr>
+          <w:noProof/>
+        </w:rPr>
+      </w:pPr>
+      <w:r>
+        <w:rPr>
+          <w:noProof/>
+        </w:rPr>
+        <w:drawing>
+          <wp:inline distT="0" distB="0" distL="0" distR="0" wp14:anchorId="52443F48" wp14:editId="08130A98">
+            <wp:extent cx="2314898" cy="1228896"/>
+            <wp:effectExtent l="0" t="0" r="9525" b="9525"/>
+            <wp:docPr id="54" name="Imagem 54"/>
+            <wp:cNvGraphicFramePr>
+              <a:graphicFrameLocks xmlns:a="http://schemas.openxmlformats.org/drawingml/2006/main" noChangeAspect="1"/>
+            </wp:cNvGraphicFramePr>
+            <a:graphic xmlns:a="http://schemas.openxmlformats.org/drawingml/2006/main">
+              <a:graphicData uri="http://schemas.openxmlformats.org/drawingml/2006/picture">
+                <pic:pic xmlns:pic="http://schemas.openxmlformats.org/drawingml/2006/picture">
+                  <pic:nvPicPr>
+                    <pic:cNvPr id="1" name=""/>
+                    <pic:cNvPicPr/>
+                  </pic:nvPicPr>
+                  <pic:blipFill>
+                    <a:blip r:embed="rId47"/>
+                    <a:stretch>
+                      <a:fillRect/>
+                    </a:stretch>
+                  </pic:blipFill>
+                  <pic:spPr>
+                    <a:xfrm>
+                      <a:off x="0" y="0"/>
+                      <a:ext cx="2314898" cy="1228896"/>
+                    </a:xfrm>
+                    <a:prstGeom prst="rect">
+                      <a:avLst/>
+                    </a:prstGeom>
+                  </pic:spPr>
+                </pic:pic>
+              </a:graphicData>
+            </a:graphic>
+          </wp:inline>
+        </w:drawing>
+      </w:r>
+    </w:p>
+    <w:p>
+      <w:pPr>
+        <w:rPr>
+          <w:noProof/>
+        </w:rPr>
+      </w:pPr>
+      <w:r>
+        <w:rPr>
+          <w:noProof/>
+        </w:rPr>
+        <w:t>26 – Para melhorar o espaço entre os itens do menu utilizamos o seguinte código:</w:t>
+      </w:r>
+    </w:p>
+    <w:p>
+      <w:pPr>
+        <w:jc w:val="center"/>
+        <w:rPr>
+          <w:noProof/>
+        </w:rPr>
+      </w:pPr>
+      <w:r>
+        <w:rPr>
+          <w:noProof/>
+        </w:rPr>
+        <w:drawing>
+          <wp:inline distT="0" distB="0" distL="0" distR="0" wp14:anchorId="56A4732C" wp14:editId="7DE3463B">
+            <wp:extent cx="3697298" cy="2552700"/>
+            <wp:effectExtent l="0" t="0" r="0" b="0"/>
+            <wp:docPr id="60" name="Imagem 60"/>
+            <wp:cNvGraphicFramePr>
+              <a:graphicFrameLocks xmlns:a="http://schemas.openxmlformats.org/drawingml/2006/main" noChangeAspect="1"/>
+            </wp:cNvGraphicFramePr>
+            <a:graphic xmlns:a="http://schemas.openxmlformats.org/drawingml/2006/main">
+              <a:graphicData uri="http://schemas.openxmlformats.org/drawingml/2006/picture">
+                <pic:pic xmlns:pic="http://schemas.openxmlformats.org/drawingml/2006/picture">
+                  <pic:nvPicPr>
+                    <pic:cNvPr id="1" name=""/>
+                    <pic:cNvPicPr/>
+                  </pic:nvPicPr>
+                  <pic:blipFill>
+                    <a:blip r:embed="rId48"/>
+                    <a:stretch>
+                      <a:fillRect/>
+                    </a:stretch>
+                  </pic:blipFill>
+                  <pic:spPr>
+                    <a:xfrm>
+                      <a:off x="0" y="0"/>
+                      <a:ext cx="3718465" cy="2567314"/>
+                    </a:xfrm>
+                    <a:prstGeom prst="rect">
+                      <a:avLst/>
+                    </a:prstGeom>
+                  </pic:spPr>
+                </pic:pic>
+              </a:graphicData>
+            </a:graphic>
+          </wp:inline>
+        </w:drawing>
+      </w:r>
+      <w:r>
+        <w:rPr>
+          <w:noProof/>
+        </w:rPr>
+        <w:drawing>
+          <wp:inline distT="0" distB="0" distL="0" distR="0" wp14:anchorId="36916D65" wp14:editId="5D4AED04">
+            <wp:extent cx="1800476" cy="714475"/>
+            <wp:effectExtent l="0" t="0" r="0" b="9525"/>
+            <wp:docPr id="59" name="Imagem 59"/>
+            <wp:cNvGraphicFramePr>
+              <a:graphicFrameLocks xmlns:a="http://schemas.openxmlformats.org/drawingml/2006/main" noChangeAspect="1"/>
+            </wp:cNvGraphicFramePr>
+            <a:graphic xmlns:a="http://schemas.openxmlformats.org/drawingml/2006/main">
+              <a:graphicData uri="http://schemas.openxmlformats.org/drawingml/2006/picture">
+                <pic:pic xmlns:pic="http://schemas.openxmlformats.org/drawingml/2006/picture">
+                  <pic:nvPicPr>
+                    <pic:cNvPr id="1" name=""/>
+                    <pic:cNvPicPr/>
+                  </pic:nvPicPr>
+                  <pic:blipFill>
+                    <a:blip r:embed="rId49"/>
+                    <a:stretch>
+                      <a:fillRect/>
+                    </a:stretch>
+                  </pic:blipFill>
+                  <pic:spPr>
+                    <a:xfrm>
+                      <a:off x="0" y="0"/>
+                      <a:ext cx="1800476" cy="714475"/>
+                    </a:xfrm>
+                    <a:prstGeom prst="rect">
+                      <a:avLst/>
+                    </a:prstGeom>
+                  </pic:spPr>
+                </pic:pic>
+              </a:graphicData>
+            </a:graphic>
+          </wp:inline>
+        </w:drawing>
+      </w:r>
+    </w:p>
+    <w:p>
+      <w:r>
+        <w:rPr>
+          <w:noProof/>
+        </w:rPr>
+        <w:t xml:space="preserve">27 </w:t>
+      </w:r>
+      <w:r>
+        <w:rPr>
+          <w:noProof/>
+        </w:rPr>
+        <w:t>–</w:t>
+      </w:r>
+      <w:r>
+        <w:rPr>
+          <w:noProof/>
+        </w:rPr>
+        <w:t xml:space="preserve"> </w:t>
+      </w:r>
+      <w:r>
+        <w:rPr>
+          <w:noProof/>
+        </w:rPr>
+        <w:t>Para resetar o css do navegador utilizamos o “reset.css”, onde retiramos do seguinte site:</w:t>
+      </w:r>
+      <w:r>
+        <w:t xml:space="preserve"> </w:t>
+      </w:r>
+      <w:hyperlink r:id="rId50" w:history="1">
+        <w:r>
+          <w:rPr>
+            <w:rStyle w:val="Hyperlink"/>
+          </w:rPr>
+          <w:t xml:space="preserve">CSS Tools: Reset </w:t>
+        </w:r>
+        <w:proofErr w:type="spellStart"/>
+        <w:r>
+          <w:rPr>
+            <w:rStyle w:val="Hyperlink"/>
+          </w:rPr>
+          <w:t>CSS</w:t>
+        </w:r>
+      </w:hyperlink>
+      <w:r>
+        <w:t>.</w:t>
+      </w:r>
+      <w:r>
+        <w:rPr>
+          <w:noProof/>
+        </w:rPr>
+        <w:t>Criamos</w:t>
+      </w:r>
+      <w:proofErr w:type="spellEnd"/>
+      <w:r>
+        <w:rPr>
+          <w:noProof/>
+        </w:rPr>
+        <w:t xml:space="preserve"> um arquivo chamado reset.css e, adicionamos ao nosso site. E ele retirou todo o css do navegador, deixando apenas o nosso css.</w:t>
+      </w:r>
+      <w:r>
+        <w:rPr>
+          <w:noProof/>
+        </w:rPr>
+        <w:t xml:space="preserve"> </w:t>
+      </w:r>
+    </w:p>
+    <w:p>
+      <w:pPr>
+        <w:jc w:val="center"/>
+        <w:rPr>
+          <w:noProof/>
+        </w:rPr>
+      </w:pPr>
+      <w:r>
+        <w:rPr>
+          <w:noProof/>
+        </w:rPr>
+        <w:drawing>
+          <wp:inline distT="0" distB="0" distL="0" distR="0" wp14:anchorId="34ABA366" wp14:editId="37A85E8A">
+            <wp:extent cx="1371785" cy="1704975"/>
+            <wp:effectExtent l="0" t="0" r="0" b="0"/>
+            <wp:docPr id="62" name="Imagem 62"/>
+            <wp:cNvGraphicFramePr>
+              <a:graphicFrameLocks xmlns:a="http://schemas.openxmlformats.org/drawingml/2006/main" noChangeAspect="1"/>
+            </wp:cNvGraphicFramePr>
+            <a:graphic xmlns:a="http://schemas.openxmlformats.org/drawingml/2006/main">
+              <a:graphicData uri="http://schemas.openxmlformats.org/drawingml/2006/picture">
+                <pic:pic xmlns:pic="http://schemas.openxmlformats.org/drawingml/2006/picture">
+                  <pic:nvPicPr>
+                    <pic:cNvPr id="1" name=""/>
+                    <pic:cNvPicPr/>
+                  </pic:nvPicPr>
+                  <pic:blipFill>
+                    <a:blip r:embed="rId51"/>
+                    <a:stretch>
+                      <a:fillRect/>
+                    </a:stretch>
+                  </pic:blipFill>
+                  <pic:spPr>
+                    <a:xfrm>
+                      <a:off x="0" y="0"/>
+                      <a:ext cx="1376223" cy="1710490"/>
+                    </a:xfrm>
+                    <a:prstGeom prst="rect">
+                      <a:avLst/>
+                    </a:prstGeom>
+                  </pic:spPr>
+                </pic:pic>
+              </a:graphicData>
+            </a:graphic>
+          </wp:inline>
+        </w:drawing>
+      </w:r>
+      <w:r>
+        <w:rPr>
+          <w:noProof/>
+        </w:rPr>
+        <w:drawing>
+          <wp:inline distT="0" distB="0" distL="0" distR="0" wp14:anchorId="66451D61" wp14:editId="0484EEC7">
+            <wp:extent cx="2609850" cy="568373"/>
+            <wp:effectExtent l="0" t="0" r="0" b="3175"/>
+            <wp:docPr id="63" name="Imagem 63"/>
+            <wp:cNvGraphicFramePr>
+              <a:graphicFrameLocks xmlns:a="http://schemas.openxmlformats.org/drawingml/2006/main" noChangeAspect="1"/>
+            </wp:cNvGraphicFramePr>
+            <a:graphic xmlns:a="http://schemas.openxmlformats.org/drawingml/2006/main">
+              <a:graphicData uri="http://schemas.openxmlformats.org/drawingml/2006/picture">
+                <pic:pic xmlns:pic="http://schemas.openxmlformats.org/drawingml/2006/picture">
+                  <pic:nvPicPr>
+                    <pic:cNvPr id="1" name=""/>
+                    <pic:cNvPicPr/>
+                  </pic:nvPicPr>
+                  <pic:blipFill>
+                    <a:blip r:embed="rId52"/>
+                    <a:stretch>
+                      <a:fillRect/>
+                    </a:stretch>
+                  </pic:blipFill>
+                  <pic:spPr>
+                    <a:xfrm>
+                      <a:off x="0" y="0"/>
+                      <a:ext cx="2664791" cy="580338"/>
+                    </a:xfrm>
+                    <a:prstGeom prst="rect">
+                      <a:avLst/>
+                    </a:prstGeom>
+                  </pic:spPr>
+                </pic:pic>
+              </a:graphicData>
+            </a:graphic>
+          </wp:inline>
+        </w:drawing>
+      </w:r>
+    </w:p>
+    <w:p>
+      <w:pPr>
+        <w:rPr>
+          <w:noProof/>
+        </w:rPr>
+      </w:pPr>
+      <w:r>
+        <w:rPr>
+          <w:noProof/>
+        </w:rPr>
+        <w:t>Obs: O reset sempre tem que ficar em cima do nosso css senão ele ira resetar o css que estamos trabalhando em nossa página.</w:t>
+      </w:r>
+    </w:p>
+    <w:p>
+      <w:pPr>
+        <w:rPr>
+          <w:noProof/>
+          <w:u w:val="single"/>
+        </w:rPr>
+      </w:pPr>
+      <w:r>
+        <w:rPr>
+          <w:noProof/>
+        </w:rPr>
+        <w:lastRenderedPageBreak/>
+        <w:t xml:space="preserve">28 - </w:t>
       </w:r>
       <w:bookmarkStart w:id="0" w:name="_GoBack"/>
       <w:bookmarkEnd w:id="0"/>
+    </w:p>
+    <w:p>
+      <w:pPr>
+        <w:jc w:val="center"/>
+        <w:rPr>
+          <w:noProof/>
+        </w:rPr>
+      </w:pPr>
+    </w:p>
+    <w:p>
+      <w:pPr>
+        <w:jc w:val="center"/>
+        <w:rPr>
+          <w:noProof/>
+        </w:rPr>
+      </w:pPr>
+    </w:p>
+    <w:p>
+      <w:pPr>
+        <w:rPr>
+          <w:noProof/>
+        </w:rPr>
+      </w:pPr>
+    </w:p>
+    <w:p>
+      <w:pPr>
+        <w:pStyle w:val="PargrafodaLista"/>
+        <w:rPr>
+          <w:noProof/>
+        </w:rPr>
+      </w:pPr>
+    </w:p>
+    <w:p>
+      <w:pPr>
+        <w:rPr>
+          <w:noProof/>
+        </w:rPr>
+      </w:pPr>
     </w:p>
     <w:p>
       <w:pPr>
@@ -3208,4 +4676,16 @@
     </a:ext>
   </a:extLst>
 </a:theme>
+</file>
+
+<file path=customXml/item1.xml><?xml version="1.0" encoding="utf-8"?>
+<b:Sources xmlns:b="http://schemas.openxmlformats.org/officeDocument/2006/bibliography" xmlns="http://schemas.openxmlformats.org/officeDocument/2006/bibliography" SelectedStyle="\APASixthEditionOfficeOnline.xsl" StyleName="APA" Version="6"/>
+</file>
+
+<file path=customXml/itemProps1.xml><?xml version="1.0" encoding="utf-8"?>
+<ds:datastoreItem xmlns:ds="http://schemas.openxmlformats.org/officeDocument/2006/customXml" ds:itemID="{FF45A729-79B5-4045-AD4A-E541324805E7}">
+  <ds:schemaRefs>
+    <ds:schemaRef ds:uri="http://schemas.openxmlformats.org/officeDocument/2006/bibliography"/>
+  </ds:schemaRefs>
+</ds:datastoreItem>
 </file>
</xml_diff>

<commit_message>
terminamos o menu e começamos o main
</commit_message>
<xml_diff>
--- a/Apostila/Projeto Space For Men.docx
+++ b/Apostila/Projeto Space For Men.docx
@@ -2,6 +2,46 @@
 <file path=word/document.xml><?xml version="1.0" encoding="utf-8"?>
 <w:document xmlns:wpc="http://schemas.microsoft.com/office/word/2010/wordprocessingCanvas" xmlns:cx="http://schemas.microsoft.com/office/drawing/2014/chartex" xmlns:cx1="http://schemas.microsoft.com/office/drawing/2015/9/8/chartex" xmlns:cx2="http://schemas.microsoft.com/office/drawing/2015/10/21/chartex" xmlns:cx3="http://schemas.microsoft.com/office/drawing/2016/5/9/chartex" xmlns:cx4="http://schemas.microsoft.com/office/drawing/2016/5/10/chartex" xmlns:cx5="http://schemas.microsoft.com/office/drawing/2016/5/11/chartex" xmlns:cx6="http://schemas.microsoft.com/office/drawing/2016/5/12/chartex" xmlns:cx7="http://schemas.microsoft.com/office/drawing/2016/5/13/chartex" xmlns:cx8="http://schemas.microsoft.com/office/drawing/2016/5/14/chartex" xmlns:mc="http://schemas.openxmlformats.org/markup-compatibility/2006" xmlns:aink="http://schemas.microsoft.com/office/drawing/2016/ink" xmlns:am3d="http://schemas.microsoft.com/office/drawing/2017/model3d" xmlns:o="urn:schemas-microsoft-com:office:office" xmlns:r="http://schemas.openxmlformats.org/officeDocument/2006/relationships" xmlns:m="http://schemas.openxmlformats.org/officeDocument/2006/math" xmlns:v="urn:schemas-microsoft-com:vml" xmlns:wp14="http://schemas.microsoft.com/office/word/2010/wordprocessingDrawing" xmlns:wp="http://schemas.openxmlformats.org/drawingml/2006/wordprocessingDrawing" xmlns:w10="urn:schemas-microsoft-com:office:word" xmlns:w="http://schemas.openxmlformats.org/wordprocessingml/2006/main" xmlns:w14="http://schemas.microsoft.com/office/word/2010/wordml" xmlns:w15="http://schemas.microsoft.com/office/word/2012/wordml" xmlns:w16cid="http://schemas.microsoft.com/office/word/2016/wordml/cid" xmlns:w16se="http://schemas.microsoft.com/office/word/2015/wordml/symex" xmlns:wpg="http://schemas.microsoft.com/office/word/2010/wordprocessingGroup" xmlns:wpi="http://schemas.microsoft.com/office/word/2010/wordprocessingInk" xmlns:wne="http://schemas.microsoft.com/office/word/2006/wordml" xmlns:wps="http://schemas.microsoft.com/office/word/2010/wordprocessingShape" mc:Ignorable="w14 w15 w16se w16cid wp14">
   <w:body>
+    <w:p>
+      <w:pPr>
+        <w:jc w:val="center"/>
+      </w:pPr>
+    </w:p>
+    <w:p>
+      <w:pPr>
+        <w:jc w:val="center"/>
+      </w:pPr>
+    </w:p>
+    <w:p>
+      <w:pPr>
+        <w:jc w:val="center"/>
+      </w:pPr>
+    </w:p>
+    <w:p>
+      <w:pPr>
+        <w:jc w:val="center"/>
+      </w:pPr>
+    </w:p>
+    <w:p>
+      <w:pPr>
+        <w:jc w:val="center"/>
+      </w:pPr>
+    </w:p>
+    <w:p>
+      <w:pPr>
+        <w:jc w:val="center"/>
+      </w:pPr>
+    </w:p>
+    <w:p>
+      <w:pPr>
+        <w:jc w:val="center"/>
+      </w:pPr>
+    </w:p>
+    <w:p>
+      <w:pPr>
+        <w:jc w:val="center"/>
+      </w:pPr>
+    </w:p>
     <w:p>
       <w:pPr>
         <w:jc w:val="center"/>
@@ -360,6 +400,7 @@
     </w:p>
     <w:p>
       <w:r>
+        <w:lastRenderedPageBreak/>
         <w:t xml:space="preserve">4 – Colocamos a cor vermelha utilizando o </w:t>
       </w:r>
       <w:proofErr w:type="spellStart"/>
@@ -565,7 +606,6 @@
         <w:rPr>
           <w:noProof/>
         </w:rPr>
-        <w:lastRenderedPageBreak/>
         <w:t>6 – No css centralizamos o nosso titulo h1:</w:t>
       </w:r>
       <w:r>
@@ -981,6 +1021,7 @@
         <w:rPr>
           <w:noProof/>
         </w:rPr>
+        <w:lastRenderedPageBreak/>
         <w:t>E deixamos o fundo dessa divisão com a cor branca.</w:t>
       </w:r>
       <w:r>
@@ -1093,7 +1134,6 @@
         <w:rPr>
           <w:noProof/>
         </w:rPr>
-        <w:lastRenderedPageBreak/>
         <w:t>11 – A segunda div sendo acima do segundo título “benefícios” e fechando abaixo da última lista não-ordenada.</w:t>
       </w:r>
     </w:p>
@@ -1346,6 +1386,7 @@
         <w:rPr>
           <w:noProof/>
         </w:rPr>
+        <w:lastRenderedPageBreak/>
         <w:drawing>
           <wp:inline distT="0" distB="0" distL="0" distR="0" wp14:anchorId="6C6DA4EB" wp14:editId="1BB393F4">
             <wp:extent cx="4819650" cy="2692634"/>
@@ -1433,7 +1474,6 @@
         <w:rPr>
           <w:noProof/>
         </w:rPr>
-        <w:lastRenderedPageBreak/>
         <w:t xml:space="preserve">14 – Para alinhar a lista ao topo da imagem utilizamos o seguinte </w:t>
       </w:r>
       <w:r>
@@ -1454,8 +1494,8 @@
         </w:rPr>
         <w:drawing>
           <wp:inline distT="0" distB="0" distL="0" distR="0" wp14:anchorId="1795DBB3" wp14:editId="6C8369E0">
-            <wp:extent cx="5400040" cy="2979420"/>
-            <wp:effectExtent l="0" t="0" r="0" b="0"/>
+            <wp:extent cx="3884301" cy="2143125"/>
+            <wp:effectExtent l="0" t="0" r="1905" b="0"/>
             <wp:docPr id="31" name="Imagem 31"/>
             <wp:cNvGraphicFramePr>
               <a:graphicFrameLocks xmlns:a="http://schemas.openxmlformats.org/drawingml/2006/main" noChangeAspect="1"/>
@@ -1476,7 +1516,7 @@
                   <pic:spPr>
                     <a:xfrm>
                       <a:off x="0" y="0"/>
-                      <a:ext cx="5400040" cy="2979420"/>
+                      <a:ext cx="3897688" cy="2150511"/>
                     </a:xfrm>
                     <a:prstGeom prst="rect">
                       <a:avLst/>
@@ -1763,13 +1803,22 @@
         </w:rPr>
         <w:t xml:space="preserve"> </w:t>
       </w:r>
-      <w:r>
-        <w:rPr>
-          <w:noProof/>
-        </w:rPr>
+    </w:p>
+    <w:p>
+      <w:pPr>
+        <w:jc w:val="center"/>
+        <w:rPr>
+          <w:noProof/>
+        </w:rPr>
+      </w:pPr>
+      <w:r>
+        <w:rPr>
+          <w:noProof/>
+        </w:rPr>
+        <w:lastRenderedPageBreak/>
         <w:drawing>
           <wp:inline distT="0" distB="0" distL="0" distR="0" wp14:anchorId="512E0C87" wp14:editId="11ED7C38">
-            <wp:extent cx="5626452" cy="2114550"/>
+            <wp:extent cx="3905250" cy="1467683"/>
             <wp:effectExtent l="0" t="0" r="0" b="0"/>
             <wp:docPr id="33" name="Imagem 33"/>
             <wp:cNvGraphicFramePr>
@@ -1791,7 +1840,7 @@
                   <pic:spPr>
                     <a:xfrm>
                       <a:off x="0" y="0"/>
-                      <a:ext cx="5635754" cy="2118046"/>
+                      <a:ext cx="3935363" cy="1479000"/>
                     </a:xfrm>
                     <a:prstGeom prst="rect">
                       <a:avLst/>
@@ -1915,7 +1964,6 @@
         <w:rPr>
           <w:noProof/>
         </w:rPr>
-        <w:lastRenderedPageBreak/>
         <w:t>17 – Na div principal inderimos um espaço interno tanto para cima, direita, baixo e esquerda</w:t>
       </w:r>
       <w:r>
@@ -2124,8 +2172,8 @@
         </w:rPr>
         <w:drawing>
           <wp:inline distT="0" distB="0" distL="0" distR="0" wp14:anchorId="07E278DA" wp14:editId="0ECF6217">
-            <wp:extent cx="1743318" cy="485843"/>
-            <wp:effectExtent l="0" t="0" r="0" b="9525"/>
+            <wp:extent cx="1435473" cy="400050"/>
+            <wp:effectExtent l="0" t="0" r="0" b="0"/>
             <wp:docPr id="46" name="Imagem 46"/>
             <wp:cNvGraphicFramePr>
               <a:graphicFrameLocks xmlns:a="http://schemas.openxmlformats.org/drawingml/2006/main" noChangeAspect="1"/>
@@ -2146,7 +2194,7 @@
                   <pic:spPr>
                     <a:xfrm>
                       <a:off x="0" y="0"/>
-                      <a:ext cx="1743318" cy="485843"/>
+                      <a:ext cx="1439788" cy="401253"/>
                     </a:xfrm>
                     <a:prstGeom prst="rect">
                       <a:avLst/>
@@ -2164,8 +2212,8 @@
         </w:rPr>
         <w:drawing>
           <wp:inline distT="0" distB="0" distL="0" distR="0" wp14:anchorId="18E936A8" wp14:editId="17DC2EB4">
-            <wp:extent cx="3543795" cy="257211"/>
-            <wp:effectExtent l="0" t="0" r="0" b="9525"/>
+            <wp:extent cx="3133725" cy="227448"/>
+            <wp:effectExtent l="0" t="0" r="0" b="1270"/>
             <wp:docPr id="48" name="Imagem 48"/>
             <wp:cNvGraphicFramePr>
               <a:graphicFrameLocks xmlns:a="http://schemas.openxmlformats.org/drawingml/2006/main" noChangeAspect="1"/>
@@ -2186,7 +2234,7 @@
                   <pic:spPr>
                     <a:xfrm>
                       <a:off x="0" y="0"/>
-                      <a:ext cx="3543795" cy="257211"/>
+                      <a:ext cx="3242846" cy="235368"/>
                     </a:xfrm>
                     <a:prstGeom prst="rect">
                       <a:avLst/>
@@ -2204,7 +2252,7 @@
         </w:rPr>
         <w:drawing>
           <wp:inline distT="0" distB="0" distL="0" distR="0" wp14:anchorId="47D080B7" wp14:editId="3ED7064D">
-            <wp:extent cx="5400040" cy="228600"/>
+            <wp:extent cx="4581525" cy="193950"/>
             <wp:effectExtent l="0" t="0" r="0" b="0"/>
             <wp:docPr id="47" name="Imagem 47"/>
             <wp:cNvGraphicFramePr>
@@ -2226,7 +2274,7 @@
                   <pic:spPr>
                     <a:xfrm>
                       <a:off x="0" y="0"/>
-                      <a:ext cx="5400040" cy="228600"/>
+                      <a:ext cx="4945587" cy="209362"/>
                     </a:xfrm>
                     <a:prstGeom prst="rect">
                       <a:avLst/>
@@ -2293,10 +2341,11 @@
         <w:rPr>
           <w:noProof/>
         </w:rPr>
+        <w:lastRenderedPageBreak/>
         <w:drawing>
           <wp:inline distT="0" distB="0" distL="0" distR="0" wp14:anchorId="136F294C" wp14:editId="2A900873">
-            <wp:extent cx="4467225" cy="856779"/>
-            <wp:effectExtent l="0" t="0" r="0" b="635"/>
+            <wp:extent cx="3162300" cy="606504"/>
+            <wp:effectExtent l="0" t="0" r="0" b="3175"/>
             <wp:docPr id="17" name="Imagem 17"/>
             <wp:cNvGraphicFramePr>
               <a:graphicFrameLocks xmlns:a="http://schemas.openxmlformats.org/drawingml/2006/main" noChangeAspect="1"/>
@@ -2317,7 +2366,7 @@
                   <pic:spPr>
                     <a:xfrm>
                       <a:off x="0" y="0"/>
-                      <a:ext cx="4559384" cy="874454"/>
+                      <a:ext cx="3333362" cy="639312"/>
                     </a:xfrm>
                     <a:prstGeom prst="rect">
                       <a:avLst/>
@@ -2335,8 +2384,8 @@
         </w:rPr>
         <w:drawing>
           <wp:inline distT="0" distB="0" distL="0" distR="0" wp14:anchorId="43E19985" wp14:editId="53D02411">
-            <wp:extent cx="1304544" cy="1219200"/>
-            <wp:effectExtent l="0" t="0" r="0" b="0"/>
+            <wp:extent cx="1121093" cy="1047750"/>
+            <wp:effectExtent l="0" t="0" r="3175" b="0"/>
             <wp:docPr id="16" name="Imagem 16"/>
             <wp:cNvGraphicFramePr>
               <a:graphicFrameLocks xmlns:a="http://schemas.openxmlformats.org/drawingml/2006/main" noChangeAspect="1"/>
@@ -2357,7 +2406,7 @@
                   <pic:spPr>
                     <a:xfrm>
                       <a:off x="0" y="0"/>
-                      <a:ext cx="1317440" cy="1231252"/>
+                      <a:ext cx="1136788" cy="1062419"/>
                     </a:xfrm>
                     <a:prstGeom prst="rect">
                       <a:avLst/>
@@ -2412,8 +2461,8 @@
         </w:rPr>
         <w:drawing>
           <wp:inline distT="0" distB="0" distL="0" distR="0" wp14:anchorId="2B1B0049" wp14:editId="419D80B7">
-            <wp:extent cx="3209925" cy="1270935"/>
-            <wp:effectExtent l="0" t="0" r="0" b="5715"/>
+            <wp:extent cx="2790825" cy="1104997"/>
+            <wp:effectExtent l="0" t="0" r="0" b="0"/>
             <wp:docPr id="22" name="Imagem 22"/>
             <wp:cNvGraphicFramePr>
               <a:graphicFrameLocks xmlns:a="http://schemas.openxmlformats.org/drawingml/2006/main" noChangeAspect="1"/>
@@ -2434,7 +2483,7 @@
                   <pic:spPr>
                     <a:xfrm>
                       <a:off x="0" y="0"/>
-                      <a:ext cx="3284161" cy="1300328"/>
+                      <a:ext cx="2871867" cy="1137085"/>
                     </a:xfrm>
                     <a:prstGeom prst="rect">
                       <a:avLst/>
@@ -2457,7 +2506,6 @@
         <w:rPr>
           <w:noProof/>
         </w:rPr>
-        <w:lastRenderedPageBreak/>
         <w:t xml:space="preserve">21 </w:t>
       </w:r>
       <w:r>
@@ -2491,8 +2539,8 @@
         </w:rPr>
         <w:drawing>
           <wp:inline distT="0" distB="0" distL="0" distR="0" wp14:anchorId="670F65F9" wp14:editId="54C7EC9B">
-            <wp:extent cx="2200275" cy="1181469"/>
-            <wp:effectExtent l="0" t="0" r="0" b="0"/>
+            <wp:extent cx="1628775" cy="874594"/>
+            <wp:effectExtent l="0" t="0" r="0" b="1905"/>
             <wp:docPr id="36" name="Imagem 36"/>
             <wp:cNvGraphicFramePr>
               <a:graphicFrameLocks xmlns:a="http://schemas.openxmlformats.org/drawingml/2006/main" noChangeAspect="1"/>
@@ -2513,7 +2561,7 @@
                   <pic:spPr>
                     <a:xfrm>
                       <a:off x="0" y="0"/>
-                      <a:ext cx="2215027" cy="1189390"/>
+                      <a:ext cx="1657206" cy="889860"/>
                     </a:xfrm>
                     <a:prstGeom prst="rect">
                       <a:avLst/>
@@ -2531,8 +2579,8 @@
         </w:rPr>
         <w:drawing>
           <wp:inline distT="0" distB="0" distL="0" distR="0" wp14:anchorId="345B4371" wp14:editId="4258EFA0">
-            <wp:extent cx="2581275" cy="551794"/>
-            <wp:effectExtent l="0" t="0" r="0" b="1270"/>
+            <wp:extent cx="2257425" cy="482565"/>
+            <wp:effectExtent l="0" t="0" r="0" b="0"/>
             <wp:docPr id="27" name="Imagem 27"/>
             <wp:cNvGraphicFramePr>
               <a:graphicFrameLocks xmlns:a="http://schemas.openxmlformats.org/drawingml/2006/main" noChangeAspect="1"/>
@@ -2553,7 +2601,7 @@
                   <pic:spPr>
                     <a:xfrm>
                       <a:off x="0" y="0"/>
-                      <a:ext cx="2585022" cy="552595"/>
+                      <a:ext cx="2281905" cy="487798"/>
                     </a:xfrm>
                     <a:prstGeom prst="rect">
                       <a:avLst/>
@@ -2834,7 +2882,6 @@
     </w:p>
     <w:p>
       <w:pPr>
-        <w:jc w:val="center"/>
         <w:rPr>
           <w:noProof/>
         </w:rPr>
@@ -2844,10 +2891,10 @@
           <w:noProof/>
         </w:rPr>
         <w:drawing>
-          <wp:inline distT="0" distB="0" distL="0" distR="0" wp14:anchorId="388B4677" wp14:editId="521B1FFE">
-            <wp:extent cx="1964416" cy="1990725"/>
-            <wp:effectExtent l="0" t="0" r="0" b="0"/>
-            <wp:docPr id="49" name="Imagem 49"/>
+          <wp:inline distT="0" distB="0" distL="0" distR="0" wp14:anchorId="0CA1B4A7" wp14:editId="329C18C0">
+            <wp:extent cx="1648055" cy="562053"/>
+            <wp:effectExtent l="0" t="0" r="9525" b="9525"/>
+            <wp:docPr id="42" name="Imagem 42"/>
             <wp:cNvGraphicFramePr>
               <a:graphicFrameLocks xmlns:a="http://schemas.openxmlformats.org/drawingml/2006/main" noChangeAspect="1"/>
             </wp:cNvGraphicFramePr>
@@ -2867,7 +2914,7 @@
                   <pic:spPr>
                     <a:xfrm>
                       <a:off x="0" y="0"/>
-                      <a:ext cx="1967316" cy="1993663"/>
+                      <a:ext cx="1648055" cy="562053"/>
                     </a:xfrm>
                     <a:prstGeom prst="rect">
                       <a:avLst/>
@@ -2884,10 +2931,10 @@
           <w:noProof/>
         </w:rPr>
         <w:drawing>
-          <wp:inline distT="0" distB="0" distL="0" distR="0" wp14:anchorId="6BE8D055" wp14:editId="5D8D376D">
-            <wp:extent cx="1648055" cy="562053"/>
-            <wp:effectExtent l="0" t="0" r="9525" b="9525"/>
-            <wp:docPr id="42" name="Imagem 42"/>
+          <wp:inline distT="0" distB="0" distL="0" distR="0" wp14:anchorId="3D6CAA14" wp14:editId="0CC5944A">
+            <wp:extent cx="911716" cy="923925"/>
+            <wp:effectExtent l="0" t="0" r="3175" b="0"/>
+            <wp:docPr id="49" name="Imagem 49"/>
             <wp:cNvGraphicFramePr>
               <a:graphicFrameLocks xmlns:a="http://schemas.openxmlformats.org/drawingml/2006/main" noChangeAspect="1"/>
             </wp:cNvGraphicFramePr>
@@ -2907,7 +2954,7 @@
                   <pic:spPr>
                     <a:xfrm>
                       <a:off x="0" y="0"/>
-                      <a:ext cx="1648055" cy="562053"/>
+                      <a:ext cx="931302" cy="943773"/>
                     </a:xfrm>
                     <a:prstGeom prst="rect">
                       <a:avLst/>
@@ -2926,6 +2973,21 @@
           <w:noProof/>
         </w:rPr>
       </w:pPr>
+    </w:p>
+    <w:p>
+      <w:pPr>
+        <w:jc w:val="center"/>
+        <w:rPr>
+          <w:noProof/>
+        </w:rPr>
+      </w:pPr>
+    </w:p>
+    <w:p>
+      <w:pPr>
+        <w:rPr>
+          <w:noProof/>
+        </w:rPr>
+      </w:pPr>
       <w:r>
         <w:rPr>
           <w:noProof/>
@@ -2961,6 +3023,7 @@
         <w:rPr>
           <w:noProof/>
         </w:rPr>
+        <w:lastRenderedPageBreak/>
         <w:drawing>
           <wp:inline distT="0" distB="0" distL="0" distR="0" wp14:anchorId="639557F7" wp14:editId="7ECB714A">
             <wp:extent cx="2381582" cy="714475"/>
@@ -3004,53 +3067,10 @@
           <w:noProof/>
         </w:rPr>
       </w:pPr>
-    </w:p>
-    <w:p>
-      <w:pPr>
-        <w:rPr>
-          <w:noProof/>
-        </w:rPr>
-      </w:pPr>
-    </w:p>
-    <w:p>
-      <w:pPr>
-        <w:rPr>
-          <w:noProof/>
-        </w:rPr>
-      </w:pPr>
-    </w:p>
-    <w:p>
-      <w:pPr>
-        <w:rPr>
-          <w:noProof/>
-        </w:rPr>
-      </w:pPr>
-    </w:p>
-    <w:p>
-      <w:pPr>
-        <w:rPr>
-          <w:noProof/>
-        </w:rPr>
-      </w:pPr>
-    </w:p>
-    <w:p>
-      <w:pPr>
-        <w:rPr>
-          <w:noProof/>
-        </w:rPr>
-      </w:pPr>
-    </w:p>
-    <w:p>
-      <w:pPr>
-        <w:rPr>
-          <w:noProof/>
-        </w:rPr>
-      </w:pPr>
-      <w:r>
-        <w:rPr>
-          <w:noProof/>
-        </w:rPr>
-        <w:lastRenderedPageBreak/>
+      <w:r>
+        <w:rPr>
+          <w:noProof/>
+        </w:rPr>
         <mc:AlternateContent>
           <mc:Choice Requires="wps">
             <w:drawing>
@@ -3333,7 +3353,19 @@
         <w:rPr>
           <w:noProof/>
         </w:rPr>
-        <w:t>Aumentamos o tamnho da fonte;</w:t>
+        <w:t>Aumentamos o tam</w:t>
+      </w:r>
+      <w:r>
+        <w:rPr>
+          <w:noProof/>
+        </w:rPr>
+        <w:t>a</w:t>
+      </w:r>
+      <w:r>
+        <w:rPr>
+          <w:noProof/>
+        </w:rPr>
+        <w:t>nho da fonte;</w:t>
       </w:r>
     </w:p>
     <w:p>
@@ -3414,21 +3446,19 @@
         </w:rPr>
         <w:t>26 – Para melhorar o espaço entre os itens do menu utilizamos o seguinte código:</w:t>
       </w:r>
-    </w:p>
-    <w:p>
-      <w:pPr>
-        <w:jc w:val="center"/>
-        <w:rPr>
-          <w:noProof/>
-        </w:rPr>
-      </w:pPr>
+      <w:r>
+        <w:rPr>
+          <w:noProof/>
+        </w:rPr>
+        <w:t xml:space="preserve"> </w:t>
+      </w:r>
       <w:r>
         <w:rPr>
           <w:noProof/>
         </w:rPr>
         <w:drawing>
-          <wp:inline distT="0" distB="0" distL="0" distR="0" wp14:anchorId="56A4732C" wp14:editId="7DE3463B">
-            <wp:extent cx="3697298" cy="2552700"/>
+          <wp:inline distT="0" distB="0" distL="0" distR="0" wp14:anchorId="2EC3E5E6" wp14:editId="2C577A4E">
+            <wp:extent cx="1738282" cy="1200150"/>
             <wp:effectExtent l="0" t="0" r="0" b="0"/>
             <wp:docPr id="60" name="Imagem 60"/>
             <wp:cNvGraphicFramePr>
@@ -3450,7 +3480,7 @@
                   <pic:spPr>
                     <a:xfrm>
                       <a:off x="0" y="0"/>
-                      <a:ext cx="3718465" cy="2567314"/>
+                      <a:ext cx="1767686" cy="1220451"/>
                     </a:xfrm>
                     <a:prstGeom prst="rect">
                       <a:avLst/>
@@ -3467,9 +3497,9 @@
           <w:noProof/>
         </w:rPr>
         <w:drawing>
-          <wp:inline distT="0" distB="0" distL="0" distR="0" wp14:anchorId="36916D65" wp14:editId="5D4AED04">
-            <wp:extent cx="1800476" cy="714475"/>
-            <wp:effectExtent l="0" t="0" r="0" b="9525"/>
+          <wp:inline distT="0" distB="0" distL="0" distR="0" wp14:anchorId="76F5D4CD" wp14:editId="4FF1B5EE">
+            <wp:extent cx="1362075" cy="540506"/>
+            <wp:effectExtent l="0" t="0" r="0" b="0"/>
             <wp:docPr id="59" name="Imagem 59"/>
             <wp:cNvGraphicFramePr>
               <a:graphicFrameLocks xmlns:a="http://schemas.openxmlformats.org/drawingml/2006/main" noChangeAspect="1"/>
@@ -3490,7 +3520,7 @@
                   <pic:spPr>
                     <a:xfrm>
                       <a:off x="0" y="0"/>
-                      <a:ext cx="1800476" cy="714475"/>
+                      <a:ext cx="1377037" cy="546443"/>
                     </a:xfrm>
                     <a:prstGeom prst="rect">
                       <a:avLst/>
@@ -3502,6 +3532,21 @@
           </wp:inline>
         </w:drawing>
       </w:r>
+    </w:p>
+    <w:p>
+      <w:pPr>
+        <w:rPr>
+          <w:noProof/>
+        </w:rPr>
+      </w:pPr>
+    </w:p>
+    <w:p>
+      <w:pPr>
+        <w:jc w:val="center"/>
+        <w:rPr>
+          <w:noProof/>
+        </w:rPr>
+      </w:pPr>
     </w:p>
     <w:p>
       <w:r>
@@ -3582,8 +3627,8 @@
         </w:rPr>
         <w:drawing>
           <wp:inline distT="0" distB="0" distL="0" distR="0" wp14:anchorId="34ABA366" wp14:editId="37A85E8A">
-            <wp:extent cx="1371785" cy="1704975"/>
-            <wp:effectExtent l="0" t="0" r="0" b="0"/>
+            <wp:extent cx="1862257" cy="2314575"/>
+            <wp:effectExtent l="0" t="0" r="5080" b="0"/>
             <wp:docPr id="62" name="Imagem 62"/>
             <wp:cNvGraphicFramePr>
               <a:graphicFrameLocks xmlns:a="http://schemas.openxmlformats.org/drawingml/2006/main" noChangeAspect="1"/>
@@ -3604,7 +3649,7 @@
                   <pic:spPr>
                     <a:xfrm>
                       <a:off x="0" y="0"/>
-                      <a:ext cx="1376223" cy="1710490"/>
+                      <a:ext cx="1891403" cy="2350800"/>
                     </a:xfrm>
                     <a:prstGeom prst="rect">
                       <a:avLst/>
@@ -3672,9 +3717,9 @@
     </w:p>
     <w:p>
       <w:pPr>
-        <w:rPr>
-          <w:noProof/>
-          <w:u w:val="single"/>
+        <w:jc w:val="center"/>
+        <w:rPr>
+          <w:noProof/>
         </w:rPr>
       </w:pPr>
       <w:r>
@@ -3682,10 +3727,572 @@
           <w:noProof/>
         </w:rPr>
         <w:lastRenderedPageBreak/>
-        <w:t xml:space="preserve">28 - </w:t>
+        <w:t xml:space="preserve">28 </w:t>
+      </w:r>
+      <w:r>
+        <w:rPr>
+          <w:noProof/>
+        </w:rPr>
+        <w:t>–</w:t>
+      </w:r>
+      <w:r>
+        <w:rPr>
+          <w:noProof/>
+        </w:rPr>
+        <w:t xml:space="preserve"> </w:t>
+      </w:r>
+      <w:r>
+        <w:rPr>
+          <w:noProof/>
+        </w:rPr>
+        <w:t>Trabalhando com posicionamento.</w:t>
+      </w:r>
+    </w:p>
+    <w:p>
+      <w:pPr>
+        <w:rPr>
+          <w:noProof/>
+        </w:rPr>
+      </w:pPr>
+      <w:r>
+        <w:rPr>
+          <w:noProof/>
+        </w:rPr>
+        <w:t xml:space="preserve">Queremos centralizar o nosso menu e a imagem dentro do heander para isso vimos tres tipos de posicionamento: </w:t>
+      </w:r>
+    </w:p>
+    <w:p>
+      <w:pPr>
+        <w:rPr>
+          <w:noProof/>
+        </w:rPr>
+      </w:pPr>
+      <w:r>
+        <w:rPr>
+          <w:noProof/>
+        </w:rPr>
+        <w:t>Position:static; - Ele fica fixo na posição de origem.</w:t>
+      </w:r>
+    </w:p>
+    <w:p>
+      <w:pPr>
+        <w:rPr>
+          <w:noProof/>
+        </w:rPr>
+      </w:pPr>
+      <w:r>
+        <w:rPr>
+          <w:noProof/>
+        </w:rPr>
+        <w:t>Position:relative; - Ele anda conforme sua posição original.</w:t>
+      </w:r>
+    </w:p>
+    <w:p>
+      <w:pPr>
+        <w:rPr>
+          <w:noProof/>
+        </w:rPr>
+      </w:pPr>
+      <w:r>
+        <w:rPr>
+          <w:noProof/>
+        </w:rPr>
+        <w:t>Position:absolute; - Ele anda conforme a posição absoluta do site</w:t>
+      </w:r>
+    </w:p>
+    <w:p>
+      <w:pPr>
+        <w:rPr>
+          <w:noProof/>
+        </w:rPr>
+      </w:pPr>
+    </w:p>
+    <w:p>
+      <w:pPr>
+        <w:rPr>
+          <w:noProof/>
+        </w:rPr>
+      </w:pPr>
+    </w:p>
+    <w:p>
+      <w:pPr>
+        <w:rPr>
+          <w:noProof/>
+        </w:rPr>
+      </w:pPr>
+    </w:p>
+    <w:p>
+      <w:pPr>
+        <w:rPr>
+          <w:noProof/>
+        </w:rPr>
+      </w:pPr>
+      <w:r>
+        <w:rPr>
+          <w:noProof/>
+        </w:rPr>
+        <w:t>29 – Ao centralizar a altura do menu dentro do header utilizamos o inspecionador de código ou DevTools para saber a altura do elemento dentro do header, apertando o “f12”.</w:t>
+      </w:r>
+    </w:p>
+    <w:p>
+      <w:pPr>
+        <w:jc w:val="center"/>
+        <w:rPr>
+          <w:noProof/>
+        </w:rPr>
+      </w:pPr>
+      <w:r>
+        <w:rPr>
+          <w:noProof/>
+        </w:rPr>
+        <w:drawing>
+          <wp:inline distT="0" distB="0" distL="0" distR="0" wp14:anchorId="607D090C" wp14:editId="6050A4B4">
+            <wp:extent cx="3649863" cy="790575"/>
+            <wp:effectExtent l="0" t="0" r="8255" b="0"/>
+            <wp:docPr id="24" name="Imagem 24"/>
+            <wp:cNvGraphicFramePr>
+              <a:graphicFrameLocks xmlns:a="http://schemas.openxmlformats.org/drawingml/2006/main" noChangeAspect="1"/>
+            </wp:cNvGraphicFramePr>
+            <a:graphic xmlns:a="http://schemas.openxmlformats.org/drawingml/2006/main">
+              <a:graphicData uri="http://schemas.openxmlformats.org/drawingml/2006/picture">
+                <pic:pic xmlns:pic="http://schemas.openxmlformats.org/drawingml/2006/picture">
+                  <pic:nvPicPr>
+                    <pic:cNvPr id="1" name=""/>
+                    <pic:cNvPicPr/>
+                  </pic:nvPicPr>
+                  <pic:blipFill>
+                    <a:blip r:embed="rId53"/>
+                    <a:stretch>
+                      <a:fillRect/>
+                    </a:stretch>
+                  </pic:blipFill>
+                  <pic:spPr>
+                    <a:xfrm>
+                      <a:off x="0" y="0"/>
+                      <a:ext cx="3906282" cy="846116"/>
+                    </a:xfrm>
+                    <a:prstGeom prst="rect">
+                      <a:avLst/>
+                    </a:prstGeom>
+                  </pic:spPr>
+                </pic:pic>
+              </a:graphicData>
+            </a:graphic>
+          </wp:inline>
+        </w:drawing>
+      </w:r>
+    </w:p>
+    <w:p>
+      <w:pPr>
+        <w:jc w:val="center"/>
+        <w:rPr>
+          <w:noProof/>
+        </w:rPr>
+      </w:pPr>
+      <w:r>
+        <w:rPr>
+          <w:noProof/>
+        </w:rPr>
+        <w:t xml:space="preserve">Conforme imagem acima </w:t>
+      </w:r>
+      <w:r>
+        <w:rPr>
+          <w:noProof/>
+        </w:rPr>
+        <w:t>verificamos que é 253px a altura do header então dividimos esse valor e colocamos em nosso cíodigo 126px.</w:t>
+      </w:r>
+    </w:p>
+    <w:p>
+      <w:pPr>
+        <w:jc w:val="center"/>
+        <w:rPr>
+          <w:noProof/>
+        </w:rPr>
+      </w:pPr>
+      <w:r>
+        <w:rPr>
+          <w:noProof/>
+        </w:rPr>
+        <w:drawing>
+          <wp:inline distT="0" distB="0" distL="0" distR="0" wp14:anchorId="74EF74B5" wp14:editId="5A53FCEA">
+            <wp:extent cx="1571625" cy="724099"/>
+            <wp:effectExtent l="0" t="0" r="0" b="0"/>
+            <wp:docPr id="37" name="Imagem 37"/>
+            <wp:cNvGraphicFramePr>
+              <a:graphicFrameLocks xmlns:a="http://schemas.openxmlformats.org/drawingml/2006/main" noChangeAspect="1"/>
+            </wp:cNvGraphicFramePr>
+            <a:graphic xmlns:a="http://schemas.openxmlformats.org/drawingml/2006/main">
+              <a:graphicData uri="http://schemas.openxmlformats.org/drawingml/2006/picture">
+                <pic:pic xmlns:pic="http://schemas.openxmlformats.org/drawingml/2006/picture">
+                  <pic:nvPicPr>
+                    <pic:cNvPr id="1" name=""/>
+                    <pic:cNvPicPr/>
+                  </pic:nvPicPr>
+                  <pic:blipFill>
+                    <a:blip r:embed="rId54"/>
+                    <a:stretch>
+                      <a:fillRect/>
+                    </a:stretch>
+                  </pic:blipFill>
+                  <pic:spPr>
+                    <a:xfrm>
+                      <a:off x="0" y="0"/>
+                      <a:ext cx="1584823" cy="730180"/>
+                    </a:xfrm>
+                    <a:prstGeom prst="rect">
+                      <a:avLst/>
+                    </a:prstGeom>
+                  </pic:spPr>
+                </pic:pic>
+              </a:graphicData>
+            </a:graphic>
+          </wp:inline>
+        </w:drawing>
+      </w:r>
+    </w:p>
+    <w:p>
+      <w:pPr>
+        <w:rPr>
+          <w:noProof/>
+        </w:rPr>
+      </w:pPr>
+      <w:r>
+        <w:rPr>
+          <w:noProof/>
+        </w:rPr>
+        <w:t xml:space="preserve">30 </w:t>
+      </w:r>
+      <w:r>
+        <w:rPr>
+          <w:noProof/>
+        </w:rPr>
+        <w:t>–</w:t>
+      </w:r>
+      <w:r>
+        <w:rPr>
+          <w:noProof/>
+        </w:rPr>
+        <w:t xml:space="preserve"> </w:t>
+      </w:r>
+      <w:r>
+        <w:rPr>
+          <w:noProof/>
+        </w:rPr>
+        <w:t xml:space="preserve">Para centralizae o logo e nossa lista(menu) </w:t>
+      </w:r>
+      <w:r>
+        <w:rPr>
+          <w:noProof/>
+        </w:rPr>
+        <w:t>envolvemos eles dentro de uma “div” chamada “caixa”.</w:t>
+      </w:r>
+    </w:p>
+    <w:p>
+      <w:pPr>
+        <w:rPr>
+          <w:noProof/>
+        </w:rPr>
+      </w:pPr>
+      <w:r>
+        <w:rPr>
+          <w:noProof/>
+        </w:rPr>
+        <w:drawing>
+          <wp:inline distT="0" distB="0" distL="0" distR="0" wp14:anchorId="3E30498A" wp14:editId="2217B6A1">
+            <wp:extent cx="2038350" cy="956003"/>
+            <wp:effectExtent l="0" t="0" r="0" b="0"/>
+            <wp:docPr id="50" name="Imagem 50"/>
+            <wp:cNvGraphicFramePr>
+              <a:graphicFrameLocks xmlns:a="http://schemas.openxmlformats.org/drawingml/2006/main" noChangeAspect="1"/>
+            </wp:cNvGraphicFramePr>
+            <a:graphic xmlns:a="http://schemas.openxmlformats.org/drawingml/2006/main">
+              <a:graphicData uri="http://schemas.openxmlformats.org/drawingml/2006/picture">
+                <pic:pic xmlns:pic="http://schemas.openxmlformats.org/drawingml/2006/picture">
+                  <pic:nvPicPr>
+                    <pic:cNvPr id="1" name=""/>
+                    <pic:cNvPicPr/>
+                  </pic:nvPicPr>
+                  <pic:blipFill>
+                    <a:blip r:embed="rId55"/>
+                    <a:stretch>
+                      <a:fillRect/>
+                    </a:stretch>
+                  </pic:blipFill>
+                  <pic:spPr>
+                    <a:xfrm>
+                      <a:off x="0" y="0"/>
+                      <a:ext cx="2094193" cy="982194"/>
+                    </a:xfrm>
+                    <a:prstGeom prst="rect">
+                      <a:avLst/>
+                    </a:prstGeom>
+                  </pic:spPr>
+                </pic:pic>
+              </a:graphicData>
+            </a:graphic>
+          </wp:inline>
+        </w:drawing>
+      </w:r>
+    </w:p>
+    <w:p>
+      <w:pPr>
+        <w:rPr>
+          <w:noProof/>
+        </w:rPr>
+      </w:pPr>
+      <w:r>
+        <w:rPr>
+          <w:noProof/>
+        </w:rPr>
+        <w:t>31 – E definimos uma largura para “div caixa”, deixando uma medida padrão e centralizamos tanto a logo com a lista utilizando “margin:0 auto;”.</w:t>
+      </w:r>
+    </w:p>
+    <w:p>
+      <w:pPr>
+        <w:rPr>
+          <w:noProof/>
+        </w:rPr>
+      </w:pPr>
+      <w:r>
+        <w:rPr>
+          <w:noProof/>
+        </w:rPr>
+        <w:t>Como header estava utilizando “position:absolute;” se fez necessário colocar “position:relative;” para que a lista ficasse centralizada automaticamente tanto para direita tanto para esquerda.</w:t>
+      </w:r>
+    </w:p>
+    <w:p>
+      <w:pPr>
+        <w:rPr>
+          <w:noProof/>
+        </w:rPr>
+      </w:pPr>
+      <w:r>
+        <w:rPr>
+          <w:noProof/>
+        </w:rPr>
+        <w:drawing>
+          <wp:inline distT="0" distB="0" distL="0" distR="0" wp14:anchorId="0D89AC26" wp14:editId="7D8FCF77">
+            <wp:extent cx="2206211" cy="828675"/>
+            <wp:effectExtent l="0" t="0" r="3810" b="0"/>
+            <wp:docPr id="52" name="Imagem 52"/>
+            <wp:cNvGraphicFramePr>
+              <a:graphicFrameLocks xmlns:a="http://schemas.openxmlformats.org/drawingml/2006/main" noChangeAspect="1"/>
+            </wp:cNvGraphicFramePr>
+            <a:graphic xmlns:a="http://schemas.openxmlformats.org/drawingml/2006/main">
+              <a:graphicData uri="http://schemas.openxmlformats.org/drawingml/2006/picture">
+                <pic:pic xmlns:pic="http://schemas.openxmlformats.org/drawingml/2006/picture">
+                  <pic:nvPicPr>
+                    <pic:cNvPr id="1" name=""/>
+                    <pic:cNvPicPr/>
+                  </pic:nvPicPr>
+                  <pic:blipFill>
+                    <a:blip r:embed="rId56"/>
+                    <a:stretch>
+                      <a:fillRect/>
+                    </a:stretch>
+                  </pic:blipFill>
+                  <pic:spPr>
+                    <a:xfrm>
+                      <a:off x="0" y="0"/>
+                      <a:ext cx="2284139" cy="857945"/>
+                    </a:xfrm>
+                    <a:prstGeom prst="rect">
+                      <a:avLst/>
+                    </a:prstGeom>
+                  </pic:spPr>
+                </pic:pic>
+              </a:graphicData>
+            </a:graphic>
+          </wp:inline>
+        </w:drawing>
+      </w:r>
+    </w:p>
+    <w:p>
+      <w:pPr>
+        <w:rPr>
+          <w:noProof/>
+        </w:rPr>
+      </w:pPr>
+      <w:r>
+        <w:rPr>
+          <w:noProof/>
+        </w:rPr>
+        <w:lastRenderedPageBreak/>
+        <w:t xml:space="preserve">32 </w:t>
+      </w:r>
+      <w:r>
+        <w:rPr>
+          <w:noProof/>
+        </w:rPr>
+        <w:t>–</w:t>
+      </w:r>
+      <w:r>
+        <w:rPr>
+          <w:noProof/>
+        </w:rPr>
+        <w:t xml:space="preserve"> </w:t>
+      </w:r>
+      <w:r>
+        <w:rPr>
+          <w:noProof/>
+        </w:rPr>
+        <w:t>Para melhorar o espaço interno do header utilizamos o”padding”, tanto para cima tanto para baixo, conforme imagem do código:</w:t>
+      </w:r>
+      <w:r>
+        <w:rPr>
+          <w:noProof/>
+        </w:rPr>
+        <w:t xml:space="preserve"> </w:t>
+      </w:r>
+      <w:r>
+        <w:rPr>
+          <w:noProof/>
+        </w:rPr>
+        <w:drawing>
+          <wp:inline distT="0" distB="0" distL="0" distR="0" wp14:anchorId="6F9D67FE" wp14:editId="304DCB94">
+            <wp:extent cx="4002656" cy="792624"/>
+            <wp:effectExtent l="0" t="0" r="0" b="7620"/>
+            <wp:docPr id="61" name="Imagem 61"/>
+            <wp:cNvGraphicFramePr>
+              <a:graphicFrameLocks xmlns:a="http://schemas.openxmlformats.org/drawingml/2006/main" noChangeAspect="1"/>
+            </wp:cNvGraphicFramePr>
+            <a:graphic xmlns:a="http://schemas.openxmlformats.org/drawingml/2006/main">
+              <a:graphicData uri="http://schemas.openxmlformats.org/drawingml/2006/picture">
+                <pic:pic xmlns:pic="http://schemas.openxmlformats.org/drawingml/2006/picture">
+                  <pic:nvPicPr>
+                    <pic:cNvPr id="1" name=""/>
+                    <pic:cNvPicPr/>
+                  </pic:nvPicPr>
+                  <pic:blipFill>
+                    <a:blip r:embed="rId57"/>
+                    <a:stretch>
+                      <a:fillRect/>
+                    </a:stretch>
+                  </pic:blipFill>
+                  <pic:spPr>
+                    <a:xfrm>
+                      <a:off x="0" y="0"/>
+                      <a:ext cx="4080448" cy="808029"/>
+                    </a:xfrm>
+                    <a:prstGeom prst="rect">
+                      <a:avLst/>
+                    </a:prstGeom>
+                  </pic:spPr>
+                </pic:pic>
+              </a:graphicData>
+            </a:graphic>
+          </wp:inline>
+        </w:drawing>
+      </w:r>
+    </w:p>
+    <w:p>
+      <w:pPr>
+        <w:rPr>
+          <w:noProof/>
+        </w:rPr>
+      </w:pPr>
+      <w:r>
+        <w:rPr>
+          <w:noProof/>
+        </w:rPr>
+        <w:drawing>
+          <wp:inline distT="0" distB="0" distL="0" distR="0" wp14:anchorId="5DBB7A17" wp14:editId="01FE1864">
+            <wp:extent cx="1966823" cy="554356"/>
+            <wp:effectExtent l="0" t="0" r="0" b="0"/>
+            <wp:docPr id="55" name="Imagem 55"/>
+            <wp:cNvGraphicFramePr>
+              <a:graphicFrameLocks xmlns:a="http://schemas.openxmlformats.org/drawingml/2006/main" noChangeAspect="1"/>
+            </wp:cNvGraphicFramePr>
+            <a:graphic xmlns:a="http://schemas.openxmlformats.org/drawingml/2006/main">
+              <a:graphicData uri="http://schemas.openxmlformats.org/drawingml/2006/picture">
+                <pic:pic xmlns:pic="http://schemas.openxmlformats.org/drawingml/2006/picture">
+                  <pic:nvPicPr>
+                    <pic:cNvPr id="1" name=""/>
+                    <pic:cNvPicPr/>
+                  </pic:nvPicPr>
+                  <pic:blipFill>
+                    <a:blip r:embed="rId58"/>
+                    <a:stretch>
+                      <a:fillRect/>
+                    </a:stretch>
+                  </pic:blipFill>
+                  <pic:spPr>
+                    <a:xfrm>
+                      <a:off x="0" y="0"/>
+                      <a:ext cx="2005242" cy="565185"/>
+                    </a:xfrm>
+                    <a:prstGeom prst="rect">
+                      <a:avLst/>
+                    </a:prstGeom>
+                  </pic:spPr>
+                </pic:pic>
+              </a:graphicData>
+            </a:graphic>
+          </wp:inline>
+        </w:drawing>
+      </w:r>
+    </w:p>
+    <w:p>
+      <w:pPr>
+        <w:rPr>
+          <w:noProof/>
+        </w:rPr>
+      </w:pPr>
+      <w:r>
+        <w:rPr>
+          <w:noProof/>
+        </w:rPr>
+        <w:t xml:space="preserve">33 - </w:t>
       </w:r>
       <w:bookmarkStart w:id="0" w:name="_GoBack"/>
       <w:bookmarkEnd w:id="0"/>
+    </w:p>
+    <w:p>
+      <w:pPr>
+        <w:rPr>
+          <w:noProof/>
+        </w:rPr>
+      </w:pPr>
+    </w:p>
+    <w:p>
+      <w:pPr>
+        <w:rPr>
+          <w:noProof/>
+        </w:rPr>
+      </w:pPr>
+      <w:r>
+        <w:rPr>
+          <w:noProof/>
+        </w:rPr>
+        <w:br w:type="page"/>
+      </w:r>
+    </w:p>
+    <w:p>
+      <w:pPr>
+        <w:rPr>
+          <w:noProof/>
+        </w:rPr>
+      </w:pPr>
+    </w:p>
+    <w:p>
+      <w:pPr>
+        <w:rPr>
+          <w:noProof/>
+        </w:rPr>
+      </w:pPr>
+      <w:r>
+        <w:rPr>
+          <w:noProof/>
+        </w:rPr>
+        <w:br w:type="page"/>
+      </w:r>
+    </w:p>
+    <w:p>
+      <w:pPr>
+        <w:rPr>
+          <w:noProof/>
+        </w:rPr>
+      </w:pPr>
     </w:p>
     <w:p>
       <w:pPr>
@@ -4683,7 +5290,7 @@
 </file>
 
 <file path=customXml/itemProps1.xml><?xml version="1.0" encoding="utf-8"?>
-<ds:datastoreItem xmlns:ds="http://schemas.openxmlformats.org/officeDocument/2006/customXml" ds:itemID="{FF45A729-79B5-4045-AD4A-E541324805E7}">
+<ds:datastoreItem xmlns:ds="http://schemas.openxmlformats.org/officeDocument/2006/customXml" ds:itemID="{2634170C-78B0-42D2-8EC7-F1AA6DA15C9D}">
   <ds:schemaRefs>
     <ds:schemaRef ds:uri="http://schemas.openxmlformats.org/officeDocument/2006/bibliography"/>
   </ds:schemaRefs>

</xml_diff>

<commit_message>
quase terminando o site, utilizamos hover
</commit_message>
<xml_diff>
--- a/Apostila/Projeto Space For Men.docx
+++ b/Apostila/Projeto Space For Men.docx
@@ -5345,10 +5345,1072 @@
         <w:rPr>
           <w:noProof/>
         </w:rPr>
-        <w:t xml:space="preserve">40 - </w:t>
+        <w:t xml:space="preserve">40 </w:t>
+      </w:r>
+      <w:r>
+        <w:rPr>
+          <w:noProof/>
+        </w:rPr>
+        <w:t>–</w:t>
+      </w:r>
+      <w:r>
+        <w:rPr>
+          <w:noProof/>
+        </w:rPr>
+        <w:t xml:space="preserve"> </w:t>
+      </w:r>
+      <w:r>
+        <w:rPr>
+          <w:noProof/>
+        </w:rPr>
+        <w:t>Na class “produtos” inserimos um espaço interno que aumentou o tamanho tanto para cima como para baixo.</w:t>
+      </w:r>
+    </w:p>
+    <w:p>
+      <w:pPr>
+        <w:rPr>
+          <w:noProof/>
+        </w:rPr>
+      </w:pPr>
+      <w:r>
+        <w:rPr>
+          <w:noProof/>
+        </w:rPr>
+        <w:drawing>
+          <wp:inline distT="0" distB="0" distL="0" distR="0" wp14:anchorId="5FA7F4EC" wp14:editId="65BABC97">
+            <wp:extent cx="3140210" cy="1066800"/>
+            <wp:effectExtent l="0" t="0" r="3175" b="0"/>
+            <wp:docPr id="45" name="Imagem 45"/>
+            <wp:cNvGraphicFramePr>
+              <a:graphicFrameLocks xmlns:a="http://schemas.openxmlformats.org/drawingml/2006/main" noChangeAspect="1"/>
+            </wp:cNvGraphicFramePr>
+            <a:graphic xmlns:a="http://schemas.openxmlformats.org/drawingml/2006/main">
+              <a:graphicData uri="http://schemas.openxmlformats.org/drawingml/2006/picture">
+                <pic:pic xmlns:pic="http://schemas.openxmlformats.org/drawingml/2006/picture">
+                  <pic:nvPicPr>
+                    <pic:cNvPr id="1" name=""/>
+                    <pic:cNvPicPr/>
+                  </pic:nvPicPr>
+                  <pic:blipFill>
+                    <a:blip r:embed="rId72"/>
+                    <a:stretch>
+                      <a:fillRect/>
+                    </a:stretch>
+                  </pic:blipFill>
+                  <pic:spPr>
+                    <a:xfrm>
+                      <a:off x="0" y="0"/>
+                      <a:ext cx="3173345" cy="1078057"/>
+                    </a:xfrm>
+                    <a:prstGeom prst="rect">
+                      <a:avLst/>
+                    </a:prstGeom>
+                  </pic:spPr>
+                </pic:pic>
+              </a:graphicData>
+            </a:graphic>
+          </wp:inline>
+        </w:drawing>
+      </w:r>
+      <w:r>
+        <w:rPr>
+          <w:noProof/>
+        </w:rPr>
+        <w:drawing>
+          <wp:inline distT="0" distB="0" distL="0" distR="0" wp14:anchorId="207258D4" wp14:editId="04D9BE38">
+            <wp:extent cx="1724266" cy="933580"/>
+            <wp:effectExtent l="0" t="0" r="9525" b="0"/>
+            <wp:docPr id="10" name="Imagem 10"/>
+            <wp:cNvGraphicFramePr>
+              <a:graphicFrameLocks xmlns:a="http://schemas.openxmlformats.org/drawingml/2006/main" noChangeAspect="1"/>
+            </wp:cNvGraphicFramePr>
+            <a:graphic xmlns:a="http://schemas.openxmlformats.org/drawingml/2006/main">
+              <a:graphicData uri="http://schemas.openxmlformats.org/drawingml/2006/picture">
+                <pic:pic xmlns:pic="http://schemas.openxmlformats.org/drawingml/2006/picture">
+                  <pic:nvPicPr>
+                    <pic:cNvPr id="1" name=""/>
+                    <pic:cNvPicPr/>
+                  </pic:nvPicPr>
+                  <pic:blipFill>
+                    <a:blip r:embed="rId73"/>
+                    <a:stretch>
+                      <a:fillRect/>
+                    </a:stretch>
+                  </pic:blipFill>
+                  <pic:spPr>
+                    <a:xfrm>
+                      <a:off x="0" y="0"/>
+                      <a:ext cx="1724266" cy="933580"/>
+                    </a:xfrm>
+                    <a:prstGeom prst="rect">
+                      <a:avLst/>
+                    </a:prstGeom>
+                  </pic:spPr>
+                </pic:pic>
+              </a:graphicData>
+            </a:graphic>
+          </wp:inline>
+        </w:drawing>
+      </w:r>
+    </w:p>
+    <w:p>
+      <w:pPr>
+        <w:rPr>
+          <w:noProof/>
+        </w:rPr>
+      </w:pPr>
+      <w:r>
+        <w:rPr>
+          <w:noProof/>
+        </w:rPr>
+        <w:t xml:space="preserve">41 </w:t>
+      </w:r>
+      <w:r>
+        <w:rPr>
+          <w:noProof/>
+        </w:rPr>
+        <w:t>–</w:t>
+      </w:r>
+      <w:r>
+        <w:rPr>
+          <w:noProof/>
+        </w:rPr>
+        <w:t xml:space="preserve"> </w:t>
+      </w:r>
+      <w:r>
+        <w:rPr>
+          <w:noProof/>
+        </w:rPr>
+        <w:t>No “produtos li” adicionamos um espaço interno para cima como para baixo e para direita e esquerda.</w:t>
+      </w:r>
+    </w:p>
+    <w:p>
+      <w:pPr>
+        <w:rPr>
+          <w:noProof/>
+        </w:rPr>
+      </w:pPr>
+      <w:r>
+        <w:rPr>
+          <w:noProof/>
+        </w:rPr>
+        <w:drawing>
+          <wp:inline distT="0" distB="0" distL="0" distR="0" wp14:anchorId="08B6A0DF" wp14:editId="61463A71">
+            <wp:extent cx="2383309" cy="2133600"/>
+            <wp:effectExtent l="0" t="0" r="0" b="0"/>
+            <wp:docPr id="67" name="Imagem 67"/>
+            <wp:cNvGraphicFramePr>
+              <a:graphicFrameLocks xmlns:a="http://schemas.openxmlformats.org/drawingml/2006/main" noChangeAspect="1"/>
+            </wp:cNvGraphicFramePr>
+            <a:graphic xmlns:a="http://schemas.openxmlformats.org/drawingml/2006/main">
+              <a:graphicData uri="http://schemas.openxmlformats.org/drawingml/2006/picture">
+                <pic:pic xmlns:pic="http://schemas.openxmlformats.org/drawingml/2006/picture">
+                  <pic:nvPicPr>
+                    <pic:cNvPr id="1" name=""/>
+                    <pic:cNvPicPr/>
+                  </pic:nvPicPr>
+                  <pic:blipFill>
+                    <a:blip r:embed="rId74"/>
+                    <a:stretch>
+                      <a:fillRect/>
+                    </a:stretch>
+                  </pic:blipFill>
+                  <pic:spPr>
+                    <a:xfrm>
+                      <a:off x="0" y="0"/>
+                      <a:ext cx="2390925" cy="2140418"/>
+                    </a:xfrm>
+                    <a:prstGeom prst="rect">
+                      <a:avLst/>
+                    </a:prstGeom>
+                  </pic:spPr>
+                </pic:pic>
+              </a:graphicData>
+            </a:graphic>
+          </wp:inline>
+        </w:drawing>
+      </w:r>
+      <w:r>
+        <w:rPr>
+          <w:noProof/>
+        </w:rPr>
+        <w:drawing>
+          <wp:inline distT="0" distB="0" distL="0" distR="0" wp14:anchorId="6E12F03D" wp14:editId="320B16DD">
+            <wp:extent cx="1568385" cy="1257300"/>
+            <wp:effectExtent l="0" t="0" r="0" b="0"/>
+            <wp:docPr id="65" name="Imagem 65"/>
+            <wp:cNvGraphicFramePr>
+              <a:graphicFrameLocks xmlns:a="http://schemas.openxmlformats.org/drawingml/2006/main" noChangeAspect="1"/>
+            </wp:cNvGraphicFramePr>
+            <a:graphic xmlns:a="http://schemas.openxmlformats.org/drawingml/2006/main">
+              <a:graphicData uri="http://schemas.openxmlformats.org/drawingml/2006/picture">
+                <pic:pic xmlns:pic="http://schemas.openxmlformats.org/drawingml/2006/picture">
+                  <pic:nvPicPr>
+                    <pic:cNvPr id="1" name=""/>
+                    <pic:cNvPicPr/>
+                  </pic:nvPicPr>
+                  <pic:blipFill>
+                    <a:blip r:embed="rId75"/>
+                    <a:stretch>
+                      <a:fillRect/>
+                    </a:stretch>
+                  </pic:blipFill>
+                  <pic:spPr>
+                    <a:xfrm>
+                      <a:off x="0" y="0"/>
+                      <a:ext cx="1583277" cy="1269239"/>
+                    </a:xfrm>
+                    <a:prstGeom prst="rect">
+                      <a:avLst/>
+                    </a:prstGeom>
+                  </pic:spPr>
+                </pic:pic>
+              </a:graphicData>
+            </a:graphic>
+          </wp:inline>
+        </w:drawing>
+      </w:r>
+    </w:p>
+    <w:p>
+      <w:pPr>
+        <w:rPr>
+          <w:noProof/>
+        </w:rPr>
+      </w:pPr>
+      <w:r>
+        <w:rPr>
+          <w:noProof/>
+        </w:rPr>
+        <w:t>42 – Para ajustar o espaço utilizamos o “box-sizzing</w:t>
+      </w:r>
+      <w:r>
+        <w:rPr>
+          <w:noProof/>
+        </w:rPr>
+        <w:t>: border-box;</w:t>
+      </w:r>
+      <w:r>
+        <w:rPr>
+          <w:noProof/>
+        </w:rPr>
+        <w:t>” onde ele  automaticamente ajusta o espaço entre as imagens.</w:t>
+      </w:r>
+    </w:p>
+    <w:p>
+      <w:pPr>
+        <w:rPr>
+          <w:noProof/>
+        </w:rPr>
+      </w:pPr>
+      <w:r>
+        <w:rPr>
+          <w:noProof/>
+        </w:rPr>
+        <mc:AlternateContent>
+          <mc:Choice Requires="wps">
+            <w:drawing>
+              <wp:anchor distT="0" distB="0" distL="114300" distR="114300" simplePos="0" relativeHeight="251674624" behindDoc="0" locked="0" layoutInCell="1" allowOverlap="1">
+                <wp:simplePos x="0" y="0"/>
+                <wp:positionH relativeFrom="column">
+                  <wp:posOffset>5187315</wp:posOffset>
+                </wp:positionH>
+                <wp:positionV relativeFrom="paragraph">
+                  <wp:posOffset>1502410</wp:posOffset>
+                </wp:positionV>
+                <wp:extent cx="685800" cy="28575"/>
+                <wp:effectExtent l="38100" t="76200" r="19050" b="66675"/>
+                <wp:wrapNone/>
+                <wp:docPr id="87" name="Conector de Seta Reta 87"/>
+                <wp:cNvGraphicFramePr/>
+                <a:graphic xmlns:a="http://schemas.openxmlformats.org/drawingml/2006/main">
+                  <a:graphicData uri="http://schemas.microsoft.com/office/word/2010/wordprocessingShape">
+                    <wps:wsp>
+                      <wps:cNvCnPr/>
+                      <wps:spPr>
+                        <a:xfrm flipH="1" flipV="1">
+                          <a:off x="0" y="0"/>
+                          <a:ext cx="685800" cy="28575"/>
+                        </a:xfrm>
+                        <a:prstGeom prst="straightConnector1">
+                          <a:avLst/>
+                        </a:prstGeom>
+                        <a:ln>
+                          <a:solidFill>
+                            <a:srgbClr val="FF0000"/>
+                          </a:solidFill>
+                          <a:tailEnd type="triangle"/>
+                        </a:ln>
+                      </wps:spPr>
+                      <wps:style>
+                        <a:lnRef idx="1">
+                          <a:schemeClr val="accent1"/>
+                        </a:lnRef>
+                        <a:fillRef idx="0">
+                          <a:schemeClr val="accent1"/>
+                        </a:fillRef>
+                        <a:effectRef idx="0">
+                          <a:schemeClr val="accent1"/>
+                        </a:effectRef>
+                        <a:fontRef idx="minor">
+                          <a:schemeClr val="tx1"/>
+                        </a:fontRef>
+                      </wps:style>
+                      <wps:bodyPr/>
+                    </wps:wsp>
+                  </a:graphicData>
+                </a:graphic>
+              </wp:anchor>
+            </w:drawing>
+          </mc:Choice>
+          <mc:Fallback>
+            <w:pict>
+              <v:shapetype w14:anchorId="32B26F14" id="_x0000_t32" coordsize="21600,21600" o:spt="32" o:oned="t" path="m,l21600,21600e" filled="f">
+                <v:path arrowok="t" fillok="f" o:connecttype="none"/>
+                <o:lock v:ext="edit" shapetype="t"/>
+              </v:shapetype>
+              <v:shape id="Conector de Seta Reta 87" o:spid="_x0000_s1026" type="#_x0000_t32" style="position:absolute;margin-left:408.45pt;margin-top:118.3pt;width:54pt;height:2.25pt;flip:x y;z-index:251674624;visibility:visible;mso-wrap-style:square;mso-wrap-distance-left:9pt;mso-wrap-distance-top:0;mso-wrap-distance-right:9pt;mso-wrap-distance-bottom:0;mso-position-horizontal:absolute;mso-position-horizontal-relative:text;mso-position-vertical:absolute;mso-position-vertical-relative:text" o:gfxdata="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" strokecolor="red" strokeweight=".5pt">
+                <v:stroke endarrow="block" joinstyle="miter"/>
+              </v:shape>
+            </w:pict>
+          </mc:Fallback>
+        </mc:AlternateContent>
+      </w:r>
+      <w:r>
+        <w:rPr>
+          <w:noProof/>
+        </w:rPr>
+        <w:drawing>
+          <wp:inline distT="0" distB="0" distL="0" distR="0" wp14:anchorId="04B46BAE" wp14:editId="1893AA43">
+            <wp:extent cx="4114800" cy="1575339"/>
+            <wp:effectExtent l="0" t="0" r="0" b="6350"/>
+            <wp:docPr id="72" name="Imagem 72"/>
+            <wp:cNvGraphicFramePr>
+              <a:graphicFrameLocks xmlns:a="http://schemas.openxmlformats.org/drawingml/2006/main" noChangeAspect="1"/>
+            </wp:cNvGraphicFramePr>
+            <a:graphic xmlns:a="http://schemas.openxmlformats.org/drawingml/2006/main">
+              <a:graphicData uri="http://schemas.openxmlformats.org/drawingml/2006/picture">
+                <pic:pic xmlns:pic="http://schemas.openxmlformats.org/drawingml/2006/picture">
+                  <pic:nvPicPr>
+                    <pic:cNvPr id="1" name=""/>
+                    <pic:cNvPicPr/>
+                  </pic:nvPicPr>
+                  <pic:blipFill>
+                    <a:blip r:embed="rId76"/>
+                    <a:stretch>
+                      <a:fillRect/>
+                    </a:stretch>
+                  </pic:blipFill>
+                  <pic:spPr>
+                    <a:xfrm>
+                      <a:off x="0" y="0"/>
+                      <a:ext cx="4205157" cy="1609932"/>
+                    </a:xfrm>
+                    <a:prstGeom prst="rect">
+                      <a:avLst/>
+                    </a:prstGeom>
+                  </pic:spPr>
+                </pic:pic>
+              </a:graphicData>
+            </a:graphic>
+          </wp:inline>
+        </w:drawing>
+      </w:r>
+      <w:r>
+        <w:rPr>
+          <w:noProof/>
+        </w:rPr>
+        <w:drawing>
+          <wp:inline distT="0" distB="0" distL="0" distR="0" wp14:anchorId="023E56C4" wp14:editId="2C93595F">
+            <wp:extent cx="1238250" cy="1905000"/>
+            <wp:effectExtent l="0" t="0" r="0" b="0"/>
+            <wp:docPr id="73" name="Imagem 73"/>
+            <wp:cNvGraphicFramePr>
+              <a:graphicFrameLocks xmlns:a="http://schemas.openxmlformats.org/drawingml/2006/main" noChangeAspect="1"/>
+            </wp:cNvGraphicFramePr>
+            <a:graphic xmlns:a="http://schemas.openxmlformats.org/drawingml/2006/main">
+              <a:graphicData uri="http://schemas.openxmlformats.org/drawingml/2006/picture">
+                <pic:pic xmlns:pic="http://schemas.openxmlformats.org/drawingml/2006/picture">
+                  <pic:nvPicPr>
+                    <pic:cNvPr id="0" name="Picture 1"/>
+                    <pic:cNvPicPr>
+                      <a:picLocks noChangeAspect="1" noChangeArrowheads="1"/>
+                    </pic:cNvPicPr>
+                  </pic:nvPicPr>
+                  <pic:blipFill>
+                    <a:blip r:embed="rId77">
+                      <a:extLst>
+                        <a:ext uri="{28A0092B-C50C-407E-A947-70E740481C1C}">
+                          <a14:useLocalDpi xmlns:a14="http://schemas.microsoft.com/office/drawing/2010/main" val="0"/>
+                        </a:ext>
+                      </a:extLst>
+                    </a:blip>
+                    <a:srcRect/>
+                    <a:stretch>
+                      <a:fillRect/>
+                    </a:stretch>
+                  </pic:blipFill>
+                  <pic:spPr bwMode="auto">
+                    <a:xfrm>
+                      <a:off x="0" y="0"/>
+                      <a:ext cx="1288644" cy="1982529"/>
+                    </a:xfrm>
+                    <a:prstGeom prst="rect">
+                      <a:avLst/>
+                    </a:prstGeom>
+                    <a:noFill/>
+                    <a:ln>
+                      <a:noFill/>
+                    </a:ln>
+                  </pic:spPr>
+                </pic:pic>
+              </a:graphicData>
+            </a:graphic>
+          </wp:inline>
+        </w:drawing>
+      </w:r>
+    </w:p>
+    <w:p>
+      <w:pPr>
+        <w:rPr>
+          <w:noProof/>
+        </w:rPr>
+      </w:pPr>
+      <w:r>
+        <w:rPr>
+          <w:noProof/>
+        </w:rPr>
+        <w:lastRenderedPageBreak/>
+        <w:t>43 – Para arrrumar o espaço entre o texto  e o preço, colocamos um espaço externo na class “preco” conforme imagem.</w:t>
+      </w:r>
+    </w:p>
+    <w:p>
+      <w:pPr>
+        <w:jc w:val="center"/>
+        <w:rPr>
+          <w:noProof/>
+        </w:rPr>
+      </w:pPr>
+      <w:r>
+        <w:rPr>
+          <w:noProof/>
+        </w:rPr>
+        <mc:AlternateContent>
+          <mc:Choice Requires="wps">
+            <w:drawing>
+              <wp:anchor distT="0" distB="0" distL="114300" distR="114300" simplePos="0" relativeHeight="251673600" behindDoc="0" locked="0" layoutInCell="1" allowOverlap="1">
+                <wp:simplePos x="0" y="0"/>
+                <wp:positionH relativeFrom="column">
+                  <wp:posOffset>3263265</wp:posOffset>
+                </wp:positionH>
+                <wp:positionV relativeFrom="paragraph">
+                  <wp:posOffset>487680</wp:posOffset>
+                </wp:positionV>
+                <wp:extent cx="838200" cy="114300"/>
+                <wp:effectExtent l="38100" t="0" r="19050" b="76200"/>
+                <wp:wrapNone/>
+                <wp:docPr id="86" name="Conector de Seta Reta 86"/>
+                <wp:cNvGraphicFramePr/>
+                <a:graphic xmlns:a="http://schemas.openxmlformats.org/drawingml/2006/main">
+                  <a:graphicData uri="http://schemas.microsoft.com/office/word/2010/wordprocessingShape">
+                    <wps:wsp>
+                      <wps:cNvCnPr/>
+                      <wps:spPr>
+                        <a:xfrm flipH="1">
+                          <a:off x="0" y="0"/>
+                          <a:ext cx="838200" cy="114300"/>
+                        </a:xfrm>
+                        <a:prstGeom prst="straightConnector1">
+                          <a:avLst/>
+                        </a:prstGeom>
+                        <a:ln>
+                          <a:solidFill>
+                            <a:srgbClr val="FF0000"/>
+                          </a:solidFill>
+                          <a:tailEnd type="triangle"/>
+                        </a:ln>
+                      </wps:spPr>
+                      <wps:style>
+                        <a:lnRef idx="1">
+                          <a:schemeClr val="accent1"/>
+                        </a:lnRef>
+                        <a:fillRef idx="0">
+                          <a:schemeClr val="accent1"/>
+                        </a:fillRef>
+                        <a:effectRef idx="0">
+                          <a:schemeClr val="accent1"/>
+                        </a:effectRef>
+                        <a:fontRef idx="minor">
+                          <a:schemeClr val="tx1"/>
+                        </a:fontRef>
+                      </wps:style>
+                      <wps:bodyPr/>
+                    </wps:wsp>
+                  </a:graphicData>
+                </a:graphic>
+              </wp:anchor>
+            </w:drawing>
+          </mc:Choice>
+          <mc:Fallback>
+            <w:pict>
+              <v:shape w14:anchorId="6FA7C045" id="Conector de Seta Reta 86" o:spid="_x0000_s1026" type="#_x0000_t32" style="position:absolute;margin-left:256.95pt;margin-top:38.4pt;width:66pt;height:9pt;flip:x;z-index:251673600;visibility:visible;mso-wrap-style:square;mso-wrap-distance-left:9pt;mso-wrap-distance-top:0;mso-wrap-distance-right:9pt;mso-wrap-distance-bottom:0;mso-position-horizontal:absolute;mso-position-horizontal-relative:text;mso-position-vertical:absolute;mso-position-vertical-relative:text" o:gfxdata="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" strokecolor="red" strokeweight=".5pt">
+                <v:stroke endarrow="block" joinstyle="miter"/>
+              </v:shape>
+            </w:pict>
+          </mc:Fallback>
+        </mc:AlternateContent>
+      </w:r>
+      <w:r>
+        <w:rPr>
+          <w:noProof/>
+        </w:rPr>
+        <w:drawing>
+          <wp:inline distT="0" distB="0" distL="0" distR="0" wp14:anchorId="261E0A27" wp14:editId="467576D5">
+            <wp:extent cx="1792224" cy="914400"/>
+            <wp:effectExtent l="0" t="0" r="0" b="0"/>
+            <wp:docPr id="83" name="Imagem 83"/>
+            <wp:cNvGraphicFramePr>
+              <a:graphicFrameLocks xmlns:a="http://schemas.openxmlformats.org/drawingml/2006/main" noChangeAspect="1"/>
+            </wp:cNvGraphicFramePr>
+            <a:graphic xmlns:a="http://schemas.openxmlformats.org/drawingml/2006/main">
+              <a:graphicData uri="http://schemas.openxmlformats.org/drawingml/2006/picture">
+                <pic:pic xmlns:pic="http://schemas.openxmlformats.org/drawingml/2006/picture">
+                  <pic:nvPicPr>
+                    <pic:cNvPr id="1" name=""/>
+                    <pic:cNvPicPr/>
+                  </pic:nvPicPr>
+                  <pic:blipFill>
+                    <a:blip r:embed="rId78"/>
+                    <a:stretch>
+                      <a:fillRect/>
+                    </a:stretch>
+                  </pic:blipFill>
+                  <pic:spPr>
+                    <a:xfrm>
+                      <a:off x="0" y="0"/>
+                      <a:ext cx="1794286" cy="915452"/>
+                    </a:xfrm>
+                    <a:prstGeom prst="rect">
+                      <a:avLst/>
+                    </a:prstGeom>
+                  </pic:spPr>
+                </pic:pic>
+              </a:graphicData>
+            </a:graphic>
+          </wp:inline>
+        </w:drawing>
+      </w:r>
+    </w:p>
+    <w:p>
+      <w:pPr>
+        <w:rPr>
+          <w:noProof/>
+        </w:rPr>
+      </w:pPr>
+      <w:r>
+        <w:rPr>
+          <w:noProof/>
+        </w:rPr>
+        <w:t>44 – Tiramos a cor de fundo dos “produtos li” e adicionamos uma borda, conforme o código.</w:t>
+      </w:r>
+    </w:p>
+    <w:p>
+      <w:pPr>
+        <w:jc w:val="center"/>
+        <w:rPr>
+          <w:noProof/>
+        </w:rPr>
+      </w:pPr>
+      <w:r>
+        <w:rPr>
+          <w:noProof/>
+        </w:rPr>
+        <mc:AlternateContent>
+          <mc:Choice Requires="wps">
+            <w:drawing>
+              <wp:anchor distT="0" distB="0" distL="114300" distR="114300" simplePos="0" relativeHeight="251672576" behindDoc="0" locked="0" layoutInCell="1" allowOverlap="1">
+                <wp:simplePos x="0" y="0"/>
+                <wp:positionH relativeFrom="column">
+                  <wp:posOffset>5139690</wp:posOffset>
+                </wp:positionH>
+                <wp:positionV relativeFrom="paragraph">
+                  <wp:posOffset>1201420</wp:posOffset>
+                </wp:positionV>
+                <wp:extent cx="476250" cy="9525"/>
+                <wp:effectExtent l="19050" t="57150" r="0" b="85725"/>
+                <wp:wrapNone/>
+                <wp:docPr id="85" name="Conector de Seta Reta 85"/>
+                <wp:cNvGraphicFramePr/>
+                <a:graphic xmlns:a="http://schemas.openxmlformats.org/drawingml/2006/main">
+                  <a:graphicData uri="http://schemas.microsoft.com/office/word/2010/wordprocessingShape">
+                    <wps:wsp>
+                      <wps:cNvCnPr/>
+                      <wps:spPr>
+                        <a:xfrm flipH="1">
+                          <a:off x="0" y="0"/>
+                          <a:ext cx="476250" cy="9525"/>
+                        </a:xfrm>
+                        <a:prstGeom prst="straightConnector1">
+                          <a:avLst/>
+                        </a:prstGeom>
+                        <a:ln>
+                          <a:solidFill>
+                            <a:srgbClr val="FF0000"/>
+                          </a:solidFill>
+                          <a:tailEnd type="triangle"/>
+                        </a:ln>
+                      </wps:spPr>
+                      <wps:style>
+                        <a:lnRef idx="1">
+                          <a:schemeClr val="accent1"/>
+                        </a:lnRef>
+                        <a:fillRef idx="0">
+                          <a:schemeClr val="accent1"/>
+                        </a:fillRef>
+                        <a:effectRef idx="0">
+                          <a:schemeClr val="accent1"/>
+                        </a:effectRef>
+                        <a:fontRef idx="minor">
+                          <a:schemeClr val="tx1"/>
+                        </a:fontRef>
+                      </wps:style>
+                      <wps:bodyPr/>
+                    </wps:wsp>
+                  </a:graphicData>
+                </a:graphic>
+              </wp:anchor>
+            </w:drawing>
+          </mc:Choice>
+          <mc:Fallback>
+            <w:pict>
+              <v:shape w14:anchorId="4F922348" id="Conector de Seta Reta 85" o:spid="_x0000_s1026" type="#_x0000_t32" style="position:absolute;margin-left:404.7pt;margin-top:94.6pt;width:37.5pt;height:.75pt;flip:x;z-index:251672576;visibility:visible;mso-wrap-style:square;mso-wrap-distance-left:9pt;mso-wrap-distance-top:0;mso-wrap-distance-right:9pt;mso-wrap-distance-bottom:0;mso-position-horizontal:absolute;mso-position-horizontal-relative:text;mso-position-vertical:absolute;mso-position-vertical-relative:text" o:gfxdata="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" strokecolor="red" strokeweight=".5pt">
+                <v:stroke endarrow="block" joinstyle="miter"/>
+              </v:shape>
+            </w:pict>
+          </mc:Fallback>
+        </mc:AlternateContent>
+      </w:r>
+      <w:r>
+        <w:rPr>
+          <w:noProof/>
+        </w:rPr>
+        <w:drawing>
+          <wp:inline distT="0" distB="0" distL="0" distR="0" wp14:anchorId="49F049F2" wp14:editId="5517873B">
+            <wp:extent cx="3298070" cy="1428750"/>
+            <wp:effectExtent l="0" t="0" r="0" b="0"/>
+            <wp:docPr id="88" name="Imagem 88"/>
+            <wp:cNvGraphicFramePr>
+              <a:graphicFrameLocks xmlns:a="http://schemas.openxmlformats.org/drawingml/2006/main" noChangeAspect="1"/>
+            </wp:cNvGraphicFramePr>
+            <a:graphic xmlns:a="http://schemas.openxmlformats.org/drawingml/2006/main">
+              <a:graphicData uri="http://schemas.openxmlformats.org/drawingml/2006/picture">
+                <pic:pic xmlns:pic="http://schemas.openxmlformats.org/drawingml/2006/picture">
+                  <pic:nvPicPr>
+                    <pic:cNvPr id="1" name=""/>
+                    <pic:cNvPicPr/>
+                  </pic:nvPicPr>
+                  <pic:blipFill>
+                    <a:blip r:embed="rId79"/>
+                    <a:stretch>
+                      <a:fillRect/>
+                    </a:stretch>
+                  </pic:blipFill>
+                  <pic:spPr>
+                    <a:xfrm>
+                      <a:off x="0" y="0"/>
+                      <a:ext cx="3316307" cy="1436650"/>
+                    </a:xfrm>
+                    <a:prstGeom prst="rect">
+                      <a:avLst/>
+                    </a:prstGeom>
+                  </pic:spPr>
+                </pic:pic>
+              </a:graphicData>
+            </a:graphic>
+          </wp:inline>
+        </w:drawing>
+      </w:r>
+      <w:r>
+        <w:rPr>
+          <w:noProof/>
+        </w:rPr>
+        <w:drawing>
+          <wp:inline distT="0" distB="0" distL="0" distR="0" wp14:anchorId="4BB1E7A3" wp14:editId="220EF5B9">
+            <wp:extent cx="1676400" cy="1346851"/>
+            <wp:effectExtent l="0" t="0" r="0" b="5715"/>
+            <wp:docPr id="84" name="Imagem 84"/>
+            <wp:cNvGraphicFramePr>
+              <a:graphicFrameLocks xmlns:a="http://schemas.openxmlformats.org/drawingml/2006/main" noChangeAspect="1"/>
+            </wp:cNvGraphicFramePr>
+            <a:graphic xmlns:a="http://schemas.openxmlformats.org/drawingml/2006/main">
+              <a:graphicData uri="http://schemas.openxmlformats.org/drawingml/2006/picture">
+                <pic:pic xmlns:pic="http://schemas.openxmlformats.org/drawingml/2006/picture">
+                  <pic:nvPicPr>
+                    <pic:cNvPr id="1" name=""/>
+                    <pic:cNvPicPr/>
+                  </pic:nvPicPr>
+                  <pic:blipFill>
+                    <a:blip r:embed="rId80"/>
+                    <a:stretch>
+                      <a:fillRect/>
+                    </a:stretch>
+                  </pic:blipFill>
+                  <pic:spPr>
+                    <a:xfrm>
+                      <a:off x="0" y="0"/>
+                      <a:ext cx="1694260" cy="1361200"/>
+                    </a:xfrm>
+                    <a:prstGeom prst="rect">
+                      <a:avLst/>
+                    </a:prstGeom>
+                  </pic:spPr>
+                </pic:pic>
+              </a:graphicData>
+            </a:graphic>
+          </wp:inline>
+        </w:drawing>
+      </w:r>
+    </w:p>
+    <w:p>
+      <w:pPr>
+        <w:rPr>
+          <w:noProof/>
+        </w:rPr>
+      </w:pPr>
+      <w:r>
+        <w:rPr>
+          <w:noProof/>
+        </w:rPr>
+        <w:t xml:space="preserve">45 </w:t>
+      </w:r>
+      <w:r>
+        <w:rPr>
+          <w:noProof/>
+        </w:rPr>
+        <w:t>–</w:t>
+      </w:r>
+      <w:r>
+        <w:rPr>
+          <w:noProof/>
+        </w:rPr>
+        <w:t xml:space="preserve"> </w:t>
+      </w:r>
+      <w:r>
+        <w:rPr>
+          <w:noProof/>
+        </w:rPr>
+        <w:t>Arredondamos os cantos da borda da nossa lista de produto utilizando “border-radius: 10px;”.</w:t>
+      </w:r>
+    </w:p>
+    <w:p>
+      <w:pPr>
+        <w:rPr>
+          <w:noProof/>
+        </w:rPr>
+      </w:pPr>
+      <w:r>
+        <w:rPr>
+          <w:noProof/>
+        </w:rPr>
+        <w:drawing>
+          <wp:inline distT="0" distB="0" distL="0" distR="0" wp14:anchorId="2A6C900B" wp14:editId="7D426F81">
+            <wp:extent cx="1695450" cy="1438353"/>
+            <wp:effectExtent l="0" t="0" r="0" b="9525"/>
+            <wp:docPr id="89" name="Imagem 89"/>
+            <wp:cNvGraphicFramePr>
+              <a:graphicFrameLocks xmlns:a="http://schemas.openxmlformats.org/drawingml/2006/main" noChangeAspect="1"/>
+            </wp:cNvGraphicFramePr>
+            <a:graphic xmlns:a="http://schemas.openxmlformats.org/drawingml/2006/main">
+              <a:graphicData uri="http://schemas.openxmlformats.org/drawingml/2006/picture">
+                <pic:pic xmlns:pic="http://schemas.openxmlformats.org/drawingml/2006/picture">
+                  <pic:nvPicPr>
+                    <pic:cNvPr id="1" name=""/>
+                    <pic:cNvPicPr/>
+                  </pic:nvPicPr>
+                  <pic:blipFill>
+                    <a:blip r:embed="rId81"/>
+                    <a:stretch>
+                      <a:fillRect/>
+                    </a:stretch>
+                  </pic:blipFill>
+                  <pic:spPr>
+                    <a:xfrm>
+                      <a:off x="0" y="0"/>
+                      <a:ext cx="1705746" cy="1447087"/>
+                    </a:xfrm>
+                    <a:prstGeom prst="rect">
+                      <a:avLst/>
+                    </a:prstGeom>
+                  </pic:spPr>
+                </pic:pic>
+              </a:graphicData>
+            </a:graphic>
+          </wp:inline>
+        </w:drawing>
+      </w:r>
+    </w:p>
+    <w:p>
+      <w:pPr>
+        <w:rPr>
+          <w:noProof/>
+        </w:rPr>
+      </w:pPr>
+      <w:r>
+        <w:rPr>
+          <w:noProof/>
+        </w:rPr>
+        <w:t>46 – Vamos trabalhar com comportamento quando o usuário ao passar o mouse sobre o elemento ele realizará uma ação, nessa situação vamos trabalhar com o menu ao passar o mouse o elemento mudará de cor, utilizando o “hover”.</w:t>
+      </w:r>
+    </w:p>
+    <w:p>
+      <w:pPr>
+        <w:rPr>
+          <w:noProof/>
+        </w:rPr>
+      </w:pPr>
+      <w:r>
+        <w:rPr>
+          <w:noProof/>
+        </w:rPr>
+        <w:drawing>
+          <wp:inline distT="0" distB="0" distL="0" distR="0" wp14:anchorId="69B313EC" wp14:editId="098A98DB">
+            <wp:extent cx="1724025" cy="637139"/>
+            <wp:effectExtent l="0" t="0" r="0" b="0"/>
+            <wp:docPr id="90" name="Imagem 90"/>
+            <wp:cNvGraphicFramePr>
+              <a:graphicFrameLocks xmlns:a="http://schemas.openxmlformats.org/drawingml/2006/main" noChangeAspect="1"/>
+            </wp:cNvGraphicFramePr>
+            <a:graphic xmlns:a="http://schemas.openxmlformats.org/drawingml/2006/main">
+              <a:graphicData uri="http://schemas.openxmlformats.org/drawingml/2006/picture">
+                <pic:pic xmlns:pic="http://schemas.openxmlformats.org/drawingml/2006/picture">
+                  <pic:nvPicPr>
+                    <pic:cNvPr id="1" name=""/>
+                    <pic:cNvPicPr/>
+                  </pic:nvPicPr>
+                  <pic:blipFill>
+                    <a:blip r:embed="rId82"/>
+                    <a:stretch>
+                      <a:fillRect/>
+                    </a:stretch>
+                  </pic:blipFill>
+                  <pic:spPr>
+                    <a:xfrm>
+                      <a:off x="0" y="0"/>
+                      <a:ext cx="1748720" cy="646265"/>
+                    </a:xfrm>
+                    <a:prstGeom prst="rect">
+                      <a:avLst/>
+                    </a:prstGeom>
+                  </pic:spPr>
+                </pic:pic>
+              </a:graphicData>
+            </a:graphic>
+          </wp:inline>
+        </w:drawing>
+      </w:r>
+      <w:r>
+        <w:rPr>
+          <w:noProof/>
+        </w:rPr>
+        <w:drawing>
+          <wp:inline distT="0" distB="0" distL="0" distR="0" wp14:anchorId="4C8E2171" wp14:editId="09FEA97F">
+            <wp:extent cx="3619500" cy="832486"/>
+            <wp:effectExtent l="0" t="0" r="0" b="5715"/>
+            <wp:docPr id="91" name="Imagem 91"/>
+            <wp:cNvGraphicFramePr>
+              <a:graphicFrameLocks xmlns:a="http://schemas.openxmlformats.org/drawingml/2006/main" noChangeAspect="1"/>
+            </wp:cNvGraphicFramePr>
+            <a:graphic xmlns:a="http://schemas.openxmlformats.org/drawingml/2006/main">
+              <a:graphicData uri="http://schemas.openxmlformats.org/drawingml/2006/picture">
+                <pic:pic xmlns:pic="http://schemas.openxmlformats.org/drawingml/2006/picture">
+                  <pic:nvPicPr>
+                    <pic:cNvPr id="1" name=""/>
+                    <pic:cNvPicPr/>
+                  </pic:nvPicPr>
+                  <pic:blipFill>
+                    <a:blip r:embed="rId83"/>
+                    <a:stretch>
+                      <a:fillRect/>
+                    </a:stretch>
+                  </pic:blipFill>
+                  <pic:spPr>
+                    <a:xfrm>
+                      <a:off x="0" y="0"/>
+                      <a:ext cx="3691100" cy="848954"/>
+                    </a:xfrm>
+                    <a:prstGeom prst="rect">
+                      <a:avLst/>
+                    </a:prstGeom>
+                  </pic:spPr>
+                </pic:pic>
+              </a:graphicData>
+            </a:graphic>
+          </wp:inline>
+        </w:drawing>
+      </w:r>
+    </w:p>
+    <w:p>
+      <w:pPr>
+        <w:rPr>
+          <w:noProof/>
+        </w:rPr>
+      </w:pPr>
+      <w:r>
+        <w:rPr>
+          <w:noProof/>
+        </w:rPr>
+        <w:t>47 – Ainda trablhando com “hover” ao passar o mouse adicionamos uma linha em cada item do menu.</w:t>
+      </w:r>
+    </w:p>
+    <w:p>
+      <w:pPr>
+        <w:rPr>
+          <w:noProof/>
+        </w:rPr>
+      </w:pPr>
+      <w:r>
+        <w:rPr>
+          <w:noProof/>
+        </w:rPr>
+        <w:drawing>
+          <wp:inline distT="0" distB="0" distL="0" distR="0" wp14:anchorId="2481B32F" wp14:editId="73C86C8B">
+            <wp:extent cx="3038089" cy="1266825"/>
+            <wp:effectExtent l="0" t="0" r="0" b="0"/>
+            <wp:docPr id="92" name="Imagem 92"/>
+            <wp:cNvGraphicFramePr>
+              <a:graphicFrameLocks xmlns:a="http://schemas.openxmlformats.org/drawingml/2006/main" noChangeAspect="1"/>
+            </wp:cNvGraphicFramePr>
+            <a:graphic xmlns:a="http://schemas.openxmlformats.org/drawingml/2006/main">
+              <a:graphicData uri="http://schemas.openxmlformats.org/drawingml/2006/picture">
+                <pic:pic xmlns:pic="http://schemas.openxmlformats.org/drawingml/2006/picture">
+                  <pic:nvPicPr>
+                    <pic:cNvPr id="1" name=""/>
+                    <pic:cNvPicPr/>
+                  </pic:nvPicPr>
+                  <pic:blipFill>
+                    <a:blip r:embed="rId84"/>
+                    <a:stretch>
+                      <a:fillRect/>
+                    </a:stretch>
+                  </pic:blipFill>
+                  <pic:spPr>
+                    <a:xfrm>
+                      <a:off x="0" y="0"/>
+                      <a:ext cx="3094922" cy="1290523"/>
+                    </a:xfrm>
+                    <a:prstGeom prst="rect">
+                      <a:avLst/>
+                    </a:prstGeom>
+                  </pic:spPr>
+                </pic:pic>
+              </a:graphicData>
+            </a:graphic>
+          </wp:inline>
+        </w:drawing>
+      </w:r>
+    </w:p>
+    <w:p>
+      <w:pPr>
+        <w:rPr>
+          <w:noProof/>
+        </w:rPr>
+      </w:pPr>
+      <w:r>
+        <w:rPr>
+          <w:noProof/>
+        </w:rPr>
+        <w:lastRenderedPageBreak/>
+        <w:t>48 – Mudamos a cor da borda ao passar o mouse.</w:t>
+      </w:r>
+    </w:p>
+    <w:p>
+      <w:pPr>
+        <w:rPr>
+          <w:noProof/>
+        </w:rPr>
+      </w:pPr>
+      <w:r>
+        <w:rPr>
+          <w:noProof/>
+        </w:rPr>
+        <w:drawing>
+          <wp:inline distT="0" distB="0" distL="0" distR="0" wp14:anchorId="4DEE23FE" wp14:editId="50A812B9">
+            <wp:extent cx="2238687" cy="676369"/>
+            <wp:effectExtent l="0" t="0" r="9525" b="9525"/>
+            <wp:docPr id="93" name="Imagem 93"/>
+            <wp:cNvGraphicFramePr>
+              <a:graphicFrameLocks xmlns:a="http://schemas.openxmlformats.org/drawingml/2006/main" noChangeAspect="1"/>
+            </wp:cNvGraphicFramePr>
+            <a:graphic xmlns:a="http://schemas.openxmlformats.org/drawingml/2006/main">
+              <a:graphicData uri="http://schemas.openxmlformats.org/drawingml/2006/picture">
+                <pic:pic xmlns:pic="http://schemas.openxmlformats.org/drawingml/2006/picture">
+                  <pic:nvPicPr>
+                    <pic:cNvPr id="1" name=""/>
+                    <pic:cNvPicPr/>
+                  </pic:nvPicPr>
+                  <pic:blipFill>
+                    <a:blip r:embed="rId85"/>
+                    <a:stretch>
+                      <a:fillRect/>
+                    </a:stretch>
+                  </pic:blipFill>
+                  <pic:spPr>
+                    <a:xfrm>
+                      <a:off x="0" y="0"/>
+                      <a:ext cx="2238687" cy="676369"/>
+                    </a:xfrm>
+                    <a:prstGeom prst="rect">
+                      <a:avLst/>
+                    </a:prstGeom>
+                  </pic:spPr>
+                </pic:pic>
+              </a:graphicData>
+            </a:graphic>
+          </wp:inline>
+        </w:drawing>
+      </w:r>
+    </w:p>
+    <w:p>
+      <w:pPr>
+        <w:rPr>
+          <w:noProof/>
+        </w:rPr>
+      </w:pPr>
+      <w:r>
+        <w:rPr>
+          <w:noProof/>
+        </w:rPr>
+        <w:t xml:space="preserve">49 - </w:t>
       </w:r>
       <w:bookmarkStart w:id="0" w:name="_GoBack"/>
       <w:bookmarkEnd w:id="0"/>
+    </w:p>
+    <w:p>
+      <w:pPr>
+        <w:rPr>
+          <w:noProof/>
+        </w:rPr>
+      </w:pPr>
+    </w:p>
+    <w:p>
+      <w:pPr>
+        <w:rPr>
+          <w:noProof/>
+        </w:rPr>
+      </w:pPr>
+    </w:p>
+    <w:p>
+      <w:pPr>
+        <w:rPr>
+          <w:noProof/>
+        </w:rPr>
+      </w:pPr>
+    </w:p>
+    <w:p>
+      <w:pPr>
+        <w:rPr>
+          <w:noProof/>
+        </w:rPr>
+      </w:pPr>
     </w:p>
     <w:sectPr>
       <w:pgSz w:w="11906" w:h="16838"/>
@@ -6232,7 +7294,7 @@
 </file>
 
 <file path=customXml/itemProps1.xml><?xml version="1.0" encoding="utf-8"?>
-<ds:datastoreItem xmlns:ds="http://schemas.openxmlformats.org/officeDocument/2006/customXml" ds:itemID="{22A922AA-D76C-4A5B-90F4-572B120A1D4A}">
+<ds:datastoreItem xmlns:ds="http://schemas.openxmlformats.org/officeDocument/2006/customXml" ds:itemID="{B5899C54-0AEC-4EB1-BA34-CA9E63F1CB23}">
   <ds:schemaRefs>
     <ds:schemaRef ds:uri="http://schemas.openxmlformats.org/officeDocument/2006/bibliography"/>
   </ds:schemaRefs>

</xml_diff>

<commit_message>
atualizamos mais a pagina na parte do footer e um pouco do main
</commit_message>
<xml_diff>
--- a/Apostila/Projeto Space For Men.docx
+++ b/Apostila/Projeto Space For Men.docx
@@ -6379,7 +6379,425 @@
         <w:rPr>
           <w:noProof/>
         </w:rPr>
-        <w:t xml:space="preserve">49 - </w:t>
+        <w:t xml:space="preserve">49 </w:t>
+      </w:r>
+      <w:r>
+        <w:rPr>
+          <w:noProof/>
+        </w:rPr>
+        <w:t>–</w:t>
+      </w:r>
+      <w:r>
+        <w:rPr>
+          <w:noProof/>
+        </w:rPr>
+        <w:t xml:space="preserve"> </w:t>
+      </w:r>
+      <w:r>
+        <w:rPr>
+          <w:noProof/>
+        </w:rPr>
+        <w:t>Mudamos a cor da borda ao clicarmos.</w:t>
+      </w:r>
+    </w:p>
+    <w:p>
+      <w:pPr>
+        <w:rPr>
+          <w:noProof/>
+        </w:rPr>
+      </w:pPr>
+      <w:r>
+        <w:rPr>
+          <w:noProof/>
+        </w:rPr>
+        <w:drawing>
+          <wp:inline distT="0" distB="0" distL="0" distR="0" wp14:anchorId="4878875E" wp14:editId="589F4969">
+            <wp:extent cx="2267266" cy="562053"/>
+            <wp:effectExtent l="0" t="0" r="0" b="9525"/>
+            <wp:docPr id="69" name="Imagem 69"/>
+            <wp:cNvGraphicFramePr>
+              <a:graphicFrameLocks xmlns:a="http://schemas.openxmlformats.org/drawingml/2006/main" noChangeAspect="1"/>
+            </wp:cNvGraphicFramePr>
+            <a:graphic xmlns:a="http://schemas.openxmlformats.org/drawingml/2006/main">
+              <a:graphicData uri="http://schemas.openxmlformats.org/drawingml/2006/picture">
+                <pic:pic xmlns:pic="http://schemas.openxmlformats.org/drawingml/2006/picture">
+                  <pic:nvPicPr>
+                    <pic:cNvPr id="1" name=""/>
+                    <pic:cNvPicPr/>
+                  </pic:nvPicPr>
+                  <pic:blipFill>
+                    <a:blip r:embed="rId86"/>
+                    <a:stretch>
+                      <a:fillRect/>
+                    </a:stretch>
+                  </pic:blipFill>
+                  <pic:spPr>
+                    <a:xfrm>
+                      <a:off x="0" y="0"/>
+                      <a:ext cx="2267266" cy="562053"/>
+                    </a:xfrm>
+                    <a:prstGeom prst="rect">
+                      <a:avLst/>
+                    </a:prstGeom>
+                  </pic:spPr>
+                </pic:pic>
+              </a:graphicData>
+            </a:graphic>
+          </wp:inline>
+        </w:drawing>
+      </w:r>
+    </w:p>
+    <w:p>
+      <w:pPr>
+        <w:rPr>
+          <w:noProof/>
+        </w:rPr>
+      </w:pPr>
+      <w:r>
+        <w:rPr>
+          <w:noProof/>
+        </w:rPr>
+        <w:t xml:space="preserve">50 </w:t>
+      </w:r>
+      <w:r>
+        <w:rPr>
+          <w:noProof/>
+        </w:rPr>
+        <w:t xml:space="preserve">– Agora vamos deixar a nossa página mais interativa colocando um </w:t>
+      </w:r>
+      <w:r>
+        <w:rPr>
+          <w:noProof/>
+        </w:rPr>
+        <w:t>“</w:t>
+      </w:r>
+      <w:r>
+        <w:rPr>
+          <w:noProof/>
+        </w:rPr>
+        <w:t>hover</w:t>
+      </w:r>
+      <w:r>
+        <w:rPr>
+          <w:noProof/>
+        </w:rPr>
+        <w:t>”</w:t>
+      </w:r>
+      <w:r>
+        <w:rPr>
+          <w:noProof/>
+        </w:rPr>
+        <w:t xml:space="preserve"> no título</w:t>
+      </w:r>
+      <w:r>
+        <w:rPr>
+          <w:noProof/>
+        </w:rPr>
+        <w:t>, ou seja, vamos passar o mouse e ele vai aumentar de tamanho, passando uma impressão que a imagem esta se movendo.</w:t>
+      </w:r>
+      <w:r>
+        <w:rPr>
+          <w:noProof/>
+        </w:rPr>
+        <w:t xml:space="preserve"> </w:t>
+      </w:r>
+    </w:p>
+    <w:p>
+      <w:pPr>
+        <w:rPr>
+          <w:noProof/>
+        </w:rPr>
+      </w:pPr>
+      <w:r>
+        <w:rPr>
+          <w:noProof/>
+        </w:rPr>
+        <w:drawing>
+          <wp:inline distT="0" distB="0" distL="0" distR="0" wp14:anchorId="10D4344F" wp14:editId="56FF781B">
+            <wp:extent cx="1829055" cy="543001"/>
+            <wp:effectExtent l="0" t="0" r="0" b="9525"/>
+            <wp:docPr id="94" name="Imagem 94"/>
+            <wp:cNvGraphicFramePr>
+              <a:graphicFrameLocks xmlns:a="http://schemas.openxmlformats.org/drawingml/2006/main" noChangeAspect="1"/>
+            </wp:cNvGraphicFramePr>
+            <a:graphic xmlns:a="http://schemas.openxmlformats.org/drawingml/2006/main">
+              <a:graphicData uri="http://schemas.openxmlformats.org/drawingml/2006/picture">
+                <pic:pic xmlns:pic="http://schemas.openxmlformats.org/drawingml/2006/picture">
+                  <pic:nvPicPr>
+                    <pic:cNvPr id="1" name=""/>
+                    <pic:cNvPicPr/>
+                  </pic:nvPicPr>
+                  <pic:blipFill>
+                    <a:blip r:embed="rId87"/>
+                    <a:stretch>
+                      <a:fillRect/>
+                    </a:stretch>
+                  </pic:blipFill>
+                  <pic:spPr>
+                    <a:xfrm>
+                      <a:off x="0" y="0"/>
+                      <a:ext cx="1829055" cy="543001"/>
+                    </a:xfrm>
+                    <a:prstGeom prst="rect">
+                      <a:avLst/>
+                    </a:prstGeom>
+                  </pic:spPr>
+                </pic:pic>
+              </a:graphicData>
+            </a:graphic>
+          </wp:inline>
+        </w:drawing>
+      </w:r>
+    </w:p>
+    <w:p>
+      <w:pPr>
+        <w:rPr>
+          <w:noProof/>
+        </w:rPr>
+      </w:pPr>
+      <w:r>
+        <w:rPr>
+          <w:noProof/>
+        </w:rPr>
+        <w:t>51 – Adicionamos uma imagem ao “footer” conforme código.</w:t>
+      </w:r>
+    </w:p>
+    <w:p>
+      <w:pPr>
+        <w:rPr>
+          <w:noProof/>
+        </w:rPr>
+      </w:pPr>
+      <w:r>
+        <w:rPr>
+          <w:noProof/>
+        </w:rPr>
+        <w:drawing>
+          <wp:inline distT="0" distB="0" distL="0" distR="0" wp14:anchorId="61601A94" wp14:editId="7C312B91">
+            <wp:extent cx="3600450" cy="567639"/>
+            <wp:effectExtent l="0" t="0" r="0" b="4445"/>
+            <wp:docPr id="95" name="Imagem 95"/>
+            <wp:cNvGraphicFramePr>
+              <a:graphicFrameLocks xmlns:a="http://schemas.openxmlformats.org/drawingml/2006/main" noChangeAspect="1"/>
+            </wp:cNvGraphicFramePr>
+            <a:graphic xmlns:a="http://schemas.openxmlformats.org/drawingml/2006/main">
+              <a:graphicData uri="http://schemas.openxmlformats.org/drawingml/2006/picture">
+                <pic:pic xmlns:pic="http://schemas.openxmlformats.org/drawingml/2006/picture">
+                  <pic:nvPicPr>
+                    <pic:cNvPr id="1" name=""/>
+                    <pic:cNvPicPr/>
+                  </pic:nvPicPr>
+                  <pic:blipFill>
+                    <a:blip r:embed="rId88"/>
+                    <a:stretch>
+                      <a:fillRect/>
+                    </a:stretch>
+                  </pic:blipFill>
+                  <pic:spPr>
+                    <a:xfrm>
+                      <a:off x="0" y="0"/>
+                      <a:ext cx="3672649" cy="579022"/>
+                    </a:xfrm>
+                    <a:prstGeom prst="rect">
+                      <a:avLst/>
+                    </a:prstGeom>
+                  </pic:spPr>
+                </pic:pic>
+              </a:graphicData>
+            </a:graphic>
+          </wp:inline>
+        </w:drawing>
+      </w:r>
+    </w:p>
+    <w:p>
+      <w:pPr>
+        <w:rPr>
+          <w:noProof/>
+        </w:rPr>
+      </w:pPr>
+      <w:r>
+        <w:rPr>
+          <w:noProof/>
+        </w:rPr>
+        <w:t>52 – Como a imagem do “footer” é branca, precisamos adicionar uma cor de fundo.</w:t>
+      </w:r>
+    </w:p>
+    <w:p>
+      <w:pPr>
+        <w:rPr>
+          <w:noProof/>
+        </w:rPr>
+      </w:pPr>
+      <w:r>
+        <w:rPr>
+          <w:noProof/>
+        </w:rPr>
+        <w:drawing>
+          <wp:inline distT="0" distB="0" distL="0" distR="0" wp14:anchorId="7FC321A4" wp14:editId="7780706F">
+            <wp:extent cx="2266950" cy="616680"/>
+            <wp:effectExtent l="0" t="0" r="0" b="0"/>
+            <wp:docPr id="96" name="Imagem 96"/>
+            <wp:cNvGraphicFramePr>
+              <a:graphicFrameLocks xmlns:a="http://schemas.openxmlformats.org/drawingml/2006/main" noChangeAspect="1"/>
+            </wp:cNvGraphicFramePr>
+            <a:graphic xmlns:a="http://schemas.openxmlformats.org/drawingml/2006/main">
+              <a:graphicData uri="http://schemas.openxmlformats.org/drawingml/2006/picture">
+                <pic:pic xmlns:pic="http://schemas.openxmlformats.org/drawingml/2006/picture">
+                  <pic:nvPicPr>
+                    <pic:cNvPr id="1" name=""/>
+                    <pic:cNvPicPr/>
+                  </pic:nvPicPr>
+                  <pic:blipFill>
+                    <a:blip r:embed="rId89"/>
+                    <a:stretch>
+                      <a:fillRect/>
+                    </a:stretch>
+                  </pic:blipFill>
+                  <pic:spPr>
+                    <a:xfrm>
+                      <a:off x="0" y="0"/>
+                      <a:ext cx="2285723" cy="621787"/>
+                    </a:xfrm>
+                    <a:prstGeom prst="rect">
+                      <a:avLst/>
+                    </a:prstGeom>
+                  </pic:spPr>
+                </pic:pic>
+              </a:graphicData>
+            </a:graphic>
+          </wp:inline>
+        </w:drawing>
+      </w:r>
+    </w:p>
+    <w:p>
+      <w:pPr>
+        <w:rPr>
+          <w:noProof/>
+        </w:rPr>
+      </w:pPr>
+      <w:r>
+        <w:rPr>
+          <w:noProof/>
+        </w:rPr>
+        <w:t xml:space="preserve">53 </w:t>
+      </w:r>
+      <w:r>
+        <w:rPr>
+          <w:noProof/>
+        </w:rPr>
+        <w:t>–</w:t>
+      </w:r>
+      <w:r>
+        <w:rPr>
+          <w:noProof/>
+        </w:rPr>
+        <w:t xml:space="preserve"> </w:t>
+      </w:r>
+      <w:r>
+        <w:rPr>
+          <w:noProof/>
+        </w:rPr>
+        <w:t>Inserimos um parágrafo no “footer” e centralizamos os conteúdos dentro dele.</w:t>
+      </w:r>
+    </w:p>
+    <w:p>
+      <w:pPr>
+        <w:rPr>
+          <w:noProof/>
+        </w:rPr>
+      </w:pPr>
+      <w:r>
+        <w:rPr>
+          <w:noProof/>
+        </w:rPr>
+        <w:drawing>
+          <wp:inline distT="0" distB="0" distL="0" distR="0" wp14:anchorId="1BB57F34" wp14:editId="39905D86">
+            <wp:extent cx="3038475" cy="762000"/>
+            <wp:effectExtent l="0" t="0" r="9525" b="0"/>
+            <wp:docPr id="100" name="Imagem 100"/>
+            <wp:cNvGraphicFramePr>
+              <a:graphicFrameLocks xmlns:a="http://schemas.openxmlformats.org/drawingml/2006/main" noChangeAspect="1"/>
+            </wp:cNvGraphicFramePr>
+            <a:graphic xmlns:a="http://schemas.openxmlformats.org/drawingml/2006/main">
+              <a:graphicData uri="http://schemas.openxmlformats.org/drawingml/2006/picture">
+                <pic:pic xmlns:pic="http://schemas.openxmlformats.org/drawingml/2006/picture">
+                  <pic:nvPicPr>
+                    <pic:cNvPr id="1" name=""/>
+                    <pic:cNvPicPr/>
+                  </pic:nvPicPr>
+                  <pic:blipFill>
+                    <a:blip r:embed="rId90"/>
+                    <a:stretch>
+                      <a:fillRect/>
+                    </a:stretch>
+                  </pic:blipFill>
+                  <pic:spPr>
+                    <a:xfrm>
+                      <a:off x="0" y="0"/>
+                      <a:ext cx="3038902" cy="762107"/>
+                    </a:xfrm>
+                    <a:prstGeom prst="rect">
+                      <a:avLst/>
+                    </a:prstGeom>
+                  </pic:spPr>
+                </pic:pic>
+              </a:graphicData>
+            </a:graphic>
+          </wp:inline>
+        </w:drawing>
+      </w:r>
+      <w:r>
+        <w:rPr>
+          <w:noProof/>
+        </w:rPr>
+        <w:drawing>
+          <wp:inline distT="0" distB="0" distL="0" distR="0" wp14:anchorId="4F3B4586" wp14:editId="4B166C4D">
+            <wp:extent cx="2247900" cy="672729"/>
+            <wp:effectExtent l="0" t="0" r="0" b="0"/>
+            <wp:docPr id="97" name="Imagem 97"/>
+            <wp:cNvGraphicFramePr>
+              <a:graphicFrameLocks xmlns:a="http://schemas.openxmlformats.org/drawingml/2006/main" noChangeAspect="1"/>
+            </wp:cNvGraphicFramePr>
+            <a:graphic xmlns:a="http://schemas.openxmlformats.org/drawingml/2006/main">
+              <a:graphicData uri="http://schemas.openxmlformats.org/drawingml/2006/picture">
+                <pic:pic xmlns:pic="http://schemas.openxmlformats.org/drawingml/2006/picture">
+                  <pic:nvPicPr>
+                    <pic:cNvPr id="1" name=""/>
+                    <pic:cNvPicPr/>
+                  </pic:nvPicPr>
+                  <pic:blipFill>
+                    <a:blip r:embed="rId91"/>
+                    <a:stretch>
+                      <a:fillRect/>
+                    </a:stretch>
+                  </pic:blipFill>
+                  <pic:spPr>
+                    <a:xfrm>
+                      <a:off x="0" y="0"/>
+                      <a:ext cx="2247900" cy="672729"/>
+                    </a:xfrm>
+                    <a:prstGeom prst="rect">
+                      <a:avLst/>
+                    </a:prstGeom>
+                  </pic:spPr>
+                </pic:pic>
+              </a:graphicData>
+            </a:graphic>
+          </wp:inline>
+        </w:drawing>
+      </w:r>
+    </w:p>
+    <w:p>
+      <w:pPr>
+        <w:rPr>
+          <w:noProof/>
+        </w:rPr>
+      </w:pPr>
+      <w:r>
+        <w:rPr>
+          <w:noProof/>
+        </w:rPr>
+        <w:t xml:space="preserve">54 - </w:t>
       </w:r>
       <w:bookmarkStart w:id="0" w:name="_GoBack"/>
       <w:bookmarkEnd w:id="0"/>
@@ -7294,7 +7712,7 @@
 </file>
 
 <file path=customXml/itemProps1.xml><?xml version="1.0" encoding="utf-8"?>
-<ds:datastoreItem xmlns:ds="http://schemas.openxmlformats.org/officeDocument/2006/customXml" ds:itemID="{B5899C54-0AEC-4EB1-BA34-CA9E63F1CB23}">
+<ds:datastoreItem xmlns:ds="http://schemas.openxmlformats.org/officeDocument/2006/customXml" ds:itemID="{3063B0F2-7E09-4802-A319-2E98B1D1B73E}">
   <ds:schemaRefs>
     <ds:schemaRef ds:uri="http://schemas.openxmlformats.org/officeDocument/2006/bibliography"/>
   </ds:schemaRefs>

</xml_diff>

<commit_message>
terminamos a pagina produtos e iniciamos a pagina contatos
</commit_message>
<xml_diff>
--- a/Apostila/Projeto Space For Men.docx
+++ b/Apostila/Projeto Space For Men.docx
@@ -6734,7 +6734,7 @@
                   <pic:spPr>
                     <a:xfrm>
                       <a:off x="0" y="0"/>
-                      <a:ext cx="3038902" cy="762107"/>
+                      <a:ext cx="3038475" cy="762000"/>
                     </a:xfrm>
                     <a:prstGeom prst="rect">
                       <a:avLst/>
@@ -6797,38 +6797,744 @@
         <w:rPr>
           <w:noProof/>
         </w:rPr>
+        <mc:AlternateContent>
+          <mc:Choice Requires="wps">
+            <w:drawing>
+              <wp:anchor distT="0" distB="0" distL="114300" distR="114300" simplePos="0" relativeHeight="251676672" behindDoc="0" locked="0" layoutInCell="1" allowOverlap="1">
+                <wp:simplePos x="0" y="0"/>
+                <wp:positionH relativeFrom="column">
+                  <wp:posOffset>996315</wp:posOffset>
+                </wp:positionH>
+                <wp:positionV relativeFrom="paragraph">
+                  <wp:posOffset>397510</wp:posOffset>
+                </wp:positionV>
+                <wp:extent cx="1333500" cy="1104900"/>
+                <wp:effectExtent l="0" t="0" r="76200" b="57150"/>
+                <wp:wrapNone/>
+                <wp:docPr id="101" name="Conector de Seta Reta 101"/>
+                <wp:cNvGraphicFramePr/>
+                <a:graphic xmlns:a="http://schemas.openxmlformats.org/drawingml/2006/main">
+                  <a:graphicData uri="http://schemas.microsoft.com/office/word/2010/wordprocessingShape">
+                    <wps:wsp>
+                      <wps:cNvCnPr/>
+                      <wps:spPr>
+                        <a:xfrm>
+                          <a:off x="0" y="0"/>
+                          <a:ext cx="1333500" cy="1104900"/>
+                        </a:xfrm>
+                        <a:prstGeom prst="straightConnector1">
+                          <a:avLst/>
+                        </a:prstGeom>
+                        <a:ln>
+                          <a:solidFill>
+                            <a:srgbClr val="FF0000"/>
+                          </a:solidFill>
+                          <a:tailEnd type="triangle"/>
+                        </a:ln>
+                      </wps:spPr>
+                      <wps:style>
+                        <a:lnRef idx="1">
+                          <a:schemeClr val="accent1"/>
+                        </a:lnRef>
+                        <a:fillRef idx="0">
+                          <a:schemeClr val="accent1"/>
+                        </a:fillRef>
+                        <a:effectRef idx="0">
+                          <a:schemeClr val="accent1"/>
+                        </a:effectRef>
+                        <a:fontRef idx="minor">
+                          <a:schemeClr val="tx1"/>
+                        </a:fontRef>
+                      </wps:style>
+                      <wps:bodyPr/>
+                    </wps:wsp>
+                  </a:graphicData>
+                </a:graphic>
+              </wp:anchor>
+            </w:drawing>
+          </mc:Choice>
+          <mc:Fallback>
+            <w:pict>
+              <v:shapetype w14:anchorId="33FAA8AC" id="_x0000_t32" coordsize="21600,21600" o:spt="32" o:oned="t" path="m,l21600,21600e" filled="f">
+                <v:path arrowok="t" fillok="f" o:connecttype="none"/>
+                <o:lock v:ext="edit" shapetype="t"/>
+              </v:shapetype>
+              <v:shape id="Conector de Seta Reta 101" o:spid="_x0000_s1026" type="#_x0000_t32" style="position:absolute;margin-left:78.45pt;margin-top:31.3pt;width:105pt;height:87pt;z-index:251676672;visibility:visible;mso-wrap-style:square;mso-wrap-distance-left:9pt;mso-wrap-distance-top:0;mso-wrap-distance-right:9pt;mso-wrap-distance-bottom:0;mso-position-horizontal:absolute;mso-position-horizontal-relative:text;mso-position-vertical:absolute;mso-position-vertical-relative:text" o:gfxdata="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" strokecolor="red" strokeweight=".5pt">
+                <v:stroke endarrow="block" joinstyle="miter"/>
+              </v:shape>
+            </w:pict>
+          </mc:Fallback>
+        </mc:AlternateContent>
+      </w:r>
+      <w:r>
+        <w:rPr>
+          <w:noProof/>
+        </w:rPr>
         <w:t xml:space="preserve">54 - </w:t>
+      </w:r>
+      <w:r>
+        <w:rPr>
+          <w:noProof/>
+        </w:rPr>
+        <w:t xml:space="preserve"> inserimos uma imagem de f</w:t>
+      </w:r>
+      <w:r>
+        <w:rPr>
+          <w:noProof/>
+        </w:rPr>
+        <w:t>u</w:t>
+      </w:r>
+      <w:r>
+        <w:rPr>
+          <w:noProof/>
+        </w:rPr>
+        <w:t>ndo no site</w:t>
+      </w:r>
+      <w:r>
+        <w:rPr>
+          <w:noProof/>
+        </w:rPr>
+        <w:t>,</w:t>
+      </w:r>
+      <w:r>
+        <w:rPr>
+          <w:noProof/>
+        </w:rPr>
+        <w:t xml:space="preserve"> ao contrário do </w:t>
+      </w:r>
+      <w:r>
+        <w:rPr>
+          <w:noProof/>
+        </w:rPr>
+        <w:t>“</w:t>
+      </w:r>
+      <w:r>
+        <w:rPr>
+          <w:noProof/>
+        </w:rPr>
+        <w:t>html</w:t>
+      </w:r>
+      <w:r>
+        <w:rPr>
+          <w:noProof/>
+        </w:rPr>
+        <w:t>”</w:t>
+      </w:r>
+      <w:r>
+        <w:rPr>
+          <w:noProof/>
+        </w:rPr>
+        <w:t xml:space="preserve"> colocamos uma imagem de fundo pelo </w:t>
+      </w:r>
+      <w:r>
+        <w:rPr>
+          <w:noProof/>
+        </w:rPr>
+        <w:t>“</w:t>
+      </w:r>
+      <w:r>
+        <w:rPr>
+          <w:noProof/>
+        </w:rPr>
+        <w:t>css</w:t>
+      </w:r>
+      <w:r>
+        <w:rPr>
+          <w:noProof/>
+        </w:rPr>
+        <w:t>”</w:t>
+      </w:r>
+      <w:r>
+        <w:rPr>
+          <w:noProof/>
+        </w:rPr>
+        <w:t xml:space="preserve"> e</w:t>
+      </w:r>
+      <w:r>
+        <w:rPr>
+          <w:noProof/>
+        </w:rPr>
+        <w:t>,</w:t>
+      </w:r>
+      <w:r>
+        <w:rPr>
+          <w:noProof/>
+        </w:rPr>
+        <w:t xml:space="preserve"> quando realizamos </w:t>
+      </w:r>
+      <w:r>
+        <w:rPr>
+          <w:noProof/>
+        </w:rPr>
+        <w:t xml:space="preserve">tal função a natureza da imagem e ficar se repetindo no site. </w:t>
+      </w:r>
+    </w:p>
+    <w:p>
+      <w:pPr>
+        <w:rPr>
+          <w:noProof/>
+        </w:rPr>
+      </w:pPr>
+      <w:r>
+        <w:rPr>
+          <w:noProof/>
+        </w:rPr>
+        <mc:AlternateContent>
+          <mc:Choice Requires="wps">
+            <w:drawing>
+              <wp:anchor distT="0" distB="0" distL="114300" distR="114300" simplePos="0" relativeHeight="251675648" behindDoc="0" locked="0" layoutInCell="1" allowOverlap="1">
+                <wp:simplePos x="0" y="0"/>
+                <wp:positionH relativeFrom="column">
+                  <wp:posOffset>158115</wp:posOffset>
+                </wp:positionH>
+                <wp:positionV relativeFrom="paragraph">
+                  <wp:posOffset>314960</wp:posOffset>
+                </wp:positionV>
+                <wp:extent cx="200025" cy="809625"/>
+                <wp:effectExtent l="0" t="0" r="66675" b="47625"/>
+                <wp:wrapNone/>
+                <wp:docPr id="99" name="Conector de Seta Reta 99"/>
+                <wp:cNvGraphicFramePr/>
+                <a:graphic xmlns:a="http://schemas.openxmlformats.org/drawingml/2006/main">
+                  <a:graphicData uri="http://schemas.microsoft.com/office/word/2010/wordprocessingShape">
+                    <wps:wsp>
+                      <wps:cNvCnPr/>
+                      <wps:spPr>
+                        <a:xfrm>
+                          <a:off x="0" y="0"/>
+                          <a:ext cx="200025" cy="809625"/>
+                        </a:xfrm>
+                        <a:prstGeom prst="straightConnector1">
+                          <a:avLst/>
+                        </a:prstGeom>
+                        <a:ln>
+                          <a:solidFill>
+                            <a:srgbClr val="FF0000"/>
+                          </a:solidFill>
+                          <a:tailEnd type="triangle"/>
+                        </a:ln>
+                      </wps:spPr>
+                      <wps:style>
+                        <a:lnRef idx="1">
+                          <a:schemeClr val="accent1"/>
+                        </a:lnRef>
+                        <a:fillRef idx="0">
+                          <a:schemeClr val="accent1"/>
+                        </a:fillRef>
+                        <a:effectRef idx="0">
+                          <a:schemeClr val="accent1"/>
+                        </a:effectRef>
+                        <a:fontRef idx="minor">
+                          <a:schemeClr val="tx1"/>
+                        </a:fontRef>
+                      </wps:style>
+                      <wps:bodyPr/>
+                    </wps:wsp>
+                  </a:graphicData>
+                </a:graphic>
+              </wp:anchor>
+            </w:drawing>
+          </mc:Choice>
+          <mc:Fallback>
+            <w:pict>
+              <v:shape w14:anchorId="4C87B208" id="Conector de Seta Reta 99" o:spid="_x0000_s1026" type="#_x0000_t32" style="position:absolute;margin-left:12.45pt;margin-top:24.8pt;width:15.75pt;height:63.75pt;z-index:251675648;visibility:visible;mso-wrap-style:square;mso-wrap-distance-left:9pt;mso-wrap-distance-top:0;mso-wrap-distance-right:9pt;mso-wrap-distance-bottom:0;mso-position-horizontal:absolute;mso-position-horizontal-relative:text;mso-position-vertical:absolute;mso-position-vertical-relative:text" o:gfxdata="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" strokecolor="red" strokeweight=".5pt">
+                <v:stroke endarrow="block" joinstyle="miter"/>
+              </v:shape>
+            </w:pict>
+          </mc:Fallback>
+        </mc:AlternateContent>
+      </w:r>
+      <w:r>
+        <w:rPr>
+          <w:noProof/>
+        </w:rPr>
+        <w:t>Se não quisermos que isso aconteça precisamos adicionar o comando: “background-repeat: no-repeat;”.</w:t>
+      </w:r>
+    </w:p>
+    <w:p>
+      <w:pPr>
+        <w:rPr>
+          <w:noProof/>
+        </w:rPr>
+      </w:pPr>
+      <w:r>
+        <w:rPr>
+          <w:noProof/>
+        </w:rPr>
+        <w:drawing>
+          <wp:inline distT="0" distB="0" distL="0" distR="0" wp14:anchorId="069B4CFA" wp14:editId="7AE87426">
+            <wp:extent cx="3438525" cy="1011198"/>
+            <wp:effectExtent l="0" t="0" r="0" b="0"/>
+            <wp:docPr id="98" name="Imagem 98"/>
+            <wp:cNvGraphicFramePr>
+              <a:graphicFrameLocks xmlns:a="http://schemas.openxmlformats.org/drawingml/2006/main" noChangeAspect="1"/>
+            </wp:cNvGraphicFramePr>
+            <a:graphic xmlns:a="http://schemas.openxmlformats.org/drawingml/2006/main">
+              <a:graphicData uri="http://schemas.openxmlformats.org/drawingml/2006/picture">
+                <pic:pic xmlns:pic="http://schemas.openxmlformats.org/drawingml/2006/picture">
+                  <pic:nvPicPr>
+                    <pic:cNvPr id="1" name=""/>
+                    <pic:cNvPicPr/>
+                  </pic:nvPicPr>
+                  <pic:blipFill>
+                    <a:blip r:embed="rId92"/>
+                    <a:stretch>
+                      <a:fillRect/>
+                    </a:stretch>
+                  </pic:blipFill>
+                  <pic:spPr>
+                    <a:xfrm>
+                      <a:off x="0" y="0"/>
+                      <a:ext cx="3836997" cy="1128380"/>
+                    </a:xfrm>
+                    <a:prstGeom prst="rect">
+                      <a:avLst/>
+                    </a:prstGeom>
+                  </pic:spPr>
+                </pic:pic>
+              </a:graphicData>
+            </a:graphic>
+          </wp:inline>
+        </w:drawing>
+      </w:r>
+    </w:p>
+    <w:p>
+      <w:pPr>
+        <w:rPr>
+          <w:noProof/>
+        </w:rPr>
+      </w:pPr>
+      <w:r>
+        <w:rPr>
+          <w:noProof/>
+        </w:rPr>
+        <w:lastRenderedPageBreak/>
+        <mc:AlternateContent>
+          <mc:Choice Requires="wps">
+            <w:drawing>
+              <wp:anchor distT="0" distB="0" distL="114300" distR="114300" simplePos="0" relativeHeight="251677696" behindDoc="0" locked="0" layoutInCell="1" allowOverlap="1">
+                <wp:simplePos x="0" y="0"/>
+                <wp:positionH relativeFrom="column">
+                  <wp:posOffset>1243965</wp:posOffset>
+                </wp:positionH>
+                <wp:positionV relativeFrom="paragraph">
+                  <wp:posOffset>186055</wp:posOffset>
+                </wp:positionV>
+                <wp:extent cx="3924300" cy="1371600"/>
+                <wp:effectExtent l="38100" t="0" r="19050" b="76200"/>
+                <wp:wrapNone/>
+                <wp:docPr id="103" name="Conector de Seta Reta 103"/>
+                <wp:cNvGraphicFramePr/>
+                <a:graphic xmlns:a="http://schemas.openxmlformats.org/drawingml/2006/main">
+                  <a:graphicData uri="http://schemas.microsoft.com/office/word/2010/wordprocessingShape">
+                    <wps:wsp>
+                      <wps:cNvCnPr/>
+                      <wps:spPr>
+                        <a:xfrm flipH="1">
+                          <a:off x="0" y="0"/>
+                          <a:ext cx="3924300" cy="1371600"/>
+                        </a:xfrm>
+                        <a:prstGeom prst="straightConnector1">
+                          <a:avLst/>
+                        </a:prstGeom>
+                        <a:ln>
+                          <a:solidFill>
+                            <a:srgbClr val="FF0000"/>
+                          </a:solidFill>
+                          <a:tailEnd type="triangle"/>
+                        </a:ln>
+                      </wps:spPr>
+                      <wps:style>
+                        <a:lnRef idx="1">
+                          <a:schemeClr val="accent1"/>
+                        </a:lnRef>
+                        <a:fillRef idx="0">
+                          <a:schemeClr val="accent1"/>
+                        </a:fillRef>
+                        <a:effectRef idx="0">
+                          <a:schemeClr val="accent1"/>
+                        </a:effectRef>
+                        <a:fontRef idx="minor">
+                          <a:schemeClr val="tx1"/>
+                        </a:fontRef>
+                      </wps:style>
+                      <wps:bodyPr/>
+                    </wps:wsp>
+                  </a:graphicData>
+                </a:graphic>
+              </wp:anchor>
+            </w:drawing>
+          </mc:Choice>
+          <mc:Fallback>
+            <w:pict>
+              <v:shape w14:anchorId="65426AE1" id="Conector de Seta Reta 103" o:spid="_x0000_s1026" type="#_x0000_t32" style="position:absolute;margin-left:97.95pt;margin-top:14.65pt;width:309pt;height:108pt;flip:x;z-index:251677696;visibility:visible;mso-wrap-style:square;mso-wrap-distance-left:9pt;mso-wrap-distance-top:0;mso-wrap-distance-right:9pt;mso-wrap-distance-bottom:0;mso-position-horizontal:absolute;mso-position-horizontal-relative:text;mso-position-vertical:absolute;mso-position-vertical-relative:text" o:gfxdata="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" strokecolor="red" strokeweight=".5pt">
+                <v:stroke endarrow="block" joinstyle="miter"/>
+              </v:shape>
+            </w:pict>
+          </mc:Fallback>
+        </mc:AlternateContent>
+      </w:r>
+      <w:r>
+        <w:rPr>
+          <w:noProof/>
+        </w:rPr>
+        <w:t xml:space="preserve">55 </w:t>
+      </w:r>
+      <w:r>
+        <w:rPr>
+          <w:noProof/>
+        </w:rPr>
+        <w:t>–</w:t>
+      </w:r>
+      <w:r>
+        <w:rPr>
+          <w:noProof/>
+        </w:rPr>
+        <w:t xml:space="preserve"> </w:t>
+      </w:r>
+      <w:r>
+        <w:rPr>
+          <w:noProof/>
+        </w:rPr>
+        <w:t xml:space="preserve">No “footer” após colocarmos uma imagem de fundo preta se fez necessário mudar a cor da letra no parágrafo. </w:t>
+      </w:r>
+    </w:p>
+    <w:p>
+      <w:pPr>
+        <w:rPr>
+          <w:noProof/>
+        </w:rPr>
+      </w:pPr>
+      <w:r>
+        <w:rPr>
+          <w:noProof/>
+        </w:rPr>
+        <mc:AlternateContent>
+          <mc:Choice Requires="wps">
+            <w:drawing>
+              <wp:anchor distT="0" distB="0" distL="114300" distR="114300" simplePos="0" relativeHeight="251679744" behindDoc="0" locked="0" layoutInCell="1" allowOverlap="1">
+                <wp:simplePos x="0" y="0"/>
+                <wp:positionH relativeFrom="column">
+                  <wp:posOffset>1443990</wp:posOffset>
+                </wp:positionH>
+                <wp:positionV relativeFrom="paragraph">
+                  <wp:posOffset>259079</wp:posOffset>
+                </wp:positionV>
+                <wp:extent cx="3476625" cy="1209675"/>
+                <wp:effectExtent l="38100" t="0" r="28575" b="66675"/>
+                <wp:wrapNone/>
+                <wp:docPr id="106" name="Conector de Seta Reta 106"/>
+                <wp:cNvGraphicFramePr/>
+                <a:graphic xmlns:a="http://schemas.openxmlformats.org/drawingml/2006/main">
+                  <a:graphicData uri="http://schemas.microsoft.com/office/word/2010/wordprocessingShape">
+                    <wps:wsp>
+                      <wps:cNvCnPr/>
+                      <wps:spPr>
+                        <a:xfrm flipH="1">
+                          <a:off x="0" y="0"/>
+                          <a:ext cx="3476625" cy="1209675"/>
+                        </a:xfrm>
+                        <a:prstGeom prst="straightConnector1">
+                          <a:avLst/>
+                        </a:prstGeom>
+                        <a:ln>
+                          <a:solidFill>
+                            <a:srgbClr val="FF0000"/>
+                          </a:solidFill>
+                          <a:tailEnd type="triangle"/>
+                        </a:ln>
+                      </wps:spPr>
+                      <wps:style>
+                        <a:lnRef idx="1">
+                          <a:schemeClr val="accent1"/>
+                        </a:lnRef>
+                        <a:fillRef idx="0">
+                          <a:schemeClr val="accent1"/>
+                        </a:fillRef>
+                        <a:effectRef idx="0">
+                          <a:schemeClr val="accent1"/>
+                        </a:effectRef>
+                        <a:fontRef idx="minor">
+                          <a:schemeClr val="tx1"/>
+                        </a:fontRef>
+                      </wps:style>
+                      <wps:bodyPr/>
+                    </wps:wsp>
+                  </a:graphicData>
+                </a:graphic>
+              </wp:anchor>
+            </w:drawing>
+          </mc:Choice>
+          <mc:Fallback>
+            <w:pict>
+              <v:shape w14:anchorId="5EA9ABDA" id="Conector de Seta Reta 106" o:spid="_x0000_s1026" type="#_x0000_t32" style="position:absolute;margin-left:113.7pt;margin-top:20.4pt;width:273.75pt;height:95.25pt;flip:x;z-index:251679744;visibility:visible;mso-wrap-style:square;mso-wrap-distance-left:9pt;mso-wrap-distance-top:0;mso-wrap-distance-right:9pt;mso-wrap-distance-bottom:0;mso-position-horizontal:absolute;mso-position-horizontal-relative:text;mso-position-vertical:absolute;mso-position-vertical-relative:text" o:gfxdata="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" strokecolor="red" strokeweight=".5pt">
+                <v:stroke endarrow="block" joinstyle="miter"/>
+              </v:shape>
+            </w:pict>
+          </mc:Fallback>
+        </mc:AlternateContent>
+      </w:r>
+      <w:r>
+        <w:rPr>
+          <w:noProof/>
+        </w:rPr>
+        <mc:AlternateContent>
+          <mc:Choice Requires="wps">
+            <w:drawing>
+              <wp:anchor distT="0" distB="0" distL="114300" distR="114300" simplePos="0" relativeHeight="251678720" behindDoc="0" locked="0" layoutInCell="1" allowOverlap="1">
+                <wp:simplePos x="0" y="0"/>
+                <wp:positionH relativeFrom="column">
+                  <wp:posOffset>424815</wp:posOffset>
+                </wp:positionH>
+                <wp:positionV relativeFrom="paragraph">
+                  <wp:posOffset>192404</wp:posOffset>
+                </wp:positionV>
+                <wp:extent cx="333375" cy="1057275"/>
+                <wp:effectExtent l="0" t="0" r="66675" b="47625"/>
+                <wp:wrapNone/>
+                <wp:docPr id="105" name="Conector de Seta Reta 105"/>
+                <wp:cNvGraphicFramePr/>
+                <a:graphic xmlns:a="http://schemas.openxmlformats.org/drawingml/2006/main">
+                  <a:graphicData uri="http://schemas.microsoft.com/office/word/2010/wordprocessingShape">
+                    <wps:wsp>
+                      <wps:cNvCnPr/>
+                      <wps:spPr>
+                        <a:xfrm>
+                          <a:off x="0" y="0"/>
+                          <a:ext cx="333375" cy="1057275"/>
+                        </a:xfrm>
+                        <a:prstGeom prst="straightConnector1">
+                          <a:avLst/>
+                        </a:prstGeom>
+                        <a:ln>
+                          <a:solidFill>
+                            <a:srgbClr val="FF0000"/>
+                          </a:solidFill>
+                          <a:tailEnd type="triangle"/>
+                        </a:ln>
+                      </wps:spPr>
+                      <wps:style>
+                        <a:lnRef idx="1">
+                          <a:schemeClr val="accent1"/>
+                        </a:lnRef>
+                        <a:fillRef idx="0">
+                          <a:schemeClr val="accent1"/>
+                        </a:fillRef>
+                        <a:effectRef idx="0">
+                          <a:schemeClr val="accent1"/>
+                        </a:effectRef>
+                        <a:fontRef idx="minor">
+                          <a:schemeClr val="tx1"/>
+                        </a:fontRef>
+                      </wps:style>
+                      <wps:bodyPr/>
+                    </wps:wsp>
+                  </a:graphicData>
+                </a:graphic>
+              </wp:anchor>
+            </w:drawing>
+          </mc:Choice>
+          <mc:Fallback>
+            <w:pict>
+              <v:shape w14:anchorId="1B5DD400" id="Conector de Seta Reta 105" o:spid="_x0000_s1026" type="#_x0000_t32" style="position:absolute;margin-left:33.45pt;margin-top:15.15pt;width:26.25pt;height:83.25pt;z-index:251678720;visibility:visible;mso-wrap-style:square;mso-wrap-distance-left:9pt;mso-wrap-distance-top:0;mso-wrap-distance-right:9pt;mso-wrap-distance-bottom:0;mso-position-horizontal:absolute;mso-position-horizontal-relative:text;mso-position-vertical:absolute;mso-position-vertical-relative:text" o:gfxdata="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" strokecolor="red" strokeweight=".5pt">
+                <v:stroke endarrow="block" joinstyle="miter"/>
+              </v:shape>
+            </w:pict>
+          </mc:Fallback>
+        </mc:AlternateContent>
+      </w:r>
+      <w:r>
+        <w:rPr>
+          <w:noProof/>
+        </w:rPr>
+        <w:t>Aumentamos o espaço interno tanto para cima como para baixo e, diminuímos o tamanho da fonte.</w:t>
+      </w:r>
+    </w:p>
+    <w:p>
+      <w:pPr>
+        <w:rPr>
+          <w:noProof/>
+        </w:rPr>
+      </w:pPr>
+      <w:r>
+        <w:rPr>
+          <w:noProof/>
+        </w:rPr>
+        <w:drawing>
+          <wp:inline distT="0" distB="0" distL="0" distR="0" wp14:anchorId="51148F59" wp14:editId="5C9C759B">
+            <wp:extent cx="2857500" cy="1375832"/>
+            <wp:effectExtent l="0" t="0" r="0" b="0"/>
+            <wp:docPr id="102" name="Imagem 102"/>
+            <wp:cNvGraphicFramePr>
+              <a:graphicFrameLocks xmlns:a="http://schemas.openxmlformats.org/drawingml/2006/main" noChangeAspect="1"/>
+            </wp:cNvGraphicFramePr>
+            <a:graphic xmlns:a="http://schemas.openxmlformats.org/drawingml/2006/main">
+              <a:graphicData uri="http://schemas.openxmlformats.org/drawingml/2006/picture">
+                <pic:pic xmlns:pic="http://schemas.openxmlformats.org/drawingml/2006/picture">
+                  <pic:nvPicPr>
+                    <pic:cNvPr id="1" name=""/>
+                    <pic:cNvPicPr/>
+                  </pic:nvPicPr>
+                  <pic:blipFill>
+                    <a:blip r:embed="rId93"/>
+                    <a:stretch>
+                      <a:fillRect/>
+                    </a:stretch>
+                  </pic:blipFill>
+                  <pic:spPr>
+                    <a:xfrm>
+                      <a:off x="0" y="0"/>
+                      <a:ext cx="2870387" cy="1382037"/>
+                    </a:xfrm>
+                    <a:prstGeom prst="rect">
+                      <a:avLst/>
+                    </a:prstGeom>
+                  </pic:spPr>
+                </pic:pic>
+              </a:graphicData>
+            </a:graphic>
+          </wp:inline>
+        </w:drawing>
+      </w:r>
+    </w:p>
+    <w:p>
+      <w:pPr>
+        <w:rPr>
+          <w:noProof/>
+        </w:rPr>
+      </w:pPr>
+      <w:r>
+        <w:rPr>
+          <w:noProof/>
+        </w:rPr>
+        <w:t xml:space="preserve">56 </w:t>
+      </w:r>
+      <w:r>
+        <w:rPr>
+          <w:noProof/>
+        </w:rPr>
+        <w:t>–</w:t>
+      </w:r>
+      <w:r>
+        <w:rPr>
+          <w:noProof/>
+        </w:rPr>
+        <w:t xml:space="preserve"> </w:t>
+      </w:r>
+      <w:r>
+        <w:rPr>
+          <w:noProof/>
+        </w:rPr>
+        <w:t>Criamos a página “contatos.html” e “contatos.css”. Copiamos o cabeçalho (header) da página “produtos.html” e colamos na página “contatos.html” e repetimos o mesmo processo n</w:t>
       </w:r>
       <w:bookmarkStart w:id="0" w:name="_GoBack"/>
       <w:bookmarkEnd w:id="0"/>
-    </w:p>
-    <w:p>
-      <w:pPr>
-        <w:rPr>
-          <w:noProof/>
-        </w:rPr>
-      </w:pPr>
-    </w:p>
-    <w:p>
-      <w:pPr>
-        <w:rPr>
-          <w:noProof/>
-        </w:rPr>
-      </w:pPr>
-    </w:p>
-    <w:p>
-      <w:pPr>
-        <w:rPr>
-          <w:noProof/>
-        </w:rPr>
-      </w:pPr>
-    </w:p>
-    <w:p>
-      <w:pPr>
-        <w:rPr>
-          <w:noProof/>
-        </w:rPr>
-      </w:pPr>
+      <w:r>
+        <w:rPr>
+          <w:noProof/>
+        </w:rPr>
+        <w:t>o css. Com isso finalizamos o menu que já estava pronto.</w:t>
+      </w:r>
+    </w:p>
+    <w:p>
+      <w:pPr>
+        <w:rPr>
+          <w:noProof/>
+        </w:rPr>
+      </w:pPr>
+      <w:r>
+        <w:rPr>
+          <w:noProof/>
+        </w:rPr>
+        <w:drawing>
+          <wp:inline distT="0" distB="0" distL="0" distR="0" wp14:anchorId="0246C1F6" wp14:editId="1D7FC91C">
+            <wp:extent cx="2432761" cy="1104900"/>
+            <wp:effectExtent l="0" t="0" r="5715" b="0"/>
+            <wp:docPr id="107" name="Imagem 107"/>
+            <wp:cNvGraphicFramePr>
+              <a:graphicFrameLocks xmlns:a="http://schemas.openxmlformats.org/drawingml/2006/main" noChangeAspect="1"/>
+            </wp:cNvGraphicFramePr>
+            <a:graphic xmlns:a="http://schemas.openxmlformats.org/drawingml/2006/main">
+              <a:graphicData uri="http://schemas.openxmlformats.org/drawingml/2006/picture">
+                <pic:pic xmlns:pic="http://schemas.openxmlformats.org/drawingml/2006/picture">
+                  <pic:nvPicPr>
+                    <pic:cNvPr id="1" name=""/>
+                    <pic:cNvPicPr/>
+                  </pic:nvPicPr>
+                  <pic:blipFill>
+                    <a:blip r:embed="rId94"/>
+                    <a:stretch>
+                      <a:fillRect/>
+                    </a:stretch>
+                  </pic:blipFill>
+                  <pic:spPr>
+                    <a:xfrm>
+                      <a:off x="0" y="0"/>
+                      <a:ext cx="2449913" cy="1112690"/>
+                    </a:xfrm>
+                    <a:prstGeom prst="rect">
+                      <a:avLst/>
+                    </a:prstGeom>
+                  </pic:spPr>
+                </pic:pic>
+              </a:graphicData>
+            </a:graphic>
+          </wp:inline>
+        </w:drawing>
+      </w:r>
+      <w:r>
+        <w:rPr>
+          <w:noProof/>
+        </w:rPr>
+        <w:drawing>
+          <wp:inline distT="0" distB="0" distL="0" distR="0" wp14:anchorId="1F9496BA" wp14:editId="6E2A96EF">
+            <wp:extent cx="1093210" cy="2721269"/>
+            <wp:effectExtent l="5080" t="0" r="0" b="0"/>
+            <wp:docPr id="108" name="Imagem 108"/>
+            <wp:cNvGraphicFramePr>
+              <a:graphicFrameLocks xmlns:a="http://schemas.openxmlformats.org/drawingml/2006/main" noChangeAspect="1"/>
+            </wp:cNvGraphicFramePr>
+            <a:graphic xmlns:a="http://schemas.openxmlformats.org/drawingml/2006/main">
+              <a:graphicData uri="http://schemas.openxmlformats.org/drawingml/2006/picture">
+                <pic:pic xmlns:pic="http://schemas.openxmlformats.org/drawingml/2006/picture">
+                  <pic:nvPicPr>
+                    <pic:cNvPr id="1" name=""/>
+                    <pic:cNvPicPr/>
+                  </pic:nvPicPr>
+                  <pic:blipFill>
+                    <a:blip r:embed="rId95"/>
+                    <a:stretch>
+                      <a:fillRect/>
+                    </a:stretch>
+                  </pic:blipFill>
+                  <pic:spPr>
+                    <a:xfrm rot="5400000">
+                      <a:off x="0" y="0"/>
+                      <a:ext cx="1122595" cy="2794416"/>
+                    </a:xfrm>
+                    <a:prstGeom prst="rect">
+                      <a:avLst/>
+                    </a:prstGeom>
+                  </pic:spPr>
+                </pic:pic>
+              </a:graphicData>
+            </a:graphic>
+          </wp:inline>
+        </w:drawing>
+      </w:r>
+    </w:p>
+    <w:p>
+      <w:pPr>
+        <w:rPr>
+          <w:noProof/>
+        </w:rPr>
+      </w:pPr>
+      <w:r>
+        <w:rPr>
+          <w:noProof/>
+        </w:rPr>
+        <w:t xml:space="preserve">57 - </w:t>
+      </w:r>
     </w:p>
     <w:sectPr>
       <w:pgSz w:w="11906" w:h="16838"/>
@@ -7712,7 +8418,7 @@
 </file>
 
 <file path=customXml/itemProps1.xml><?xml version="1.0" encoding="utf-8"?>
-<ds:datastoreItem xmlns:ds="http://schemas.openxmlformats.org/officeDocument/2006/customXml" ds:itemID="{3063B0F2-7E09-4802-A319-2E98B1D1B73E}">
+<ds:datastoreItem xmlns:ds="http://schemas.openxmlformats.org/officeDocument/2006/customXml" ds:itemID="{0CCA935D-1358-43A1-96A8-4F27FB87FB53}">
   <ds:schemaRefs>
     <ds:schemaRef ds:uri="http://schemas.openxmlformats.org/officeDocument/2006/bibliography"/>
   </ds:schemaRefs>

</xml_diff>

<commit_message>
adicionamos um formulário ao main
</commit_message>
<xml_diff>
--- a/Apostila/Projeto Space For Men.docx
+++ b/Apostila/Projeto Space For Men.docx
@@ -7425,15 +7425,7 @@
         <w:rPr>
           <w:noProof/>
         </w:rPr>
-        <w:t>Criamos a página “contatos.html” e “contatos.css”. Copiamos o cabeçalho (header) da página “produtos.html” e colamos na página “contatos.html” e repetimos o mesmo processo n</w:t>
-      </w:r>
-      <w:bookmarkStart w:id="0" w:name="_GoBack"/>
-      <w:bookmarkEnd w:id="0"/>
-      <w:r>
-        <w:rPr>
-          <w:noProof/>
-        </w:rPr>
-        <w:t>o css. Com isso finalizamos o menu que já estava pronto.</w:t>
+        <w:t>Criamos a página “contatos.html” e “contatos.css”. Copiamos o cabeçalho (header) da página “produtos.html” e colamos na página “contatos.html” e repetimos o mesmo processo no css. Com isso finalizamos o menu que já estava pronto.</w:t>
       </w:r>
     </w:p>
     <w:p>
@@ -7533,8 +7525,445 @@
         <w:rPr>
           <w:noProof/>
         </w:rPr>
-        <w:t xml:space="preserve">57 - </w:t>
-      </w:r>
+        <w:t xml:space="preserve">57 </w:t>
+      </w:r>
+      <w:r>
+        <w:rPr>
+          <w:noProof/>
+        </w:rPr>
+        <w:t>–</w:t>
+      </w:r>
+      <w:r>
+        <w:rPr>
+          <w:noProof/>
+        </w:rPr>
+        <w:t xml:space="preserve"> </w:t>
+      </w:r>
+      <w:r>
+        <w:rPr>
+          <w:noProof/>
+        </w:rPr>
+        <w:t>Na página “contatos.html” inserimos o “main” dentro dele, adicionamos o “form” e começamos a trabalhar com “label” (etiqueta) e “input” de texto.</w:t>
+      </w:r>
+    </w:p>
+    <w:p>
+      <w:pPr>
+        <w:rPr>
+          <w:noProof/>
+        </w:rPr>
+      </w:pPr>
+      <w:r>
+        <w:rPr>
+          <w:noProof/>
+        </w:rPr>
+        <w:drawing>
+          <wp:inline distT="0" distB="0" distL="0" distR="0" wp14:anchorId="59303F76" wp14:editId="254C5F7C">
+            <wp:extent cx="2552700" cy="914604"/>
+            <wp:effectExtent l="0" t="0" r="0" b="0"/>
+            <wp:docPr id="104" name="Imagem 104"/>
+            <wp:cNvGraphicFramePr>
+              <a:graphicFrameLocks xmlns:a="http://schemas.openxmlformats.org/drawingml/2006/main" noChangeAspect="1"/>
+            </wp:cNvGraphicFramePr>
+            <a:graphic xmlns:a="http://schemas.openxmlformats.org/drawingml/2006/main">
+              <a:graphicData uri="http://schemas.openxmlformats.org/drawingml/2006/picture">
+                <pic:pic xmlns:pic="http://schemas.openxmlformats.org/drawingml/2006/picture">
+                  <pic:nvPicPr>
+                    <pic:cNvPr id="1" name=""/>
+                    <pic:cNvPicPr/>
+                  </pic:nvPicPr>
+                  <pic:blipFill>
+                    <a:blip r:embed="rId96"/>
+                    <a:stretch>
+                      <a:fillRect/>
+                    </a:stretch>
+                  </pic:blipFill>
+                  <pic:spPr>
+                    <a:xfrm>
+                      <a:off x="0" y="0"/>
+                      <a:ext cx="2611758" cy="935764"/>
+                    </a:xfrm>
+                    <a:prstGeom prst="rect">
+                      <a:avLst/>
+                    </a:prstGeom>
+                  </pic:spPr>
+                </pic:pic>
+              </a:graphicData>
+            </a:graphic>
+          </wp:inline>
+        </w:drawing>
+      </w:r>
+    </w:p>
+    <w:p>
+      <w:pPr>
+        <w:rPr>
+          <w:noProof/>
+        </w:rPr>
+      </w:pPr>
+      <w:r>
+        <w:rPr>
+          <w:noProof/>
+        </w:rPr>
+        <w:t>58 – Para unir o “label” com o “input” adicionamos o mesmo nome tanto no “for” da “label” como no “id” do “input”.</w:t>
+      </w:r>
+    </w:p>
+    <w:p>
+      <w:pPr>
+        <w:rPr>
+          <w:noProof/>
+        </w:rPr>
+      </w:pPr>
+      <w:r>
+        <w:rPr>
+          <w:noProof/>
+        </w:rPr>
+        <w:drawing>
+          <wp:inline distT="0" distB="0" distL="0" distR="0" wp14:anchorId="7548B42F" wp14:editId="56A88803">
+            <wp:extent cx="2789365" cy="809625"/>
+            <wp:effectExtent l="0" t="0" r="0" b="0"/>
+            <wp:docPr id="109" name="Imagem 109"/>
+            <wp:cNvGraphicFramePr>
+              <a:graphicFrameLocks xmlns:a="http://schemas.openxmlformats.org/drawingml/2006/main" noChangeAspect="1"/>
+            </wp:cNvGraphicFramePr>
+            <a:graphic xmlns:a="http://schemas.openxmlformats.org/drawingml/2006/main">
+              <a:graphicData uri="http://schemas.openxmlformats.org/drawingml/2006/picture">
+                <pic:pic xmlns:pic="http://schemas.openxmlformats.org/drawingml/2006/picture">
+                  <pic:nvPicPr>
+                    <pic:cNvPr id="1" name=""/>
+                    <pic:cNvPicPr/>
+                  </pic:nvPicPr>
+                  <pic:blipFill>
+                    <a:blip r:embed="rId97"/>
+                    <a:stretch>
+                      <a:fillRect/>
+                    </a:stretch>
+                  </pic:blipFill>
+                  <pic:spPr>
+                    <a:xfrm>
+                      <a:off x="0" y="0"/>
+                      <a:ext cx="2820060" cy="818534"/>
+                    </a:xfrm>
+                    <a:prstGeom prst="rect">
+                      <a:avLst/>
+                    </a:prstGeom>
+                  </pic:spPr>
+                </pic:pic>
+              </a:graphicData>
+            </a:graphic>
+          </wp:inline>
+        </w:drawing>
+      </w:r>
+    </w:p>
+    <w:p>
+      <w:pPr>
+        <w:rPr>
+          <w:noProof/>
+        </w:rPr>
+      </w:pPr>
+      <w:r>
+        <w:rPr>
+          <w:noProof/>
+        </w:rPr>
+        <w:t xml:space="preserve">59 </w:t>
+      </w:r>
+      <w:r>
+        <w:rPr>
+          <w:noProof/>
+        </w:rPr>
+        <w:t>–</w:t>
+      </w:r>
+      <w:r>
+        <w:rPr>
+          <w:noProof/>
+        </w:rPr>
+        <w:t xml:space="preserve"> </w:t>
+      </w:r>
+      <w:r>
+        <w:rPr>
+          <w:noProof/>
+        </w:rPr>
+        <w:t>Para centralizar o conteúdo dentro do “main” demos uma largura e, utilizamos o “margin: 0 auto;”. Conforme imagem:</w:t>
+      </w:r>
+    </w:p>
+    <w:p>
+      <w:pPr>
+        <w:rPr>
+          <w:noProof/>
+        </w:rPr>
+      </w:pPr>
+      <w:r>
+        <w:rPr>
+          <w:noProof/>
+        </w:rPr>
+        <w:drawing>
+          <wp:inline distT="0" distB="0" distL="0" distR="0" wp14:anchorId="35D2372E" wp14:editId="53460FD2">
+            <wp:extent cx="1467055" cy="828791"/>
+            <wp:effectExtent l="0" t="0" r="0" b="9525"/>
+            <wp:docPr id="110" name="Imagem 110"/>
+            <wp:cNvGraphicFramePr>
+              <a:graphicFrameLocks xmlns:a="http://schemas.openxmlformats.org/drawingml/2006/main" noChangeAspect="1"/>
+            </wp:cNvGraphicFramePr>
+            <a:graphic xmlns:a="http://schemas.openxmlformats.org/drawingml/2006/main">
+              <a:graphicData uri="http://schemas.openxmlformats.org/drawingml/2006/picture">
+                <pic:pic xmlns:pic="http://schemas.openxmlformats.org/drawingml/2006/picture">
+                  <pic:nvPicPr>
+                    <pic:cNvPr id="1" name=""/>
+                    <pic:cNvPicPr/>
+                  </pic:nvPicPr>
+                  <pic:blipFill>
+                    <a:blip r:embed="rId98"/>
+                    <a:stretch>
+                      <a:fillRect/>
+                    </a:stretch>
+                  </pic:blipFill>
+                  <pic:spPr>
+                    <a:xfrm>
+                      <a:off x="0" y="0"/>
+                      <a:ext cx="1467055" cy="828791"/>
+                    </a:xfrm>
+                    <a:prstGeom prst="rect">
+                      <a:avLst/>
+                    </a:prstGeom>
+                  </pic:spPr>
+                </pic:pic>
+              </a:graphicData>
+            </a:graphic>
+          </wp:inline>
+        </w:drawing>
+      </w:r>
+    </w:p>
+    <w:p>
+      <w:pPr>
+        <w:rPr>
+          <w:noProof/>
+        </w:rPr>
+      </w:pPr>
+      <w:r>
+        <w:rPr>
+          <w:noProof/>
+        </w:rPr>
+        <w:lastRenderedPageBreak/>
+        <w:t>60 – Observamos que o nosso formulário estava apertado entre o cabeçalho e o rodapé então, inserimos uma altura tanto para cima como para baixo.</w:t>
+      </w:r>
+    </w:p>
+    <w:p>
+      <w:pPr>
+        <w:rPr>
+          <w:noProof/>
+        </w:rPr>
+      </w:pPr>
+      <w:r>
+        <w:rPr>
+          <w:noProof/>
+        </w:rPr>
+        <w:drawing>
+          <wp:inline distT="0" distB="0" distL="0" distR="0" wp14:anchorId="6FB96C10" wp14:editId="37739B0C">
+            <wp:extent cx="2961486" cy="1409700"/>
+            <wp:effectExtent l="0" t="0" r="0" b="0"/>
+            <wp:docPr id="112" name="Imagem 112"/>
+            <wp:cNvGraphicFramePr>
+              <a:graphicFrameLocks xmlns:a="http://schemas.openxmlformats.org/drawingml/2006/main" noChangeAspect="1"/>
+            </wp:cNvGraphicFramePr>
+            <a:graphic xmlns:a="http://schemas.openxmlformats.org/drawingml/2006/main">
+              <a:graphicData uri="http://schemas.openxmlformats.org/drawingml/2006/picture">
+                <pic:pic xmlns:pic="http://schemas.openxmlformats.org/drawingml/2006/picture">
+                  <pic:nvPicPr>
+                    <pic:cNvPr id="1" name=""/>
+                    <pic:cNvPicPr/>
+                  </pic:nvPicPr>
+                  <pic:blipFill>
+                    <a:blip r:embed="rId99"/>
+                    <a:stretch>
+                      <a:fillRect/>
+                    </a:stretch>
+                  </pic:blipFill>
+                  <pic:spPr>
+                    <a:xfrm>
+                      <a:off x="0" y="0"/>
+                      <a:ext cx="2975245" cy="1416250"/>
+                    </a:xfrm>
+                    <a:prstGeom prst="rect">
+                      <a:avLst/>
+                    </a:prstGeom>
+                  </pic:spPr>
+                </pic:pic>
+              </a:graphicData>
+            </a:graphic>
+          </wp:inline>
+        </w:drawing>
+      </w:r>
+      <w:r>
+        <w:rPr>
+          <w:noProof/>
+        </w:rPr>
+        <w:drawing>
+          <wp:inline distT="0" distB="0" distL="0" distR="0" wp14:anchorId="1C9791F3" wp14:editId="47CC30B0">
+            <wp:extent cx="1495634" cy="685896"/>
+            <wp:effectExtent l="0" t="0" r="9525" b="0"/>
+            <wp:docPr id="111" name="Imagem 111"/>
+            <wp:cNvGraphicFramePr>
+              <a:graphicFrameLocks xmlns:a="http://schemas.openxmlformats.org/drawingml/2006/main" noChangeAspect="1"/>
+            </wp:cNvGraphicFramePr>
+            <a:graphic xmlns:a="http://schemas.openxmlformats.org/drawingml/2006/main">
+              <a:graphicData uri="http://schemas.openxmlformats.org/drawingml/2006/picture">
+                <pic:pic xmlns:pic="http://schemas.openxmlformats.org/drawingml/2006/picture">
+                  <pic:nvPicPr>
+                    <pic:cNvPr id="1" name=""/>
+                    <pic:cNvPicPr/>
+                  </pic:nvPicPr>
+                  <pic:blipFill>
+                    <a:blip r:embed="rId100"/>
+                    <a:stretch>
+                      <a:fillRect/>
+                    </a:stretch>
+                  </pic:blipFill>
+                  <pic:spPr>
+                    <a:xfrm>
+                      <a:off x="0" y="0"/>
+                      <a:ext cx="1495634" cy="685896"/>
+                    </a:xfrm>
+                    <a:prstGeom prst="rect">
+                      <a:avLst/>
+                    </a:prstGeom>
+                  </pic:spPr>
+                </pic:pic>
+              </a:graphicData>
+            </a:graphic>
+          </wp:inline>
+        </w:drawing>
+      </w:r>
+    </w:p>
+    <w:p>
+      <w:pPr>
+        <w:rPr>
+          <w:noProof/>
+        </w:rPr>
+      </w:pPr>
+      <w:r>
+        <w:rPr>
+          <w:noProof/>
+        </w:rPr>
+        <w:t xml:space="preserve">61 </w:t>
+      </w:r>
+      <w:r>
+        <w:rPr>
+          <w:noProof/>
+        </w:rPr>
+        <w:t>–</w:t>
+      </w:r>
+      <w:r>
+        <w:rPr>
+          <w:noProof/>
+        </w:rPr>
+        <w:t xml:space="preserve"> </w:t>
+      </w:r>
+      <w:r>
+        <w:rPr>
+          <w:noProof/>
+        </w:rPr>
+        <w:t>Podemos avaliar que o nosso formulário tem um tipo de comportamento mesmo colocando um elemento em baixo do outro no “html”, ao renderizar a página os elementos(label e input) ficam um ao lado do outro. Para mudar essa situiação, mudamos a natureza do ”label” e “input” conforme código abaixo:</w:t>
+      </w:r>
+    </w:p>
+    <w:p>
+      <w:pPr>
+        <w:rPr>
+          <w:noProof/>
+        </w:rPr>
+      </w:pPr>
+      <w:r>
+        <w:rPr>
+          <w:noProof/>
+        </w:rPr>
+        <w:drawing>
+          <wp:inline distT="0" distB="0" distL="0" distR="0" wp14:anchorId="4017D216" wp14:editId="728B204C">
+            <wp:extent cx="1409700" cy="1279172"/>
+            <wp:effectExtent l="0" t="0" r="0" b="0"/>
+            <wp:docPr id="113" name="Imagem 113"/>
+            <wp:cNvGraphicFramePr>
+              <a:graphicFrameLocks xmlns:a="http://schemas.openxmlformats.org/drawingml/2006/main" noChangeAspect="1"/>
+            </wp:cNvGraphicFramePr>
+            <a:graphic xmlns:a="http://schemas.openxmlformats.org/drawingml/2006/main">
+              <a:graphicData uri="http://schemas.openxmlformats.org/drawingml/2006/picture">
+                <pic:pic xmlns:pic="http://schemas.openxmlformats.org/drawingml/2006/picture">
+                  <pic:nvPicPr>
+                    <pic:cNvPr id="1" name=""/>
+                    <pic:cNvPicPr/>
+                  </pic:nvPicPr>
+                  <pic:blipFill>
+                    <a:blip r:embed="rId101"/>
+                    <a:stretch>
+                      <a:fillRect/>
+                    </a:stretch>
+                  </pic:blipFill>
+                  <pic:spPr>
+                    <a:xfrm>
+                      <a:off x="0" y="0"/>
+                      <a:ext cx="1414049" cy="1283118"/>
+                    </a:xfrm>
+                    <a:prstGeom prst="rect">
+                      <a:avLst/>
+                    </a:prstGeom>
+                  </pic:spPr>
+                </pic:pic>
+              </a:graphicData>
+            </a:graphic>
+          </wp:inline>
+        </w:drawing>
+      </w:r>
+      <w:r>
+        <w:rPr>
+          <w:noProof/>
+        </w:rPr>
+        <w:drawing>
+          <wp:inline distT="0" distB="0" distL="0" distR="0" wp14:anchorId="398D3BFE" wp14:editId="5ACB0D38">
+            <wp:extent cx="3759218" cy="1266190"/>
+            <wp:effectExtent l="0" t="0" r="0" b="0"/>
+            <wp:docPr id="114" name="Imagem 114"/>
+            <wp:cNvGraphicFramePr>
+              <a:graphicFrameLocks xmlns:a="http://schemas.openxmlformats.org/drawingml/2006/main" noChangeAspect="1"/>
+            </wp:cNvGraphicFramePr>
+            <a:graphic xmlns:a="http://schemas.openxmlformats.org/drawingml/2006/main">
+              <a:graphicData uri="http://schemas.openxmlformats.org/drawingml/2006/picture">
+                <pic:pic xmlns:pic="http://schemas.openxmlformats.org/drawingml/2006/picture">
+                  <pic:nvPicPr>
+                    <pic:cNvPr id="1" name=""/>
+                    <pic:cNvPicPr/>
+                  </pic:nvPicPr>
+                  <pic:blipFill>
+                    <a:blip r:embed="rId102"/>
+                    <a:stretch>
+                      <a:fillRect/>
+                    </a:stretch>
+                  </pic:blipFill>
+                  <pic:spPr>
+                    <a:xfrm>
+                      <a:off x="0" y="0"/>
+                      <a:ext cx="3820347" cy="1286780"/>
+                    </a:xfrm>
+                    <a:prstGeom prst="rect">
+                      <a:avLst/>
+                    </a:prstGeom>
+                  </pic:spPr>
+                </pic:pic>
+              </a:graphicData>
+            </a:graphic>
+          </wp:inline>
+        </w:drawing>
+      </w:r>
+    </w:p>
+    <w:p>
+      <w:pPr>
+        <w:rPr>
+          <w:noProof/>
+        </w:rPr>
+      </w:pPr>
+      <w:r>
+        <w:rPr>
+          <w:noProof/>
+        </w:rPr>
+        <w:t xml:space="preserve">62 - </w:t>
+      </w:r>
+      <w:bookmarkStart w:id="0" w:name="_GoBack"/>
+      <w:bookmarkEnd w:id="0"/>
     </w:p>
     <w:sectPr>
       <w:pgSz w:w="11906" w:h="16838"/>
@@ -8418,7 +8847,7 @@
 </file>
 
 <file path=customXml/itemProps1.xml><?xml version="1.0" encoding="utf-8"?>
-<ds:datastoreItem xmlns:ds="http://schemas.openxmlformats.org/officeDocument/2006/customXml" ds:itemID="{0CCA935D-1358-43A1-96A8-4F27FB87FB53}">
+<ds:datastoreItem xmlns:ds="http://schemas.openxmlformats.org/officeDocument/2006/customXml" ds:itemID="{82CC3B05-780F-47A7-890E-9E098F406707}">
   <ds:schemaRefs>
     <ds:schemaRef ds:uri="http://schemas.openxmlformats.org/officeDocument/2006/bibliography"/>
   </ds:schemaRefs>

</xml_diff>

<commit_message>
modulamos o formulario deixando quase do jeito que queremos
</commit_message>
<xml_diff>
--- a/Apostila/Projeto Space For Men.docx
+++ b/Apostila/Projeto Space For Men.docx
@@ -7865,17 +7865,58 @@
     </w:p>
     <w:p>
       <w:pPr>
-        <w:rPr>
-          <w:noProof/>
-        </w:rPr>
-      </w:pPr>
+        <w:jc w:val="center"/>
+        <w:rPr>
+          <w:noProof/>
+        </w:rPr>
+      </w:pPr>
+      <w:r>
+        <w:rPr>
+          <w:noProof/>
+        </w:rPr>
+        <w:drawing>
+          <wp:inline distT="0" distB="0" distL="0" distR="0" wp14:anchorId="4C7F2D07" wp14:editId="45EF5569">
+            <wp:extent cx="4100451" cy="1381125"/>
+            <wp:effectExtent l="0" t="0" r="0" b="0"/>
+            <wp:docPr id="114" name="Imagem 114"/>
+            <wp:cNvGraphicFramePr>
+              <a:graphicFrameLocks xmlns:a="http://schemas.openxmlformats.org/drawingml/2006/main" noChangeAspect="1"/>
+            </wp:cNvGraphicFramePr>
+            <a:graphic xmlns:a="http://schemas.openxmlformats.org/drawingml/2006/main">
+              <a:graphicData uri="http://schemas.openxmlformats.org/drawingml/2006/picture">
+                <pic:pic xmlns:pic="http://schemas.openxmlformats.org/drawingml/2006/picture">
+                  <pic:nvPicPr>
+                    <pic:cNvPr id="1" name=""/>
+                    <pic:cNvPicPr/>
+                  </pic:nvPicPr>
+                  <pic:blipFill>
+                    <a:blip r:embed="rId101"/>
+                    <a:stretch>
+                      <a:fillRect/>
+                    </a:stretch>
+                  </pic:blipFill>
+                  <pic:spPr>
+                    <a:xfrm>
+                      <a:off x="0" y="0"/>
+                      <a:ext cx="4173470" cy="1405719"/>
+                    </a:xfrm>
+                    <a:prstGeom prst="rect">
+                      <a:avLst/>
+                    </a:prstGeom>
+                  </pic:spPr>
+                </pic:pic>
+              </a:graphicData>
+            </a:graphic>
+          </wp:inline>
+        </w:drawing>
+      </w:r>
       <w:r>
         <w:rPr>
           <w:noProof/>
         </w:rPr>
         <w:drawing>
           <wp:inline distT="0" distB="0" distL="0" distR="0" wp14:anchorId="4017D216" wp14:editId="728B204C">
-            <wp:extent cx="1409700" cy="1279172"/>
+            <wp:extent cx="1514475" cy="1374245"/>
             <wp:effectExtent l="0" t="0" r="0" b="0"/>
             <wp:docPr id="113" name="Imagem 113"/>
             <wp:cNvGraphicFramePr>
@@ -7889,81 +7930,1497 @@
                     <pic:cNvPicPr/>
                   </pic:nvPicPr>
                   <pic:blipFill>
-                    <a:blip r:embed="rId101"/>
-                    <a:stretch>
-                      <a:fillRect/>
-                    </a:stretch>
-                  </pic:blipFill>
-                  <pic:spPr>
-                    <a:xfrm>
-                      <a:off x="0" y="0"/>
-                      <a:ext cx="1414049" cy="1283118"/>
-                    </a:xfrm>
-                    <a:prstGeom prst="rect">
-                      <a:avLst/>
-                    </a:prstGeom>
-                  </pic:spPr>
-                </pic:pic>
-              </a:graphicData>
-            </a:graphic>
-          </wp:inline>
-        </w:drawing>
-      </w:r>
-      <w:r>
-        <w:rPr>
-          <w:noProof/>
-        </w:rPr>
-        <w:drawing>
-          <wp:inline distT="0" distB="0" distL="0" distR="0" wp14:anchorId="398D3BFE" wp14:editId="5ACB0D38">
-            <wp:extent cx="3759218" cy="1266190"/>
+                    <a:blip r:embed="rId102"/>
+                    <a:stretch>
+                      <a:fillRect/>
+                    </a:stretch>
+                  </pic:blipFill>
+                  <pic:spPr>
+                    <a:xfrm>
+                      <a:off x="0" y="0"/>
+                      <a:ext cx="1521027" cy="1380190"/>
+                    </a:xfrm>
+                    <a:prstGeom prst="rect">
+                      <a:avLst/>
+                    </a:prstGeom>
+                  </pic:spPr>
+                </pic:pic>
+              </a:graphicData>
+            </a:graphic>
+          </wp:inline>
+        </w:drawing>
+      </w:r>
+    </w:p>
+    <w:p>
+      <w:pPr>
+        <w:rPr>
+          <w:noProof/>
+        </w:rPr>
+      </w:pPr>
+      <w:r>
+        <w:rPr>
+          <w:noProof/>
+        </w:rPr>
+        <w:t xml:space="preserve">62 </w:t>
+      </w:r>
+      <w:r>
+        <w:rPr>
+          <w:noProof/>
+        </w:rPr>
+        <w:t>–</w:t>
+      </w:r>
+      <w:r>
+        <w:rPr>
+          <w:noProof/>
+        </w:rPr>
+        <w:t xml:space="preserve"> </w:t>
+      </w:r>
+      <w:r>
+        <w:rPr>
+          <w:noProof/>
+        </w:rPr>
+        <w:t>D</w:t>
+      </w:r>
+      <w:r>
+        <w:rPr>
+          <w:noProof/>
+        </w:rPr>
+        <w:t xml:space="preserve">emos um espaço para o lado de baixo da </w:t>
+      </w:r>
+      <w:r>
+        <w:rPr>
+          <w:noProof/>
+        </w:rPr>
+        <w:t>“</w:t>
+      </w:r>
+      <w:r>
+        <w:rPr>
+          <w:noProof/>
+        </w:rPr>
+        <w:t>label</w:t>
+      </w:r>
+      <w:r>
+        <w:rPr>
+          <w:noProof/>
+        </w:rPr>
+        <w:t>”</w:t>
+      </w:r>
+      <w:r>
+        <w:rPr>
+          <w:noProof/>
+        </w:rPr>
+        <w:t xml:space="preserve"> </w:t>
+      </w:r>
+      <w:r>
+        <w:rPr>
+          <w:noProof/>
+        </w:rPr>
+        <w:t>com</w:t>
+      </w:r>
+      <w:r>
+        <w:rPr>
+          <w:noProof/>
+        </w:rPr>
+        <w:t xml:space="preserve"> </w:t>
+      </w:r>
+      <w:r>
+        <w:rPr>
+          <w:noProof/>
+        </w:rPr>
+        <w:t>“</w:t>
+      </w:r>
+      <w:r>
+        <w:rPr>
+          <w:noProof/>
+        </w:rPr>
+        <w:t>margin: 20px;</w:t>
+      </w:r>
+      <w:r>
+        <w:rPr>
+          <w:noProof/>
+        </w:rPr>
+        <w:t>”</w:t>
+      </w:r>
+      <w:r>
+        <w:rPr>
+          <w:noProof/>
+        </w:rPr>
+        <w:t xml:space="preserve"> e aumentamos o tamanho da fonte</w:t>
+      </w:r>
+      <w:r>
+        <w:rPr>
+          <w:noProof/>
+        </w:rPr>
+        <w:t>. No “input” também acrescetamos um espaço no lado de baixo e, aumentamos o espaço interno tanto na parte de cima, baixo, direita e esquerda.</w:t>
+      </w:r>
+    </w:p>
+    <w:p>
+      <w:pPr>
+        <w:rPr>
+          <w:noProof/>
+        </w:rPr>
+      </w:pPr>
+      <w:r>
+        <w:rPr>
+          <w:noProof/>
+        </w:rPr>
+        <w:drawing>
+          <wp:inline distT="0" distB="0" distL="0" distR="0" wp14:anchorId="30B5DF10" wp14:editId="4C3B3B62">
+            <wp:extent cx="1695450" cy="1057275"/>
+            <wp:effectExtent l="0" t="0" r="0" b="9525"/>
+            <wp:docPr id="115" name="Imagem 115"/>
+            <wp:cNvGraphicFramePr>
+              <a:graphicFrameLocks xmlns:a="http://schemas.openxmlformats.org/drawingml/2006/main" noChangeAspect="1"/>
+            </wp:cNvGraphicFramePr>
+            <a:graphic xmlns:a="http://schemas.openxmlformats.org/drawingml/2006/main">
+              <a:graphicData uri="http://schemas.openxmlformats.org/drawingml/2006/picture">
+                <pic:pic xmlns:pic="http://schemas.openxmlformats.org/drawingml/2006/picture">
+                  <pic:nvPicPr>
+                    <pic:cNvPr id="1" name=""/>
+                    <pic:cNvPicPr/>
+                  </pic:nvPicPr>
+                  <pic:blipFill>
+                    <a:blip r:embed="rId103"/>
+                    <a:stretch>
+                      <a:fillRect/>
+                    </a:stretch>
+                  </pic:blipFill>
+                  <pic:spPr>
+                    <a:xfrm>
+                      <a:off x="0" y="0"/>
+                      <a:ext cx="1695687" cy="1057423"/>
+                    </a:xfrm>
+                    <a:prstGeom prst="rect">
+                      <a:avLst/>
+                    </a:prstGeom>
+                  </pic:spPr>
+                </pic:pic>
+              </a:graphicData>
+            </a:graphic>
+          </wp:inline>
+        </w:drawing>
+      </w:r>
+      <w:r>
+        <w:rPr>
+          <w:noProof/>
+        </w:rPr>
+        <w:drawing>
+          <wp:inline distT="0" distB="0" distL="0" distR="0" wp14:anchorId="24699F56" wp14:editId="031260EA">
+            <wp:extent cx="1856844" cy="2295525"/>
             <wp:effectExtent l="0" t="0" r="0" b="0"/>
-            <wp:docPr id="114" name="Imagem 114"/>
-            <wp:cNvGraphicFramePr>
-              <a:graphicFrameLocks xmlns:a="http://schemas.openxmlformats.org/drawingml/2006/main" noChangeAspect="1"/>
-            </wp:cNvGraphicFramePr>
-            <a:graphic xmlns:a="http://schemas.openxmlformats.org/drawingml/2006/main">
-              <a:graphicData uri="http://schemas.openxmlformats.org/drawingml/2006/picture">
-                <pic:pic xmlns:pic="http://schemas.openxmlformats.org/drawingml/2006/picture">
-                  <pic:nvPicPr>
-                    <pic:cNvPr id="1" name=""/>
-                    <pic:cNvPicPr/>
-                  </pic:nvPicPr>
-                  <pic:blipFill>
-                    <a:blip r:embed="rId102"/>
-                    <a:stretch>
-                      <a:fillRect/>
-                    </a:stretch>
-                  </pic:blipFill>
-                  <pic:spPr>
-                    <a:xfrm>
-                      <a:off x="0" y="0"/>
-                      <a:ext cx="3820347" cy="1286780"/>
-                    </a:xfrm>
-                    <a:prstGeom prst="rect">
-                      <a:avLst/>
-                    </a:prstGeom>
-                  </pic:spPr>
-                </pic:pic>
-              </a:graphicData>
-            </a:graphic>
-          </wp:inline>
-        </w:drawing>
-      </w:r>
-    </w:p>
-    <w:p>
-      <w:pPr>
-        <w:rPr>
-          <w:noProof/>
-        </w:rPr>
-      </w:pPr>
-      <w:r>
-        <w:rPr>
-          <w:noProof/>
-        </w:rPr>
-        <w:t xml:space="preserve">62 - </w:t>
+            <wp:docPr id="117" name="Imagem 117"/>
+            <wp:cNvGraphicFramePr>
+              <a:graphicFrameLocks xmlns:a="http://schemas.openxmlformats.org/drawingml/2006/main" noChangeAspect="1"/>
+            </wp:cNvGraphicFramePr>
+            <a:graphic xmlns:a="http://schemas.openxmlformats.org/drawingml/2006/main">
+              <a:graphicData uri="http://schemas.openxmlformats.org/drawingml/2006/picture">
+                <pic:pic xmlns:pic="http://schemas.openxmlformats.org/drawingml/2006/picture">
+                  <pic:nvPicPr>
+                    <pic:cNvPr id="1" name=""/>
+                    <pic:cNvPicPr/>
+                  </pic:nvPicPr>
+                  <pic:blipFill>
+                    <a:blip r:embed="rId104"/>
+                    <a:stretch>
+                      <a:fillRect/>
+                    </a:stretch>
+                  </pic:blipFill>
+                  <pic:spPr>
+                    <a:xfrm>
+                      <a:off x="0" y="0"/>
+                      <a:ext cx="1871503" cy="2313647"/>
+                    </a:xfrm>
+                    <a:prstGeom prst="rect">
+                      <a:avLst/>
+                    </a:prstGeom>
+                  </pic:spPr>
+                </pic:pic>
+              </a:graphicData>
+            </a:graphic>
+          </wp:inline>
+        </w:drawing>
+      </w:r>
+      <w:r>
+        <w:rPr>
+          <w:noProof/>
+        </w:rPr>
+        <w:drawing>
+          <wp:inline distT="0" distB="0" distL="0" distR="0" wp14:anchorId="06BCDD34" wp14:editId="167EB84F">
+            <wp:extent cx="1762371" cy="1057423"/>
+            <wp:effectExtent l="0" t="0" r="0" b="9525"/>
+            <wp:docPr id="116" name="Imagem 116"/>
+            <wp:cNvGraphicFramePr>
+              <a:graphicFrameLocks xmlns:a="http://schemas.openxmlformats.org/drawingml/2006/main" noChangeAspect="1"/>
+            </wp:cNvGraphicFramePr>
+            <a:graphic xmlns:a="http://schemas.openxmlformats.org/drawingml/2006/main">
+              <a:graphicData uri="http://schemas.openxmlformats.org/drawingml/2006/picture">
+                <pic:pic xmlns:pic="http://schemas.openxmlformats.org/drawingml/2006/picture">
+                  <pic:nvPicPr>
+                    <pic:cNvPr id="1" name=""/>
+                    <pic:cNvPicPr/>
+                  </pic:nvPicPr>
+                  <pic:blipFill>
+                    <a:blip r:embed="rId105"/>
+                    <a:stretch>
+                      <a:fillRect/>
+                    </a:stretch>
+                  </pic:blipFill>
+                  <pic:spPr>
+                    <a:xfrm>
+                      <a:off x="0" y="0"/>
+                      <a:ext cx="1762371" cy="1057423"/>
+                    </a:xfrm>
+                    <a:prstGeom prst="rect">
+                      <a:avLst/>
+                    </a:prstGeom>
+                  </pic:spPr>
+                </pic:pic>
+              </a:graphicData>
+            </a:graphic>
+          </wp:inline>
+        </w:drawing>
+      </w:r>
+    </w:p>
+    <w:p>
+      <w:pPr>
+        <w:rPr>
+          <w:noProof/>
+        </w:rPr>
+      </w:pPr>
+      <w:r>
+        <w:rPr>
+          <w:noProof/>
+        </w:rPr>
+        <w:lastRenderedPageBreak/>
+        <w:t xml:space="preserve">63 – Incluímos </w:t>
+      </w:r>
+      <w:r>
+        <w:rPr>
+          <w:noProof/>
+        </w:rPr>
+        <w:t>uma porcentagem de 50% para cada “input” do nosso formulário.</w:t>
+      </w:r>
+    </w:p>
+    <w:p>
+      <w:pPr>
+        <w:rPr>
+          <w:noProof/>
+        </w:rPr>
+      </w:pPr>
+      <w:r>
+        <w:rPr>
+          <w:noProof/>
+        </w:rPr>
+        <w:drawing>
+          <wp:inline distT="0" distB="0" distL="0" distR="0" wp14:anchorId="3B13CF30" wp14:editId="02003AAF">
+            <wp:extent cx="3331689" cy="2038350"/>
+            <wp:effectExtent l="0" t="0" r="2540" b="0"/>
+            <wp:docPr id="119" name="Imagem 119"/>
+            <wp:cNvGraphicFramePr>
+              <a:graphicFrameLocks xmlns:a="http://schemas.openxmlformats.org/drawingml/2006/main" noChangeAspect="1"/>
+            </wp:cNvGraphicFramePr>
+            <a:graphic xmlns:a="http://schemas.openxmlformats.org/drawingml/2006/main">
+              <a:graphicData uri="http://schemas.openxmlformats.org/drawingml/2006/picture">
+                <pic:pic xmlns:pic="http://schemas.openxmlformats.org/drawingml/2006/picture">
+                  <pic:nvPicPr>
+                    <pic:cNvPr id="1" name=""/>
+                    <pic:cNvPicPr/>
+                  </pic:nvPicPr>
+                  <pic:blipFill>
+                    <a:blip r:embed="rId106"/>
+                    <a:stretch>
+                      <a:fillRect/>
+                    </a:stretch>
+                  </pic:blipFill>
+                  <pic:spPr>
+                    <a:xfrm>
+                      <a:off x="0" y="0"/>
+                      <a:ext cx="3365566" cy="2059076"/>
+                    </a:xfrm>
+                    <a:prstGeom prst="rect">
+                      <a:avLst/>
+                    </a:prstGeom>
+                  </pic:spPr>
+                </pic:pic>
+              </a:graphicData>
+            </a:graphic>
+          </wp:inline>
+        </w:drawing>
+      </w:r>
+      <w:r>
+        <w:rPr>
+          <w:noProof/>
+        </w:rPr>
+        <w:drawing>
+          <wp:inline distT="0" distB="0" distL="0" distR="0" wp14:anchorId="436E863A" wp14:editId="24B54B4D">
+            <wp:extent cx="1745292" cy="1038225"/>
+            <wp:effectExtent l="0" t="0" r="7620" b="0"/>
+            <wp:docPr id="118" name="Imagem 118"/>
+            <wp:cNvGraphicFramePr>
+              <a:graphicFrameLocks xmlns:a="http://schemas.openxmlformats.org/drawingml/2006/main" noChangeAspect="1"/>
+            </wp:cNvGraphicFramePr>
+            <a:graphic xmlns:a="http://schemas.openxmlformats.org/drawingml/2006/main">
+              <a:graphicData uri="http://schemas.openxmlformats.org/drawingml/2006/picture">
+                <pic:pic xmlns:pic="http://schemas.openxmlformats.org/drawingml/2006/picture">
+                  <pic:nvPicPr>
+                    <pic:cNvPr id="1" name=""/>
+                    <pic:cNvPicPr/>
+                  </pic:nvPicPr>
+                  <pic:blipFill>
+                    <a:blip r:embed="rId107"/>
+                    <a:stretch>
+                      <a:fillRect/>
+                    </a:stretch>
+                  </pic:blipFill>
+                  <pic:spPr>
+                    <a:xfrm>
+                      <a:off x="0" y="0"/>
+                      <a:ext cx="1747615" cy="1039607"/>
+                    </a:xfrm>
+                    <a:prstGeom prst="rect">
+                      <a:avLst/>
+                    </a:prstGeom>
+                  </pic:spPr>
+                </pic:pic>
+              </a:graphicData>
+            </a:graphic>
+          </wp:inline>
+        </w:drawing>
+      </w:r>
+    </w:p>
+    <w:p>
+      <w:pPr>
+        <w:rPr>
+          <w:noProof/>
+        </w:rPr>
+      </w:pPr>
+      <w:r>
+        <w:rPr>
+          <w:noProof/>
+        </w:rPr>
+        <mc:AlternateContent>
+          <mc:Choice Requires="wps">
+            <w:drawing>
+              <wp:anchor distT="0" distB="0" distL="114300" distR="114300" simplePos="0" relativeHeight="251681792" behindDoc="0" locked="0" layoutInCell="1" allowOverlap="1">
+                <wp:simplePos x="0" y="0"/>
+                <wp:positionH relativeFrom="column">
+                  <wp:posOffset>1415415</wp:posOffset>
+                </wp:positionH>
+                <wp:positionV relativeFrom="paragraph">
+                  <wp:posOffset>223519</wp:posOffset>
+                </wp:positionV>
+                <wp:extent cx="28575" cy="1628775"/>
+                <wp:effectExtent l="38100" t="0" r="66675" b="47625"/>
+                <wp:wrapNone/>
+                <wp:docPr id="123" name="Conector de Seta Reta 123"/>
+                <wp:cNvGraphicFramePr/>
+                <a:graphic xmlns:a="http://schemas.openxmlformats.org/drawingml/2006/main">
+                  <a:graphicData uri="http://schemas.microsoft.com/office/word/2010/wordprocessingShape">
+                    <wps:wsp>
+                      <wps:cNvCnPr/>
+                      <wps:spPr>
+                        <a:xfrm>
+                          <a:off x="0" y="0"/>
+                          <a:ext cx="28575" cy="1628775"/>
+                        </a:xfrm>
+                        <a:prstGeom prst="straightConnector1">
+                          <a:avLst/>
+                        </a:prstGeom>
+                        <a:ln>
+                          <a:solidFill>
+                            <a:srgbClr val="FF0000"/>
+                          </a:solidFill>
+                          <a:tailEnd type="triangle"/>
+                        </a:ln>
+                      </wps:spPr>
+                      <wps:style>
+                        <a:lnRef idx="1">
+                          <a:schemeClr val="accent1"/>
+                        </a:lnRef>
+                        <a:fillRef idx="0">
+                          <a:schemeClr val="accent1"/>
+                        </a:fillRef>
+                        <a:effectRef idx="0">
+                          <a:schemeClr val="accent1"/>
+                        </a:effectRef>
+                        <a:fontRef idx="minor">
+                          <a:schemeClr val="tx1"/>
+                        </a:fontRef>
+                      </wps:style>
+                      <wps:bodyPr/>
+                    </wps:wsp>
+                  </a:graphicData>
+                </a:graphic>
+              </wp:anchor>
+            </w:drawing>
+          </mc:Choice>
+          <mc:Fallback>
+            <w:pict>
+              <v:shapetype w14:anchorId="2DA97432" id="_x0000_t32" coordsize="21600,21600" o:spt="32" o:oned="t" path="m,l21600,21600e" filled="f">
+                <v:path arrowok="t" fillok="f" o:connecttype="none"/>
+                <o:lock v:ext="edit" shapetype="t"/>
+              </v:shapetype>
+              <v:shape id="Conector de Seta Reta 123" o:spid="_x0000_s1026" type="#_x0000_t32" style="position:absolute;margin-left:111.45pt;margin-top:17.6pt;width:2.25pt;height:128.25pt;z-index:251681792;visibility:visible;mso-wrap-style:square;mso-wrap-distance-left:9pt;mso-wrap-distance-top:0;mso-wrap-distance-right:9pt;mso-wrap-distance-bottom:0;mso-position-horizontal:absolute;mso-position-horizontal-relative:text;mso-position-vertical:absolute;mso-position-vertical-relative:text" o:gfxdata="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" strokecolor="red" strokeweight=".5pt">
+                <v:stroke endarrow="block" joinstyle="miter"/>
+              </v:shape>
+            </w:pict>
+          </mc:Fallback>
+        </mc:AlternateContent>
+      </w:r>
+      <w:r>
+        <w:rPr>
+          <w:noProof/>
+        </w:rPr>
+        <w:t xml:space="preserve">64 – Inserimos um “textarea”(input de mensagem), em baixo do </w:t>
+      </w:r>
+      <w:r>
+        <w:rPr>
+          <w:noProof/>
+        </w:rPr>
+        <w:t>“</w:t>
+      </w:r>
+      <w:r>
+        <w:rPr>
+          <w:noProof/>
+        </w:rPr>
+        <w:t>input telefone</w:t>
+      </w:r>
+      <w:r>
+        <w:rPr>
+          <w:noProof/>
+        </w:rPr>
+        <w:t>”</w:t>
+      </w:r>
+      <w:r>
+        <w:rPr>
+          <w:noProof/>
+        </w:rPr>
+        <w:t xml:space="preserve"> e aumentamos o tamanho da coluna para ficar alinhado com os outros inputs.</w:t>
+      </w:r>
+    </w:p>
+    <w:p>
+      <w:pPr>
+        <w:rPr>
+          <w:noProof/>
+        </w:rPr>
+      </w:pPr>
+      <w:r>
+        <w:rPr>
+          <w:noProof/>
+        </w:rPr>
+        <mc:AlternateContent>
+          <mc:Choice Requires="wps">
+            <w:drawing>
+              <wp:anchor distT="0" distB="0" distL="114300" distR="114300" simplePos="0" relativeHeight="251680768" behindDoc="0" locked="0" layoutInCell="1" allowOverlap="1">
+                <wp:simplePos x="0" y="0"/>
+                <wp:positionH relativeFrom="column">
+                  <wp:posOffset>2005965</wp:posOffset>
+                </wp:positionH>
+                <wp:positionV relativeFrom="paragraph">
+                  <wp:posOffset>1363345</wp:posOffset>
+                </wp:positionV>
+                <wp:extent cx="476250" cy="104775"/>
+                <wp:effectExtent l="0" t="57150" r="0" b="28575"/>
+                <wp:wrapNone/>
+                <wp:docPr id="122" name="Conector de Seta Reta 122"/>
+                <wp:cNvGraphicFramePr/>
+                <a:graphic xmlns:a="http://schemas.openxmlformats.org/drawingml/2006/main">
+                  <a:graphicData uri="http://schemas.microsoft.com/office/word/2010/wordprocessingShape">
+                    <wps:wsp>
+                      <wps:cNvCnPr/>
+                      <wps:spPr>
+                        <a:xfrm flipV="1">
+                          <a:off x="0" y="0"/>
+                          <a:ext cx="476250" cy="104775"/>
+                        </a:xfrm>
+                        <a:prstGeom prst="straightConnector1">
+                          <a:avLst/>
+                        </a:prstGeom>
+                        <a:ln>
+                          <a:solidFill>
+                            <a:srgbClr val="FF0000"/>
+                          </a:solidFill>
+                          <a:tailEnd type="triangle"/>
+                        </a:ln>
+                      </wps:spPr>
+                      <wps:style>
+                        <a:lnRef idx="1">
+                          <a:schemeClr val="accent1"/>
+                        </a:lnRef>
+                        <a:fillRef idx="0">
+                          <a:schemeClr val="accent1"/>
+                        </a:fillRef>
+                        <a:effectRef idx="0">
+                          <a:schemeClr val="accent1"/>
+                        </a:effectRef>
+                        <a:fontRef idx="minor">
+                          <a:schemeClr val="tx1"/>
+                        </a:fontRef>
+                      </wps:style>
+                      <wps:bodyPr/>
+                    </wps:wsp>
+                  </a:graphicData>
+                </a:graphic>
+              </wp:anchor>
+            </w:drawing>
+          </mc:Choice>
+          <mc:Fallback>
+            <w:pict>
+              <v:shape w14:anchorId="12DC29BE" id="Conector de Seta Reta 122" o:spid="_x0000_s1026" type="#_x0000_t32" style="position:absolute;margin-left:157.95pt;margin-top:107.35pt;width:37.5pt;height:8.25pt;flip:y;z-index:251680768;visibility:visible;mso-wrap-style:square;mso-wrap-distance-left:9pt;mso-wrap-distance-top:0;mso-wrap-distance-right:9pt;mso-wrap-distance-bottom:0;mso-position-horizontal:absolute;mso-position-horizontal-relative:text;mso-position-vertical:absolute;mso-position-vertical-relative:text" o:gfxdata="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" strokecolor="red" strokeweight=".5pt">
+                <v:stroke endarrow="block" joinstyle="miter"/>
+              </v:shape>
+            </w:pict>
+          </mc:Fallback>
+        </mc:AlternateContent>
+      </w:r>
+      <w:r>
+        <w:rPr>
+          <w:noProof/>
+        </w:rPr>
+        <w:drawing>
+          <wp:inline distT="0" distB="0" distL="0" distR="0" wp14:anchorId="5FF5F403" wp14:editId="5F2FFE17">
+            <wp:extent cx="2466975" cy="2017456"/>
+            <wp:effectExtent l="0" t="0" r="0" b="1905"/>
+            <wp:docPr id="120" name="Imagem 120"/>
+            <wp:cNvGraphicFramePr>
+              <a:graphicFrameLocks xmlns:a="http://schemas.openxmlformats.org/drawingml/2006/main" noChangeAspect="1"/>
+            </wp:cNvGraphicFramePr>
+            <a:graphic xmlns:a="http://schemas.openxmlformats.org/drawingml/2006/main">
+              <a:graphicData uri="http://schemas.openxmlformats.org/drawingml/2006/picture">
+                <pic:pic xmlns:pic="http://schemas.openxmlformats.org/drawingml/2006/picture">
+                  <pic:nvPicPr>
+                    <pic:cNvPr id="1" name=""/>
+                    <pic:cNvPicPr/>
+                  </pic:nvPicPr>
+                  <pic:blipFill>
+                    <a:blip r:embed="rId108"/>
+                    <a:stretch>
+                      <a:fillRect/>
+                    </a:stretch>
+                  </pic:blipFill>
+                  <pic:spPr>
+                    <a:xfrm>
+                      <a:off x="0" y="0"/>
+                      <a:ext cx="2527702" cy="2067118"/>
+                    </a:xfrm>
+                    <a:prstGeom prst="rect">
+                      <a:avLst/>
+                    </a:prstGeom>
+                  </pic:spPr>
+                </pic:pic>
+              </a:graphicData>
+            </a:graphic>
+          </wp:inline>
+        </w:drawing>
+      </w:r>
+      <w:r>
+        <w:rPr>
+          <w:noProof/>
+        </w:rPr>
+        <w:drawing>
+          <wp:inline distT="0" distB="0" distL="0" distR="0" wp14:anchorId="354758D3" wp14:editId="1C84A830">
+            <wp:extent cx="2695575" cy="2513242"/>
+            <wp:effectExtent l="0" t="0" r="0" b="1905"/>
+            <wp:docPr id="121" name="Imagem 121"/>
+            <wp:cNvGraphicFramePr>
+              <a:graphicFrameLocks xmlns:a="http://schemas.openxmlformats.org/drawingml/2006/main" noChangeAspect="1"/>
+            </wp:cNvGraphicFramePr>
+            <a:graphic xmlns:a="http://schemas.openxmlformats.org/drawingml/2006/main">
+              <a:graphicData uri="http://schemas.openxmlformats.org/drawingml/2006/picture">
+                <pic:pic xmlns:pic="http://schemas.openxmlformats.org/drawingml/2006/picture">
+                  <pic:nvPicPr>
+                    <pic:cNvPr id="1" name=""/>
+                    <pic:cNvPicPr/>
+                  </pic:nvPicPr>
+                  <pic:blipFill>
+                    <a:blip r:embed="rId109"/>
+                    <a:stretch>
+                      <a:fillRect/>
+                    </a:stretch>
+                  </pic:blipFill>
+                  <pic:spPr>
+                    <a:xfrm>
+                      <a:off x="0" y="0"/>
+                      <a:ext cx="2729562" cy="2544930"/>
+                    </a:xfrm>
+                    <a:prstGeom prst="rect">
+                      <a:avLst/>
+                    </a:prstGeom>
+                  </pic:spPr>
+                </pic:pic>
+              </a:graphicData>
+            </a:graphic>
+          </wp:inline>
+        </w:drawing>
+      </w:r>
+    </w:p>
+    <w:p>
+      <w:pPr>
+        <w:rPr>
+          <w:noProof/>
+        </w:rPr>
+      </w:pPr>
+      <w:r>
+        <w:rPr>
+          <w:noProof/>
+        </w:rPr>
+        <w:t xml:space="preserve">65 </w:t>
+      </w:r>
+      <w:r>
+        <w:rPr>
+          <w:noProof/>
+        </w:rPr>
+        <w:t>–</w:t>
+      </w:r>
+      <w:r>
+        <w:rPr>
+          <w:noProof/>
+        </w:rPr>
+        <w:t xml:space="preserve"> </w:t>
+      </w:r>
+      <w:r>
+        <w:rPr>
+          <w:noProof/>
+        </w:rPr>
+        <w:t>Trabalhamos com o “input:radio;” em nosso formulário e inserimos os “label” e os “input: radio;”. Conforme imagem a baixo. E transformamos que somente uma opção possa ser escolhida utilizando o mesmo nome na palavra “name” do código.</w:t>
+      </w:r>
+    </w:p>
+    <w:p>
+      <w:pPr>
+        <w:rPr>
+          <w:noProof/>
+        </w:rPr>
+      </w:pPr>
+      <w:r>
+        <w:rPr>
+          <w:noProof/>
+        </w:rPr>
+        <w:drawing>
+          <wp:inline distT="0" distB="0" distL="0" distR="0" wp14:anchorId="1FA4A6C1" wp14:editId="6319F9CF">
+            <wp:extent cx="2600325" cy="1324166"/>
+            <wp:effectExtent l="0" t="0" r="0" b="9525"/>
+            <wp:docPr id="124" name="Imagem 124"/>
+            <wp:cNvGraphicFramePr>
+              <a:graphicFrameLocks xmlns:a="http://schemas.openxmlformats.org/drawingml/2006/main" noChangeAspect="1"/>
+            </wp:cNvGraphicFramePr>
+            <a:graphic xmlns:a="http://schemas.openxmlformats.org/drawingml/2006/main">
+              <a:graphicData uri="http://schemas.openxmlformats.org/drawingml/2006/picture">
+                <pic:pic xmlns:pic="http://schemas.openxmlformats.org/drawingml/2006/picture">
+                  <pic:nvPicPr>
+                    <pic:cNvPr id="1" name=""/>
+                    <pic:cNvPicPr/>
+                  </pic:nvPicPr>
+                  <pic:blipFill>
+                    <a:blip r:embed="rId110"/>
+                    <a:stretch>
+                      <a:fillRect/>
+                    </a:stretch>
+                  </pic:blipFill>
+                  <pic:spPr>
+                    <a:xfrm>
+                      <a:off x="0" y="0"/>
+                      <a:ext cx="2626590" cy="1337541"/>
+                    </a:xfrm>
+                    <a:prstGeom prst="rect">
+                      <a:avLst/>
+                    </a:prstGeom>
+                  </pic:spPr>
+                </pic:pic>
+              </a:graphicData>
+            </a:graphic>
+          </wp:inline>
+        </w:drawing>
+      </w:r>
+      <w:r>
+        <w:rPr>
+          <w:noProof/>
+        </w:rPr>
+        <w:drawing>
+          <wp:inline distT="0" distB="0" distL="0" distR="0" wp14:anchorId="18E1D975" wp14:editId="218EE6CE">
+            <wp:extent cx="2722585" cy="1104900"/>
+            <wp:effectExtent l="0" t="0" r="1905" b="0"/>
+            <wp:docPr id="125" name="Imagem 125"/>
+            <wp:cNvGraphicFramePr>
+              <a:graphicFrameLocks xmlns:a="http://schemas.openxmlformats.org/drawingml/2006/main" noChangeAspect="1"/>
+            </wp:cNvGraphicFramePr>
+            <a:graphic xmlns:a="http://schemas.openxmlformats.org/drawingml/2006/main">
+              <a:graphicData uri="http://schemas.openxmlformats.org/drawingml/2006/picture">
+                <pic:pic xmlns:pic="http://schemas.openxmlformats.org/drawingml/2006/picture">
+                  <pic:nvPicPr>
+                    <pic:cNvPr id="1" name=""/>
+                    <pic:cNvPicPr/>
+                  </pic:nvPicPr>
+                  <pic:blipFill>
+                    <a:blip r:embed="rId111"/>
+                    <a:stretch>
+                      <a:fillRect/>
+                    </a:stretch>
+                  </pic:blipFill>
+                  <pic:spPr>
+                    <a:xfrm>
+                      <a:off x="0" y="0"/>
+                      <a:ext cx="2758535" cy="1119490"/>
+                    </a:xfrm>
+                    <a:prstGeom prst="rect">
+                      <a:avLst/>
+                    </a:prstGeom>
+                  </pic:spPr>
+                </pic:pic>
+              </a:graphicData>
+            </a:graphic>
+          </wp:inline>
+        </w:drawing>
+      </w:r>
+    </w:p>
+    <w:p>
+      <w:pPr>
+        <w:rPr>
+          <w:noProof/>
+        </w:rPr>
+      </w:pPr>
+      <w:r>
+        <w:rPr>
+          <w:noProof/>
+        </w:rPr>
+        <w:t xml:space="preserve">66 </w:t>
+      </w:r>
+      <w:r>
+        <w:rPr>
+          <w:noProof/>
+        </w:rPr>
+        <w:t>–</w:t>
+      </w:r>
+      <w:r>
+        <w:rPr>
+          <w:noProof/>
+        </w:rPr>
+        <w:t xml:space="preserve"> </w:t>
+      </w:r>
+      <w:r>
+        <w:rPr>
+          <w:noProof/>
+        </w:rPr>
+        <w:t>Inserimos um parágrafo em cima da label radio-box e-mail.</w:t>
+      </w:r>
+    </w:p>
+    <w:p>
+      <w:pPr>
+        <w:rPr>
+          <w:noProof/>
+        </w:rPr>
+      </w:pPr>
+      <w:r>
+        <w:rPr>
+          <w:noProof/>
+        </w:rPr>
+        <w:drawing>
+          <wp:inline distT="0" distB="0" distL="0" distR="0" wp14:anchorId="0663A748" wp14:editId="2DBA0A9D">
+            <wp:extent cx="3978060" cy="704850"/>
+            <wp:effectExtent l="0" t="0" r="3810" b="0"/>
+            <wp:docPr id="126" name="Imagem 126"/>
+            <wp:cNvGraphicFramePr>
+              <a:graphicFrameLocks xmlns:a="http://schemas.openxmlformats.org/drawingml/2006/main" noChangeAspect="1"/>
+            </wp:cNvGraphicFramePr>
+            <a:graphic xmlns:a="http://schemas.openxmlformats.org/drawingml/2006/main">
+              <a:graphicData uri="http://schemas.openxmlformats.org/drawingml/2006/picture">
+                <pic:pic xmlns:pic="http://schemas.openxmlformats.org/drawingml/2006/picture">
+                  <pic:nvPicPr>
+                    <pic:cNvPr id="1" name=""/>
+                    <pic:cNvPicPr/>
+                  </pic:nvPicPr>
+                  <pic:blipFill>
+                    <a:blip r:embed="rId112"/>
+                    <a:stretch>
+                      <a:fillRect/>
+                    </a:stretch>
+                  </pic:blipFill>
+                  <pic:spPr>
+                    <a:xfrm>
+                      <a:off x="0" y="0"/>
+                      <a:ext cx="4000144" cy="708763"/>
+                    </a:xfrm>
+                    <a:prstGeom prst="rect">
+                      <a:avLst/>
+                    </a:prstGeom>
+                  </pic:spPr>
+                </pic:pic>
+              </a:graphicData>
+            </a:graphic>
+          </wp:inline>
+        </w:drawing>
+      </w:r>
+    </w:p>
+    <w:p>
+      <w:pPr>
+        <w:rPr>
+          <w:noProof/>
+        </w:rPr>
+      </w:pPr>
+      <w:r>
+        <w:rPr>
+          <w:noProof/>
+        </w:rPr>
+        <w:lastRenderedPageBreak/>
+        <w:t xml:space="preserve">67 </w:t>
+      </w:r>
+      <w:r>
+        <w:rPr>
+          <w:noProof/>
+        </w:rPr>
+        <w:t>–</w:t>
+      </w:r>
+      <w:r>
+        <w:rPr>
+          <w:noProof/>
+        </w:rPr>
+        <w:t xml:space="preserve"> </w:t>
+      </w:r>
+      <w:r>
+        <w:rPr>
+          <w:noProof/>
+        </w:rPr>
+        <w:t xml:space="preserve">Adicionamos uma </w:t>
+      </w:r>
+      <w:r>
+        <w:rPr>
+          <w:noProof/>
+        </w:rPr>
+        <w:t>“</w:t>
+      </w:r>
+      <w:r>
+        <w:rPr>
+          <w:noProof/>
+        </w:rPr>
+        <w:t>div</w:t>
+      </w:r>
+      <w:r>
+        <w:rPr>
+          <w:noProof/>
+        </w:rPr>
+        <w:t>”</w:t>
+      </w:r>
+      <w:r>
+        <w:rPr>
+          <w:noProof/>
+        </w:rPr>
+        <w:t xml:space="preserve"> envolvendo o parágrafo e as </w:t>
+      </w:r>
+      <w:r>
+        <w:rPr>
+          <w:noProof/>
+        </w:rPr>
+        <w:t>“</w:t>
+      </w:r>
+      <w:r>
+        <w:rPr>
+          <w:noProof/>
+        </w:rPr>
+        <w:t>label</w:t>
+      </w:r>
+      <w:r>
+        <w:rPr>
+          <w:noProof/>
+        </w:rPr>
+        <w:t>”</w:t>
+      </w:r>
+      <w:r>
+        <w:rPr>
+          <w:noProof/>
+        </w:rPr>
+        <w:t xml:space="preserve"> </w:t>
+      </w:r>
+      <w:r>
+        <w:rPr>
+          <w:noProof/>
+        </w:rPr>
+        <w:t>com os</w:t>
+      </w:r>
+      <w:r>
+        <w:rPr>
+          <w:noProof/>
+        </w:rPr>
+        <w:t xml:space="preserve"> </w:t>
+      </w:r>
+      <w:r>
+        <w:rPr>
+          <w:noProof/>
+        </w:rPr>
+        <w:t>“</w:t>
+      </w:r>
+      <w:r>
+        <w:rPr>
+          <w:noProof/>
+        </w:rPr>
+        <w:t>input</w:t>
+      </w:r>
+      <w:r>
+        <w:rPr>
+          <w:noProof/>
+        </w:rPr>
+        <w:t>:radio;”</w:t>
+      </w:r>
+    </w:p>
+    <w:p>
+      <w:pPr>
+        <w:rPr>
+          <w:noProof/>
+        </w:rPr>
+      </w:pPr>
+      <w:r>
+        <w:rPr>
+          <w:noProof/>
+        </w:rPr>
+        <w:drawing>
+          <wp:inline distT="0" distB="0" distL="0" distR="0" wp14:anchorId="5E60B99F" wp14:editId="5F6306C5">
+            <wp:extent cx="3019425" cy="1516813"/>
+            <wp:effectExtent l="0" t="0" r="0" b="7620"/>
+            <wp:docPr id="127" name="Imagem 127"/>
+            <wp:cNvGraphicFramePr>
+              <a:graphicFrameLocks xmlns:a="http://schemas.openxmlformats.org/drawingml/2006/main" noChangeAspect="1"/>
+            </wp:cNvGraphicFramePr>
+            <a:graphic xmlns:a="http://schemas.openxmlformats.org/drawingml/2006/main">
+              <a:graphicData uri="http://schemas.openxmlformats.org/drawingml/2006/picture">
+                <pic:pic xmlns:pic="http://schemas.openxmlformats.org/drawingml/2006/picture">
+                  <pic:nvPicPr>
+                    <pic:cNvPr id="1" name=""/>
+                    <pic:cNvPicPr/>
+                  </pic:nvPicPr>
+                  <pic:blipFill>
+                    <a:blip r:embed="rId113"/>
+                    <a:stretch>
+                      <a:fillRect/>
+                    </a:stretch>
+                  </pic:blipFill>
+                  <pic:spPr>
+                    <a:xfrm>
+                      <a:off x="0" y="0"/>
+                      <a:ext cx="3047644" cy="1530989"/>
+                    </a:xfrm>
+                    <a:prstGeom prst="rect">
+                      <a:avLst/>
+                    </a:prstGeom>
+                  </pic:spPr>
+                </pic:pic>
+              </a:graphicData>
+            </a:graphic>
+          </wp:inline>
+        </w:drawing>
+      </w:r>
+    </w:p>
+    <w:p>
+      <w:pPr>
+        <w:rPr>
+          <w:noProof/>
+        </w:rPr>
+      </w:pPr>
+      <w:r>
+        <w:rPr>
+          <w:noProof/>
+        </w:rPr>
+        <w:t>68 – Adicionamos uma “label” com o “input:checkbox;”.</w:t>
+      </w:r>
+    </w:p>
+    <w:p>
+      <w:pPr>
+        <w:rPr>
+          <w:noProof/>
+        </w:rPr>
+      </w:pPr>
+      <w:r>
+        <w:rPr>
+          <w:noProof/>
+        </w:rPr>
+        <w:drawing>
+          <wp:inline distT="0" distB="0" distL="0" distR="0" wp14:anchorId="5FAA1BA5" wp14:editId="269420F9">
+            <wp:extent cx="4676775" cy="366817"/>
+            <wp:effectExtent l="0" t="0" r="0" b="0"/>
+            <wp:docPr id="128" name="Imagem 128"/>
+            <wp:cNvGraphicFramePr>
+              <a:graphicFrameLocks xmlns:a="http://schemas.openxmlformats.org/drawingml/2006/main" noChangeAspect="1"/>
+            </wp:cNvGraphicFramePr>
+            <a:graphic xmlns:a="http://schemas.openxmlformats.org/drawingml/2006/main">
+              <a:graphicData uri="http://schemas.openxmlformats.org/drawingml/2006/picture">
+                <pic:pic xmlns:pic="http://schemas.openxmlformats.org/drawingml/2006/picture">
+                  <pic:nvPicPr>
+                    <pic:cNvPr id="1" name=""/>
+                    <pic:cNvPicPr/>
+                  </pic:nvPicPr>
+                  <pic:blipFill>
+                    <a:blip r:embed="rId114"/>
+                    <a:stretch>
+                      <a:fillRect/>
+                    </a:stretch>
+                  </pic:blipFill>
+                  <pic:spPr>
+                    <a:xfrm>
+                      <a:off x="0" y="0"/>
+                      <a:ext cx="4810941" cy="377340"/>
+                    </a:xfrm>
+                    <a:prstGeom prst="rect">
+                      <a:avLst/>
+                    </a:prstGeom>
+                  </pic:spPr>
+                </pic:pic>
+              </a:graphicData>
+            </a:graphic>
+          </wp:inline>
+        </w:drawing>
+      </w:r>
+      <w:r>
+        <w:rPr>
+          <w:noProof/>
+        </w:rPr>
+        <w:drawing>
+          <wp:inline distT="0" distB="0" distL="0" distR="0" wp14:anchorId="4DD33BEB" wp14:editId="0F18C619">
+            <wp:extent cx="4541386" cy="571500"/>
+            <wp:effectExtent l="0" t="0" r="0" b="0"/>
+            <wp:docPr id="129" name="Imagem 129"/>
+            <wp:cNvGraphicFramePr>
+              <a:graphicFrameLocks xmlns:a="http://schemas.openxmlformats.org/drawingml/2006/main" noChangeAspect="1"/>
+            </wp:cNvGraphicFramePr>
+            <a:graphic xmlns:a="http://schemas.openxmlformats.org/drawingml/2006/main">
+              <a:graphicData uri="http://schemas.openxmlformats.org/drawingml/2006/picture">
+                <pic:pic xmlns:pic="http://schemas.openxmlformats.org/drawingml/2006/picture">
+                  <pic:nvPicPr>
+                    <pic:cNvPr id="1" name=""/>
+                    <pic:cNvPicPr/>
+                  </pic:nvPicPr>
+                  <pic:blipFill>
+                    <a:blip r:embed="rId115"/>
+                    <a:stretch>
+                      <a:fillRect/>
+                    </a:stretch>
+                  </pic:blipFill>
+                  <pic:spPr>
+                    <a:xfrm>
+                      <a:off x="0" y="0"/>
+                      <a:ext cx="4588768" cy="577463"/>
+                    </a:xfrm>
+                    <a:prstGeom prst="rect">
+                      <a:avLst/>
+                    </a:prstGeom>
+                  </pic:spPr>
+                </pic:pic>
+              </a:graphicData>
+            </a:graphic>
+          </wp:inline>
+        </w:drawing>
+      </w:r>
+    </w:p>
+    <w:p>
+      <w:pPr>
+        <w:rPr>
+          <w:noProof/>
+        </w:rPr>
+      </w:pPr>
+      <w:r>
+        <w:rPr>
+          <w:noProof/>
+        </w:rPr>
+        <w:t xml:space="preserve">69 </w:t>
+      </w:r>
+      <w:r>
+        <w:rPr>
+          <w:noProof/>
+        </w:rPr>
+        <w:t>–</w:t>
+      </w:r>
+      <w:r>
+        <w:rPr>
+          <w:noProof/>
+        </w:rPr>
+        <w:t xml:space="preserve"> </w:t>
+      </w:r>
+      <w:r>
+        <w:rPr>
+          <w:noProof/>
+        </w:rPr>
+        <w:t>Para colocar os “input:radio;” e “input:checkbox;” precisamos adicionar os “inputs” dentro da “label”. Conforme imagem a baixo:</w:t>
+      </w:r>
+      <w:r>
+        <w:rPr>
+          <w:noProof/>
+        </w:rPr>
+        <w:t xml:space="preserve"> </w:t>
+      </w:r>
+    </w:p>
+    <w:p>
+      <w:pPr>
+        <w:rPr>
+          <w:noProof/>
+        </w:rPr>
+      </w:pPr>
+      <w:r>
+        <w:rPr>
+          <w:noProof/>
+        </w:rPr>
+        <w:drawing>
+          <wp:inline distT="0" distB="0" distL="0" distR="0" wp14:anchorId="2B7EEF5E" wp14:editId="2D6105EA">
+            <wp:extent cx="5325435" cy="1314450"/>
+            <wp:effectExtent l="0" t="0" r="8890" b="0"/>
+            <wp:docPr id="130" name="Imagem 130"/>
+            <wp:cNvGraphicFramePr>
+              <a:graphicFrameLocks xmlns:a="http://schemas.openxmlformats.org/drawingml/2006/main" noChangeAspect="1"/>
+            </wp:cNvGraphicFramePr>
+            <a:graphic xmlns:a="http://schemas.openxmlformats.org/drawingml/2006/main">
+              <a:graphicData uri="http://schemas.openxmlformats.org/drawingml/2006/picture">
+                <pic:pic xmlns:pic="http://schemas.openxmlformats.org/drawingml/2006/picture">
+                  <pic:nvPicPr>
+                    <pic:cNvPr id="1" name=""/>
+                    <pic:cNvPicPr/>
+                  </pic:nvPicPr>
+                  <pic:blipFill>
+                    <a:blip r:embed="rId116"/>
+                    <a:stretch>
+                      <a:fillRect/>
+                    </a:stretch>
+                  </pic:blipFill>
+                  <pic:spPr>
+                    <a:xfrm>
+                      <a:off x="0" y="0"/>
+                      <a:ext cx="5358544" cy="1322622"/>
+                    </a:xfrm>
+                    <a:prstGeom prst="rect">
+                      <a:avLst/>
+                    </a:prstGeom>
+                  </pic:spPr>
+                </pic:pic>
+              </a:graphicData>
+            </a:graphic>
+          </wp:inline>
+        </w:drawing>
+      </w:r>
+      <w:r>
+        <w:rPr>
+          <w:noProof/>
+        </w:rPr>
+        <w:t xml:space="preserve"> </w:t>
+      </w:r>
+      <w:r>
+        <w:rPr>
+          <w:noProof/>
+        </w:rPr>
+        <w:drawing>
+          <wp:inline distT="0" distB="0" distL="0" distR="0" wp14:anchorId="46E52706" wp14:editId="740F21EB">
+            <wp:extent cx="2647950" cy="995285"/>
+            <wp:effectExtent l="0" t="0" r="0" b="0"/>
+            <wp:docPr id="131" name="Imagem 131"/>
+            <wp:cNvGraphicFramePr>
+              <a:graphicFrameLocks xmlns:a="http://schemas.openxmlformats.org/drawingml/2006/main" noChangeAspect="1"/>
+            </wp:cNvGraphicFramePr>
+            <a:graphic xmlns:a="http://schemas.openxmlformats.org/drawingml/2006/main">
+              <a:graphicData uri="http://schemas.openxmlformats.org/drawingml/2006/picture">
+                <pic:pic xmlns:pic="http://schemas.openxmlformats.org/drawingml/2006/picture">
+                  <pic:nvPicPr>
+                    <pic:cNvPr id="1" name=""/>
+                    <pic:cNvPicPr/>
+                  </pic:nvPicPr>
+                  <pic:blipFill>
+                    <a:blip r:embed="rId117"/>
+                    <a:stretch>
+                      <a:fillRect/>
+                    </a:stretch>
+                  </pic:blipFill>
+                  <pic:spPr>
+                    <a:xfrm>
+                      <a:off x="0" y="0"/>
+                      <a:ext cx="2708941" cy="1018210"/>
+                    </a:xfrm>
+                    <a:prstGeom prst="rect">
+                      <a:avLst/>
+                    </a:prstGeom>
+                  </pic:spPr>
+                </pic:pic>
+              </a:graphicData>
+            </a:graphic>
+          </wp:inline>
+        </w:drawing>
+      </w:r>
+    </w:p>
+    <w:p>
+      <w:pPr>
+        <w:rPr>
+          <w:noProof/>
+        </w:rPr>
+      </w:pPr>
+      <w:r>
+        <w:rPr>
+          <w:noProof/>
+        </w:rPr>
+        <w:t xml:space="preserve">70 </w:t>
+      </w:r>
+      <w:r>
+        <w:rPr>
+          <w:noProof/>
+        </w:rPr>
+        <w:t>–</w:t>
+      </w:r>
+      <w:r>
+        <w:rPr>
+          <w:noProof/>
+        </w:rPr>
+        <w:t xml:space="preserve"> </w:t>
+      </w:r>
+      <w:r>
+        <w:rPr>
+          <w:noProof/>
+        </w:rPr>
+        <w:t xml:space="preserve">Notamos que em nosso caso o </w:t>
+      </w:r>
+      <w:r>
+        <w:rPr>
+          <w:noProof/>
+        </w:rPr>
+        <w:t>“</w:t>
+      </w:r>
+      <w:r>
+        <w:rPr>
+          <w:noProof/>
+        </w:rPr>
+        <w:t>form input</w:t>
+      </w:r>
+      <w:r>
+        <w:rPr>
+          <w:noProof/>
+        </w:rPr>
+        <w:t>{}”</w:t>
+      </w:r>
+      <w:r>
+        <w:rPr>
+          <w:noProof/>
+        </w:rPr>
+        <w:t xml:space="preserve"> estava configurado como </w:t>
+      </w:r>
+      <w:r>
+        <w:rPr>
+          <w:noProof/>
+        </w:rPr>
+        <w:t>“</w:t>
+      </w:r>
+      <w:r>
+        <w:rPr>
+          <w:noProof/>
+        </w:rPr>
+        <w:t>display:block;</w:t>
+      </w:r>
+      <w:r>
+        <w:rPr>
+          <w:noProof/>
+        </w:rPr>
+        <w:t>”</w:t>
+      </w:r>
+      <w:r>
+        <w:rPr>
+          <w:noProof/>
+        </w:rPr>
+        <w:t xml:space="preserve"> impedindo que as </w:t>
+      </w:r>
+      <w:r>
+        <w:rPr>
+          <w:noProof/>
+        </w:rPr>
+        <w:t>“</w:t>
+      </w:r>
+      <w:r>
+        <w:rPr>
+          <w:noProof/>
+        </w:rPr>
+        <w:t>label</w:t>
+      </w:r>
+      <w:r>
+        <w:rPr>
+          <w:noProof/>
+        </w:rPr>
+        <w:t>”</w:t>
+      </w:r>
+      <w:r>
+        <w:rPr>
+          <w:noProof/>
+        </w:rPr>
+        <w:t xml:space="preserve"> e os </w:t>
+      </w:r>
+      <w:r>
+        <w:rPr>
+          <w:noProof/>
+        </w:rPr>
+        <w:t>“</w:t>
+      </w:r>
+      <w:r>
+        <w:rPr>
+          <w:noProof/>
+        </w:rPr>
+        <w:t>input</w:t>
+      </w:r>
+      <w:r>
+        <w:rPr>
+          <w:noProof/>
+        </w:rPr>
+        <w:t>”</w:t>
+      </w:r>
+      <w:r>
+        <w:rPr>
+          <w:noProof/>
+        </w:rPr>
+        <w:t xml:space="preserve"> de ficarem um ao lado do outro. Para resolver essa situação mudamos onde antigamente era </w:t>
+      </w:r>
+      <w:r>
+        <w:rPr>
+          <w:noProof/>
+        </w:rPr>
+        <w:t>“</w:t>
+      </w:r>
+      <w:r>
+        <w:rPr>
+          <w:noProof/>
+        </w:rPr>
+        <w:t>form input</w:t>
+      </w:r>
+      <w:r>
+        <w:rPr>
+          <w:noProof/>
+        </w:rPr>
+        <w:t>”</w:t>
+      </w:r>
+      <w:r>
+        <w:rPr>
+          <w:noProof/>
+        </w:rPr>
+        <w:t xml:space="preserve">, trocamos para uma class </w:t>
+      </w:r>
+      <w:r>
+        <w:rPr>
+          <w:noProof/>
+        </w:rPr>
+        <w:t>“</w:t>
+      </w:r>
+      <w:r>
+        <w:rPr>
+          <w:noProof/>
+        </w:rPr>
+        <w:t>inputs-padrao{}</w:t>
+      </w:r>
+      <w:r>
+        <w:rPr>
+          <w:noProof/>
+        </w:rPr>
+        <w:t>” e adicionamos nos “inputs” os quais queriamos que ficassem um a baixo do outro.</w:t>
+      </w:r>
+    </w:p>
+    <w:p>
+      <w:pPr>
+        <w:rPr>
+          <w:noProof/>
+        </w:rPr>
+      </w:pPr>
+      <w:r>
+        <w:rPr>
+          <w:noProof/>
+        </w:rPr>
+        <w:drawing>
+          <wp:inline distT="0" distB="0" distL="0" distR="0" wp14:anchorId="45089605" wp14:editId="6A6A8121">
+            <wp:extent cx="2037715" cy="1733550"/>
+            <wp:effectExtent l="0" t="0" r="635" b="0"/>
+            <wp:docPr id="132" name="Imagem 132"/>
+            <wp:cNvGraphicFramePr>
+              <a:graphicFrameLocks xmlns:a="http://schemas.openxmlformats.org/drawingml/2006/main" noChangeAspect="1"/>
+            </wp:cNvGraphicFramePr>
+            <a:graphic xmlns:a="http://schemas.openxmlformats.org/drawingml/2006/main">
+              <a:graphicData uri="http://schemas.openxmlformats.org/drawingml/2006/picture">
+                <pic:pic xmlns:pic="http://schemas.openxmlformats.org/drawingml/2006/picture">
+                  <pic:nvPicPr>
+                    <pic:cNvPr id="1" name=""/>
+                    <pic:cNvPicPr/>
+                  </pic:nvPicPr>
+                  <pic:blipFill>
+                    <a:blip r:embed="rId118"/>
+                    <a:stretch>
+                      <a:fillRect/>
+                    </a:stretch>
+                  </pic:blipFill>
+                  <pic:spPr>
+                    <a:xfrm>
+                      <a:off x="0" y="0"/>
+                      <a:ext cx="2049523" cy="1743595"/>
+                    </a:xfrm>
+                    <a:prstGeom prst="rect">
+                      <a:avLst/>
+                    </a:prstGeom>
+                  </pic:spPr>
+                </pic:pic>
+              </a:graphicData>
+            </a:graphic>
+          </wp:inline>
+        </w:drawing>
+      </w:r>
+      <w:r>
+        <w:rPr>
+          <w:noProof/>
+        </w:rPr>
+        <w:drawing>
+          <wp:inline distT="0" distB="0" distL="0" distR="0" wp14:anchorId="5F96E3C2" wp14:editId="03D9F2AC">
+            <wp:extent cx="3343275" cy="1388076"/>
+            <wp:effectExtent l="0" t="0" r="0" b="3175"/>
+            <wp:docPr id="133" name="Imagem 133"/>
+            <wp:cNvGraphicFramePr>
+              <a:graphicFrameLocks xmlns:a="http://schemas.openxmlformats.org/drawingml/2006/main" noChangeAspect="1"/>
+            </wp:cNvGraphicFramePr>
+            <a:graphic xmlns:a="http://schemas.openxmlformats.org/drawingml/2006/main">
+              <a:graphicData uri="http://schemas.openxmlformats.org/drawingml/2006/picture">
+                <pic:pic xmlns:pic="http://schemas.openxmlformats.org/drawingml/2006/picture">
+                  <pic:nvPicPr>
+                    <pic:cNvPr id="1" name=""/>
+                    <pic:cNvPicPr/>
+                  </pic:nvPicPr>
+                  <pic:blipFill>
+                    <a:blip r:embed="rId119"/>
+                    <a:stretch>
+                      <a:fillRect/>
+                    </a:stretch>
+                  </pic:blipFill>
+                  <pic:spPr>
+                    <a:xfrm>
+                      <a:off x="0" y="0"/>
+                      <a:ext cx="3398204" cy="1410882"/>
+                    </a:xfrm>
+                    <a:prstGeom prst="rect">
+                      <a:avLst/>
+                    </a:prstGeom>
+                  </pic:spPr>
+                </pic:pic>
+              </a:graphicData>
+            </a:graphic>
+          </wp:inline>
+        </w:drawing>
+      </w:r>
+    </w:p>
+    <w:p>
+      <w:pPr>
+        <w:rPr>
+          <w:noProof/>
+        </w:rPr>
+      </w:pPr>
+      <w:r>
+        <w:rPr>
+          <w:noProof/>
+        </w:rPr>
+        <w:lastRenderedPageBreak/>
+        <w:t xml:space="preserve">71 - </w:t>
       </w:r>
       <w:bookmarkStart w:id="0" w:name="_GoBack"/>
       <w:bookmarkEnd w:id="0"/>
+    </w:p>
+    <w:p>
+      <w:pPr>
+        <w:rPr>
+          <w:noProof/>
+        </w:rPr>
+      </w:pPr>
+      <w:r>
+        <w:rPr>
+          <w:noProof/>
+        </w:rPr>
+        <w:t xml:space="preserve"> </w:t>
+      </w:r>
     </w:p>
     <w:sectPr>
       <w:pgSz w:w="11906" w:h="16838"/>
@@ -8847,7 +10304,7 @@
 </file>
 
 <file path=customXml/itemProps1.xml><?xml version="1.0" encoding="utf-8"?>
-<ds:datastoreItem xmlns:ds="http://schemas.openxmlformats.org/officeDocument/2006/customXml" ds:itemID="{82CC3B05-780F-47A7-890E-9E098F406707}">
+<ds:datastoreItem xmlns:ds="http://schemas.openxmlformats.org/officeDocument/2006/customXml" ds:itemID="{458C01F4-5E1A-4AC5-A8D7-8BE3A6F306BA}">
   <ds:schemaRefs>
     <ds:schemaRef ds:uri="http://schemas.openxmlformats.org/officeDocument/2006/bibliography"/>
   </ds:schemaRefs>

</xml_diff>

<commit_message>
quase terminamos o formalario
</commit_message>
<xml_diff>
--- a/Apostila/Projeto Space For Men.docx
+++ b/Apostila/Projeto Space For Men.docx
@@ -9404,7 +9404,1160 @@
           <w:noProof/>
         </w:rPr>
         <w:lastRenderedPageBreak/>
-        <w:t xml:space="preserve">71 - </w:t>
+        <w:t xml:space="preserve">71 </w:t>
+      </w:r>
+      <w:r>
+        <w:rPr>
+          <w:noProof/>
+        </w:rPr>
+        <w:t>–</w:t>
+      </w:r>
+      <w:r>
+        <w:rPr>
+          <w:noProof/>
+        </w:rPr>
+        <w:t xml:space="preserve"> </w:t>
+      </w:r>
+      <w:r>
+        <w:rPr>
+          <w:noProof/>
+        </w:rPr>
+        <w:t>Adicionamos uma “class” na ”label” “checkbox” para dar um espaço tanto para cima como para baixo.</w:t>
+      </w:r>
+    </w:p>
+    <w:p>
+      <w:pPr>
+        <w:rPr>
+          <w:noProof/>
+        </w:rPr>
+      </w:pPr>
+      <w:r>
+        <w:rPr>
+          <w:noProof/>
+        </w:rPr>
+        <w:drawing>
+          <wp:inline distT="0" distB="0" distL="0" distR="0" wp14:anchorId="19CE2025" wp14:editId="22C8ABE7">
+            <wp:extent cx="5400040" cy="218440"/>
+            <wp:effectExtent l="0" t="0" r="0" b="0"/>
+            <wp:docPr id="134" name="Imagem 134"/>
+            <wp:cNvGraphicFramePr>
+              <a:graphicFrameLocks xmlns:a="http://schemas.openxmlformats.org/drawingml/2006/main" noChangeAspect="1"/>
+            </wp:cNvGraphicFramePr>
+            <a:graphic xmlns:a="http://schemas.openxmlformats.org/drawingml/2006/main">
+              <a:graphicData uri="http://schemas.openxmlformats.org/drawingml/2006/picture">
+                <pic:pic xmlns:pic="http://schemas.openxmlformats.org/drawingml/2006/picture">
+                  <pic:nvPicPr>
+                    <pic:cNvPr id="1" name=""/>
+                    <pic:cNvPicPr/>
+                  </pic:nvPicPr>
+                  <pic:blipFill>
+                    <a:blip r:embed="rId120"/>
+                    <a:stretch>
+                      <a:fillRect/>
+                    </a:stretch>
+                  </pic:blipFill>
+                  <pic:spPr>
+                    <a:xfrm>
+                      <a:off x="0" y="0"/>
+                      <a:ext cx="5400040" cy="218440"/>
+                    </a:xfrm>
+                    <a:prstGeom prst="rect">
+                      <a:avLst/>
+                    </a:prstGeom>
+                  </pic:spPr>
+                </pic:pic>
+              </a:graphicData>
+            </a:graphic>
+          </wp:inline>
+        </w:drawing>
+      </w:r>
+      <w:r>
+        <w:rPr>
+          <w:noProof/>
+        </w:rPr>
+        <w:drawing>
+          <wp:inline distT="0" distB="0" distL="0" distR="0" wp14:anchorId="116E43C5" wp14:editId="79F49CEB">
+            <wp:extent cx="1267002" cy="495369"/>
+            <wp:effectExtent l="0" t="0" r="9525" b="0"/>
+            <wp:docPr id="135" name="Imagem 135"/>
+            <wp:cNvGraphicFramePr>
+              <a:graphicFrameLocks xmlns:a="http://schemas.openxmlformats.org/drawingml/2006/main" noChangeAspect="1"/>
+            </wp:cNvGraphicFramePr>
+            <a:graphic xmlns:a="http://schemas.openxmlformats.org/drawingml/2006/main">
+              <a:graphicData uri="http://schemas.openxmlformats.org/drawingml/2006/picture">
+                <pic:pic xmlns:pic="http://schemas.openxmlformats.org/drawingml/2006/picture">
+                  <pic:nvPicPr>
+                    <pic:cNvPr id="1" name=""/>
+                    <pic:cNvPicPr/>
+                  </pic:nvPicPr>
+                  <pic:blipFill>
+                    <a:blip r:embed="rId121"/>
+                    <a:stretch>
+                      <a:fillRect/>
+                    </a:stretch>
+                  </pic:blipFill>
+                  <pic:spPr>
+                    <a:xfrm>
+                      <a:off x="0" y="0"/>
+                      <a:ext cx="1267002" cy="495369"/>
+                    </a:xfrm>
+                    <a:prstGeom prst="rect">
+                      <a:avLst/>
+                    </a:prstGeom>
+                  </pic:spPr>
+                </pic:pic>
+              </a:graphicData>
+            </a:graphic>
+          </wp:inline>
+        </w:drawing>
+      </w:r>
+    </w:p>
+    <w:p>
+      <w:pPr>
+        <w:rPr>
+          <w:noProof/>
+        </w:rPr>
+      </w:pPr>
+      <w:r>
+        <w:rPr>
+          <w:noProof/>
+        </w:rPr>
+        <w:t xml:space="preserve">72 – Inserimos um parágrafo </w:t>
+      </w:r>
+      <w:r>
+        <w:rPr>
+          <w:noProof/>
+        </w:rPr>
+        <w:t>fazendo a pergunta de qual a preferência de horário e, adicionamos “select” com “option” no “html” conforme código.</w:t>
+      </w:r>
+    </w:p>
+    <w:p>
+      <w:pPr>
+        <w:rPr>
+          <w:noProof/>
+        </w:rPr>
+      </w:pPr>
+      <w:r>
+        <w:rPr>
+          <w:noProof/>
+        </w:rPr>
+        <w:drawing>
+          <wp:inline distT="0" distB="0" distL="0" distR="0" wp14:anchorId="0CE478A7" wp14:editId="5ED54B6A">
+            <wp:extent cx="2514600" cy="877738"/>
+            <wp:effectExtent l="0" t="0" r="0" b="0"/>
+            <wp:docPr id="136" name="Imagem 136"/>
+            <wp:cNvGraphicFramePr>
+              <a:graphicFrameLocks xmlns:a="http://schemas.openxmlformats.org/drawingml/2006/main" noChangeAspect="1"/>
+            </wp:cNvGraphicFramePr>
+            <a:graphic xmlns:a="http://schemas.openxmlformats.org/drawingml/2006/main">
+              <a:graphicData uri="http://schemas.openxmlformats.org/drawingml/2006/picture">
+                <pic:pic xmlns:pic="http://schemas.openxmlformats.org/drawingml/2006/picture">
+                  <pic:nvPicPr>
+                    <pic:cNvPr id="1" name=""/>
+                    <pic:cNvPicPr/>
+                  </pic:nvPicPr>
+                  <pic:blipFill>
+                    <a:blip r:embed="rId122"/>
+                    <a:stretch>
+                      <a:fillRect/>
+                    </a:stretch>
+                  </pic:blipFill>
+                  <pic:spPr>
+                    <a:xfrm>
+                      <a:off x="0" y="0"/>
+                      <a:ext cx="2549655" cy="889974"/>
+                    </a:xfrm>
+                    <a:prstGeom prst="rect">
+                      <a:avLst/>
+                    </a:prstGeom>
+                  </pic:spPr>
+                </pic:pic>
+              </a:graphicData>
+            </a:graphic>
+          </wp:inline>
+        </w:drawing>
+      </w:r>
+    </w:p>
+    <w:p>
+      <w:pPr>
+        <w:rPr>
+          <w:noProof/>
+        </w:rPr>
+      </w:pPr>
+      <w:r>
+        <w:rPr>
+          <w:noProof/>
+        </w:rPr>
+        <w:t xml:space="preserve">73 </w:t>
+      </w:r>
+      <w:r>
+        <w:rPr>
+          <w:noProof/>
+        </w:rPr>
+        <w:t>–</w:t>
+      </w:r>
+      <w:r>
+        <w:rPr>
+          <w:noProof/>
+        </w:rPr>
+        <w:t xml:space="preserve"> </w:t>
+      </w:r>
+      <w:r>
+        <w:rPr>
+          <w:noProof/>
+        </w:rPr>
+        <w:t>Entramos no site “mobile input type” para saber qual tipo de “input” usar em dispositivos moveis.</w:t>
+      </w:r>
+    </w:p>
+    <w:p>
+      <w:pPr>
+        <w:rPr>
+          <w:noProof/>
+        </w:rPr>
+      </w:pPr>
+      <w:r>
+        <w:rPr>
+          <w:noProof/>
+        </w:rPr>
+        <w:drawing>
+          <wp:inline distT="0" distB="0" distL="0" distR="0" wp14:anchorId="1884A43B" wp14:editId="2E52DB56">
+            <wp:extent cx="3352800" cy="765480"/>
+            <wp:effectExtent l="0" t="0" r="0" b="0"/>
+            <wp:docPr id="137" name="Imagem 137"/>
+            <wp:cNvGraphicFramePr>
+              <a:graphicFrameLocks xmlns:a="http://schemas.openxmlformats.org/drawingml/2006/main" noChangeAspect="1"/>
+            </wp:cNvGraphicFramePr>
+            <a:graphic xmlns:a="http://schemas.openxmlformats.org/drawingml/2006/main">
+              <a:graphicData uri="http://schemas.openxmlformats.org/drawingml/2006/picture">
+                <pic:pic xmlns:pic="http://schemas.openxmlformats.org/drawingml/2006/picture">
+                  <pic:nvPicPr>
+                    <pic:cNvPr id="1" name=""/>
+                    <pic:cNvPicPr/>
+                  </pic:nvPicPr>
+                  <pic:blipFill>
+                    <a:blip r:embed="rId123"/>
+                    <a:stretch>
+                      <a:fillRect/>
+                    </a:stretch>
+                  </pic:blipFill>
+                  <pic:spPr>
+                    <a:xfrm>
+                      <a:off x="0" y="0"/>
+                      <a:ext cx="3413229" cy="779276"/>
+                    </a:xfrm>
+                    <a:prstGeom prst="rect">
+                      <a:avLst/>
+                    </a:prstGeom>
+                  </pic:spPr>
+                </pic:pic>
+              </a:graphicData>
+            </a:graphic>
+          </wp:inline>
+        </w:drawing>
+      </w:r>
+      <w:r>
+        <w:rPr>
+          <w:noProof/>
+        </w:rPr>
+        <w:drawing>
+          <wp:inline distT="0" distB="0" distL="0" distR="0" wp14:anchorId="7974CBA8" wp14:editId="2D2C1771">
+            <wp:extent cx="1895475" cy="658597"/>
+            <wp:effectExtent l="0" t="0" r="0" b="8255"/>
+            <wp:docPr id="138" name="Imagem 138"/>
+            <wp:cNvGraphicFramePr>
+              <a:graphicFrameLocks xmlns:a="http://schemas.openxmlformats.org/drawingml/2006/main" noChangeAspect="1"/>
+            </wp:cNvGraphicFramePr>
+            <a:graphic xmlns:a="http://schemas.openxmlformats.org/drawingml/2006/main">
+              <a:graphicData uri="http://schemas.openxmlformats.org/drawingml/2006/picture">
+                <pic:pic xmlns:pic="http://schemas.openxmlformats.org/drawingml/2006/picture">
+                  <pic:nvPicPr>
+                    <pic:cNvPr id="1" name=""/>
+                    <pic:cNvPicPr/>
+                  </pic:nvPicPr>
+                  <pic:blipFill>
+                    <a:blip r:embed="rId124"/>
+                    <a:stretch>
+                      <a:fillRect/>
+                    </a:stretch>
+                  </pic:blipFill>
+                  <pic:spPr>
+                    <a:xfrm>
+                      <a:off x="0" y="0"/>
+                      <a:ext cx="1911405" cy="664132"/>
+                    </a:xfrm>
+                    <a:prstGeom prst="rect">
+                      <a:avLst/>
+                    </a:prstGeom>
+                  </pic:spPr>
+                </pic:pic>
+              </a:graphicData>
+            </a:graphic>
+          </wp:inline>
+        </w:drawing>
+      </w:r>
+    </w:p>
+    <w:p>
+      <w:pPr>
+        <w:rPr>
+          <w:noProof/>
+        </w:rPr>
+      </w:pPr>
+      <w:r>
+        <w:rPr>
+          <w:noProof/>
+        </w:rPr>
+        <w:t>74 – Quando queremos que alguns campos seja</w:t>
+      </w:r>
+      <w:r>
+        <w:rPr>
+          <w:noProof/>
+        </w:rPr>
+        <w:t>m</w:t>
+      </w:r>
+      <w:r>
+        <w:rPr>
+          <w:noProof/>
+        </w:rPr>
+        <w:t xml:space="preserve"> obrigatórios </w:t>
+      </w:r>
+      <w:r>
+        <w:rPr>
+          <w:noProof/>
+        </w:rPr>
+        <w:t>no formulário usamos o “required” no “input”(obs: se usamos o tipo de “input” correto como por exemplo o email se, não estiver correto a grafia ele também não envia).</w:t>
+      </w:r>
+    </w:p>
+    <w:p>
+      <w:pPr>
+        <w:rPr>
+          <w:noProof/>
+        </w:rPr>
+      </w:pPr>
+      <w:r>
+        <w:rPr>
+          <w:noProof/>
+        </w:rPr>
+        <w:drawing>
+          <wp:inline distT="0" distB="0" distL="0" distR="0" wp14:anchorId="1835AD8F" wp14:editId="1B85F35C">
+            <wp:extent cx="3800475" cy="1088861"/>
+            <wp:effectExtent l="0" t="0" r="0" b="0"/>
+            <wp:docPr id="139" name="Imagem 139"/>
+            <wp:cNvGraphicFramePr>
+              <a:graphicFrameLocks xmlns:a="http://schemas.openxmlformats.org/drawingml/2006/main" noChangeAspect="1"/>
+            </wp:cNvGraphicFramePr>
+            <a:graphic xmlns:a="http://schemas.openxmlformats.org/drawingml/2006/main">
+              <a:graphicData uri="http://schemas.openxmlformats.org/drawingml/2006/picture">
+                <pic:pic xmlns:pic="http://schemas.openxmlformats.org/drawingml/2006/picture">
+                  <pic:nvPicPr>
+                    <pic:cNvPr id="1" name=""/>
+                    <pic:cNvPicPr/>
+                  </pic:nvPicPr>
+                  <pic:blipFill>
+                    <a:blip r:embed="rId125"/>
+                    <a:stretch>
+                      <a:fillRect/>
+                    </a:stretch>
+                  </pic:blipFill>
+                  <pic:spPr>
+                    <a:xfrm>
+                      <a:off x="0" y="0"/>
+                      <a:ext cx="3849130" cy="1102801"/>
+                    </a:xfrm>
+                    <a:prstGeom prst="rect">
+                      <a:avLst/>
+                    </a:prstGeom>
+                  </pic:spPr>
+                </pic:pic>
+              </a:graphicData>
+            </a:graphic>
+          </wp:inline>
+        </w:drawing>
+      </w:r>
+    </w:p>
+    <w:p>
+      <w:pPr>
+        <w:rPr>
+          <w:noProof/>
+        </w:rPr>
+      </w:pPr>
+      <w:r>
+        <w:rPr>
+          <w:noProof/>
+        </w:rPr>
+        <w:t xml:space="preserve">75 </w:t>
+      </w:r>
+      <w:r>
+        <w:rPr>
+          <w:noProof/>
+        </w:rPr>
+        <w:t>–</w:t>
+      </w:r>
+      <w:r>
+        <w:rPr>
+          <w:noProof/>
+        </w:rPr>
+        <w:t xml:space="preserve"> </w:t>
+      </w:r>
+      <w:r>
+        <w:rPr>
+          <w:noProof/>
+        </w:rPr>
+        <w:t>Utilizamos o “placeholder” para deixar exemplo dentro dos “inputs” como deve ser preenchido.</w:t>
+      </w:r>
+    </w:p>
+    <w:p>
+      <w:pPr>
+        <w:rPr>
+          <w:noProof/>
+        </w:rPr>
+      </w:pPr>
+      <w:r>
+        <w:rPr>
+          <w:noProof/>
+        </w:rPr>
+        <w:drawing>
+          <wp:inline distT="0" distB="0" distL="0" distR="0" wp14:anchorId="7303739A" wp14:editId="56D5EB18">
+            <wp:extent cx="3400425" cy="744542"/>
+            <wp:effectExtent l="0" t="0" r="0" b="0"/>
+            <wp:docPr id="140" name="Imagem 140"/>
+            <wp:cNvGraphicFramePr>
+              <a:graphicFrameLocks xmlns:a="http://schemas.openxmlformats.org/drawingml/2006/main" noChangeAspect="1"/>
+            </wp:cNvGraphicFramePr>
+            <a:graphic xmlns:a="http://schemas.openxmlformats.org/drawingml/2006/main">
+              <a:graphicData uri="http://schemas.openxmlformats.org/drawingml/2006/picture">
+                <pic:pic xmlns:pic="http://schemas.openxmlformats.org/drawingml/2006/picture">
+                  <pic:nvPicPr>
+                    <pic:cNvPr id="1" name=""/>
+                    <pic:cNvPicPr/>
+                  </pic:nvPicPr>
+                  <pic:blipFill>
+                    <a:blip r:embed="rId126"/>
+                    <a:stretch>
+                      <a:fillRect/>
+                    </a:stretch>
+                  </pic:blipFill>
+                  <pic:spPr>
+                    <a:xfrm>
+                      <a:off x="0" y="0"/>
+                      <a:ext cx="3449342" cy="755253"/>
+                    </a:xfrm>
+                    <a:prstGeom prst="rect">
+                      <a:avLst/>
+                    </a:prstGeom>
+                  </pic:spPr>
+                </pic:pic>
+              </a:graphicData>
+            </a:graphic>
+          </wp:inline>
+        </w:drawing>
+      </w:r>
+      <w:r>
+        <w:rPr>
+          <w:noProof/>
+        </w:rPr>
+        <w:drawing>
+          <wp:inline distT="0" distB="0" distL="0" distR="0" wp14:anchorId="505ED463" wp14:editId="5E0CE6D0">
+            <wp:extent cx="3512344" cy="1666875"/>
+            <wp:effectExtent l="0" t="0" r="0" b="0"/>
+            <wp:docPr id="141" name="Imagem 141"/>
+            <wp:cNvGraphicFramePr>
+              <a:graphicFrameLocks xmlns:a="http://schemas.openxmlformats.org/drawingml/2006/main" noChangeAspect="1"/>
+            </wp:cNvGraphicFramePr>
+            <a:graphic xmlns:a="http://schemas.openxmlformats.org/drawingml/2006/main">
+              <a:graphicData uri="http://schemas.openxmlformats.org/drawingml/2006/picture">
+                <pic:pic xmlns:pic="http://schemas.openxmlformats.org/drawingml/2006/picture">
+                  <pic:nvPicPr>
+                    <pic:cNvPr id="1" name=""/>
+                    <pic:cNvPicPr/>
+                  </pic:nvPicPr>
+                  <pic:blipFill>
+                    <a:blip r:embed="rId127"/>
+                    <a:stretch>
+                      <a:fillRect/>
+                    </a:stretch>
+                  </pic:blipFill>
+                  <pic:spPr>
+                    <a:xfrm>
+                      <a:off x="0" y="0"/>
+                      <a:ext cx="3521048" cy="1671006"/>
+                    </a:xfrm>
+                    <a:prstGeom prst="rect">
+                      <a:avLst/>
+                    </a:prstGeom>
+                  </pic:spPr>
+                </pic:pic>
+              </a:graphicData>
+            </a:graphic>
+          </wp:inline>
+        </w:drawing>
+      </w:r>
+    </w:p>
+    <w:p>
+      <w:pPr>
+        <w:rPr>
+          <w:noProof/>
+        </w:rPr>
+      </w:pPr>
+      <w:r>
+        <w:rPr>
+          <w:noProof/>
+        </w:rPr>
+        <w:lastRenderedPageBreak/>
+        <w:t xml:space="preserve">76 </w:t>
+      </w:r>
+      <w:r>
+        <w:rPr>
+          <w:noProof/>
+        </w:rPr>
+        <w:t>–</w:t>
+      </w:r>
+      <w:r>
+        <w:rPr>
+          <w:noProof/>
+        </w:rPr>
+        <w:t xml:space="preserve"> </w:t>
+      </w:r>
+      <w:r>
+        <w:rPr>
+          <w:noProof/>
+        </w:rPr>
+        <w:t>Trocamos as “div” do formulário por “fieldset”(conjuntos de campos) e, os parágrafos por “legend” sendo uma melhor forma de trabalhar quando estamos tratando de formulário. E no “css” as “legend” ficaram com as mesmas configurações das label.</w:t>
+      </w:r>
+    </w:p>
+    <w:p>
+      <w:pPr>
+        <w:rPr>
+          <w:noProof/>
+        </w:rPr>
+      </w:pPr>
+      <w:r>
+        <w:rPr>
+          <w:noProof/>
+        </w:rPr>
+        <mc:AlternateContent>
+          <mc:Choice Requires="wps">
+            <w:drawing>
+              <wp:anchor distT="0" distB="0" distL="114300" distR="114300" simplePos="0" relativeHeight="251684864" behindDoc="0" locked="0" layoutInCell="1" allowOverlap="1">
+                <wp:simplePos x="0" y="0"/>
+                <wp:positionH relativeFrom="column">
+                  <wp:posOffset>176464</wp:posOffset>
+                </wp:positionH>
+                <wp:positionV relativeFrom="paragraph">
+                  <wp:posOffset>1807070</wp:posOffset>
+                </wp:positionV>
+                <wp:extent cx="50488" cy="684397"/>
+                <wp:effectExtent l="38100" t="38100" r="64135" b="59055"/>
+                <wp:wrapNone/>
+                <wp:docPr id="148" name="Conector de Seta Reta 148"/>
+                <wp:cNvGraphicFramePr/>
+                <a:graphic xmlns:a="http://schemas.openxmlformats.org/drawingml/2006/main">
+                  <a:graphicData uri="http://schemas.microsoft.com/office/word/2010/wordprocessingShape">
+                    <wps:wsp>
+                      <wps:cNvCnPr/>
+                      <wps:spPr>
+                        <a:xfrm flipH="1">
+                          <a:off x="0" y="0"/>
+                          <a:ext cx="50488" cy="684397"/>
+                        </a:xfrm>
+                        <a:prstGeom prst="straightConnector1">
+                          <a:avLst/>
+                        </a:prstGeom>
+                        <a:ln>
+                          <a:solidFill>
+                            <a:srgbClr val="FF0000"/>
+                          </a:solidFill>
+                          <a:headEnd type="triangle"/>
+                          <a:tailEnd type="triangle"/>
+                        </a:ln>
+                      </wps:spPr>
+                      <wps:style>
+                        <a:lnRef idx="1">
+                          <a:schemeClr val="accent1"/>
+                        </a:lnRef>
+                        <a:fillRef idx="0">
+                          <a:schemeClr val="accent1"/>
+                        </a:fillRef>
+                        <a:effectRef idx="0">
+                          <a:schemeClr val="accent1"/>
+                        </a:effectRef>
+                        <a:fontRef idx="minor">
+                          <a:schemeClr val="tx1"/>
+                        </a:fontRef>
+                      </wps:style>
+                      <wps:bodyPr/>
+                    </wps:wsp>
+                  </a:graphicData>
+                </a:graphic>
+              </wp:anchor>
+            </w:drawing>
+          </mc:Choice>
+          <mc:Fallback>
+            <w:pict>
+              <v:shapetype w14:anchorId="1B4E84AB" id="_x0000_t32" coordsize="21600,21600" o:spt="32" o:oned="t" path="m,l21600,21600e" filled="f">
+                <v:path arrowok="t" fillok="f" o:connecttype="none"/>
+                <o:lock v:ext="edit" shapetype="t"/>
+              </v:shapetype>
+              <v:shape id="Conector de Seta Reta 148" o:spid="_x0000_s1026" type="#_x0000_t32" style="position:absolute;margin-left:13.9pt;margin-top:142.3pt;width:4pt;height:53.9pt;flip:x;z-index:251684864;visibility:visible;mso-wrap-style:square;mso-wrap-distance-left:9pt;mso-wrap-distance-top:0;mso-wrap-distance-right:9pt;mso-wrap-distance-bottom:0;mso-position-horizontal:absolute;mso-position-horizontal-relative:text;mso-position-vertical:absolute;mso-position-vertical-relative:text" o:gfxdata="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" strokecolor="red" strokeweight=".5pt">
+                <v:stroke startarrow="block" endarrow="block" joinstyle="miter"/>
+              </v:shape>
+            </w:pict>
+          </mc:Fallback>
+        </mc:AlternateContent>
+      </w:r>
+      <w:r>
+        <w:rPr>
+          <w:noProof/>
+        </w:rPr>
+        <mc:AlternateContent>
+          <mc:Choice Requires="wps">
+            <w:drawing>
+              <wp:anchor distT="0" distB="0" distL="114300" distR="114300" simplePos="0" relativeHeight="251683840" behindDoc="0" locked="0" layoutInCell="1" allowOverlap="1">
+                <wp:simplePos x="0" y="0"/>
+                <wp:positionH relativeFrom="column">
+                  <wp:posOffset>221342</wp:posOffset>
+                </wp:positionH>
+                <wp:positionV relativeFrom="paragraph">
+                  <wp:posOffset>1234869</wp:posOffset>
+                </wp:positionV>
+                <wp:extent cx="347809" cy="168294"/>
+                <wp:effectExtent l="38100" t="38100" r="52705" b="60325"/>
+                <wp:wrapNone/>
+                <wp:docPr id="147" name="Conector de Seta Reta 147"/>
+                <wp:cNvGraphicFramePr/>
+                <a:graphic xmlns:a="http://schemas.openxmlformats.org/drawingml/2006/main">
+                  <a:graphicData uri="http://schemas.microsoft.com/office/word/2010/wordprocessingShape">
+                    <wps:wsp>
+                      <wps:cNvCnPr/>
+                      <wps:spPr>
+                        <a:xfrm flipH="1">
+                          <a:off x="0" y="0"/>
+                          <a:ext cx="347809" cy="168294"/>
+                        </a:xfrm>
+                        <a:prstGeom prst="straightConnector1">
+                          <a:avLst/>
+                        </a:prstGeom>
+                        <a:ln>
+                          <a:solidFill>
+                            <a:srgbClr val="FF0000"/>
+                          </a:solidFill>
+                          <a:headEnd type="triangle"/>
+                          <a:tailEnd type="triangle"/>
+                        </a:ln>
+                      </wps:spPr>
+                      <wps:style>
+                        <a:lnRef idx="1">
+                          <a:schemeClr val="accent1"/>
+                        </a:lnRef>
+                        <a:fillRef idx="0">
+                          <a:schemeClr val="accent1"/>
+                        </a:fillRef>
+                        <a:effectRef idx="0">
+                          <a:schemeClr val="accent1"/>
+                        </a:effectRef>
+                        <a:fontRef idx="minor">
+                          <a:schemeClr val="tx1"/>
+                        </a:fontRef>
+                      </wps:style>
+                      <wps:bodyPr/>
+                    </wps:wsp>
+                  </a:graphicData>
+                </a:graphic>
+                <wp14:sizeRelH relativeFrom="margin">
+                  <wp14:pctWidth>0</wp14:pctWidth>
+                </wp14:sizeRelH>
+                <wp14:sizeRelV relativeFrom="margin">
+                  <wp14:pctHeight>0</wp14:pctHeight>
+                </wp14:sizeRelV>
+              </wp:anchor>
+            </w:drawing>
+          </mc:Choice>
+          <mc:Fallback>
+            <w:pict>
+              <v:shape w14:anchorId="5A777407" id="Conector de Seta Reta 147" o:spid="_x0000_s1026" type="#_x0000_t32" style="position:absolute;margin-left:17.45pt;margin-top:97.25pt;width:27.4pt;height:13.25pt;flip:x;z-index:251683840;visibility:visible;mso-wrap-style:square;mso-width-percent:0;mso-height-percent:0;mso-wrap-distance-left:9pt;mso-wrap-distance-top:0;mso-wrap-distance-right:9pt;mso-wrap-distance-bottom:0;mso-position-horizontal:absolute;mso-position-horizontal-relative:text;mso-position-vertical:absolute;mso-position-vertical-relative:text;mso-width-percent:0;mso-height-percent:0;mso-width-relative:margin;mso-height-relative:margin" o:gfxdata="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" strokecolor="red" strokeweight=".5pt">
+                <v:stroke startarrow="block" endarrow="block" joinstyle="miter"/>
+              </v:shape>
+            </w:pict>
+          </mc:Fallback>
+        </mc:AlternateContent>
+      </w:r>
+      <w:r>
+        <w:rPr>
+          <w:noProof/>
+        </w:rPr>
+        <mc:AlternateContent>
+          <mc:Choice Requires="wps">
+            <w:drawing>
+              <wp:anchor distT="0" distB="0" distL="114300" distR="114300" simplePos="0" relativeHeight="251682816" behindDoc="0" locked="0" layoutInCell="1" allowOverlap="1">
+                <wp:simplePos x="0" y="0"/>
+                <wp:positionH relativeFrom="column">
+                  <wp:posOffset>114756</wp:posOffset>
+                </wp:positionH>
+                <wp:positionV relativeFrom="paragraph">
+                  <wp:posOffset>135345</wp:posOffset>
+                </wp:positionV>
+                <wp:extent cx="308540" cy="145855"/>
+                <wp:effectExtent l="57150" t="38100" r="53975" b="83185"/>
+                <wp:wrapNone/>
+                <wp:docPr id="146" name="Conector: Curvo 146"/>
+                <wp:cNvGraphicFramePr/>
+                <a:graphic xmlns:a="http://schemas.openxmlformats.org/drawingml/2006/main">
+                  <a:graphicData uri="http://schemas.microsoft.com/office/word/2010/wordprocessingShape">
+                    <wps:wsp>
+                      <wps:cNvCnPr/>
+                      <wps:spPr>
+                        <a:xfrm>
+                          <a:off x="0" y="0"/>
+                          <a:ext cx="308540" cy="145855"/>
+                        </a:xfrm>
+                        <a:prstGeom prst="curvedConnector3">
+                          <a:avLst>
+                            <a:gd name="adj1" fmla="val 2766"/>
+                          </a:avLst>
+                        </a:prstGeom>
+                        <a:ln>
+                          <a:solidFill>
+                            <a:srgbClr val="FF0000"/>
+                          </a:solidFill>
+                          <a:headEnd type="triangle"/>
+                          <a:tailEnd type="triangle"/>
+                        </a:ln>
+                      </wps:spPr>
+                      <wps:style>
+                        <a:lnRef idx="1">
+                          <a:schemeClr val="accent1"/>
+                        </a:lnRef>
+                        <a:fillRef idx="0">
+                          <a:schemeClr val="accent1"/>
+                        </a:fillRef>
+                        <a:effectRef idx="0">
+                          <a:schemeClr val="accent1"/>
+                        </a:effectRef>
+                        <a:fontRef idx="minor">
+                          <a:schemeClr val="tx1"/>
+                        </a:fontRef>
+                      </wps:style>
+                      <wps:bodyPr/>
+                    </wps:wsp>
+                  </a:graphicData>
+                </a:graphic>
+                <wp14:sizeRelH relativeFrom="margin">
+                  <wp14:pctWidth>0</wp14:pctWidth>
+                </wp14:sizeRelH>
+                <wp14:sizeRelV relativeFrom="margin">
+                  <wp14:pctHeight>0</wp14:pctHeight>
+                </wp14:sizeRelV>
+              </wp:anchor>
+            </w:drawing>
+          </mc:Choice>
+          <mc:Fallback>
+            <w:pict>
+              <v:shapetype w14:anchorId="6F753592" id="_x0000_t38" coordsize="21600,21600" o:spt="38" o:oned="t" path="m,c@0,0@1,5400@1,10800@1,16200@2,21600,21600,21600e" filled="f">
+                <v:formulas>
+                  <v:f eqn="mid #0 0"/>
+                  <v:f eqn="val #0"/>
+                  <v:f eqn="mid #0 21600"/>
+                </v:formulas>
+                <v:path arrowok="t" fillok="f" o:connecttype="none"/>
+                <v:handles>
+                  <v:h position="#0,center"/>
+                </v:handles>
+                <o:lock v:ext="edit" shapetype="t"/>
+              </v:shapetype>
+              <v:shape id="Conector: Curvo 146" o:spid="_x0000_s1026" type="#_x0000_t38" style="position:absolute;margin-left:9.05pt;margin-top:10.65pt;width:24.3pt;height:11.5pt;z-index:251682816;visibility:visible;mso-wrap-style:square;mso-width-percent:0;mso-height-percent:0;mso-wrap-distance-left:9pt;mso-wrap-distance-top:0;mso-wrap-distance-right:9pt;mso-wrap-distance-bottom:0;mso-position-horizontal:absolute;mso-position-horizontal-relative:text;mso-position-vertical:absolute;mso-position-vertical-relative:text;mso-width-percent:0;mso-height-percent:0;mso-width-relative:margin;mso-height-relative:margin" o:gfxdata="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" adj="597" strokecolor="red" strokeweight=".5pt">
+                <v:stroke startarrow="block" endarrow="block" joinstyle="miter"/>
+              </v:shape>
+            </w:pict>
+          </mc:Fallback>
+        </mc:AlternateContent>
+      </w:r>
+      <w:r>
+        <w:rPr>
+          <w:noProof/>
+          <w:highlight w:val="cyan"/>
+        </w:rPr>
+        <w:drawing>
+          <wp:inline distT="0" distB="0" distL="0" distR="0" wp14:anchorId="7902A7FA" wp14:editId="528FE78D">
+            <wp:extent cx="5400040" cy="2676525"/>
+            <wp:effectExtent l="0" t="0" r="0" b="9525"/>
+            <wp:docPr id="142" name="Imagem 142"/>
+            <wp:cNvGraphicFramePr>
+              <a:graphicFrameLocks xmlns:a="http://schemas.openxmlformats.org/drawingml/2006/main" noChangeAspect="1"/>
+            </wp:cNvGraphicFramePr>
+            <a:graphic xmlns:a="http://schemas.openxmlformats.org/drawingml/2006/main">
+              <a:graphicData uri="http://schemas.openxmlformats.org/drawingml/2006/picture">
+                <pic:pic xmlns:pic="http://schemas.openxmlformats.org/drawingml/2006/picture">
+                  <pic:nvPicPr>
+                    <pic:cNvPr id="1" name=""/>
+                    <pic:cNvPicPr/>
+                  </pic:nvPicPr>
+                  <pic:blipFill>
+                    <a:blip r:embed="rId128"/>
+                    <a:stretch>
+                      <a:fillRect/>
+                    </a:stretch>
+                  </pic:blipFill>
+                  <pic:spPr>
+                    <a:xfrm>
+                      <a:off x="0" y="0"/>
+                      <a:ext cx="5400040" cy="2676525"/>
+                    </a:xfrm>
+                    <a:prstGeom prst="rect">
+                      <a:avLst/>
+                    </a:prstGeom>
+                  </pic:spPr>
+                </pic:pic>
+              </a:graphicData>
+            </a:graphic>
+          </wp:inline>
+        </w:drawing>
+      </w:r>
+      <w:r>
+        <w:rPr>
+          <w:noProof/>
+        </w:rPr>
+        <w:drawing>
+          <wp:inline distT="0" distB="0" distL="0" distR="0" wp14:anchorId="656336C0" wp14:editId="4D76DACF">
+            <wp:extent cx="1447800" cy="667124"/>
+            <wp:effectExtent l="0" t="0" r="0" b="0"/>
+            <wp:docPr id="143" name="Imagem 143"/>
+            <wp:cNvGraphicFramePr>
+              <a:graphicFrameLocks xmlns:a="http://schemas.openxmlformats.org/drawingml/2006/main" noChangeAspect="1"/>
+            </wp:cNvGraphicFramePr>
+            <a:graphic xmlns:a="http://schemas.openxmlformats.org/drawingml/2006/main">
+              <a:graphicData uri="http://schemas.openxmlformats.org/drawingml/2006/picture">
+                <pic:pic xmlns:pic="http://schemas.openxmlformats.org/drawingml/2006/picture">
+                  <pic:nvPicPr>
+                    <pic:cNvPr id="1" name=""/>
+                    <pic:cNvPicPr/>
+                  </pic:nvPicPr>
+                  <pic:blipFill>
+                    <a:blip r:embed="rId129"/>
+                    <a:stretch>
+                      <a:fillRect/>
+                    </a:stretch>
+                  </pic:blipFill>
+                  <pic:spPr>
+                    <a:xfrm>
+                      <a:off x="0" y="0"/>
+                      <a:ext cx="1460737" cy="673085"/>
+                    </a:xfrm>
+                    <a:prstGeom prst="rect">
+                      <a:avLst/>
+                    </a:prstGeom>
+                  </pic:spPr>
+                </pic:pic>
+              </a:graphicData>
+            </a:graphic>
+          </wp:inline>
+        </w:drawing>
+      </w:r>
+    </w:p>
+    <w:p>
+      <w:pPr>
+        <w:rPr>
+          <w:noProof/>
+        </w:rPr>
+      </w:pPr>
+      <w:r>
+        <w:rPr>
+          <w:noProof/>
+        </w:rPr>
+        <w:t xml:space="preserve">77 – No html inserimos uma class enviar no botão e no css </w:t>
+      </w:r>
+      <w:r>
+        <w:rPr>
+          <w:noProof/>
+        </w:rPr>
+        <w:t>aumentamos a largura e o espaço interno tanto para cima como para baixo.</w:t>
+      </w:r>
+    </w:p>
+    <w:p>
+      <w:pPr>
+        <w:jc w:val="center"/>
+        <w:rPr>
+          <w:noProof/>
+        </w:rPr>
+      </w:pPr>
+      <w:r>
+        <w:rPr>
+          <w:noProof/>
+        </w:rPr>
+        <w:drawing>
+          <wp:inline distT="0" distB="0" distL="0" distR="0" wp14:anchorId="4C0DF721" wp14:editId="4ECE8182">
+            <wp:extent cx="1524000" cy="762001"/>
+            <wp:effectExtent l="0" t="0" r="0" b="0"/>
+            <wp:docPr id="150" name="Imagem 150"/>
+            <wp:cNvGraphicFramePr>
+              <a:graphicFrameLocks xmlns:a="http://schemas.openxmlformats.org/drawingml/2006/main" noChangeAspect="1"/>
+            </wp:cNvGraphicFramePr>
+            <a:graphic xmlns:a="http://schemas.openxmlformats.org/drawingml/2006/main">
+              <a:graphicData uri="http://schemas.openxmlformats.org/drawingml/2006/picture">
+                <pic:pic xmlns:pic="http://schemas.openxmlformats.org/drawingml/2006/picture">
+                  <pic:nvPicPr>
+                    <pic:cNvPr id="1" name=""/>
+                    <pic:cNvPicPr/>
+                  </pic:nvPicPr>
+                  <pic:blipFill>
+                    <a:blip r:embed="rId130"/>
+                    <a:stretch>
+                      <a:fillRect/>
+                    </a:stretch>
+                  </pic:blipFill>
+                  <pic:spPr>
+                    <a:xfrm>
+                      <a:off x="0" y="0"/>
+                      <a:ext cx="1526187" cy="763094"/>
+                    </a:xfrm>
+                    <a:prstGeom prst="rect">
+                      <a:avLst/>
+                    </a:prstGeom>
+                  </pic:spPr>
+                </pic:pic>
+              </a:graphicData>
+            </a:graphic>
+          </wp:inline>
+        </w:drawing>
+      </w:r>
+      <w:r>
+        <w:rPr>
+          <w:noProof/>
+        </w:rPr>
+        <w:drawing>
+          <wp:inline distT="0" distB="0" distL="0" distR="0" wp14:anchorId="6AE3FB05" wp14:editId="7AEFAF2A">
+            <wp:extent cx="3915321" cy="247685"/>
+            <wp:effectExtent l="0" t="0" r="0" b="0"/>
+            <wp:docPr id="149" name="Imagem 149"/>
+            <wp:cNvGraphicFramePr>
+              <a:graphicFrameLocks xmlns:a="http://schemas.openxmlformats.org/drawingml/2006/main" noChangeAspect="1"/>
+            </wp:cNvGraphicFramePr>
+            <a:graphic xmlns:a="http://schemas.openxmlformats.org/drawingml/2006/main">
+              <a:graphicData uri="http://schemas.openxmlformats.org/drawingml/2006/picture">
+                <pic:pic xmlns:pic="http://schemas.openxmlformats.org/drawingml/2006/picture">
+                  <pic:nvPicPr>
+                    <pic:cNvPr id="1" name=""/>
+                    <pic:cNvPicPr/>
+                  </pic:nvPicPr>
+                  <pic:blipFill>
+                    <a:blip r:embed="rId131"/>
+                    <a:stretch>
+                      <a:fillRect/>
+                    </a:stretch>
+                  </pic:blipFill>
+                  <pic:spPr>
+                    <a:xfrm>
+                      <a:off x="0" y="0"/>
+                      <a:ext cx="3915321" cy="247685"/>
+                    </a:xfrm>
+                    <a:prstGeom prst="rect">
+                      <a:avLst/>
+                    </a:prstGeom>
+                  </pic:spPr>
+                </pic:pic>
+              </a:graphicData>
+            </a:graphic>
+          </wp:inline>
+        </w:drawing>
+      </w:r>
+    </w:p>
+    <w:p>
+      <w:pPr>
+        <w:rPr>
+          <w:noProof/>
+        </w:rPr>
+      </w:pPr>
+      <w:r>
+        <w:rPr>
+          <w:noProof/>
+        </w:rPr>
+        <w:t xml:space="preserve">78 </w:t>
+      </w:r>
+      <w:r>
+        <w:rPr>
+          <w:noProof/>
+        </w:rPr>
+        <w:t>–</w:t>
+      </w:r>
+      <w:r>
+        <w:rPr>
+          <w:noProof/>
+        </w:rPr>
+        <w:t xml:space="preserve"> </w:t>
+      </w:r>
+      <w:r>
+        <w:rPr>
+          <w:noProof/>
+        </w:rPr>
+        <w:t>Ainda trabalhando com o botão enviar fizemos:</w:t>
+      </w:r>
+    </w:p>
+    <w:p>
+      <w:pPr>
+        <w:pStyle w:val="PargrafodaLista"/>
+        <w:numPr>
+          <w:ilvl w:val="0"/>
+          <w:numId w:val="1"/>
+        </w:numPr>
+        <w:rPr>
+          <w:noProof/>
+        </w:rPr>
+      </w:pPr>
+      <w:r>
+        <w:rPr>
+          <w:noProof/>
+        </w:rPr>
+        <w:t>Colocamos uma cor de fundo</w:t>
+      </w:r>
+    </w:p>
+    <w:p>
+      <w:pPr>
+        <w:pStyle w:val="PargrafodaLista"/>
+        <w:numPr>
+          <w:ilvl w:val="0"/>
+          <w:numId w:val="1"/>
+        </w:numPr>
+        <w:rPr>
+          <w:noProof/>
+        </w:rPr>
+      </w:pPr>
+      <w:r>
+        <w:rPr>
+          <w:noProof/>
+        </w:rPr>
+        <w:t>Mudamos a cor da letra para branco</w:t>
+      </w:r>
+    </w:p>
+    <w:p>
+      <w:pPr>
+        <w:pStyle w:val="PargrafodaLista"/>
+        <w:numPr>
+          <w:ilvl w:val="0"/>
+          <w:numId w:val="1"/>
+        </w:numPr>
+        <w:rPr>
+          <w:noProof/>
+        </w:rPr>
+      </w:pPr>
+      <w:r>
+        <w:rPr>
+          <w:noProof/>
+        </w:rPr>
+        <w:t>Deixamos o texto mais encorpado e negrito</w:t>
+      </w:r>
+    </w:p>
+    <w:p>
+      <w:pPr>
+        <w:pStyle w:val="PargrafodaLista"/>
+        <w:numPr>
+          <w:ilvl w:val="0"/>
+          <w:numId w:val="1"/>
+        </w:numPr>
+        <w:rPr>
+          <w:noProof/>
+        </w:rPr>
+      </w:pPr>
+      <w:r>
+        <w:rPr>
+          <w:noProof/>
+        </w:rPr>
+        <w:t xml:space="preserve">Aumentamos o tamanho da fonte </w:t>
+      </w:r>
+    </w:p>
+    <w:p>
+      <w:pPr>
+        <w:pStyle w:val="PargrafodaLista"/>
+        <w:numPr>
+          <w:ilvl w:val="0"/>
+          <w:numId w:val="1"/>
+        </w:numPr>
+        <w:rPr>
+          <w:noProof/>
+        </w:rPr>
+      </w:pPr>
+      <w:r>
+        <w:rPr>
+          <w:noProof/>
+        </w:rPr>
+        <w:t>Tiramos a borda do botão</w:t>
+      </w:r>
+    </w:p>
+    <w:p>
+      <w:pPr>
+        <w:pStyle w:val="PargrafodaLista"/>
+        <w:numPr>
+          <w:ilvl w:val="0"/>
+          <w:numId w:val="1"/>
+        </w:numPr>
+        <w:rPr>
+          <w:noProof/>
+        </w:rPr>
+      </w:pPr>
+      <w:r>
+        <w:rPr>
+          <w:noProof/>
+        </w:rPr>
+        <w:t>Arredondamos os cantos</w:t>
+      </w:r>
+    </w:p>
+    <w:p>
+      <w:pPr>
+        <w:jc w:val="center"/>
+        <w:rPr>
+          <w:noProof/>
+        </w:rPr>
+      </w:pPr>
+      <w:r>
+        <w:rPr>
+          <w:noProof/>
+        </w:rPr>
+        <w:drawing>
+          <wp:inline distT="0" distB="0" distL="0" distR="0" wp14:anchorId="04ED27FC" wp14:editId="752A546F">
+            <wp:extent cx="2176882" cy="1609725"/>
+            <wp:effectExtent l="0" t="0" r="0" b="0"/>
+            <wp:docPr id="151" name="Imagem 151"/>
+            <wp:cNvGraphicFramePr>
+              <a:graphicFrameLocks xmlns:a="http://schemas.openxmlformats.org/drawingml/2006/main" noChangeAspect="1"/>
+            </wp:cNvGraphicFramePr>
+            <a:graphic xmlns:a="http://schemas.openxmlformats.org/drawingml/2006/main">
+              <a:graphicData uri="http://schemas.openxmlformats.org/drawingml/2006/picture">
+                <pic:pic xmlns:pic="http://schemas.openxmlformats.org/drawingml/2006/picture">
+                  <pic:nvPicPr>
+                    <pic:cNvPr id="1" name=""/>
+                    <pic:cNvPicPr/>
+                  </pic:nvPicPr>
+                  <pic:blipFill>
+                    <a:blip r:embed="rId132"/>
+                    <a:stretch>
+                      <a:fillRect/>
+                    </a:stretch>
+                  </pic:blipFill>
+                  <pic:spPr>
+                    <a:xfrm>
+                      <a:off x="0" y="0"/>
+                      <a:ext cx="2235096" cy="1652772"/>
+                    </a:xfrm>
+                    <a:prstGeom prst="rect">
+                      <a:avLst/>
+                    </a:prstGeom>
+                  </pic:spPr>
+                </pic:pic>
+              </a:graphicData>
+            </a:graphic>
+          </wp:inline>
+        </w:drawing>
+      </w:r>
+    </w:p>
+    <w:p>
+      <w:pPr>
+        <w:rPr>
+          <w:noProof/>
+        </w:rPr>
+      </w:pPr>
+      <w:r>
+        <w:rPr>
+          <w:noProof/>
+        </w:rPr>
+        <w:lastRenderedPageBreak/>
+        <w:t xml:space="preserve">79 - </w:t>
       </w:r>
       <w:bookmarkStart w:id="0" w:name="_GoBack"/>
       <w:bookmarkEnd w:id="0"/>
@@ -10304,7 +11457,7 @@
 </file>
 
 <file path=customXml/itemProps1.xml><?xml version="1.0" encoding="utf-8"?>
-<ds:datastoreItem xmlns:ds="http://schemas.openxmlformats.org/officeDocument/2006/customXml" ds:itemID="{458C01F4-5E1A-4AC5-A8D7-8BE3A6F306BA}">
+<ds:datastoreItem xmlns:ds="http://schemas.openxmlformats.org/officeDocument/2006/customXml" ds:itemID="{D802C70F-FD3A-42CC-B4B6-C7D285A4D01F}">
   <ds:schemaRefs>
     <ds:schemaRef ds:uri="http://schemas.openxmlformats.org/officeDocument/2006/bibliography"/>
   </ds:schemaRefs>

</xml_diff>

<commit_message>
terminamos a pagina do contato e adicionamos o menu e o footer na pagina do home
</commit_message>
<xml_diff>
--- a/Apostila/Projeto Space For Men.docx
+++ b/Apostila/Projeto Space For Men.docx
@@ -10557,7 +10557,512 @@
           <w:noProof/>
         </w:rPr>
         <w:lastRenderedPageBreak/>
-        <w:t xml:space="preserve">79 - </w:t>
+        <w:t xml:space="preserve">79 </w:t>
+      </w:r>
+      <w:r>
+        <w:rPr>
+          <w:noProof/>
+        </w:rPr>
+        <w:t>–</w:t>
+      </w:r>
+      <w:r>
+        <w:rPr>
+          <w:noProof/>
+        </w:rPr>
+        <w:t xml:space="preserve"> </w:t>
+      </w:r>
+      <w:r>
+        <w:rPr>
+          <w:noProof/>
+        </w:rPr>
+        <w:t xml:space="preserve">Trabalhando com hover no botão enviar, </w:t>
+      </w:r>
+      <w:r>
+        <w:rPr>
+          <w:noProof/>
+        </w:rPr>
+        <w:t>mudamos a cor de findo ao passar o mouse utilizando “ background-color”, e também criamos uma animação com “transform” “rotate” e “scale” que, ao passar o mouse ele realiza uma rotação e o “scale” aumenta o tamanho do botão.</w:t>
+      </w:r>
+    </w:p>
+    <w:p>
+      <w:pPr>
+        <w:rPr>
+          <w:noProof/>
+        </w:rPr>
+      </w:pPr>
+      <w:r>
+        <w:rPr>
+          <w:noProof/>
+        </w:rPr>
+        <w:t>(Obs: Não podemos esquecer de colocar uma “transition” na class enviar para que a animação seja feita de forma fluida”1s”.)</w:t>
+      </w:r>
+    </w:p>
+    <w:p>
+      <w:pPr>
+        <w:rPr>
+          <w:noProof/>
+        </w:rPr>
+      </w:pPr>
+      <w:r>
+        <w:rPr>
+          <w:noProof/>
+        </w:rPr>
+        <mc:AlternateContent>
+          <mc:Choice Requires="wps">
+            <w:drawing>
+              <wp:anchor distT="0" distB="0" distL="114300" distR="114300" simplePos="0" relativeHeight="251685888" behindDoc="0" locked="0" layoutInCell="1" allowOverlap="1">
+                <wp:simplePos x="0" y="0"/>
+                <wp:positionH relativeFrom="column">
+                  <wp:posOffset>1005840</wp:posOffset>
+                </wp:positionH>
+                <wp:positionV relativeFrom="paragraph">
+                  <wp:posOffset>1136015</wp:posOffset>
+                </wp:positionV>
+                <wp:extent cx="438150" cy="0"/>
+                <wp:effectExtent l="38100" t="76200" r="0" b="95250"/>
+                <wp:wrapNone/>
+                <wp:docPr id="145" name="Conector de Seta Reta 145"/>
+                <wp:cNvGraphicFramePr/>
+                <a:graphic xmlns:a="http://schemas.openxmlformats.org/drawingml/2006/main">
+                  <a:graphicData uri="http://schemas.microsoft.com/office/word/2010/wordprocessingShape">
+                    <wps:wsp>
+                      <wps:cNvCnPr/>
+                      <wps:spPr>
+                        <a:xfrm flipH="1">
+                          <a:off x="0" y="0"/>
+                          <a:ext cx="438150" cy="0"/>
+                        </a:xfrm>
+                        <a:prstGeom prst="straightConnector1">
+                          <a:avLst/>
+                        </a:prstGeom>
+                        <a:ln>
+                          <a:solidFill>
+                            <a:srgbClr val="FF0000"/>
+                          </a:solidFill>
+                          <a:tailEnd type="triangle"/>
+                        </a:ln>
+                      </wps:spPr>
+                      <wps:style>
+                        <a:lnRef idx="1">
+                          <a:schemeClr val="accent1"/>
+                        </a:lnRef>
+                        <a:fillRef idx="0">
+                          <a:schemeClr val="accent1"/>
+                        </a:fillRef>
+                        <a:effectRef idx="0">
+                          <a:schemeClr val="accent1"/>
+                        </a:effectRef>
+                        <a:fontRef idx="minor">
+                          <a:schemeClr val="tx1"/>
+                        </a:fontRef>
+                      </wps:style>
+                      <wps:bodyPr/>
+                    </wps:wsp>
+                  </a:graphicData>
+                </a:graphic>
+              </wp:anchor>
+            </w:drawing>
+          </mc:Choice>
+          <mc:Fallback>
+            <w:pict>
+              <v:shapetype w14:anchorId="6821916D" id="_x0000_t32" coordsize="21600,21600" o:spt="32" o:oned="t" path="m,l21600,21600e" filled="f">
+                <v:path arrowok="t" fillok="f" o:connecttype="none"/>
+                <o:lock v:ext="edit" shapetype="t"/>
+              </v:shapetype>
+              <v:shape id="Conector de Seta Reta 145" o:spid="_x0000_s1026" type="#_x0000_t32" style="position:absolute;margin-left:79.2pt;margin-top:89.45pt;width:34.5pt;height:0;flip:x;z-index:251685888;visibility:visible;mso-wrap-style:square;mso-wrap-distance-left:9pt;mso-wrap-distance-top:0;mso-wrap-distance-right:9pt;mso-wrap-distance-bottom:0;mso-position-horizontal:absolute;mso-position-horizontal-relative:text;mso-position-vertical:absolute;mso-position-vertical-relative:text" o:gfxdata="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" strokecolor="red" strokeweight=".5pt">
+                <v:stroke endarrow="block" joinstyle="miter"/>
+              </v:shape>
+            </w:pict>
+          </mc:Fallback>
+        </mc:AlternateContent>
+      </w:r>
+      <w:r>
+        <w:rPr>
+          <w:noProof/>
+        </w:rPr>
+        <w:drawing>
+          <wp:inline distT="0" distB="0" distL="0" distR="0" wp14:anchorId="2AB551E6" wp14:editId="65AE5320">
+            <wp:extent cx="1952625" cy="1885081"/>
+            <wp:effectExtent l="0" t="0" r="0" b="1270"/>
+            <wp:docPr id="144" name="Imagem 144"/>
+            <wp:cNvGraphicFramePr>
+              <a:graphicFrameLocks xmlns:a="http://schemas.openxmlformats.org/drawingml/2006/main" noChangeAspect="1"/>
+            </wp:cNvGraphicFramePr>
+            <a:graphic xmlns:a="http://schemas.openxmlformats.org/drawingml/2006/main">
+              <a:graphicData uri="http://schemas.openxmlformats.org/drawingml/2006/picture">
+                <pic:pic xmlns:pic="http://schemas.openxmlformats.org/drawingml/2006/picture">
+                  <pic:nvPicPr>
+                    <pic:cNvPr id="1" name=""/>
+                    <pic:cNvPicPr/>
+                  </pic:nvPicPr>
+                  <pic:blipFill>
+                    <a:blip r:embed="rId133"/>
+                    <a:stretch>
+                      <a:fillRect/>
+                    </a:stretch>
+                  </pic:blipFill>
+                  <pic:spPr>
+                    <a:xfrm>
+                      <a:off x="0" y="0"/>
+                      <a:ext cx="1965476" cy="1897488"/>
+                    </a:xfrm>
+                    <a:prstGeom prst="rect">
+                      <a:avLst/>
+                    </a:prstGeom>
+                  </pic:spPr>
+                </pic:pic>
+              </a:graphicData>
+            </a:graphic>
+          </wp:inline>
+        </w:drawing>
+      </w:r>
+    </w:p>
+    <w:p>
+      <w:pPr>
+        <w:rPr>
+          <w:noProof/>
+        </w:rPr>
+      </w:pPr>
+      <w:r>
+        <w:rPr>
+          <w:noProof/>
+        </w:rPr>
+        <w:t xml:space="preserve">80 </w:t>
+      </w:r>
+      <w:r>
+        <w:rPr>
+          <w:noProof/>
+        </w:rPr>
+        <w:t>–</w:t>
+      </w:r>
+      <w:r>
+        <w:rPr>
+          <w:noProof/>
+        </w:rPr>
+        <w:t xml:space="preserve"> </w:t>
+      </w:r>
+      <w:r>
+        <w:rPr>
+          <w:noProof/>
+        </w:rPr>
+        <w:t>Na página contatos adicionamos uma tabela onde iniciamos utilizando as tags TR-&gt; Linha da tabela e as tgs TD-&gt; Dados da tabela. Conforme código abaixo:</w:t>
+      </w:r>
+    </w:p>
+    <w:p>
+      <w:pPr>
+        <w:rPr>
+          <w:noProof/>
+        </w:rPr>
+      </w:pPr>
+      <w:r>
+        <w:rPr>
+          <w:noProof/>
+        </w:rPr>
+        <w:drawing>
+          <wp:inline distT="0" distB="0" distL="0" distR="0" wp14:anchorId="79A32F6B" wp14:editId="4C32BFC6">
+            <wp:extent cx="1190625" cy="2117199"/>
+            <wp:effectExtent l="0" t="0" r="0" b="0"/>
+            <wp:docPr id="152" name="Imagem 152"/>
+            <wp:cNvGraphicFramePr>
+              <a:graphicFrameLocks xmlns:a="http://schemas.openxmlformats.org/drawingml/2006/main" noChangeAspect="1"/>
+            </wp:cNvGraphicFramePr>
+            <a:graphic xmlns:a="http://schemas.openxmlformats.org/drawingml/2006/main">
+              <a:graphicData uri="http://schemas.openxmlformats.org/drawingml/2006/picture">
+                <pic:pic xmlns:pic="http://schemas.openxmlformats.org/drawingml/2006/picture">
+                  <pic:nvPicPr>
+                    <pic:cNvPr id="1" name=""/>
+                    <pic:cNvPicPr/>
+                  </pic:nvPicPr>
+                  <pic:blipFill>
+                    <a:blip r:embed="rId134"/>
+                    <a:stretch>
+                      <a:fillRect/>
+                    </a:stretch>
+                  </pic:blipFill>
+                  <pic:spPr>
+                    <a:xfrm>
+                      <a:off x="0" y="0"/>
+                      <a:ext cx="1206682" cy="2145752"/>
+                    </a:xfrm>
+                    <a:prstGeom prst="rect">
+                      <a:avLst/>
+                    </a:prstGeom>
+                  </pic:spPr>
+                </pic:pic>
+              </a:graphicData>
+            </a:graphic>
+          </wp:inline>
+        </w:drawing>
+      </w:r>
+    </w:p>
+    <w:p>
+      <w:pPr>
+        <w:rPr>
+          <w:noProof/>
+        </w:rPr>
+      </w:pPr>
+      <w:r>
+        <w:rPr>
+          <w:noProof/>
+        </w:rPr>
+        <w:t xml:space="preserve">81 </w:t>
+      </w:r>
+      <w:r>
+        <w:rPr>
+          <w:noProof/>
+        </w:rPr>
+        <w:t>–</w:t>
+      </w:r>
+      <w:r>
+        <w:rPr>
+          <w:noProof/>
+        </w:rPr>
+        <w:t xml:space="preserve"> </w:t>
+      </w:r>
+      <w:r>
+        <w:rPr>
+          <w:noProof/>
+        </w:rPr>
+        <w:t>Na tabela adicionamos o thead -&gt; o cabeçalho da tavela e tg -&gt; dados do cabeçalho e tbody-&gt; o corpo da tabela.</w:t>
+      </w:r>
+    </w:p>
+    <w:p>
+      <w:pPr>
+        <w:rPr>
+          <w:noProof/>
+        </w:rPr>
+      </w:pPr>
+      <w:r>
+        <w:rPr>
+          <w:noProof/>
+        </w:rPr>
+        <w:drawing>
+          <wp:inline distT="0" distB="0" distL="0" distR="0" wp14:anchorId="61834A92" wp14:editId="0FED7E0C">
+            <wp:extent cx="1277613" cy="2381250"/>
+            <wp:effectExtent l="0" t="0" r="0" b="0"/>
+            <wp:docPr id="153" name="Imagem 153"/>
+            <wp:cNvGraphicFramePr>
+              <a:graphicFrameLocks xmlns:a="http://schemas.openxmlformats.org/drawingml/2006/main" noChangeAspect="1"/>
+            </wp:cNvGraphicFramePr>
+            <a:graphic xmlns:a="http://schemas.openxmlformats.org/drawingml/2006/main">
+              <a:graphicData uri="http://schemas.openxmlformats.org/drawingml/2006/picture">
+                <pic:pic xmlns:pic="http://schemas.openxmlformats.org/drawingml/2006/picture">
+                  <pic:nvPicPr>
+                    <pic:cNvPr id="1" name=""/>
+                    <pic:cNvPicPr/>
+                  </pic:nvPicPr>
+                  <pic:blipFill>
+                    <a:blip r:embed="rId135"/>
+                    <a:stretch>
+                      <a:fillRect/>
+                    </a:stretch>
+                  </pic:blipFill>
+                  <pic:spPr>
+                    <a:xfrm>
+                      <a:off x="0" y="0"/>
+                      <a:ext cx="1294859" cy="2413394"/>
+                    </a:xfrm>
+                    <a:prstGeom prst="rect">
+                      <a:avLst/>
+                    </a:prstGeom>
+                  </pic:spPr>
+                </pic:pic>
+              </a:graphicData>
+            </a:graphic>
+          </wp:inline>
+        </w:drawing>
+      </w:r>
+    </w:p>
+    <w:p>
+      <w:pPr>
+        <w:rPr>
+          <w:noProof/>
+        </w:rPr>
+      </w:pPr>
+      <w:r>
+        <w:rPr>
+          <w:noProof/>
+        </w:rPr>
+        <w:lastRenderedPageBreak/>
+        <w:t xml:space="preserve">82 </w:t>
+      </w:r>
+      <w:r>
+        <w:rPr>
+          <w:noProof/>
+        </w:rPr>
+        <w:t>–</w:t>
+      </w:r>
+      <w:r>
+        <w:rPr>
+          <w:noProof/>
+        </w:rPr>
+        <w:t xml:space="preserve"> </w:t>
+      </w:r>
+      <w:r>
+        <w:rPr>
+          <w:noProof/>
+        </w:rPr>
+        <w:t>Adicionei uma cor de fundo no cabeçalho da tabela, mudamos a cor da letra para branco e encorpamos o texto. No td,th inserimos uma borda solida e aumentamos o espaço interno tanto para cima como para baixo e do lado direito e esquerdo.</w:t>
+      </w:r>
+    </w:p>
+    <w:p>
+      <w:pPr>
+        <w:rPr>
+          <w:noProof/>
+        </w:rPr>
+      </w:pPr>
+      <w:r>
+        <w:rPr>
+          <w:noProof/>
+        </w:rPr>
+        <w:drawing>
+          <wp:inline distT="0" distB="0" distL="0" distR="0" wp14:anchorId="79633468" wp14:editId="373C00E4">
+            <wp:extent cx="2162477" cy="2219635"/>
+            <wp:effectExtent l="0" t="0" r="9525" b="9525"/>
+            <wp:docPr id="155" name="Imagem 155"/>
+            <wp:cNvGraphicFramePr>
+              <a:graphicFrameLocks xmlns:a="http://schemas.openxmlformats.org/drawingml/2006/main" noChangeAspect="1"/>
+            </wp:cNvGraphicFramePr>
+            <a:graphic xmlns:a="http://schemas.openxmlformats.org/drawingml/2006/main">
+              <a:graphicData uri="http://schemas.openxmlformats.org/drawingml/2006/picture">
+                <pic:pic xmlns:pic="http://schemas.openxmlformats.org/drawingml/2006/picture">
+                  <pic:nvPicPr>
+                    <pic:cNvPr id="1" name=""/>
+                    <pic:cNvPicPr/>
+                  </pic:nvPicPr>
+                  <pic:blipFill>
+                    <a:blip r:embed="rId136"/>
+                    <a:stretch>
+                      <a:fillRect/>
+                    </a:stretch>
+                  </pic:blipFill>
+                  <pic:spPr>
+                    <a:xfrm>
+                      <a:off x="0" y="0"/>
+                      <a:ext cx="2162477" cy="2219635"/>
+                    </a:xfrm>
+                    <a:prstGeom prst="rect">
+                      <a:avLst/>
+                    </a:prstGeom>
+                  </pic:spPr>
+                </pic:pic>
+              </a:graphicData>
+            </a:graphic>
+          </wp:inline>
+        </w:drawing>
+      </w:r>
+    </w:p>
+    <w:p>
+      <w:pPr>
+        <w:rPr>
+          <w:noProof/>
+        </w:rPr>
+      </w:pPr>
+      <w:r>
+        <w:rPr>
+          <w:noProof/>
+        </w:rPr>
+        <w:t>83 – Trabalhando com a página do home copiamos o “html” do “header” que é o nosso menu,  que,  já se encontrava pronto nas outras páginas e o “css” da configuração do mesmo e, colamos na nossa página do home e, no “style.css”, e repetimos o mesmo processo com o “footer”, com isso já ficou pronto o menu e o nosso rodapé da página.</w:t>
+      </w:r>
+    </w:p>
+    <w:p>
+      <w:pPr>
+        <w:rPr>
+          <w:noProof/>
+        </w:rPr>
+      </w:pPr>
+      <w:r>
+        <w:rPr>
+          <w:noProof/>
+        </w:rPr>
+        <w:drawing>
+          <wp:inline distT="0" distB="0" distL="0" distR="0" wp14:anchorId="7A3C6434" wp14:editId="20752E86">
+            <wp:extent cx="3181350" cy="1209581"/>
+            <wp:effectExtent l="0" t="0" r="0" b="0"/>
+            <wp:docPr id="156" name="Imagem 156"/>
+            <wp:cNvGraphicFramePr>
+              <a:graphicFrameLocks xmlns:a="http://schemas.openxmlformats.org/drawingml/2006/main" noChangeAspect="1"/>
+            </wp:cNvGraphicFramePr>
+            <a:graphic xmlns:a="http://schemas.openxmlformats.org/drawingml/2006/main">
+              <a:graphicData uri="http://schemas.openxmlformats.org/drawingml/2006/picture">
+                <pic:pic xmlns:pic="http://schemas.openxmlformats.org/drawingml/2006/picture">
+                  <pic:nvPicPr>
+                    <pic:cNvPr id="1" name=""/>
+                    <pic:cNvPicPr/>
+                  </pic:nvPicPr>
+                  <pic:blipFill>
+                    <a:blip r:embed="rId137"/>
+                    <a:stretch>
+                      <a:fillRect/>
+                    </a:stretch>
+                  </pic:blipFill>
+                  <pic:spPr>
+                    <a:xfrm>
+                      <a:off x="0" y="0"/>
+                      <a:ext cx="3261410" cy="1240021"/>
+                    </a:xfrm>
+                    <a:prstGeom prst="rect">
+                      <a:avLst/>
+                    </a:prstGeom>
+                  </pic:spPr>
+                </pic:pic>
+              </a:graphicData>
+            </a:graphic>
+          </wp:inline>
+        </w:drawing>
+      </w:r>
+      <w:r>
+        <w:rPr>
+          <w:noProof/>
+        </w:rPr>
+        <w:drawing>
+          <wp:inline distT="0" distB="0" distL="0" distR="0" wp14:anchorId="0C093745" wp14:editId="28D90B67">
+            <wp:extent cx="3190875" cy="525728"/>
+            <wp:effectExtent l="0" t="0" r="0" b="8255"/>
+            <wp:docPr id="157" name="Imagem 157"/>
+            <wp:cNvGraphicFramePr>
+              <a:graphicFrameLocks xmlns:a="http://schemas.openxmlformats.org/drawingml/2006/main" noChangeAspect="1"/>
+            </wp:cNvGraphicFramePr>
+            <a:graphic xmlns:a="http://schemas.openxmlformats.org/drawingml/2006/main">
+              <a:graphicData uri="http://schemas.openxmlformats.org/drawingml/2006/picture">
+                <pic:pic xmlns:pic="http://schemas.openxmlformats.org/drawingml/2006/picture">
+                  <pic:nvPicPr>
+                    <pic:cNvPr id="1" name=""/>
+                    <pic:cNvPicPr/>
+                  </pic:nvPicPr>
+                  <pic:blipFill>
+                    <a:blip r:embed="rId138"/>
+                    <a:stretch>
+                      <a:fillRect/>
+                    </a:stretch>
+                  </pic:blipFill>
+                  <pic:spPr>
+                    <a:xfrm>
+                      <a:off x="0" y="0"/>
+                      <a:ext cx="3280347" cy="540469"/>
+                    </a:xfrm>
+                    <a:prstGeom prst="rect">
+                      <a:avLst/>
+                    </a:prstGeom>
+                  </pic:spPr>
+                </pic:pic>
+              </a:graphicData>
+            </a:graphic>
+          </wp:inline>
+        </w:drawing>
+      </w:r>
+    </w:p>
+    <w:p>
+      <w:pPr>
+        <w:rPr>
+          <w:noProof/>
+        </w:rPr>
+      </w:pPr>
+      <w:r>
+        <w:rPr>
+          <w:noProof/>
+        </w:rPr>
+        <w:t xml:space="preserve">84 - </w:t>
       </w:r>
       <w:bookmarkStart w:id="0" w:name="_GoBack"/>
       <w:bookmarkEnd w:id="0"/>
@@ -11457,7 +11962,7 @@
 </file>
 
 <file path=customXml/itemProps1.xml><?xml version="1.0" encoding="utf-8"?>
-<ds:datastoreItem xmlns:ds="http://schemas.openxmlformats.org/officeDocument/2006/customXml" ds:itemID="{D802C70F-FD3A-42CC-B4B6-C7D285A4D01F}">
+<ds:datastoreItem xmlns:ds="http://schemas.openxmlformats.org/officeDocument/2006/customXml" ds:itemID="{A6066C7B-A3EB-465D-A4D5-F1D787674E55}">
   <ds:schemaRefs>
     <ds:schemaRef ds:uri="http://schemas.openxmlformats.org/officeDocument/2006/bibliography"/>
   </ds:schemaRefs>

</xml_diff>

<commit_message>
trabalhando agora com a pagina principal(home)
</commit_message>
<xml_diff>
--- a/Apostila/Projeto Space For Men.docx
+++ b/Apostila/Projeto Space For Men.docx
@@ -10917,8 +10917,8 @@
         </w:rPr>
         <w:drawing>
           <wp:inline distT="0" distB="0" distL="0" distR="0" wp14:anchorId="79633468" wp14:editId="373C00E4">
-            <wp:extent cx="2162477" cy="2219635"/>
-            <wp:effectExtent l="0" t="0" r="9525" b="9525"/>
+            <wp:extent cx="2200275" cy="2258432"/>
+            <wp:effectExtent l="0" t="0" r="0" b="8890"/>
             <wp:docPr id="155" name="Imagem 155"/>
             <wp:cNvGraphicFramePr>
               <a:graphicFrameLocks xmlns:a="http://schemas.openxmlformats.org/drawingml/2006/main" noChangeAspect="1"/>
@@ -10939,7 +10939,7 @@
                   <pic:spPr>
                     <a:xfrm>
                       <a:off x="0" y="0"/>
-                      <a:ext cx="2162477" cy="2219635"/>
+                      <a:ext cx="2216502" cy="2275088"/>
                     </a:xfrm>
                     <a:prstGeom prst="rect">
                       <a:avLst/>
@@ -10977,7 +10977,7 @@
         </w:rPr>
         <w:drawing>
           <wp:inline distT="0" distB="0" distL="0" distR="0" wp14:anchorId="7A3C6434" wp14:editId="20752E86">
-            <wp:extent cx="3181350" cy="1209581"/>
+            <wp:extent cx="3209925" cy="1220445"/>
             <wp:effectExtent l="0" t="0" r="0" b="0"/>
             <wp:docPr id="156" name="Imagem 156"/>
             <wp:cNvGraphicFramePr>
@@ -10999,7 +10999,7 @@
                   <pic:spPr>
                     <a:xfrm>
                       <a:off x="0" y="0"/>
-                      <a:ext cx="3261410" cy="1240021"/>
+                      <a:ext cx="3345012" cy="1271806"/>
                     </a:xfrm>
                     <a:prstGeom prst="rect">
                       <a:avLst/>
@@ -11062,23 +11062,761 @@
         <w:rPr>
           <w:noProof/>
         </w:rPr>
-        <w:t xml:space="preserve">84 - </w:t>
+        <w:t xml:space="preserve">84 </w:t>
+      </w:r>
+      <w:r>
+        <w:rPr>
+          <w:noProof/>
+        </w:rPr>
+        <w:t>–</w:t>
+      </w:r>
+      <w:r>
+        <w:rPr>
+          <w:noProof/>
+        </w:rPr>
+        <w:t xml:space="preserve"> </w:t>
+      </w:r>
+      <w:r>
+        <w:rPr>
+          <w:noProof/>
+        </w:rPr>
+        <w:t>Aumentamos a largura da imagem do ba</w:t>
+      </w:r>
+      <w:r>
+        <w:rPr>
+          <w:noProof/>
+        </w:rPr>
+        <w:t>nner para ocupar 100% de espaço na página e demos uma largura para o main e centralizamos o conteúdo dentro dele.</w:t>
+      </w:r>
+    </w:p>
+    <w:p>
+      <w:pPr>
+        <w:rPr>
+          <w:noProof/>
+        </w:rPr>
+      </w:pPr>
+      <w:r>
+        <w:rPr>
+          <w:noProof/>
+        </w:rPr>
+        <w:drawing>
+          <wp:inline distT="0" distB="0" distL="0" distR="0" wp14:anchorId="7270C3B6" wp14:editId="0873DD93">
+            <wp:extent cx="1066949" cy="1086002"/>
+            <wp:effectExtent l="0" t="0" r="0" b="0"/>
+            <wp:docPr id="154" name="Imagem 154"/>
+            <wp:cNvGraphicFramePr>
+              <a:graphicFrameLocks xmlns:a="http://schemas.openxmlformats.org/drawingml/2006/main" noChangeAspect="1"/>
+            </wp:cNvGraphicFramePr>
+            <a:graphic xmlns:a="http://schemas.openxmlformats.org/drawingml/2006/main">
+              <a:graphicData uri="http://schemas.openxmlformats.org/drawingml/2006/picture">
+                <pic:pic xmlns:pic="http://schemas.openxmlformats.org/drawingml/2006/picture">
+                  <pic:nvPicPr>
+                    <pic:cNvPr id="1" name=""/>
+                    <pic:cNvPicPr/>
+                  </pic:nvPicPr>
+                  <pic:blipFill>
+                    <a:blip r:embed="rId139"/>
+                    <a:stretch>
+                      <a:fillRect/>
+                    </a:stretch>
+                  </pic:blipFill>
+                  <pic:spPr>
+                    <a:xfrm>
+                      <a:off x="0" y="0"/>
+                      <a:ext cx="1066949" cy="1086002"/>
+                    </a:xfrm>
+                    <a:prstGeom prst="rect">
+                      <a:avLst/>
+                    </a:prstGeom>
+                  </pic:spPr>
+                </pic:pic>
+              </a:graphicData>
+            </a:graphic>
+          </wp:inline>
+        </w:drawing>
+      </w:r>
+    </w:p>
+    <w:p>
+      <w:pPr>
+        <w:rPr>
+          <w:noProof/>
+        </w:rPr>
+      </w:pPr>
+      <w:r>
+        <w:rPr>
+          <w:noProof/>
+        </w:rPr>
+        <w:t xml:space="preserve">85 – Na página do index.html trocamos </w:t>
+      </w:r>
+      <w:r>
+        <w:rPr>
+          <w:noProof/>
+        </w:rPr>
+        <w:t>as div por section, a diferença entre div e section é que a div geralmente e usada para conteúdo visual dentro dela e não necessariamente são correspondente ao mesmo assunto. Ao contrário da div a section cria uma divisão na página em que o conteúdo interno está relacionado a um único tema, ou seja, ao mesmo assunto, então por esse motivo trocamos a div principal por section e a div benefícios.</w:t>
+      </w:r>
+    </w:p>
+    <w:p>
+      <w:pPr>
+        <w:rPr>
+          <w:noProof/>
+        </w:rPr>
+      </w:pPr>
+      <w:r>
+        <w:rPr>
+          <w:noProof/>
+        </w:rPr>
+        <w:drawing>
+          <wp:inline distT="0" distB="0" distL="0" distR="0" wp14:anchorId="7DA4546F" wp14:editId="7E0685DB">
+            <wp:extent cx="1771897" cy="228632"/>
+            <wp:effectExtent l="0" t="0" r="0" b="0"/>
+            <wp:docPr id="159" name="Imagem 159"/>
+            <wp:cNvGraphicFramePr>
+              <a:graphicFrameLocks xmlns:a="http://schemas.openxmlformats.org/drawingml/2006/main" noChangeAspect="1"/>
+            </wp:cNvGraphicFramePr>
+            <a:graphic xmlns:a="http://schemas.openxmlformats.org/drawingml/2006/main">
+              <a:graphicData uri="http://schemas.openxmlformats.org/drawingml/2006/picture">
+                <pic:pic xmlns:pic="http://schemas.openxmlformats.org/drawingml/2006/picture">
+                  <pic:nvPicPr>
+                    <pic:cNvPr id="1" name=""/>
+                    <pic:cNvPicPr/>
+                  </pic:nvPicPr>
+                  <pic:blipFill>
+                    <a:blip r:embed="rId140"/>
+                    <a:stretch>
+                      <a:fillRect/>
+                    </a:stretch>
+                  </pic:blipFill>
+                  <pic:spPr>
+                    <a:xfrm>
+                      <a:off x="0" y="0"/>
+                      <a:ext cx="1771897" cy="228632"/>
+                    </a:xfrm>
+                    <a:prstGeom prst="rect">
+                      <a:avLst/>
+                    </a:prstGeom>
+                  </pic:spPr>
+                </pic:pic>
+              </a:graphicData>
+            </a:graphic>
+          </wp:inline>
+        </w:drawing>
+      </w:r>
+      <w:r>
+        <w:rPr>
+          <w:noProof/>
+        </w:rPr>
+        <w:drawing>
+          <wp:inline distT="0" distB="0" distL="0" distR="0" wp14:anchorId="470F0F75" wp14:editId="6DEF7A2B">
+            <wp:extent cx="1781424" cy="171474"/>
+            <wp:effectExtent l="0" t="0" r="9525" b="0"/>
+            <wp:docPr id="160" name="Imagem 160"/>
+            <wp:cNvGraphicFramePr>
+              <a:graphicFrameLocks xmlns:a="http://schemas.openxmlformats.org/drawingml/2006/main" noChangeAspect="1"/>
+            </wp:cNvGraphicFramePr>
+            <a:graphic xmlns:a="http://schemas.openxmlformats.org/drawingml/2006/main">
+              <a:graphicData uri="http://schemas.openxmlformats.org/drawingml/2006/picture">
+                <pic:pic xmlns:pic="http://schemas.openxmlformats.org/drawingml/2006/picture">
+                  <pic:nvPicPr>
+                    <pic:cNvPr id="1" name=""/>
+                    <pic:cNvPicPr/>
+                  </pic:nvPicPr>
+                  <pic:blipFill>
+                    <a:blip r:embed="rId141"/>
+                    <a:stretch>
+                      <a:fillRect/>
+                    </a:stretch>
+                  </pic:blipFill>
+                  <pic:spPr>
+                    <a:xfrm>
+                      <a:off x="0" y="0"/>
+                      <a:ext cx="1781424" cy="171474"/>
+                    </a:xfrm>
+                    <a:prstGeom prst="rect">
+                      <a:avLst/>
+                    </a:prstGeom>
+                  </pic:spPr>
+                </pic:pic>
+              </a:graphicData>
+            </a:graphic>
+          </wp:inline>
+        </w:drawing>
+      </w:r>
+    </w:p>
+    <w:p>
+      <w:pPr>
+        <w:rPr>
+          <w:noProof/>
+        </w:rPr>
+      </w:pPr>
+      <w:r>
+        <w:rPr>
+          <w:noProof/>
+        </w:rPr>
+        <w:lastRenderedPageBreak/>
+        <w:t xml:space="preserve">86 </w:t>
+      </w:r>
+      <w:r>
+        <w:rPr>
+          <w:noProof/>
+        </w:rPr>
+        <w:t>–</w:t>
+      </w:r>
+      <w:r>
+        <w:rPr>
+          <w:noProof/>
+        </w:rPr>
+        <w:t xml:space="preserve"> </w:t>
+      </w:r>
+      <w:r>
+        <w:rPr>
+          <w:noProof/>
+        </w:rPr>
+        <w:t>Adicionamos a class título</w:t>
+      </w:r>
+      <w:r>
+        <w:rPr>
+          <w:noProof/>
+        </w:rPr>
+        <w:t>-</w:t>
+      </w:r>
+      <w:r>
+        <w:rPr>
+          <w:noProof/>
+        </w:rPr>
+        <w:t xml:space="preserve">principal </w:t>
+      </w:r>
+      <w:r>
+        <w:rPr>
+          <w:noProof/>
+        </w:rPr>
+        <w:t xml:space="preserve">no h2 e h3 da nossa página centralizando os subtítulos e aumentando o tamanho da fonte utilizando a medida “em” que signidica por exemplo 1em é igual a medida padrão do navegador, 2em é o dobroda medida padrão e assim por diante ao utilizarmos.  </w:t>
+      </w:r>
+    </w:p>
+    <w:p>
+      <w:pPr>
+        <w:rPr>
+          <w:noProof/>
+        </w:rPr>
+      </w:pPr>
+      <w:r>
+        <w:rPr>
+          <w:noProof/>
+        </w:rPr>
+        <w:t>E para finalizar colocamos um espaço externo para baixo de 1em aproximadamente 16px com “margin: 0 0 1em;”.</w:t>
+      </w:r>
+    </w:p>
+    <w:p>
+      <w:pPr>
+        <w:rPr>
+          <w:noProof/>
+        </w:rPr>
+      </w:pPr>
+      <w:r>
+        <w:rPr>
+          <w:noProof/>
+        </w:rPr>
+        <w:t>87 – Para colocar um espaço entre os parágrafos da nossa section principal utilizamos o seguinte código:</w:t>
+      </w:r>
+    </w:p>
+    <w:p>
+      <w:pPr>
+        <w:rPr>
+          <w:noProof/>
+        </w:rPr>
+      </w:pPr>
+      <w:r>
+        <w:rPr>
+          <w:noProof/>
+        </w:rPr>
+        <w:drawing>
+          <wp:inline distT="0" distB="0" distL="0" distR="0" wp14:anchorId="359964AA" wp14:editId="19B0BE3B">
+            <wp:extent cx="1295581" cy="504895"/>
+            <wp:effectExtent l="0" t="0" r="0" b="0"/>
+            <wp:docPr id="161" name="Imagem 161"/>
+            <wp:cNvGraphicFramePr>
+              <a:graphicFrameLocks xmlns:a="http://schemas.openxmlformats.org/drawingml/2006/main" noChangeAspect="1"/>
+            </wp:cNvGraphicFramePr>
+            <a:graphic xmlns:a="http://schemas.openxmlformats.org/drawingml/2006/main">
+              <a:graphicData uri="http://schemas.openxmlformats.org/drawingml/2006/picture">
+                <pic:pic xmlns:pic="http://schemas.openxmlformats.org/drawingml/2006/picture">
+                  <pic:nvPicPr>
+                    <pic:cNvPr id="1" name=""/>
+                    <pic:cNvPicPr/>
+                  </pic:nvPicPr>
+                  <pic:blipFill>
+                    <a:blip r:embed="rId142"/>
+                    <a:stretch>
+                      <a:fillRect/>
+                    </a:stretch>
+                  </pic:blipFill>
+                  <pic:spPr>
+                    <a:xfrm>
+                      <a:off x="0" y="0"/>
+                      <a:ext cx="1295581" cy="504895"/>
+                    </a:xfrm>
+                    <a:prstGeom prst="rect">
+                      <a:avLst/>
+                    </a:prstGeom>
+                  </pic:spPr>
+                </pic:pic>
+              </a:graphicData>
+            </a:graphic>
+          </wp:inline>
+        </w:drawing>
+      </w:r>
+    </w:p>
+    <w:p>
+      <w:pPr>
+        <w:rPr>
+          <w:noProof/>
+        </w:rPr>
+      </w:pPr>
+      <w:r>
+        <w:rPr>
+          <w:noProof/>
+        </w:rPr>
+        <w:t xml:space="preserve">88 </w:t>
+      </w:r>
+      <w:r>
+        <w:rPr>
+          <w:noProof/>
+        </w:rPr>
+        <w:t>–</w:t>
+      </w:r>
+      <w:r>
+        <w:rPr>
+          <w:noProof/>
+        </w:rPr>
+        <w:t xml:space="preserve"> </w:t>
+      </w:r>
+      <w:r>
+        <w:rPr>
+          <w:noProof/>
+        </w:rPr>
+        <w:t xml:space="preserve">Utilizando o CSS como referência para aplicar as propriedades usamos os seguintes códigos: </w:t>
+      </w:r>
+    </w:p>
+    <w:p>
+      <w:pPr>
+        <w:pStyle w:val="PargrafodaLista"/>
+        <w:numPr>
+          <w:ilvl w:val="0"/>
+          <w:numId w:val="1"/>
+        </w:numPr>
+        <w:rPr>
+          <w:noProof/>
+        </w:rPr>
+      </w:pPr>
+      <w:r>
+        <w:rPr>
+          <w:noProof/>
+        </w:rPr>
+        <w:t>Encorpamos o texto deixando em negrito(.principal strong)</w:t>
+      </w:r>
+    </w:p>
+    <w:p>
+      <w:pPr>
+        <w:pStyle w:val="PargrafodaLista"/>
+        <w:numPr>
+          <w:ilvl w:val="0"/>
+          <w:numId w:val="1"/>
+        </w:numPr>
+        <w:rPr>
+          <w:noProof/>
+        </w:rPr>
+      </w:pPr>
+      <w:r>
+        <w:rPr>
+          <w:noProof/>
+        </w:rPr>
+        <w:t>Deixamos o texto em italico(.principal em)</w:t>
+      </w:r>
+    </w:p>
+    <w:p>
+      <w:pPr>
+        <w:rPr>
+          <w:noProof/>
+        </w:rPr>
+      </w:pPr>
+      <w:r>
+        <w:rPr>
+          <w:noProof/>
+        </w:rPr>
+        <mc:AlternateContent>
+          <mc:Choice Requires="wps">
+            <w:drawing>
+              <wp:anchor distT="0" distB="0" distL="114300" distR="114300" simplePos="0" relativeHeight="251686912" behindDoc="0" locked="0" layoutInCell="1" allowOverlap="1">
+                <wp:simplePos x="0" y="0"/>
+                <wp:positionH relativeFrom="column">
+                  <wp:posOffset>2777490</wp:posOffset>
+                </wp:positionH>
+                <wp:positionV relativeFrom="paragraph">
+                  <wp:posOffset>749935</wp:posOffset>
+                </wp:positionV>
+                <wp:extent cx="1495425" cy="38100"/>
+                <wp:effectExtent l="38100" t="76200" r="28575" b="57150"/>
+                <wp:wrapNone/>
+                <wp:docPr id="165" name="Conector de Seta Reta 165"/>
+                <wp:cNvGraphicFramePr/>
+                <a:graphic xmlns:a="http://schemas.openxmlformats.org/drawingml/2006/main">
+                  <a:graphicData uri="http://schemas.microsoft.com/office/word/2010/wordprocessingShape">
+                    <wps:wsp>
+                      <wps:cNvCnPr/>
+                      <wps:spPr>
+                        <a:xfrm flipH="1" flipV="1">
+                          <a:off x="0" y="0"/>
+                          <a:ext cx="1495425" cy="38100"/>
+                        </a:xfrm>
+                        <a:prstGeom prst="straightConnector1">
+                          <a:avLst/>
+                        </a:prstGeom>
+                        <a:ln>
+                          <a:solidFill>
+                            <a:srgbClr val="FF0000"/>
+                          </a:solidFill>
+                          <a:tailEnd type="triangle"/>
+                        </a:ln>
+                      </wps:spPr>
+                      <wps:style>
+                        <a:lnRef idx="1">
+                          <a:schemeClr val="accent1"/>
+                        </a:lnRef>
+                        <a:fillRef idx="0">
+                          <a:schemeClr val="accent1"/>
+                        </a:fillRef>
+                        <a:effectRef idx="0">
+                          <a:schemeClr val="accent1"/>
+                        </a:effectRef>
+                        <a:fontRef idx="minor">
+                          <a:schemeClr val="tx1"/>
+                        </a:fontRef>
+                      </wps:style>
+                      <wps:bodyPr/>
+                    </wps:wsp>
+                  </a:graphicData>
+                </a:graphic>
+              </wp:anchor>
+            </w:drawing>
+          </mc:Choice>
+          <mc:Fallback>
+            <w:pict>
+              <v:shapetype w14:anchorId="4D562EB3" id="_x0000_t32" coordsize="21600,21600" o:spt="32" o:oned="t" path="m,l21600,21600e" filled="f">
+                <v:path arrowok="t" fillok="f" o:connecttype="none"/>
+                <o:lock v:ext="edit" shapetype="t"/>
+              </v:shapetype>
+              <v:shape id="Conector de Seta Reta 165" o:spid="_x0000_s1026" type="#_x0000_t32" style="position:absolute;margin-left:218.7pt;margin-top:59.05pt;width:117.75pt;height:3pt;flip:x y;z-index:251686912;visibility:visible;mso-wrap-style:square;mso-wrap-distance-left:9pt;mso-wrap-distance-top:0;mso-wrap-distance-right:9pt;mso-wrap-distance-bottom:0;mso-position-horizontal:absolute;mso-position-horizontal-relative:text;mso-position-vertical:absolute;mso-position-vertical-relative:text" o:gfxdata="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" strokecolor="red" strokeweight=".5pt">
+                <v:stroke endarrow="block" joinstyle="miter"/>
+              </v:shape>
+            </w:pict>
+          </mc:Fallback>
+        </mc:AlternateContent>
+      </w:r>
+      <w:r>
+        <w:rPr>
+          <w:noProof/>
+        </w:rPr>
+        <w:drawing>
+          <wp:inline distT="0" distB="0" distL="0" distR="0" wp14:anchorId="5FEDD5C0" wp14:editId="7B0D04B0">
+            <wp:extent cx="1467055" cy="1105054"/>
+            <wp:effectExtent l="0" t="0" r="0" b="0"/>
+            <wp:docPr id="162" name="Imagem 162"/>
+            <wp:cNvGraphicFramePr>
+              <a:graphicFrameLocks xmlns:a="http://schemas.openxmlformats.org/drawingml/2006/main" noChangeAspect="1"/>
+            </wp:cNvGraphicFramePr>
+            <a:graphic xmlns:a="http://schemas.openxmlformats.org/drawingml/2006/main">
+              <a:graphicData uri="http://schemas.openxmlformats.org/drawingml/2006/picture">
+                <pic:pic xmlns:pic="http://schemas.openxmlformats.org/drawingml/2006/picture">
+                  <pic:nvPicPr>
+                    <pic:cNvPr id="1" name=""/>
+                    <pic:cNvPicPr/>
+                  </pic:nvPicPr>
+                  <pic:blipFill>
+                    <a:blip r:embed="rId143"/>
+                    <a:stretch>
+                      <a:fillRect/>
+                    </a:stretch>
+                  </pic:blipFill>
+                  <pic:spPr>
+                    <a:xfrm>
+                      <a:off x="0" y="0"/>
+                      <a:ext cx="1467055" cy="1105054"/>
+                    </a:xfrm>
+                    <a:prstGeom prst="rect">
+                      <a:avLst/>
+                    </a:prstGeom>
+                  </pic:spPr>
+                </pic:pic>
+              </a:graphicData>
+            </a:graphic>
+          </wp:inline>
+        </w:drawing>
+      </w:r>
+      <w:r>
+        <w:rPr>
+          <w:noProof/>
+        </w:rPr>
+        <w:drawing>
+          <wp:inline distT="0" distB="0" distL="0" distR="0" wp14:anchorId="5E1B71DB" wp14:editId="69909E38">
+            <wp:extent cx="2961640" cy="1112008"/>
+            <wp:effectExtent l="0" t="0" r="0" b="0"/>
+            <wp:docPr id="164" name="Imagem 164"/>
+            <wp:cNvGraphicFramePr>
+              <a:graphicFrameLocks xmlns:a="http://schemas.openxmlformats.org/drawingml/2006/main" noChangeAspect="1"/>
+            </wp:cNvGraphicFramePr>
+            <a:graphic xmlns:a="http://schemas.openxmlformats.org/drawingml/2006/main">
+              <a:graphicData uri="http://schemas.openxmlformats.org/drawingml/2006/picture">
+                <pic:pic xmlns:pic="http://schemas.openxmlformats.org/drawingml/2006/picture">
+                  <pic:nvPicPr>
+                    <pic:cNvPr id="1" name=""/>
+                    <pic:cNvPicPr/>
+                  </pic:nvPicPr>
+                  <pic:blipFill>
+                    <a:blip r:embed="rId144"/>
+                    <a:stretch>
+                      <a:fillRect/>
+                    </a:stretch>
+                  </pic:blipFill>
+                  <pic:spPr>
+                    <a:xfrm>
+                      <a:off x="0" y="0"/>
+                      <a:ext cx="2994040" cy="1124173"/>
+                    </a:xfrm>
+                    <a:prstGeom prst="rect">
+                      <a:avLst/>
+                    </a:prstGeom>
+                  </pic:spPr>
+                </pic:pic>
+              </a:graphicData>
+            </a:graphic>
+          </wp:inline>
+        </w:drawing>
+      </w:r>
+      <w:r>
+        <w:rPr>
+          <w:noProof/>
+        </w:rPr>
+        <w:drawing>
+          <wp:inline distT="0" distB="0" distL="0" distR="0" wp14:anchorId="4C1157B5" wp14:editId="383D42C6">
+            <wp:extent cx="4768754" cy="314325"/>
+            <wp:effectExtent l="0" t="0" r="0" b="0"/>
+            <wp:docPr id="163" name="Imagem 163"/>
+            <wp:cNvGraphicFramePr>
+              <a:graphicFrameLocks xmlns:a="http://schemas.openxmlformats.org/drawingml/2006/main" noChangeAspect="1"/>
+            </wp:cNvGraphicFramePr>
+            <a:graphic xmlns:a="http://schemas.openxmlformats.org/drawingml/2006/main">
+              <a:graphicData uri="http://schemas.openxmlformats.org/drawingml/2006/picture">
+                <pic:pic xmlns:pic="http://schemas.openxmlformats.org/drawingml/2006/picture">
+                  <pic:nvPicPr>
+                    <pic:cNvPr id="1" name=""/>
+                    <pic:cNvPicPr/>
+                  </pic:nvPicPr>
+                  <pic:blipFill>
+                    <a:blip r:embed="rId145"/>
+                    <a:stretch>
+                      <a:fillRect/>
+                    </a:stretch>
+                  </pic:blipFill>
+                  <pic:spPr>
+                    <a:xfrm>
+                      <a:off x="0" y="0"/>
+                      <a:ext cx="5116213" cy="337227"/>
+                    </a:xfrm>
+                    <a:prstGeom prst="rect">
+                      <a:avLst/>
+                    </a:prstGeom>
+                  </pic:spPr>
+                </pic:pic>
+              </a:graphicData>
+            </a:graphic>
+          </wp:inline>
+        </w:drawing>
+      </w:r>
+    </w:p>
+    <w:p>
+      <w:pPr>
+        <w:rPr>
+          <w:noProof/>
+        </w:rPr>
+      </w:pPr>
+      <w:r>
+        <w:rPr>
+          <w:noProof/>
+        </w:rPr>
+        <w:t xml:space="preserve">89 </w:t>
+      </w:r>
+      <w:r>
+        <w:rPr>
+          <w:noProof/>
+        </w:rPr>
+        <w:t>–</w:t>
+      </w:r>
+      <w:r>
+        <w:rPr>
+          <w:noProof/>
+        </w:rPr>
+        <w:t xml:space="preserve"> </w:t>
+      </w:r>
+      <w:r>
+        <w:rPr>
+          <w:noProof/>
+        </w:rPr>
+        <w:t>Diminuimos o tamanho da imagem benefícios utilizando o seguinte código:</w:t>
+      </w:r>
+    </w:p>
+    <w:p>
+      <w:pPr>
+        <w:rPr>
+          <w:noProof/>
+        </w:rPr>
+      </w:pPr>
+      <w:r>
+        <w:rPr>
+          <w:noProof/>
+        </w:rPr>
+        <w:drawing>
+          <wp:inline distT="0" distB="0" distL="0" distR="0" wp14:anchorId="558FB8EB" wp14:editId="11D1770E">
+            <wp:extent cx="1286054" cy="533474"/>
+            <wp:effectExtent l="0" t="0" r="9525" b="0"/>
+            <wp:docPr id="166" name="Imagem 166"/>
+            <wp:cNvGraphicFramePr>
+              <a:graphicFrameLocks xmlns:a="http://schemas.openxmlformats.org/drawingml/2006/main" noChangeAspect="1"/>
+            </wp:cNvGraphicFramePr>
+            <a:graphic xmlns:a="http://schemas.openxmlformats.org/drawingml/2006/main">
+              <a:graphicData uri="http://schemas.openxmlformats.org/drawingml/2006/picture">
+                <pic:pic xmlns:pic="http://schemas.openxmlformats.org/drawingml/2006/picture">
+                  <pic:nvPicPr>
+                    <pic:cNvPr id="1" name=""/>
+                    <pic:cNvPicPr/>
+                  </pic:nvPicPr>
+                  <pic:blipFill>
+                    <a:blip r:embed="rId146"/>
+                    <a:stretch>
+                      <a:fillRect/>
+                    </a:stretch>
+                  </pic:blipFill>
+                  <pic:spPr>
+                    <a:xfrm>
+                      <a:off x="0" y="0"/>
+                      <a:ext cx="1286054" cy="533474"/>
+                    </a:xfrm>
+                    <a:prstGeom prst="rect">
+                      <a:avLst/>
+                    </a:prstGeom>
+                  </pic:spPr>
+                </pic:pic>
+              </a:graphicData>
+            </a:graphic>
+          </wp:inline>
+        </w:drawing>
+      </w:r>
+    </w:p>
+    <w:p>
+      <w:pPr>
+        <w:rPr>
+          <w:noProof/>
+        </w:rPr>
+      </w:pPr>
+      <w:r>
+        <w:rPr>
+          <w:noProof/>
+        </w:rPr>
+        <w:t xml:space="preserve">90 – Inserimos uma imagem na section principal logo </w:t>
+      </w:r>
+      <w:r>
+        <w:rPr>
+          <w:noProof/>
+        </w:rPr>
+        <w:t>a baixo do h2 e diminuímos o tamanho da imagem. Conforme o código:</w:t>
+      </w:r>
+    </w:p>
+    <w:p>
+      <w:pPr>
+        <w:rPr>
+          <w:noProof/>
+        </w:rPr>
+      </w:pPr>
+      <w:r>
+        <w:rPr>
+          <w:noProof/>
+        </w:rPr>
+        <w:drawing>
+          <wp:inline distT="0" distB="0" distL="0" distR="0" wp14:anchorId="53FFA88D" wp14:editId="11F200E4">
+            <wp:extent cx="3381375" cy="544984"/>
+            <wp:effectExtent l="0" t="0" r="0" b="7620"/>
+            <wp:docPr id="168" name="Imagem 168"/>
+            <wp:cNvGraphicFramePr>
+              <a:graphicFrameLocks xmlns:a="http://schemas.openxmlformats.org/drawingml/2006/main" noChangeAspect="1"/>
+            </wp:cNvGraphicFramePr>
+            <a:graphic xmlns:a="http://schemas.openxmlformats.org/drawingml/2006/main">
+              <a:graphicData uri="http://schemas.openxmlformats.org/drawingml/2006/picture">
+                <pic:pic xmlns:pic="http://schemas.openxmlformats.org/drawingml/2006/picture">
+                  <pic:nvPicPr>
+                    <pic:cNvPr id="1" name=""/>
+                    <pic:cNvPicPr/>
+                  </pic:nvPicPr>
+                  <pic:blipFill>
+                    <a:blip r:embed="rId147"/>
+                    <a:stretch>
+                      <a:fillRect/>
+                    </a:stretch>
+                  </pic:blipFill>
+                  <pic:spPr>
+                    <a:xfrm>
+                      <a:off x="0" y="0"/>
+                      <a:ext cx="3467661" cy="558891"/>
+                    </a:xfrm>
+                    <a:prstGeom prst="rect">
+                      <a:avLst/>
+                    </a:prstGeom>
+                  </pic:spPr>
+                </pic:pic>
+              </a:graphicData>
+            </a:graphic>
+          </wp:inline>
+        </w:drawing>
+      </w:r>
+      <w:r>
+        <w:rPr>
+          <w:noProof/>
+        </w:rPr>
+        <w:drawing>
+          <wp:inline distT="0" distB="0" distL="0" distR="0" wp14:anchorId="1B92B132" wp14:editId="12721446">
+            <wp:extent cx="1076475" cy="543001"/>
+            <wp:effectExtent l="0" t="0" r="0" b="9525"/>
+            <wp:docPr id="167" name="Imagem 167"/>
+            <wp:cNvGraphicFramePr>
+              <a:graphicFrameLocks xmlns:a="http://schemas.openxmlformats.org/drawingml/2006/main" noChangeAspect="1"/>
+            </wp:cNvGraphicFramePr>
+            <a:graphic xmlns:a="http://schemas.openxmlformats.org/drawingml/2006/main">
+              <a:graphicData uri="http://schemas.openxmlformats.org/drawingml/2006/picture">
+                <pic:pic xmlns:pic="http://schemas.openxmlformats.org/drawingml/2006/picture">
+                  <pic:nvPicPr>
+                    <pic:cNvPr id="1" name=""/>
+                    <pic:cNvPicPr/>
+                  </pic:nvPicPr>
+                  <pic:blipFill>
+                    <a:blip r:embed="rId148"/>
+                    <a:stretch>
+                      <a:fillRect/>
+                    </a:stretch>
+                  </pic:blipFill>
+                  <pic:spPr>
+                    <a:xfrm>
+                      <a:off x="0" y="0"/>
+                      <a:ext cx="1076475" cy="543001"/>
+                    </a:xfrm>
+                    <a:prstGeom prst="rect">
+                      <a:avLst/>
+                    </a:prstGeom>
+                  </pic:spPr>
+                </pic:pic>
+              </a:graphicData>
+            </a:graphic>
+          </wp:inline>
+        </w:drawing>
       </w:r>
       <w:bookmarkStart w:id="0" w:name="_GoBack"/>
       <w:bookmarkEnd w:id="0"/>
-    </w:p>
-    <w:p>
-      <w:pPr>
-        <w:rPr>
-          <w:noProof/>
-        </w:rPr>
-      </w:pPr>
-      <w:r>
-        <w:rPr>
-          <w:noProof/>
-        </w:rPr>
-        <w:t xml:space="preserve"> </w:t>
-      </w:r>
     </w:p>
     <w:sectPr>
       <w:pgSz w:w="11906" w:h="16838"/>
@@ -11962,7 +12700,7 @@
 </file>
 
 <file path=customXml/itemProps1.xml><?xml version="1.0" encoding="utf-8"?>
-<ds:datastoreItem xmlns:ds="http://schemas.openxmlformats.org/officeDocument/2006/customXml" ds:itemID="{A6066C7B-A3EB-465D-A4D5-F1D787674E55}">
+<ds:datastoreItem xmlns:ds="http://schemas.openxmlformats.org/officeDocument/2006/customXml" ds:itemID="{65B5609D-CF96-4CC4-B2B1-95D56BD399A8}">
   <ds:schemaRefs>
     <ds:schemaRef ds:uri="http://schemas.openxmlformats.org/officeDocument/2006/bibliography"/>
   </ds:schemaRefs>

</xml_diff>

<commit_message>
quase terminando a pagina home
</commit_message>
<xml_diff>
--- a/Apostila/Projeto Space For Men.docx
+++ b/Apostila/Projeto Space For Men.docx
@@ -11815,8 +11815,611 @@
           </wp:inline>
         </w:drawing>
       </w:r>
+    </w:p>
+    <w:p>
+      <w:pPr>
+        <w:rPr>
+          <w:noProof/>
+        </w:rPr>
+      </w:pPr>
+      <w:r>
+        <w:rPr>
+          <w:noProof/>
+        </w:rPr>
+        <w:t xml:space="preserve">91 </w:t>
+      </w:r>
+      <w:r>
+        <w:rPr>
+          <w:noProof/>
+        </w:rPr>
+        <w:t>–</w:t>
+      </w:r>
+      <w:r>
+        <w:rPr>
+          <w:noProof/>
+        </w:rPr>
+        <w:t xml:space="preserve"> </w:t>
+      </w:r>
+      <w:r>
+        <w:rPr>
+          <w:noProof/>
+        </w:rPr>
+        <w:t>Para colocar o texto ao lado da imagem utilizamos uma técnica de flutuação chamada float, quando utilizamos esse recurso, o elemento descola da páginao que está em baixo passa para cima, se atentando a sua sombra, continua ocupando virtualmente o espaço.</w:t>
+      </w:r>
+    </w:p>
+    <w:p>
+      <w:pPr>
+        <w:rPr>
+          <w:noProof/>
+        </w:rPr>
+      </w:pPr>
+      <w:r>
+        <w:rPr>
+          <w:noProof/>
+        </w:rPr>
+        <w:drawing>
+          <wp:inline distT="0" distB="0" distL="0" distR="0" wp14:anchorId="10FDB9F8" wp14:editId="6C52CD48">
+            <wp:extent cx="1323975" cy="866775"/>
+            <wp:effectExtent l="0" t="0" r="9525" b="9525"/>
+            <wp:docPr id="158" name="Imagem 158"/>
+            <wp:cNvGraphicFramePr>
+              <a:graphicFrameLocks xmlns:a="http://schemas.openxmlformats.org/drawingml/2006/main" noChangeAspect="1"/>
+            </wp:cNvGraphicFramePr>
+            <a:graphic xmlns:a="http://schemas.openxmlformats.org/drawingml/2006/main">
+              <a:graphicData uri="http://schemas.openxmlformats.org/drawingml/2006/picture">
+                <pic:pic xmlns:pic="http://schemas.openxmlformats.org/drawingml/2006/picture">
+                  <pic:nvPicPr>
+                    <pic:cNvPr id="1" name=""/>
+                    <pic:cNvPicPr/>
+                  </pic:nvPicPr>
+                  <pic:blipFill>
+                    <a:blip r:embed="rId149"/>
+                    <a:stretch>
+                      <a:fillRect/>
+                    </a:stretch>
+                  </pic:blipFill>
+                  <pic:spPr>
+                    <a:xfrm>
+                      <a:off x="0" y="0"/>
+                      <a:ext cx="1324161" cy="866897"/>
+                    </a:xfrm>
+                    <a:prstGeom prst="rect">
+                      <a:avLst/>
+                    </a:prstGeom>
+                  </pic:spPr>
+                </pic:pic>
+              </a:graphicData>
+            </a:graphic>
+          </wp:inline>
+        </w:drawing>
+      </w:r>
+      <w:r>
+        <w:rPr>
+          <w:noProof/>
+        </w:rPr>
+        <w:drawing>
+          <wp:inline distT="0" distB="0" distL="0" distR="0" wp14:anchorId="45CFB8D3" wp14:editId="5715F7E0">
+            <wp:extent cx="3856766" cy="1095375"/>
+            <wp:effectExtent l="0" t="0" r="0" b="0"/>
+            <wp:docPr id="169" name="Imagem 169"/>
+            <wp:cNvGraphicFramePr>
+              <a:graphicFrameLocks xmlns:a="http://schemas.openxmlformats.org/drawingml/2006/main" noChangeAspect="1"/>
+            </wp:cNvGraphicFramePr>
+            <a:graphic xmlns:a="http://schemas.openxmlformats.org/drawingml/2006/main">
+              <a:graphicData uri="http://schemas.openxmlformats.org/drawingml/2006/picture">
+                <pic:pic xmlns:pic="http://schemas.openxmlformats.org/drawingml/2006/picture">
+                  <pic:nvPicPr>
+                    <pic:cNvPr id="1" name=""/>
+                    <pic:cNvPicPr/>
+                  </pic:nvPicPr>
+                  <pic:blipFill>
+                    <a:blip r:embed="rId150"/>
+                    <a:stretch>
+                      <a:fillRect/>
+                    </a:stretch>
+                  </pic:blipFill>
+                  <pic:spPr>
+                    <a:xfrm>
+                      <a:off x="0" y="0"/>
+                      <a:ext cx="3930639" cy="1116356"/>
+                    </a:xfrm>
+                    <a:prstGeom prst="rect">
+                      <a:avLst/>
+                    </a:prstGeom>
+                  </pic:spPr>
+                </pic:pic>
+              </a:graphicData>
+            </a:graphic>
+          </wp:inline>
+        </w:drawing>
+      </w:r>
+    </w:p>
+    <w:p>
+      <w:pPr>
+        <w:rPr>
+          <w:noProof/>
+        </w:rPr>
+      </w:pPr>
+      <w:r>
+        <w:rPr>
+          <w:noProof/>
+        </w:rPr>
+        <w:lastRenderedPageBreak/>
+        <w:t>92 – Observamos que ao utilizar o “float” o elemento a baixo subiu para valor ao est</w:t>
+      </w:r>
+      <w:r>
+        <w:rPr>
+          <w:noProof/>
+        </w:rPr>
+        <w:t>ado</w:t>
+      </w:r>
+      <w:r>
+        <w:rPr>
+          <w:noProof/>
+        </w:rPr>
+        <w:t xml:space="preserve"> anterior utilizamos o “clear:left;”</w:t>
+      </w:r>
+      <w:r>
+        <w:rPr>
+          <w:noProof/>
+        </w:rPr>
+        <w:t>.</w:t>
+      </w:r>
+    </w:p>
+    <w:p>
+      <w:pPr>
+        <w:rPr>
+          <w:noProof/>
+        </w:rPr>
+      </w:pPr>
+      <w:r>
+        <w:rPr>
+          <w:noProof/>
+        </w:rPr>
+        <w:drawing>
+          <wp:inline distT="0" distB="0" distL="0" distR="0" wp14:anchorId="6EE508A8" wp14:editId="12F17A9D">
+            <wp:extent cx="1514686" cy="905001"/>
+            <wp:effectExtent l="0" t="0" r="9525" b="9525"/>
+            <wp:docPr id="170" name="Imagem 170"/>
+            <wp:cNvGraphicFramePr>
+              <a:graphicFrameLocks xmlns:a="http://schemas.openxmlformats.org/drawingml/2006/main" noChangeAspect="1"/>
+            </wp:cNvGraphicFramePr>
+            <a:graphic xmlns:a="http://schemas.openxmlformats.org/drawingml/2006/main">
+              <a:graphicData uri="http://schemas.openxmlformats.org/drawingml/2006/picture">
+                <pic:pic xmlns:pic="http://schemas.openxmlformats.org/drawingml/2006/picture">
+                  <pic:nvPicPr>
+                    <pic:cNvPr id="1" name=""/>
+                    <pic:cNvPicPr/>
+                  </pic:nvPicPr>
+                  <pic:blipFill>
+                    <a:blip r:embed="rId151"/>
+                    <a:stretch>
+                      <a:fillRect/>
+                    </a:stretch>
+                  </pic:blipFill>
+                  <pic:spPr>
+                    <a:xfrm>
+                      <a:off x="0" y="0"/>
+                      <a:ext cx="1514686" cy="905001"/>
+                    </a:xfrm>
+                    <a:prstGeom prst="rect">
+                      <a:avLst/>
+                    </a:prstGeom>
+                  </pic:spPr>
+                </pic:pic>
+              </a:graphicData>
+            </a:graphic>
+          </wp:inline>
+        </w:drawing>
+      </w:r>
+    </w:p>
+    <w:p>
+      <w:pPr>
+        <w:rPr>
+          <w:noProof/>
+        </w:rPr>
+      </w:pPr>
+      <w:r>
+        <w:rPr>
+          <w:noProof/>
+        </w:rPr>
+        <w:t>93 – O texto estava muito colado com a imagem, inserimos uma distancia externa de 20px para a direita e 20px para baixo.</w:t>
+      </w:r>
+    </w:p>
+    <w:p>
+      <w:pPr>
+        <w:rPr>
+          <w:noProof/>
+        </w:rPr>
+      </w:pPr>
+      <w:r>
+        <w:rPr>
+          <w:noProof/>
+        </w:rPr>
+        <w:drawing>
+          <wp:inline distT="0" distB="0" distL="0" distR="0" wp14:anchorId="18645D7B" wp14:editId="1426A149">
+            <wp:extent cx="1580714" cy="828675"/>
+            <wp:effectExtent l="0" t="0" r="635" b="0"/>
+            <wp:docPr id="171" name="Imagem 171"/>
+            <wp:cNvGraphicFramePr>
+              <a:graphicFrameLocks xmlns:a="http://schemas.openxmlformats.org/drawingml/2006/main" noChangeAspect="1"/>
+            </wp:cNvGraphicFramePr>
+            <a:graphic xmlns:a="http://schemas.openxmlformats.org/drawingml/2006/main">
+              <a:graphicData uri="http://schemas.openxmlformats.org/drawingml/2006/picture">
+                <pic:pic xmlns:pic="http://schemas.openxmlformats.org/drawingml/2006/picture">
+                  <pic:nvPicPr>
+                    <pic:cNvPr id="1" name=""/>
+                    <pic:cNvPicPr/>
+                  </pic:nvPicPr>
+                  <pic:blipFill>
+                    <a:blip r:embed="rId152"/>
+                    <a:stretch>
+                      <a:fillRect/>
+                    </a:stretch>
+                  </pic:blipFill>
+                  <pic:spPr>
+                    <a:xfrm>
+                      <a:off x="0" y="0"/>
+                      <a:ext cx="1588823" cy="832926"/>
+                    </a:xfrm>
+                    <a:prstGeom prst="rect">
+                      <a:avLst/>
+                    </a:prstGeom>
+                  </pic:spPr>
+                </pic:pic>
+              </a:graphicData>
+            </a:graphic>
+          </wp:inline>
+        </w:drawing>
+      </w:r>
+      <w:r>
+        <w:rPr>
+          <w:noProof/>
+        </w:rPr>
+        <w:drawing>
+          <wp:inline distT="0" distB="0" distL="0" distR="0" wp14:anchorId="0BB0CEF2" wp14:editId="305EF7A4">
+            <wp:extent cx="3314700" cy="838809"/>
+            <wp:effectExtent l="0" t="0" r="0" b="0"/>
+            <wp:docPr id="172" name="Imagem 172"/>
+            <wp:cNvGraphicFramePr>
+              <a:graphicFrameLocks xmlns:a="http://schemas.openxmlformats.org/drawingml/2006/main" noChangeAspect="1"/>
+            </wp:cNvGraphicFramePr>
+            <a:graphic xmlns:a="http://schemas.openxmlformats.org/drawingml/2006/main">
+              <a:graphicData uri="http://schemas.openxmlformats.org/drawingml/2006/picture">
+                <pic:pic xmlns:pic="http://schemas.openxmlformats.org/drawingml/2006/picture">
+                  <pic:nvPicPr>
+                    <pic:cNvPr id="1" name=""/>
+                    <pic:cNvPicPr/>
+                  </pic:nvPicPr>
+                  <pic:blipFill>
+                    <a:blip r:embed="rId153"/>
+                    <a:stretch>
+                      <a:fillRect/>
+                    </a:stretch>
+                  </pic:blipFill>
+                  <pic:spPr>
+                    <a:xfrm>
+                      <a:off x="0" y="0"/>
+                      <a:ext cx="3357868" cy="849733"/>
+                    </a:xfrm>
+                    <a:prstGeom prst="rect">
+                      <a:avLst/>
+                    </a:prstGeom>
+                  </pic:spPr>
+                </pic:pic>
+              </a:graphicData>
+            </a:graphic>
+          </wp:inline>
+        </w:drawing>
+      </w:r>
+    </w:p>
+    <w:p>
+      <w:pPr>
+        <w:rPr>
+          <w:noProof/>
+        </w:rPr>
+      </w:pPr>
+      <w:r>
+        <w:rPr>
+          <w:noProof/>
+        </w:rPr>
+        <w:t xml:space="preserve">94 – Trabalhando com fontes da internet, vamos escolher uma fonte para o nosso site que seja </w:t>
+      </w:r>
+      <w:r>
+        <w:rPr>
+          <w:noProof/>
+        </w:rPr>
+        <w:t>preparado pela intenet.</w:t>
+      </w:r>
+    </w:p>
+    <w:p>
+      <w:pPr>
+        <w:rPr>
+          <w:noProof/>
+        </w:rPr>
+      </w:pPr>
+      <w:r>
+        <w:rPr>
+          <w:noProof/>
+        </w:rPr>
+        <w:t>Qual a diferença de ser preparada ou não para a intenet? É que a fonte independente do navegador vai se comportar da mesma forma.</w:t>
+      </w:r>
+    </w:p>
+    <w:p>
+      <w:pPr>
+        <w:rPr>
+          <w:noProof/>
+        </w:rPr>
+      </w:pPr>
+      <w:r>
+        <w:rPr>
+          <w:noProof/>
+        </w:rPr>
+        <w:t xml:space="preserve">Entrar no site: </w:t>
+      </w:r>
+      <w:hyperlink r:id="rId154" w:history="1">
+        <w:r>
+          <w:rPr>
+            <w:rStyle w:val="Hyperlink"/>
+            <w:noProof/>
+          </w:rPr>
+          <w:t>http://fonts.goog</w:t>
+        </w:r>
+        <w:r>
+          <w:rPr>
+            <w:rStyle w:val="Hyperlink"/>
+            <w:noProof/>
+          </w:rPr>
+          <w:t>l</w:t>
+        </w:r>
+        <w:r>
+          <w:rPr>
+            <w:rStyle w:val="Hyperlink"/>
+            <w:noProof/>
+          </w:rPr>
+          <w:t>e.com</w:t>
+        </w:r>
+      </w:hyperlink>
+      <w:r>
+        <w:rPr>
+          <w:noProof/>
+        </w:rPr>
+        <w:t xml:space="preserve"> para escolher a fonte que desejamos</w:t>
+      </w:r>
+      <w:r>
+        <w:rPr>
+          <w:noProof/>
+        </w:rPr>
+        <w:t xml:space="preserve"> e copia o código que é gerado para colar no “html” e no “css”.</w:t>
+      </w:r>
+    </w:p>
+    <w:p>
+      <w:pPr>
+        <w:rPr>
+          <w:noProof/>
+        </w:rPr>
+      </w:pPr>
+      <w:r>
+        <w:rPr>
+          <w:noProof/>
+        </w:rPr>
+        <w:t>Lembrando que no “html” precisamos colar dentro do “head” e no “css” colamos onde queremos aplicar a fonte.</w:t>
+      </w:r>
+    </w:p>
+    <w:p>
+      <w:pPr>
+        <w:jc w:val="center"/>
+        <w:rPr>
+          <w:noProof/>
+        </w:rPr>
+      </w:pPr>
+      <w:r>
+        <w:rPr>
+          <w:noProof/>
+        </w:rPr>
+        <w:drawing>
+          <wp:inline distT="0" distB="0" distL="0" distR="0" wp14:anchorId="17FEF2FE" wp14:editId="6CCBA140">
+            <wp:extent cx="5105400" cy="1064260"/>
+            <wp:effectExtent l="0" t="0" r="0" b="2540"/>
+            <wp:docPr id="173" name="Imagem 173"/>
+            <wp:cNvGraphicFramePr>
+              <a:graphicFrameLocks xmlns:a="http://schemas.openxmlformats.org/drawingml/2006/main" noChangeAspect="1"/>
+            </wp:cNvGraphicFramePr>
+            <a:graphic xmlns:a="http://schemas.openxmlformats.org/drawingml/2006/main">
+              <a:graphicData uri="http://schemas.openxmlformats.org/drawingml/2006/picture">
+                <pic:pic xmlns:pic="http://schemas.openxmlformats.org/drawingml/2006/picture">
+                  <pic:nvPicPr>
+                    <pic:cNvPr id="1" name=""/>
+                    <pic:cNvPicPr/>
+                  </pic:nvPicPr>
+                  <pic:blipFill>
+                    <a:blip r:embed="rId155"/>
+                    <a:stretch>
+                      <a:fillRect/>
+                    </a:stretch>
+                  </pic:blipFill>
+                  <pic:spPr>
+                    <a:xfrm>
+                      <a:off x="0" y="0"/>
+                      <a:ext cx="5141484" cy="1071782"/>
+                    </a:xfrm>
+                    <a:prstGeom prst="rect">
+                      <a:avLst/>
+                    </a:prstGeom>
+                  </pic:spPr>
+                </pic:pic>
+              </a:graphicData>
+            </a:graphic>
+          </wp:inline>
+        </w:drawing>
+      </w:r>
+      <w:r>
+        <w:rPr>
+          <w:noProof/>
+        </w:rPr>
+        <w:drawing>
+          <wp:inline distT="0" distB="0" distL="0" distR="0" wp14:anchorId="2409EC92" wp14:editId="43768B19">
+            <wp:extent cx="5105400" cy="714375"/>
+            <wp:effectExtent l="0" t="0" r="0" b="9525"/>
+            <wp:docPr id="174" name="Imagem 174"/>
+            <wp:cNvGraphicFramePr>
+              <a:graphicFrameLocks xmlns:a="http://schemas.openxmlformats.org/drawingml/2006/main" noChangeAspect="1"/>
+            </wp:cNvGraphicFramePr>
+            <a:graphic xmlns:a="http://schemas.openxmlformats.org/drawingml/2006/main">
+              <a:graphicData uri="http://schemas.openxmlformats.org/drawingml/2006/picture">
+                <pic:pic xmlns:pic="http://schemas.openxmlformats.org/drawingml/2006/picture">
+                  <pic:nvPicPr>
+                    <pic:cNvPr id="1" name=""/>
+                    <pic:cNvPicPr/>
+                  </pic:nvPicPr>
+                  <pic:blipFill>
+                    <a:blip r:embed="rId156"/>
+                    <a:stretch>
+                      <a:fillRect/>
+                    </a:stretch>
+                  </pic:blipFill>
+                  <pic:spPr>
+                    <a:xfrm>
+                      <a:off x="0" y="0"/>
+                      <a:ext cx="5106115" cy="714475"/>
+                    </a:xfrm>
+                    <a:prstGeom prst="rect">
+                      <a:avLst/>
+                    </a:prstGeom>
+                  </pic:spPr>
+                </pic:pic>
+              </a:graphicData>
+            </a:graphic>
+          </wp:inline>
+        </w:drawing>
+      </w:r>
+      <w:r>
+        <w:rPr>
+          <w:noProof/>
+        </w:rPr>
+        <w:drawing>
+          <wp:inline distT="0" distB="0" distL="0" distR="0" wp14:anchorId="531C54DE" wp14:editId="740C80CB">
+            <wp:extent cx="2724150" cy="2051761"/>
+            <wp:effectExtent l="0" t="0" r="0" b="5715"/>
+            <wp:docPr id="175" name="Imagem 175"/>
+            <wp:cNvGraphicFramePr>
+              <a:graphicFrameLocks xmlns:a="http://schemas.openxmlformats.org/drawingml/2006/main" noChangeAspect="1"/>
+            </wp:cNvGraphicFramePr>
+            <a:graphic xmlns:a="http://schemas.openxmlformats.org/drawingml/2006/main">
+              <a:graphicData uri="http://schemas.openxmlformats.org/drawingml/2006/picture">
+                <pic:pic xmlns:pic="http://schemas.openxmlformats.org/drawingml/2006/picture">
+                  <pic:nvPicPr>
+                    <pic:cNvPr id="1" name=""/>
+                    <pic:cNvPicPr/>
+                  </pic:nvPicPr>
+                  <pic:blipFill>
+                    <a:blip r:embed="rId157"/>
+                    <a:stretch>
+                      <a:fillRect/>
+                    </a:stretch>
+                  </pic:blipFill>
+                  <pic:spPr>
+                    <a:xfrm>
+                      <a:off x="0" y="0"/>
+                      <a:ext cx="2760162" cy="2078884"/>
+                    </a:xfrm>
+                    <a:prstGeom prst="rect">
+                      <a:avLst/>
+                    </a:prstGeom>
+                  </pic:spPr>
+                </pic:pic>
+              </a:graphicData>
+            </a:graphic>
+          </wp:inline>
+        </w:drawing>
+      </w:r>
+    </w:p>
+    <w:p>
+      <w:pPr>
+        <w:rPr>
+          <w:noProof/>
+        </w:rPr>
+      </w:pPr>
+      <w:r>
+        <w:rPr>
+          <w:noProof/>
+        </w:rPr>
+        <w:lastRenderedPageBreak/>
+        <w:t xml:space="preserve">95 </w:t>
+      </w:r>
+      <w:r>
+        <w:rPr>
+          <w:noProof/>
+        </w:rPr>
+        <w:t>–</w:t>
+      </w:r>
+      <w:r>
+        <w:rPr>
+          <w:noProof/>
+        </w:rPr>
+        <w:t xml:space="preserve"> </w:t>
+      </w:r>
+      <w:r>
+        <w:rPr>
+          <w:noProof/>
+        </w:rPr>
+        <w:t xml:space="preserve">Para inserir um mapa no site </w:t>
+      </w:r>
+      <w:r>
+        <w:rPr>
+          <w:noProof/>
+        </w:rPr>
+        <w:t>acessamos o google maps, digitamos na pesquisa o estabelecimento desejado, no nosso caso Barbearia Space For Me. Clique no campo de menu e “compartilhar ou incorporar mapa” e copie o link html.</w:t>
+      </w:r>
       <w:bookmarkStart w:id="0" w:name="_GoBack"/>
       <w:bookmarkEnd w:id="0"/>
+    </w:p>
+    <w:p>
+      <w:pPr>
+        <w:rPr>
+          <w:noProof/>
+        </w:rPr>
+      </w:pPr>
+      <w:r>
+        <w:rPr>
+          <w:noProof/>
+        </w:rPr>
+        <w:drawing>
+          <wp:inline distT="0" distB="0" distL="0" distR="0" wp14:anchorId="5C72DAA5" wp14:editId="149CA5FE">
+            <wp:extent cx="2095500" cy="2829821"/>
+            <wp:effectExtent l="0" t="0" r="0" b="8890"/>
+            <wp:docPr id="176" name="Imagem 176"/>
+            <wp:cNvGraphicFramePr>
+              <a:graphicFrameLocks xmlns:a="http://schemas.openxmlformats.org/drawingml/2006/main" noChangeAspect="1"/>
+            </wp:cNvGraphicFramePr>
+            <a:graphic xmlns:a="http://schemas.openxmlformats.org/drawingml/2006/main">
+              <a:graphicData uri="http://schemas.openxmlformats.org/drawingml/2006/picture">
+                <pic:pic xmlns:pic="http://schemas.openxmlformats.org/drawingml/2006/picture">
+                  <pic:nvPicPr>
+                    <pic:cNvPr id="1" name=""/>
+                    <pic:cNvPicPr/>
+                  </pic:nvPicPr>
+                  <pic:blipFill>
+                    <a:blip r:embed="rId158"/>
+                    <a:stretch>
+                      <a:fillRect/>
+                    </a:stretch>
+                  </pic:blipFill>
+                  <pic:spPr>
+                    <a:xfrm>
+                      <a:off x="0" y="0"/>
+                      <a:ext cx="2100443" cy="2836497"/>
+                    </a:xfrm>
+                    <a:prstGeom prst="rect">
+                      <a:avLst/>
+                    </a:prstGeom>
+                  </pic:spPr>
+                </pic:pic>
+              </a:graphicData>
+            </a:graphic>
+          </wp:inline>
+        </w:drawing>
+      </w:r>
     </w:p>
     <w:sectPr>
       <w:pgSz w:w="11906" w:h="16838"/>
@@ -12389,11 +12992,34 @@
     <w:name w:val="Hyperlink"/>
     <w:basedOn w:val="Fontepargpadro"/>
     <w:uiPriority w:val="99"/>
-    <w:semiHidden/>
     <w:unhideWhenUsed/>
     <w:rsid w:val="00110C70"/>
     <w:rPr>
       <w:color w:val="0000FF"/>
+      <w:u w:val="single"/>
+    </w:rPr>
+  </w:style>
+  <w:style w:type="character" w:styleId="MenoPendente">
+    <w:name w:val="Unresolved Mention"/>
+    <w:basedOn w:val="Fontepargpadro"/>
+    <w:uiPriority w:val="99"/>
+    <w:semiHidden/>
+    <w:unhideWhenUsed/>
+    <w:rsid w:val="004E65D6"/>
+    <w:rPr>
+      <w:color w:val="605E5C"/>
+      <w:shd w:val="clear" w:color="auto" w:fill="E1DFDD"/>
+    </w:rPr>
+  </w:style>
+  <w:style w:type="character" w:styleId="HiperlinkVisitado">
+    <w:name w:val="FollowedHyperlink"/>
+    <w:basedOn w:val="Fontepargpadro"/>
+    <w:uiPriority w:val="99"/>
+    <w:semiHidden/>
+    <w:unhideWhenUsed/>
+    <w:rsid w:val="004E65D6"/>
+    <w:rPr>
+      <w:color w:val="954F72" w:themeColor="followedHyperlink"/>
       <w:u w:val="single"/>
     </w:rPr>
   </w:style>
@@ -12700,7 +13326,7 @@
 </file>
 
 <file path=customXml/itemProps1.xml><?xml version="1.0" encoding="utf-8"?>
-<ds:datastoreItem xmlns:ds="http://schemas.openxmlformats.org/officeDocument/2006/customXml" ds:itemID="{65B5609D-CF96-4CC4-B2B1-95D56BD399A8}">
+<ds:datastoreItem xmlns:ds="http://schemas.openxmlformats.org/officeDocument/2006/customXml" ds:itemID="{61E169EE-4C56-461E-855E-6FEC22E7C8B4}">
   <ds:schemaRefs>
     <ds:schemaRef ds:uri="http://schemas.openxmlformats.org/officeDocument/2006/bibliography"/>
   </ds:schemaRefs>

</xml_diff>

<commit_message>
modulamos o mapa e adicionamos um video e mexemos nele
</commit_message>
<xml_diff>
--- a/Apostila/Projeto Space For Men.docx
+++ b/Apostila/Projeto Space For Men.docx
@@ -12163,21 +12163,7 @@
             <w:rStyle w:val="Hyperlink"/>
             <w:noProof/>
           </w:rPr>
-          <w:t>http://fonts.goog</w:t>
-        </w:r>
-        <w:r>
-          <w:rPr>
-            <w:rStyle w:val="Hyperlink"/>
-            <w:noProof/>
-          </w:rPr>
-          <w:t>l</w:t>
-        </w:r>
-        <w:r>
-          <w:rPr>
-            <w:rStyle w:val="Hyperlink"/>
-            <w:noProof/>
-          </w:rPr>
-          <w:t>e.com</w:t>
+          <w:t>http://fonts.google.com</w:t>
         </w:r>
       </w:hyperlink>
       <w:r>
@@ -12345,7 +12331,545 @@
           <w:noProof/>
         </w:rPr>
         <w:lastRenderedPageBreak/>
-        <w:t xml:space="preserve">95 </w:t>
+        <w:t>95 – Para inserir um mapa no site acessamos o google maps, digitamos na pesquisa o estabelecimento desejado, no nosso caso Barbearia Space For Me. Clique no campo de menu e “compartilhar ou incorporar mapa” e copie o link html.</w:t>
+      </w:r>
+    </w:p>
+    <w:p>
+      <w:pPr>
+        <w:rPr>
+          <w:noProof/>
+        </w:rPr>
+      </w:pPr>
+      <w:r>
+        <w:rPr>
+          <w:noProof/>
+        </w:rPr>
+        <w:drawing>
+          <wp:inline distT="0" distB="0" distL="0" distR="0" wp14:anchorId="337192D4" wp14:editId="271A9A18">
+            <wp:extent cx="2466975" cy="3331472"/>
+            <wp:effectExtent l="0" t="0" r="0" b="2540"/>
+            <wp:docPr id="176" name="Imagem 176"/>
+            <wp:cNvGraphicFramePr>
+              <a:graphicFrameLocks xmlns:a="http://schemas.openxmlformats.org/drawingml/2006/main" noChangeAspect="1"/>
+            </wp:cNvGraphicFramePr>
+            <a:graphic xmlns:a="http://schemas.openxmlformats.org/drawingml/2006/main">
+              <a:graphicData uri="http://schemas.openxmlformats.org/drawingml/2006/picture">
+                <pic:pic xmlns:pic="http://schemas.openxmlformats.org/drawingml/2006/picture">
+                  <pic:nvPicPr>
+                    <pic:cNvPr id="1" name=""/>
+                    <pic:cNvPicPr/>
+                  </pic:nvPicPr>
+                  <pic:blipFill>
+                    <a:blip r:embed="rId158"/>
+                    <a:stretch>
+                      <a:fillRect/>
+                    </a:stretch>
+                  </pic:blipFill>
+                  <pic:spPr>
+                    <a:xfrm>
+                      <a:off x="0" y="0"/>
+                      <a:ext cx="2475423" cy="3342881"/>
+                    </a:xfrm>
+                    <a:prstGeom prst="rect">
+                      <a:avLst/>
+                    </a:prstGeom>
+                  </pic:spPr>
+                </pic:pic>
+              </a:graphicData>
+            </a:graphic>
+          </wp:inline>
+        </w:drawing>
+      </w:r>
+    </w:p>
+    <w:p>
+      <w:pPr>
+        <w:rPr>
+          <w:noProof/>
+        </w:rPr>
+      </w:pPr>
+      <w:r>
+        <w:rPr>
+          <w:noProof/>
+        </w:rPr>
+        <w:t>96 – Para melhorar a visualização do nosso mapa no site colocamos para que ele ocupe 100% de largura e 300px de altura no “iframe”.</w:t>
+      </w:r>
+    </w:p>
+    <w:p>
+      <w:pPr>
+        <w:rPr>
+          <w:noProof/>
+        </w:rPr>
+      </w:pPr>
+      <w:r>
+        <w:rPr>
+          <w:noProof/>
+        </w:rPr>
+        <w:drawing>
+          <wp:inline distT="0" distB="0" distL="0" distR="0" wp14:anchorId="429664B5" wp14:editId="1EA2535D">
+            <wp:extent cx="5640070" cy="1171575"/>
+            <wp:effectExtent l="0" t="0" r="0" b="9525"/>
+            <wp:docPr id="177" name="Imagem 177"/>
+            <wp:cNvGraphicFramePr>
+              <a:graphicFrameLocks xmlns:a="http://schemas.openxmlformats.org/drawingml/2006/main" noChangeAspect="1"/>
+            </wp:cNvGraphicFramePr>
+            <a:graphic xmlns:a="http://schemas.openxmlformats.org/drawingml/2006/main">
+              <a:graphicData uri="http://schemas.openxmlformats.org/drawingml/2006/picture">
+                <pic:pic xmlns:pic="http://schemas.openxmlformats.org/drawingml/2006/picture">
+                  <pic:nvPicPr>
+                    <pic:cNvPr id="1" name=""/>
+                    <pic:cNvPicPr/>
+                  </pic:nvPicPr>
+                  <pic:blipFill>
+                    <a:blip r:embed="rId159"/>
+                    <a:stretch>
+                      <a:fillRect/>
+                    </a:stretch>
+                  </pic:blipFill>
+                  <pic:spPr>
+                    <a:xfrm>
+                      <a:off x="0" y="0"/>
+                      <a:ext cx="5656154" cy="1174916"/>
+                    </a:xfrm>
+                    <a:prstGeom prst="rect">
+                      <a:avLst/>
+                    </a:prstGeom>
+                  </pic:spPr>
+                </pic:pic>
+              </a:graphicData>
+            </a:graphic>
+          </wp:inline>
+        </w:drawing>
+      </w:r>
+    </w:p>
+    <w:p>
+      <w:pPr>
+        <w:rPr>
+          <w:noProof/>
+        </w:rPr>
+      </w:pPr>
+      <w:r>
+        <w:rPr>
+          <w:noProof/>
+        </w:rPr>
+        <w:t>97 – Para deixar a nossa “section” mapa de uma forma mais estilizada vamos dar um espaço interno para cima e para baixo de 3em e 0 do lados.</w:t>
+      </w:r>
+    </w:p>
+    <w:p>
+      <w:pPr>
+        <w:rPr>
+          <w:noProof/>
+        </w:rPr>
+      </w:pPr>
+      <w:r>
+        <w:rPr>
+          <w:noProof/>
+        </w:rPr>
+        <w:drawing>
+          <wp:inline distT="0" distB="0" distL="0" distR="0" wp14:anchorId="5464E7EE" wp14:editId="3E228ACD">
+            <wp:extent cx="2233687" cy="847725"/>
+            <wp:effectExtent l="0" t="0" r="0" b="0"/>
+            <wp:docPr id="178" name="Imagem 178"/>
+            <wp:cNvGraphicFramePr>
+              <a:graphicFrameLocks xmlns:a="http://schemas.openxmlformats.org/drawingml/2006/main" noChangeAspect="1"/>
+            </wp:cNvGraphicFramePr>
+            <a:graphic xmlns:a="http://schemas.openxmlformats.org/drawingml/2006/main">
+              <a:graphicData uri="http://schemas.openxmlformats.org/drawingml/2006/picture">
+                <pic:pic xmlns:pic="http://schemas.openxmlformats.org/drawingml/2006/picture">
+                  <pic:nvPicPr>
+                    <pic:cNvPr id="1" name=""/>
+                    <pic:cNvPicPr/>
+                  </pic:nvPicPr>
+                  <pic:blipFill>
+                    <a:blip r:embed="rId160"/>
+                    <a:stretch>
+                      <a:fillRect/>
+                    </a:stretch>
+                  </pic:blipFill>
+                  <pic:spPr>
+                    <a:xfrm>
+                      <a:off x="0" y="0"/>
+                      <a:ext cx="2242183" cy="850950"/>
+                    </a:xfrm>
+                    <a:prstGeom prst="rect">
+                      <a:avLst/>
+                    </a:prstGeom>
+                  </pic:spPr>
+                </pic:pic>
+              </a:graphicData>
+            </a:graphic>
+          </wp:inline>
+        </w:drawing>
+      </w:r>
+    </w:p>
+    <w:p>
+      <w:pPr>
+        <w:rPr>
+          <w:noProof/>
+        </w:rPr>
+      </w:pPr>
+      <w:r>
+        <w:rPr>
+          <w:noProof/>
+        </w:rPr>
+        <w:t>98 – Demos um espaço para baixo no paragrafo da “section” mapa e centralizamos o texto.</w:t>
+      </w:r>
+    </w:p>
+    <w:p>
+      <w:pPr>
+        <w:rPr>
+          <w:noProof/>
+        </w:rPr>
+      </w:pPr>
+      <w:r>
+        <w:rPr>
+          <w:noProof/>
+        </w:rPr>
+        <w:drawing>
+          <wp:inline distT="0" distB="0" distL="0" distR="0" wp14:anchorId="4E339F2E" wp14:editId="2D6E9735">
+            <wp:extent cx="1971675" cy="886732"/>
+            <wp:effectExtent l="0" t="0" r="0" b="8890"/>
+            <wp:docPr id="179" name="Imagem 179"/>
+            <wp:cNvGraphicFramePr>
+              <a:graphicFrameLocks xmlns:a="http://schemas.openxmlformats.org/drawingml/2006/main" noChangeAspect="1"/>
+            </wp:cNvGraphicFramePr>
+            <a:graphic xmlns:a="http://schemas.openxmlformats.org/drawingml/2006/main">
+              <a:graphicData uri="http://schemas.openxmlformats.org/drawingml/2006/picture">
+                <pic:pic xmlns:pic="http://schemas.openxmlformats.org/drawingml/2006/picture">
+                  <pic:nvPicPr>
+                    <pic:cNvPr id="1" name=""/>
+                    <pic:cNvPicPr/>
+                  </pic:nvPicPr>
+                  <pic:blipFill>
+                    <a:blip r:embed="rId161"/>
+                    <a:stretch>
+                      <a:fillRect/>
+                    </a:stretch>
+                  </pic:blipFill>
+                  <pic:spPr>
+                    <a:xfrm>
+                      <a:off x="0" y="0"/>
+                      <a:ext cx="1981192" cy="891012"/>
+                    </a:xfrm>
+                    <a:prstGeom prst="rect">
+                      <a:avLst/>
+                    </a:prstGeom>
+                  </pic:spPr>
+                </pic:pic>
+              </a:graphicData>
+            </a:graphic>
+          </wp:inline>
+        </w:drawing>
+      </w:r>
+    </w:p>
+    <w:p>
+      <w:pPr>
+        <w:rPr>
+          <w:noProof/>
+        </w:rPr>
+      </w:pPr>
+      <w:r>
+        <w:rPr>
+          <w:noProof/>
+        </w:rPr>
+        <w:lastRenderedPageBreak/>
+        <w:t>99 – Já que estamos mexendo com “iframe”, vamos aprender a incorporar um vídeo do Youtube.</w:t>
+      </w:r>
+    </w:p>
+    <w:p>
+      <w:r>
+        <w:rPr>
+          <w:noProof/>
+        </w:rPr>
+        <w:t>Vamos entrar no Youtube no seguinte endereço:</w:t>
+      </w:r>
+      <w:r>
+        <w:t xml:space="preserve"> </w:t>
+      </w:r>
+      <w:hyperlink r:id="rId162" w:history="1">
+        <w:proofErr w:type="spellStart"/>
+        <w:r>
+          <w:rPr>
+            <w:rStyle w:val="Hyperlink"/>
+          </w:rPr>
+          <w:t>Scissor</w:t>
+        </w:r>
+        <w:proofErr w:type="spellEnd"/>
+        <w:r>
+          <w:rPr>
+            <w:rStyle w:val="Hyperlink"/>
+          </w:rPr>
+          <w:t xml:space="preserve"> </w:t>
+        </w:r>
+        <w:proofErr w:type="spellStart"/>
+        <w:r>
+          <w:rPr>
+            <w:rStyle w:val="Hyperlink"/>
+          </w:rPr>
+          <w:t>Cut</w:t>
+        </w:r>
+        <w:proofErr w:type="spellEnd"/>
+        <w:r>
+          <w:rPr>
+            <w:rStyle w:val="Hyperlink"/>
+          </w:rPr>
+          <w:t xml:space="preserve"> Short Back </w:t>
+        </w:r>
+        <w:proofErr w:type="spellStart"/>
+        <w:r>
+          <w:rPr>
+            <w:rStyle w:val="Hyperlink"/>
+          </w:rPr>
+          <w:t>and</w:t>
+        </w:r>
+        <w:proofErr w:type="spellEnd"/>
+        <w:r>
+          <w:rPr>
+            <w:rStyle w:val="Hyperlink"/>
+          </w:rPr>
+          <w:t xml:space="preserve"> </w:t>
+        </w:r>
+        <w:proofErr w:type="spellStart"/>
+        <w:r>
+          <w:rPr>
+            <w:rStyle w:val="Hyperlink"/>
+          </w:rPr>
+          <w:t>Sides</w:t>
+        </w:r>
+        <w:proofErr w:type="spellEnd"/>
+        <w:r>
+          <w:rPr>
+            <w:rStyle w:val="Hyperlink"/>
+          </w:rPr>
+          <w:t xml:space="preserve"> </w:t>
+        </w:r>
+        <w:proofErr w:type="spellStart"/>
+        <w:r>
+          <w:rPr>
+            <w:rStyle w:val="Hyperlink"/>
+          </w:rPr>
+          <w:t>Men's</w:t>
+        </w:r>
+        <w:proofErr w:type="spellEnd"/>
+        <w:r>
+          <w:rPr>
+            <w:rStyle w:val="Hyperlink"/>
+          </w:rPr>
+          <w:t xml:space="preserve"> </w:t>
+        </w:r>
+        <w:proofErr w:type="spellStart"/>
+        <w:r>
+          <w:rPr>
+            <w:rStyle w:val="Hyperlink"/>
+          </w:rPr>
+          <w:t>Haircut</w:t>
+        </w:r>
+        <w:proofErr w:type="spellEnd"/>
+      </w:hyperlink>
+    </w:p>
+    <w:p>
+      <w:pPr>
+        <w:rPr>
+          <w:noProof/>
+        </w:rPr>
+      </w:pPr>
+      <w:r>
+        <w:rPr>
+          <w:noProof/>
+        </w:rPr>
+        <w:t>Na página do Youtube vai aparecer um campo chamado compartilhar ao clicar nesse campo vai aparecer ícone de tag &lt;&gt; para copiar o link e colar na página.</w:t>
+      </w:r>
+    </w:p>
+    <w:p>
+      <w:pPr>
+        <w:rPr>
+          <w:noProof/>
+        </w:rPr>
+      </w:pPr>
+      <w:r>
+        <w:rPr>
+          <w:noProof/>
+        </w:rPr>
+        <mc:AlternateContent>
+          <mc:Choice Requires="wps">
+            <w:drawing>
+              <wp:anchor distT="0" distB="0" distL="114300" distR="114300" simplePos="0" relativeHeight="251688960" behindDoc="0" locked="0" layoutInCell="1" allowOverlap="1" wp14:anchorId="06AB8A86" wp14:editId="7DEDE7FB">
+                <wp:simplePos x="0" y="0"/>
+                <wp:positionH relativeFrom="column">
+                  <wp:posOffset>91440</wp:posOffset>
+                </wp:positionH>
+                <wp:positionV relativeFrom="paragraph">
+                  <wp:posOffset>672465</wp:posOffset>
+                </wp:positionV>
+                <wp:extent cx="66675" cy="466725"/>
+                <wp:effectExtent l="19050" t="38100" r="66675" b="28575"/>
+                <wp:wrapNone/>
+                <wp:docPr id="181" name="Conector de Seta Reta 181"/>
+                <wp:cNvGraphicFramePr/>
+                <a:graphic xmlns:a="http://schemas.openxmlformats.org/drawingml/2006/main">
+                  <a:graphicData uri="http://schemas.microsoft.com/office/word/2010/wordprocessingShape">
+                    <wps:wsp>
+                      <wps:cNvCnPr/>
+                      <wps:spPr>
+                        <a:xfrm flipV="1">
+                          <a:off x="0" y="0"/>
+                          <a:ext cx="66675" cy="466725"/>
+                        </a:xfrm>
+                        <a:prstGeom prst="straightConnector1">
+                          <a:avLst/>
+                        </a:prstGeom>
+                        <a:ln>
+                          <a:solidFill>
+                            <a:srgbClr val="FF0000"/>
+                          </a:solidFill>
+                          <a:tailEnd type="triangle"/>
+                        </a:ln>
+                      </wps:spPr>
+                      <wps:style>
+                        <a:lnRef idx="1">
+                          <a:schemeClr val="accent1"/>
+                        </a:lnRef>
+                        <a:fillRef idx="0">
+                          <a:schemeClr val="accent1"/>
+                        </a:fillRef>
+                        <a:effectRef idx="0">
+                          <a:schemeClr val="accent1"/>
+                        </a:effectRef>
+                        <a:fontRef idx="minor">
+                          <a:schemeClr val="tx1"/>
+                        </a:fontRef>
+                      </wps:style>
+                      <wps:bodyPr/>
+                    </wps:wsp>
+                  </a:graphicData>
+                </a:graphic>
+              </wp:anchor>
+            </w:drawing>
+          </mc:Choice>
+          <mc:Fallback>
+            <w:pict>
+              <v:shapetype w14:anchorId="182D4D8C" id="_x0000_t32" coordsize="21600,21600" o:spt="32" o:oned="t" path="m,l21600,21600e" filled="f">
+                <v:path arrowok="t" fillok="f" o:connecttype="none"/>
+                <o:lock v:ext="edit" shapetype="t"/>
+              </v:shapetype>
+              <v:shape id="Conector de Seta Reta 181" o:spid="_x0000_s1026" type="#_x0000_t32" style="position:absolute;margin-left:7.2pt;margin-top:52.95pt;width:5.25pt;height:36.75pt;flip:y;z-index:251688960;visibility:visible;mso-wrap-style:square;mso-wrap-distance-left:9pt;mso-wrap-distance-top:0;mso-wrap-distance-right:9pt;mso-wrap-distance-bottom:0;mso-position-horizontal:absolute;mso-position-horizontal-relative:text;mso-position-vertical:absolute;mso-position-vertical-relative:text" o:gfxdata="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" strokecolor="red" strokeweight=".5pt">
+                <v:stroke endarrow="block" joinstyle="miter"/>
+              </v:shape>
+            </w:pict>
+          </mc:Fallback>
+        </mc:AlternateContent>
+      </w:r>
+      <w:r>
+        <w:rPr>
+          <w:noProof/>
+        </w:rPr>
+        <w:drawing>
+          <wp:inline distT="0" distB="0" distL="0" distR="0" wp14:anchorId="2AE975F5" wp14:editId="595EEF86">
+            <wp:extent cx="2089795" cy="1524000"/>
+            <wp:effectExtent l="0" t="0" r="5715" b="0"/>
+            <wp:docPr id="180" name="Imagem 180"/>
+            <wp:cNvGraphicFramePr>
+              <a:graphicFrameLocks xmlns:a="http://schemas.openxmlformats.org/drawingml/2006/main" noChangeAspect="1"/>
+            </wp:cNvGraphicFramePr>
+            <a:graphic xmlns:a="http://schemas.openxmlformats.org/drawingml/2006/main">
+              <a:graphicData uri="http://schemas.openxmlformats.org/drawingml/2006/picture">
+                <pic:pic xmlns:pic="http://schemas.openxmlformats.org/drawingml/2006/picture">
+                  <pic:nvPicPr>
+                    <pic:cNvPr id="1" name=""/>
+                    <pic:cNvPicPr/>
+                  </pic:nvPicPr>
+                  <pic:blipFill>
+                    <a:blip r:embed="rId163"/>
+                    <a:stretch>
+                      <a:fillRect/>
+                    </a:stretch>
+                  </pic:blipFill>
+                  <pic:spPr>
+                    <a:xfrm>
+                      <a:off x="0" y="0"/>
+                      <a:ext cx="2115807" cy="1542970"/>
+                    </a:xfrm>
+                    <a:prstGeom prst="rect">
+                      <a:avLst/>
+                    </a:prstGeom>
+                  </pic:spPr>
+                </pic:pic>
+              </a:graphicData>
+            </a:graphic>
+          </wp:inline>
+        </w:drawing>
+      </w:r>
+    </w:p>
+    <w:p>
+      <w:pPr>
+        <w:rPr>
+          <w:noProof/>
+        </w:rPr>
+      </w:pPr>
+      <w:r>
+        <w:rPr>
+          <w:noProof/>
+        </w:rPr>
+        <w:t>100 – Para trabalhar com o vídeo no “css” adicionamos uma “div” com uma class: “video” entorno do link.</w:t>
+      </w:r>
+    </w:p>
+    <w:p>
+      <w:pPr>
+        <w:rPr>
+          <w:noProof/>
+        </w:rPr>
+      </w:pPr>
+      <w:r>
+        <w:rPr>
+          <w:noProof/>
+        </w:rPr>
+        <w:drawing>
+          <wp:inline distT="0" distB="0" distL="0" distR="0" wp14:anchorId="2A17D860" wp14:editId="6FD4958B">
+            <wp:extent cx="5400040" cy="943610"/>
+            <wp:effectExtent l="0" t="0" r="0" b="8890"/>
+            <wp:docPr id="182" name="Imagem 182"/>
+            <wp:cNvGraphicFramePr>
+              <a:graphicFrameLocks xmlns:a="http://schemas.openxmlformats.org/drawingml/2006/main" noChangeAspect="1"/>
+            </wp:cNvGraphicFramePr>
+            <a:graphic xmlns:a="http://schemas.openxmlformats.org/drawingml/2006/main">
+              <a:graphicData uri="http://schemas.openxmlformats.org/drawingml/2006/picture">
+                <pic:pic xmlns:pic="http://schemas.openxmlformats.org/drawingml/2006/picture">
+                  <pic:nvPicPr>
+                    <pic:cNvPr id="1" name=""/>
+                    <pic:cNvPicPr/>
+                  </pic:nvPicPr>
+                  <pic:blipFill>
+                    <a:blip r:embed="rId164"/>
+                    <a:stretch>
+                      <a:fillRect/>
+                    </a:stretch>
+                  </pic:blipFill>
+                  <pic:spPr>
+                    <a:xfrm>
+                      <a:off x="0" y="0"/>
+                      <a:ext cx="5400040" cy="943610"/>
+                    </a:xfrm>
+                    <a:prstGeom prst="rect">
+                      <a:avLst/>
+                    </a:prstGeom>
+                  </pic:spPr>
+                </pic:pic>
+              </a:graphicData>
+            </a:graphic>
+          </wp:inline>
+        </w:drawing>
+      </w:r>
+    </w:p>
+    <w:p>
+      <w:pPr>
+        <w:rPr>
+          <w:noProof/>
+        </w:rPr>
+      </w:pPr>
+      <w:r>
+        <w:rPr>
+          <w:noProof/>
+        </w:rPr>
+        <w:t xml:space="preserve">101 </w:t>
       </w:r>
       <w:r>
         <w:rPr>
@@ -12363,13 +12887,145 @@
         <w:rPr>
           <w:noProof/>
         </w:rPr>
-        <w:t xml:space="preserve">Para inserir um mapa no site </w:t>
-      </w:r>
-      <w:r>
-        <w:rPr>
-          <w:noProof/>
-        </w:rPr>
-        <w:t>acessamos o google maps, digitamos na pesquisa o estabelecimento desejado, no nosso caso Barbearia Space For Me. Clique no campo de menu e “compartilhar ou incorporar mapa” e copie o link html.</w:t>
+        <w:t>No css</w:t>
+      </w:r>
+      <w:r>
+        <w:rPr>
+          <w:noProof/>
+        </w:rPr>
+        <w:t xml:space="preserve"> na class vídeo</w:t>
+      </w:r>
+      <w:r>
+        <w:rPr>
+          <w:noProof/>
+        </w:rPr>
+        <w:t xml:space="preserve"> vamos colocar uma largura para o video de 560px e vamos dar um espaço externo </w:t>
+      </w:r>
+      <w:r>
+        <w:rPr>
+          <w:noProof/>
+        </w:rPr>
+        <w:t>para cima e para baixo de “1em auto”.</w:t>
+      </w:r>
+    </w:p>
+    <w:p>
+      <w:pPr>
+        <w:rPr>
+          <w:noProof/>
+        </w:rPr>
+      </w:pPr>
+      <w:r>
+        <w:rPr>
+          <w:noProof/>
+        </w:rPr>
+        <w:drawing>
+          <wp:inline distT="0" distB="0" distL="0" distR="0" wp14:anchorId="42107839" wp14:editId="374916DC">
+            <wp:extent cx="1905266" cy="809738"/>
+            <wp:effectExtent l="0" t="0" r="0" b="9525"/>
+            <wp:docPr id="183" name="Imagem 183"/>
+            <wp:cNvGraphicFramePr>
+              <a:graphicFrameLocks xmlns:a="http://schemas.openxmlformats.org/drawingml/2006/main" noChangeAspect="1"/>
+            </wp:cNvGraphicFramePr>
+            <a:graphic xmlns:a="http://schemas.openxmlformats.org/drawingml/2006/main">
+              <a:graphicData uri="http://schemas.openxmlformats.org/drawingml/2006/picture">
+                <pic:pic xmlns:pic="http://schemas.openxmlformats.org/drawingml/2006/picture">
+                  <pic:nvPicPr>
+                    <pic:cNvPr id="1" name=""/>
+                    <pic:cNvPicPr/>
+                  </pic:nvPicPr>
+                  <pic:blipFill>
+                    <a:blip r:embed="rId165"/>
+                    <a:stretch>
+                      <a:fillRect/>
+                    </a:stretch>
+                  </pic:blipFill>
+                  <pic:spPr>
+                    <a:xfrm>
+                      <a:off x="0" y="0"/>
+                      <a:ext cx="1905266" cy="809738"/>
+                    </a:xfrm>
+                    <a:prstGeom prst="rect">
+                      <a:avLst/>
+                    </a:prstGeom>
+                  </pic:spPr>
+                </pic:pic>
+              </a:graphicData>
+            </a:graphic>
+          </wp:inline>
+        </w:drawing>
+      </w:r>
+    </w:p>
+    <w:p>
+      <w:pPr>
+        <w:rPr>
+          <w:noProof/>
+        </w:rPr>
+      </w:pPr>
+      <w:r>
+        <w:rPr>
+          <w:noProof/>
+        </w:rPr>
+        <w:t>102 – Criamos uma “div” com a class chamada “conteudo-beneficios” que envolve a lista e a imagem beneficios para trabalhar com o espaço entre elas.</w:t>
+      </w:r>
+    </w:p>
+    <w:p>
+      <w:pPr>
+        <w:rPr>
+          <w:noProof/>
+        </w:rPr>
+      </w:pPr>
+      <w:r>
+        <w:rPr>
+          <w:noProof/>
+        </w:rPr>
+        <w:drawing>
+          <wp:inline distT="0" distB="0" distL="0" distR="0" wp14:anchorId="4EA4777A" wp14:editId="07D98627">
+            <wp:extent cx="3676650" cy="1452675"/>
+            <wp:effectExtent l="0" t="0" r="0" b="0"/>
+            <wp:docPr id="184" name="Imagem 184"/>
+            <wp:cNvGraphicFramePr>
+              <a:graphicFrameLocks xmlns:a="http://schemas.openxmlformats.org/drawingml/2006/main" noChangeAspect="1"/>
+            </wp:cNvGraphicFramePr>
+            <a:graphic xmlns:a="http://schemas.openxmlformats.org/drawingml/2006/main">
+              <a:graphicData uri="http://schemas.openxmlformats.org/drawingml/2006/picture">
+                <pic:pic xmlns:pic="http://schemas.openxmlformats.org/drawingml/2006/picture">
+                  <pic:nvPicPr>
+                    <pic:cNvPr id="1" name=""/>
+                    <pic:cNvPicPr/>
+                  </pic:nvPicPr>
+                  <pic:blipFill>
+                    <a:blip r:embed="rId166"/>
+                    <a:stretch>
+                      <a:fillRect/>
+                    </a:stretch>
+                  </pic:blipFill>
+                  <pic:spPr>
+                    <a:xfrm>
+                      <a:off x="0" y="0"/>
+                      <a:ext cx="3695802" cy="1460242"/>
+                    </a:xfrm>
+                    <a:prstGeom prst="rect">
+                      <a:avLst/>
+                    </a:prstGeom>
+                  </pic:spPr>
+                </pic:pic>
+              </a:graphicData>
+            </a:graphic>
+          </wp:inline>
+        </w:drawing>
+      </w:r>
+    </w:p>
+    <w:p>
+      <w:pPr>
+        <w:rPr>
+          <w:noProof/>
+        </w:rPr>
+      </w:pPr>
+      <w:r>
+        <w:rPr>
+          <w:noProof/>
+        </w:rPr>
+        <w:t xml:space="preserve">103 - </w:t>
       </w:r>
       <w:bookmarkStart w:id="0" w:name="_GoBack"/>
       <w:bookmarkEnd w:id="0"/>
@@ -12380,46 +13036,6 @@
           <w:noProof/>
         </w:rPr>
       </w:pPr>
-      <w:r>
-        <w:rPr>
-          <w:noProof/>
-        </w:rPr>
-        <w:drawing>
-          <wp:inline distT="0" distB="0" distL="0" distR="0" wp14:anchorId="5C72DAA5" wp14:editId="149CA5FE">
-            <wp:extent cx="2095500" cy="2829821"/>
-            <wp:effectExtent l="0" t="0" r="0" b="8890"/>
-            <wp:docPr id="176" name="Imagem 176"/>
-            <wp:cNvGraphicFramePr>
-              <a:graphicFrameLocks xmlns:a="http://schemas.openxmlformats.org/drawingml/2006/main" noChangeAspect="1"/>
-            </wp:cNvGraphicFramePr>
-            <a:graphic xmlns:a="http://schemas.openxmlformats.org/drawingml/2006/main">
-              <a:graphicData uri="http://schemas.openxmlformats.org/drawingml/2006/picture">
-                <pic:pic xmlns:pic="http://schemas.openxmlformats.org/drawingml/2006/picture">
-                  <pic:nvPicPr>
-                    <pic:cNvPr id="1" name=""/>
-                    <pic:cNvPicPr/>
-                  </pic:nvPicPr>
-                  <pic:blipFill>
-                    <a:blip r:embed="rId158"/>
-                    <a:stretch>
-                      <a:fillRect/>
-                    </a:stretch>
-                  </pic:blipFill>
-                  <pic:spPr>
-                    <a:xfrm>
-                      <a:off x="0" y="0"/>
-                      <a:ext cx="2100443" cy="2836497"/>
-                    </a:xfrm>
-                    <a:prstGeom prst="rect">
-                      <a:avLst/>
-                    </a:prstGeom>
-                  </pic:spPr>
-                </pic:pic>
-              </a:graphicData>
-            </a:graphic>
-          </wp:inline>
-        </w:drawing>
-      </w:r>
     </w:p>
     <w:sectPr>
       <w:pgSz w:w="11906" w:h="16838"/>
@@ -13326,7 +13942,7 @@
 </file>
 
 <file path=customXml/itemProps1.xml><?xml version="1.0" encoding="utf-8"?>
-<ds:datastoreItem xmlns:ds="http://schemas.openxmlformats.org/officeDocument/2006/customXml" ds:itemID="{61E169EE-4C56-461E-855E-6FEC22E7C8B4}">
+<ds:datastoreItem xmlns:ds="http://schemas.openxmlformats.org/officeDocument/2006/customXml" ds:itemID="{1046FB92-339A-405F-A72F-B2C2A96AE9E6}">
   <ds:schemaRefs>
     <ds:schemaRef ds:uri="http://schemas.openxmlformats.org/officeDocument/2006/bibliography"/>
   </ds:schemaRefs>

</xml_diff>

<commit_message>
fizemos um degrade na pagina
</commit_message>
<xml_diff>
--- a/Apostila/Projeto Space For Men.docx
+++ b/Apostila/Projeto Space For Men.docx
@@ -13601,115 +13601,616 @@
         </w:rPr>
         <w:drawing>
           <wp:inline distT="0" distB="0" distL="0" distR="0" wp14:anchorId="66BBDDAC" wp14:editId="75B86239">
-            <wp:extent cx="1524213" cy="609685"/>
+            <wp:extent cx="1976120" cy="1066800"/>
+            <wp:effectExtent l="0" t="0" r="5080" b="0"/>
+            <wp:docPr id="197" name="Imagem 197"/>
+            <wp:cNvGraphicFramePr>
+              <a:graphicFrameLocks xmlns:a="http://schemas.openxmlformats.org/drawingml/2006/main" noChangeAspect="1"/>
+            </wp:cNvGraphicFramePr>
+            <a:graphic xmlns:a="http://schemas.openxmlformats.org/drawingml/2006/main">
+              <a:graphicData uri="http://schemas.openxmlformats.org/drawingml/2006/picture">
+                <pic:pic xmlns:pic="http://schemas.openxmlformats.org/drawingml/2006/picture">
+                  <pic:nvPicPr>
+                    <pic:cNvPr id="1" name=""/>
+                    <pic:cNvPicPr/>
+                  </pic:nvPicPr>
+                  <pic:blipFill>
+                    <a:blip r:embed="rId176"/>
+                    <a:stretch>
+                      <a:fillRect/>
+                    </a:stretch>
+                  </pic:blipFill>
+                  <pic:spPr>
+                    <a:xfrm>
+                      <a:off x="0" y="0"/>
+                      <a:ext cx="1978369" cy="1068014"/>
+                    </a:xfrm>
+                    <a:prstGeom prst="rect">
+                      <a:avLst/>
+                    </a:prstGeom>
+                  </pic:spPr>
+                </pic:pic>
+              </a:graphicData>
+            </a:graphic>
+          </wp:inline>
+        </w:drawing>
+      </w:r>
+    </w:p>
+    <w:p>
+      <w:pPr>
+        <w:rPr>
+          <w:noProof/>
+        </w:rPr>
+      </w:pPr>
+      <w:r>
+        <w:rPr>
+          <w:noProof/>
+        </w:rPr>
+        <w:t>109 – No div que contem a lista e a imagem benefícios demos uma largura e centralizamos o item( a lista e a imagem ) conforme imagem:</w:t>
+      </w:r>
+    </w:p>
+    <w:p>
+      <w:pPr>
+        <w:rPr>
+          <w:noProof/>
+        </w:rPr>
+      </w:pPr>
+      <w:r>
+        <w:rPr>
+          <w:noProof/>
+        </w:rPr>
+        <w:drawing>
+          <wp:inline distT="0" distB="0" distL="0" distR="0" wp14:anchorId="31F5FA5D" wp14:editId="430AED1B">
+            <wp:extent cx="1974850" cy="1143000"/>
+            <wp:effectExtent l="0" t="0" r="6350" b="0"/>
+            <wp:docPr id="196" name="Imagem 196"/>
+            <wp:cNvGraphicFramePr>
+              <a:graphicFrameLocks xmlns:a="http://schemas.openxmlformats.org/drawingml/2006/main" noChangeAspect="1"/>
+            </wp:cNvGraphicFramePr>
+            <a:graphic xmlns:a="http://schemas.openxmlformats.org/drawingml/2006/main">
+              <a:graphicData uri="http://schemas.openxmlformats.org/drawingml/2006/picture">
+                <pic:pic xmlns:pic="http://schemas.openxmlformats.org/drawingml/2006/picture">
+                  <pic:nvPicPr>
+                    <pic:cNvPr id="1" name=""/>
+                    <pic:cNvPicPr/>
+                  </pic:nvPicPr>
+                  <pic:blipFill>
+                    <a:blip r:embed="rId177"/>
+                    <a:stretch>
+                      <a:fillRect/>
+                    </a:stretch>
+                  </pic:blipFill>
+                  <pic:spPr>
+                    <a:xfrm>
+                      <a:off x="0" y="0"/>
+                      <a:ext cx="1982701" cy="1147544"/>
+                    </a:xfrm>
+                    <a:prstGeom prst="rect">
+                      <a:avLst/>
+                    </a:prstGeom>
+                  </pic:spPr>
+                </pic:pic>
+              </a:graphicData>
+            </a:graphic>
+          </wp:inline>
+        </w:drawing>
+      </w:r>
+    </w:p>
+    <w:p>
+      <w:pPr>
+        <w:rPr>
+          <w:noProof/>
+        </w:rPr>
+      </w:pPr>
+      <w:r>
+        <w:rPr>
+          <w:noProof/>
+        </w:rPr>
+        <w:t xml:space="preserve">110 </w:t>
+      </w:r>
+      <w:r>
+        <w:rPr>
+          <w:noProof/>
+        </w:rPr>
+        <w:t>–</w:t>
+      </w:r>
+      <w:r>
+        <w:rPr>
+          <w:noProof/>
+        </w:rPr>
+        <w:t xml:space="preserve"> </w:t>
+      </w:r>
+      <w:r>
+        <w:rPr>
+          <w:noProof/>
+        </w:rPr>
+        <w:t>Aumentamos o espaço interno da section proicipal e adicionamos uma cor de fundo para fazer um degrade ou seja, é área onde dias ou mais cores são sobrepostas.</w:t>
+      </w:r>
+    </w:p>
+    <w:p>
+      <w:pPr>
+        <w:rPr>
+          <w:noProof/>
+        </w:rPr>
+      </w:pPr>
+      <w:r>
+        <w:rPr>
+          <w:noProof/>
+        </w:rPr>
+        <w:drawing>
+          <wp:inline distT="0" distB="0" distL="0" distR="0" wp14:anchorId="6CE9676E" wp14:editId="7BBCF06F">
+            <wp:extent cx="2815590" cy="981075"/>
+            <wp:effectExtent l="0" t="0" r="3810" b="9525"/>
+            <wp:docPr id="186" name="Imagem 186"/>
+            <wp:cNvGraphicFramePr>
+              <a:graphicFrameLocks xmlns:a="http://schemas.openxmlformats.org/drawingml/2006/main" noChangeAspect="1"/>
+            </wp:cNvGraphicFramePr>
+            <a:graphic xmlns:a="http://schemas.openxmlformats.org/drawingml/2006/main">
+              <a:graphicData uri="http://schemas.openxmlformats.org/drawingml/2006/picture">
+                <pic:pic xmlns:pic="http://schemas.openxmlformats.org/drawingml/2006/picture">
+                  <pic:nvPicPr>
+                    <pic:cNvPr id="1" name=""/>
+                    <pic:cNvPicPr/>
+                  </pic:nvPicPr>
+                  <pic:blipFill>
+                    <a:blip r:embed="rId178"/>
+                    <a:stretch>
+                      <a:fillRect/>
+                    </a:stretch>
+                  </pic:blipFill>
+                  <pic:spPr>
+                    <a:xfrm>
+                      <a:off x="0" y="0"/>
+                      <a:ext cx="2824447" cy="984161"/>
+                    </a:xfrm>
+                    <a:prstGeom prst="rect">
+                      <a:avLst/>
+                    </a:prstGeom>
+                  </pic:spPr>
+                </pic:pic>
+              </a:graphicData>
+            </a:graphic>
+          </wp:inline>
+        </w:drawing>
+      </w:r>
+    </w:p>
+    <w:p>
+      <w:pPr>
+        <w:rPr>
+          <w:noProof/>
+        </w:rPr>
+      </w:pPr>
+      <w:r>
+        <w:rPr>
+          <w:noProof/>
+        </w:rPr>
+        <w:t xml:space="preserve">111 </w:t>
+      </w:r>
+      <w:r>
+        <w:rPr>
+          <w:noProof/>
+        </w:rPr>
+        <w:t>–</w:t>
+      </w:r>
+      <w:r>
+        <w:rPr>
+          <w:noProof/>
+        </w:rPr>
+        <w:t xml:space="preserve"> </w:t>
+      </w:r>
+      <w:r>
+        <w:rPr>
+          <w:noProof/>
+        </w:rPr>
+        <w:t>Colocamos uma cor  de fundo na section benefícios para realizar o nosso degrade.</w:t>
+      </w:r>
+    </w:p>
+    <w:p>
+      <w:pPr>
+        <w:rPr>
+          <w:noProof/>
+        </w:rPr>
+      </w:pPr>
+      <w:r>
+        <w:rPr>
+          <w:noProof/>
+        </w:rPr>
+        <w:drawing>
+          <wp:inline distT="0" distB="0" distL="0" distR="0" wp14:anchorId="111E37E3" wp14:editId="25A76C4D">
+            <wp:extent cx="2767330" cy="952500"/>
             <wp:effectExtent l="0" t="0" r="0" b="0"/>
-            <wp:docPr id="197" name="Imagem 197"/>
-            <wp:cNvGraphicFramePr>
-              <a:graphicFrameLocks xmlns:a="http://schemas.openxmlformats.org/drawingml/2006/main" noChangeAspect="1"/>
-            </wp:cNvGraphicFramePr>
-            <a:graphic xmlns:a="http://schemas.openxmlformats.org/drawingml/2006/main">
-              <a:graphicData uri="http://schemas.openxmlformats.org/drawingml/2006/picture">
-                <pic:pic xmlns:pic="http://schemas.openxmlformats.org/drawingml/2006/picture">
-                  <pic:nvPicPr>
-                    <pic:cNvPr id="1" name=""/>
-                    <pic:cNvPicPr/>
-                  </pic:nvPicPr>
-                  <pic:blipFill>
-                    <a:blip r:embed="rId176"/>
-                    <a:stretch>
-                      <a:fillRect/>
-                    </a:stretch>
-                  </pic:blipFill>
-                  <pic:spPr>
-                    <a:xfrm>
-                      <a:off x="0" y="0"/>
-                      <a:ext cx="1524213" cy="609685"/>
-                    </a:xfrm>
-                    <a:prstGeom prst="rect">
-                      <a:avLst/>
-                    </a:prstGeom>
-                  </pic:spPr>
-                </pic:pic>
-              </a:graphicData>
-            </a:graphic>
-          </wp:inline>
-        </w:drawing>
-      </w:r>
-    </w:p>
-    <w:p>
-      <w:pPr>
-        <w:rPr>
-          <w:noProof/>
-        </w:rPr>
-      </w:pPr>
-      <w:r>
-        <w:rPr>
-          <w:noProof/>
-        </w:rPr>
-        <w:t>109 – No div que contem a lista e a imagem benefícios demos uma largura e centralizamos o item( a lista e a imagem ) conforme imagem:</w:t>
-      </w:r>
-    </w:p>
-    <w:p>
-      <w:pPr>
-        <w:rPr>
-          <w:noProof/>
-        </w:rPr>
-      </w:pPr>
-      <w:r>
-        <w:rPr>
-          <w:noProof/>
-        </w:rPr>
-        <w:drawing>
-          <wp:inline distT="0" distB="0" distL="0" distR="0" wp14:anchorId="31F5FA5D" wp14:editId="430AED1B">
-            <wp:extent cx="1714739" cy="876422"/>
+            <wp:docPr id="194" name="Imagem 194"/>
+            <wp:cNvGraphicFramePr>
+              <a:graphicFrameLocks xmlns:a="http://schemas.openxmlformats.org/drawingml/2006/main" noChangeAspect="1"/>
+            </wp:cNvGraphicFramePr>
+            <a:graphic xmlns:a="http://schemas.openxmlformats.org/drawingml/2006/main">
+              <a:graphicData uri="http://schemas.openxmlformats.org/drawingml/2006/picture">
+                <pic:pic xmlns:pic="http://schemas.openxmlformats.org/drawingml/2006/picture">
+                  <pic:nvPicPr>
+                    <pic:cNvPr id="1" name=""/>
+                    <pic:cNvPicPr/>
+                  </pic:nvPicPr>
+                  <pic:blipFill>
+                    <a:blip r:embed="rId179"/>
+                    <a:stretch>
+                      <a:fillRect/>
+                    </a:stretch>
+                  </pic:blipFill>
+                  <pic:spPr>
+                    <a:xfrm>
+                      <a:off x="0" y="0"/>
+                      <a:ext cx="2788571" cy="959811"/>
+                    </a:xfrm>
+                    <a:prstGeom prst="rect">
+                      <a:avLst/>
+                    </a:prstGeom>
+                  </pic:spPr>
+                </pic:pic>
+              </a:graphicData>
+            </a:graphic>
+          </wp:inline>
+        </w:drawing>
+      </w:r>
+    </w:p>
+    <w:p>
+      <w:pPr>
+        <w:rPr>
+          <w:noProof/>
+        </w:rPr>
+      </w:pPr>
+      <w:r>
+        <w:rPr>
+          <w:noProof/>
+        </w:rPr>
+        <w:t xml:space="preserve">112 </w:t>
+      </w:r>
+      <w:r>
+        <w:rPr>
+          <w:noProof/>
+        </w:rPr>
+        <w:t>–</w:t>
+      </w:r>
+      <w:r>
+        <w:rPr>
+          <w:noProof/>
+        </w:rPr>
+        <w:t xml:space="preserve"> </w:t>
+      </w:r>
+      <w:r>
+        <w:rPr>
+          <w:noProof/>
+        </w:rPr>
+        <w:t xml:space="preserve">Para fazer o degrade tiramos o </w:t>
+      </w:r>
+      <w:r>
+        <w:rPr>
+          <w:noProof/>
+        </w:rPr>
+        <w:t>“</w:t>
+      </w:r>
+      <w:r>
+        <w:rPr>
+          <w:noProof/>
+        </w:rPr>
+        <w:t>main</w:t>
+      </w:r>
+      <w:r>
+        <w:rPr>
+          <w:noProof/>
+        </w:rPr>
+        <w:t>”</w:t>
+      </w:r>
+      <w:r>
+        <w:rPr>
+          <w:noProof/>
+        </w:rPr>
+        <w:t xml:space="preserve"> que estava configurado para a largura de 940px e centralizando os elementos em </w:t>
+      </w:r>
+      <w:r>
+        <w:rPr>
+          <w:noProof/>
+        </w:rPr>
+        <w:t>“</w:t>
+      </w:r>
+      <w:r>
+        <w:rPr>
+          <w:noProof/>
+        </w:rPr>
+        <w:t>margin: 0 auto</w:t>
+      </w:r>
+      <w:r>
+        <w:rPr>
+          <w:noProof/>
+        </w:rPr>
+        <w:t>;” como ao cor de fundo na “section” que estava dentro do “main” as cores ficavam centralizadas. Para resolver colocamos o “margin: 0 auto;” e “width: 940px;” na “section” principal e na “section” mapa e na “section” beneficios.</w:t>
+      </w:r>
+      <w:r>
+        <w:rPr>
+          <w:noProof/>
+        </w:rPr>
+        <w:t xml:space="preserve"> </w:t>
+      </w:r>
+    </w:p>
+    <w:p>
+      <w:pPr>
+        <w:rPr>
+          <w:noProof/>
+        </w:rPr>
+      </w:pPr>
+      <w:r>
+        <w:rPr>
+          <w:noProof/>
+        </w:rPr>
+        <w:t>Na class .mapa colocamos o degrade para fazer essas cores sobrepostas porque o mapa esta na section principal e a beneficios onde queremos fazer o degrade.</w:t>
+      </w:r>
+    </w:p>
+    <w:p>
+      <w:pPr>
+        <w:rPr>
+          <w:noProof/>
+        </w:rPr>
+      </w:pPr>
+      <w:r>
+        <w:rPr>
+          <w:noProof/>
+        </w:rPr>
+        <w:drawing>
+          <wp:inline distT="0" distB="0" distL="0" distR="0" wp14:anchorId="5B628B4B" wp14:editId="414B772D">
+            <wp:extent cx="2409825" cy="1105112"/>
             <wp:effectExtent l="0" t="0" r="0" b="0"/>
-            <wp:docPr id="196" name="Imagem 196"/>
-            <wp:cNvGraphicFramePr>
-              <a:graphicFrameLocks xmlns:a="http://schemas.openxmlformats.org/drawingml/2006/main" noChangeAspect="1"/>
-            </wp:cNvGraphicFramePr>
-            <a:graphic xmlns:a="http://schemas.openxmlformats.org/drawingml/2006/main">
-              <a:graphicData uri="http://schemas.openxmlformats.org/drawingml/2006/picture">
-                <pic:pic xmlns:pic="http://schemas.openxmlformats.org/drawingml/2006/picture">
-                  <pic:nvPicPr>
-                    <pic:cNvPr id="1" name=""/>
-                    <pic:cNvPicPr/>
-                  </pic:nvPicPr>
-                  <pic:blipFill>
-                    <a:blip r:embed="rId177"/>
-                    <a:stretch>
-                      <a:fillRect/>
-                    </a:stretch>
-                  </pic:blipFill>
-                  <pic:spPr>
-                    <a:xfrm>
-                      <a:off x="0" y="0"/>
-                      <a:ext cx="1714739" cy="876422"/>
-                    </a:xfrm>
-                    <a:prstGeom prst="rect">
-                      <a:avLst/>
-                    </a:prstGeom>
-                  </pic:spPr>
-                </pic:pic>
-              </a:graphicData>
-            </a:graphic>
-          </wp:inline>
-        </w:drawing>
-      </w:r>
-    </w:p>
-    <w:p>
-      <w:pPr>
-        <w:rPr>
-          <w:noProof/>
-        </w:rPr>
-      </w:pPr>
-      <w:r>
-        <w:rPr>
-          <w:noProof/>
-        </w:rPr>
-        <w:t xml:space="preserve">110 - </w:t>
+            <wp:docPr id="195" name="Imagem 195"/>
+            <wp:cNvGraphicFramePr>
+              <a:graphicFrameLocks xmlns:a="http://schemas.openxmlformats.org/drawingml/2006/main" noChangeAspect="1"/>
+            </wp:cNvGraphicFramePr>
+            <a:graphic xmlns:a="http://schemas.openxmlformats.org/drawingml/2006/main">
+              <a:graphicData uri="http://schemas.openxmlformats.org/drawingml/2006/picture">
+                <pic:pic xmlns:pic="http://schemas.openxmlformats.org/drawingml/2006/picture">
+                  <pic:nvPicPr>
+                    <pic:cNvPr id="1" name=""/>
+                    <pic:cNvPicPr/>
+                  </pic:nvPicPr>
+                  <pic:blipFill>
+                    <a:blip r:embed="rId180"/>
+                    <a:stretch>
+                      <a:fillRect/>
+                    </a:stretch>
+                  </pic:blipFill>
+                  <pic:spPr>
+                    <a:xfrm>
+                      <a:off x="0" y="0"/>
+                      <a:ext cx="2504894" cy="1148709"/>
+                    </a:xfrm>
+                    <a:prstGeom prst="rect">
+                      <a:avLst/>
+                    </a:prstGeom>
+                  </pic:spPr>
+                </pic:pic>
+              </a:graphicData>
+            </a:graphic>
+          </wp:inline>
+        </w:drawing>
+      </w:r>
+      <w:r>
+        <w:rPr>
+          <w:noProof/>
+        </w:rPr>
+        <w:drawing>
+          <wp:inline distT="0" distB="0" distL="0" distR="0" wp14:anchorId="5746E34D" wp14:editId="558AEBF8">
+            <wp:extent cx="2471468" cy="1095375"/>
+            <wp:effectExtent l="0" t="0" r="5080" b="0"/>
+            <wp:docPr id="200" name="Imagem 200"/>
+            <wp:cNvGraphicFramePr>
+              <a:graphicFrameLocks xmlns:a="http://schemas.openxmlformats.org/drawingml/2006/main" noChangeAspect="1"/>
+            </wp:cNvGraphicFramePr>
+            <a:graphic xmlns:a="http://schemas.openxmlformats.org/drawingml/2006/main">
+              <a:graphicData uri="http://schemas.openxmlformats.org/drawingml/2006/picture">
+                <pic:pic xmlns:pic="http://schemas.openxmlformats.org/drawingml/2006/picture">
+                  <pic:nvPicPr>
+                    <pic:cNvPr id="1" name=""/>
+                    <pic:cNvPicPr/>
+                  </pic:nvPicPr>
+                  <pic:blipFill>
+                    <a:blip r:embed="rId181"/>
+                    <a:stretch>
+                      <a:fillRect/>
+                    </a:stretch>
+                  </pic:blipFill>
+                  <pic:spPr>
+                    <a:xfrm>
+                      <a:off x="0" y="0"/>
+                      <a:ext cx="2595179" cy="1150205"/>
+                    </a:xfrm>
+                    <a:prstGeom prst="rect">
+                      <a:avLst/>
+                    </a:prstGeom>
+                  </pic:spPr>
+                </pic:pic>
+              </a:graphicData>
+            </a:graphic>
+          </wp:inline>
+        </w:drawing>
+      </w:r>
+    </w:p>
+    <w:p>
+      <w:pPr>
+        <w:rPr>
+          <w:noProof/>
+        </w:rPr>
+      </w:pPr>
+      <w:r>
+        <w:rPr>
+          <w:noProof/>
+        </w:rPr>
+        <w:lastRenderedPageBreak/>
+        <w:t xml:space="preserve">113 - </w:t>
+      </w:r>
+      <w:r>
+        <w:rPr>
+          <w:noProof/>
+        </w:rPr>
+        <w:t>Ao fazer isso também percebemos que o mapa não ficou centralizado para isso criamos uma “div” que envolve o mapa chamada mapa conteudo que também colocamos “width: 940px;” e “margin: 0 auto;”.</w:t>
+      </w:r>
+    </w:p>
+    <w:p>
+      <w:pPr>
+        <w:rPr>
+          <w:noProof/>
+        </w:rPr>
+      </w:pPr>
+      <w:r>
+        <w:rPr>
+          <w:noProof/>
+        </w:rPr>
+        <w:t xml:space="preserve"> </w:t>
+      </w:r>
+      <w:r>
+        <w:rPr>
+          <w:noProof/>
+        </w:rPr>
+        <w:drawing>
+          <wp:inline distT="0" distB="0" distL="0" distR="0" wp14:anchorId="54C4ADD3" wp14:editId="184D65BA">
+            <wp:extent cx="3241040" cy="895267"/>
+            <wp:effectExtent l="0" t="0" r="0" b="635"/>
+            <wp:docPr id="198" name="Imagem 198"/>
+            <wp:cNvGraphicFramePr>
+              <a:graphicFrameLocks xmlns:a="http://schemas.openxmlformats.org/drawingml/2006/main" noChangeAspect="1"/>
+            </wp:cNvGraphicFramePr>
+            <a:graphic xmlns:a="http://schemas.openxmlformats.org/drawingml/2006/main">
+              <a:graphicData uri="http://schemas.openxmlformats.org/drawingml/2006/picture">
+                <pic:pic xmlns:pic="http://schemas.openxmlformats.org/drawingml/2006/picture">
+                  <pic:nvPicPr>
+                    <pic:cNvPr id="1" name=""/>
+                    <pic:cNvPicPr/>
+                  </pic:nvPicPr>
+                  <pic:blipFill>
+                    <a:blip r:embed="rId182"/>
+                    <a:stretch>
+                      <a:fillRect/>
+                    </a:stretch>
+                  </pic:blipFill>
+                  <pic:spPr>
+                    <a:xfrm>
+                      <a:off x="0" y="0"/>
+                      <a:ext cx="3460682" cy="955938"/>
+                    </a:xfrm>
+                    <a:prstGeom prst="rect">
+                      <a:avLst/>
+                    </a:prstGeom>
+                  </pic:spPr>
+                </pic:pic>
+              </a:graphicData>
+            </a:graphic>
+          </wp:inline>
+        </w:drawing>
+      </w:r>
+      <w:r>
+        <w:rPr>
+          <w:noProof/>
+        </w:rPr>
+        <w:t xml:space="preserve"> </w:t>
+      </w:r>
+      <w:r>
+        <w:rPr>
+          <w:noProof/>
+        </w:rPr>
+        <w:drawing>
+          <wp:inline distT="0" distB="0" distL="0" distR="0" wp14:anchorId="49078485" wp14:editId="06A106FC">
+            <wp:extent cx="1505160" cy="885949"/>
+            <wp:effectExtent l="0" t="0" r="0" b="9525"/>
+            <wp:docPr id="201" name="Imagem 201"/>
+            <wp:cNvGraphicFramePr>
+              <a:graphicFrameLocks xmlns:a="http://schemas.openxmlformats.org/drawingml/2006/main" noChangeAspect="1"/>
+            </wp:cNvGraphicFramePr>
+            <a:graphic xmlns:a="http://schemas.openxmlformats.org/drawingml/2006/main">
+              <a:graphicData uri="http://schemas.openxmlformats.org/drawingml/2006/picture">
+                <pic:pic xmlns:pic="http://schemas.openxmlformats.org/drawingml/2006/picture">
+                  <pic:nvPicPr>
+                    <pic:cNvPr id="1" name=""/>
+                    <pic:cNvPicPr/>
+                  </pic:nvPicPr>
+                  <pic:blipFill>
+                    <a:blip r:embed="rId183"/>
+                    <a:stretch>
+                      <a:fillRect/>
+                    </a:stretch>
+                  </pic:blipFill>
+                  <pic:spPr>
+                    <a:xfrm>
+                      <a:off x="0" y="0"/>
+                      <a:ext cx="1505160" cy="885949"/>
+                    </a:xfrm>
+                    <a:prstGeom prst="rect">
+                      <a:avLst/>
+                    </a:prstGeom>
+                  </pic:spPr>
+                </pic:pic>
+              </a:graphicData>
+            </a:graphic>
+          </wp:inline>
+        </w:drawing>
+      </w:r>
+      <w:r>
+        <w:rPr>
+          <w:noProof/>
+        </w:rPr>
+        <w:drawing>
+          <wp:inline distT="0" distB="0" distL="0" distR="0" wp14:anchorId="7DE8B9C7" wp14:editId="642BF06A">
+            <wp:extent cx="4819650" cy="875665"/>
+            <wp:effectExtent l="0" t="0" r="0" b="635"/>
+            <wp:docPr id="199" name="Imagem 199"/>
+            <wp:cNvGraphicFramePr>
+              <a:graphicFrameLocks xmlns:a="http://schemas.openxmlformats.org/drawingml/2006/main" noChangeAspect="1"/>
+            </wp:cNvGraphicFramePr>
+            <a:graphic xmlns:a="http://schemas.openxmlformats.org/drawingml/2006/main">
+              <a:graphicData uri="http://schemas.openxmlformats.org/drawingml/2006/picture">
+                <pic:pic xmlns:pic="http://schemas.openxmlformats.org/drawingml/2006/picture">
+                  <pic:nvPicPr>
+                    <pic:cNvPr id="1" name=""/>
+                    <pic:cNvPicPr/>
+                  </pic:nvPicPr>
+                  <pic:blipFill>
+                    <a:blip r:embed="rId184"/>
+                    <a:stretch>
+                      <a:fillRect/>
+                    </a:stretch>
+                  </pic:blipFill>
+                  <pic:spPr>
+                    <a:xfrm>
+                      <a:off x="0" y="0"/>
+                      <a:ext cx="5103128" cy="927169"/>
+                    </a:xfrm>
+                    <a:prstGeom prst="rect">
+                      <a:avLst/>
+                    </a:prstGeom>
+                  </pic:spPr>
+                </pic:pic>
+              </a:graphicData>
+            </a:graphic>
+          </wp:inline>
+        </w:drawing>
+      </w:r>
+    </w:p>
+    <w:p>
+      <w:pPr>
+        <w:rPr>
+          <w:noProof/>
+        </w:rPr>
+      </w:pPr>
+      <w:r>
+        <w:rPr>
+          <w:noProof/>
+        </w:rPr>
+        <w:t xml:space="preserve">114 - </w:t>
       </w:r>
       <w:bookmarkStart w:id="0" w:name="_GoBack"/>
       <w:bookmarkEnd w:id="0"/>
+    </w:p>
+    <w:p>
+      <w:pPr>
+        <w:rPr>
+          <w:noProof/>
+        </w:rPr>
+      </w:pPr>
     </w:p>
     <w:p>
       <w:pPr>
@@ -14623,7 +15124,7 @@
 </file>
 
 <file path=customXml/itemProps1.xml><?xml version="1.0" encoding="utf-8"?>
-<ds:datastoreItem xmlns:ds="http://schemas.openxmlformats.org/officeDocument/2006/customXml" ds:itemID="{6C65EA5E-BA3C-4587-9977-7430858B2420}">
+<ds:datastoreItem xmlns:ds="http://schemas.openxmlformats.org/officeDocument/2006/customXml" ds:itemID="{8BEE509B-C613-4BB7-9EAE-AA54FDAD6CAE}">
   <ds:schemaRefs>
     <ds:schemaRef ds:uri="http://schemas.openxmlformats.org/officeDocument/2006/bibliography"/>
   </ds:schemaRefs>

</xml_diff>

<commit_message>
aprendemos mais sobre degrade, colocamos opacidade e sombra na imagem beneficios
</commit_message>
<xml_diff>
--- a/Apostila/Projeto Space For Men.docx
+++ b/Apostila/Projeto Space For Men.docx
@@ -14200,24 +14200,809 @@
         <w:rPr>
           <w:noProof/>
         </w:rPr>
-        <w:t xml:space="preserve">114 - </w:t>
+        <w:t xml:space="preserve">114 </w:t>
+      </w:r>
+      <w:r>
+        <w:rPr>
+          <w:noProof/>
+        </w:rPr>
+        <w:t>–</w:t>
+      </w:r>
+      <w:r>
+        <w:rPr>
+          <w:noProof/>
+        </w:rPr>
+        <w:t xml:space="preserve"> </w:t>
+      </w:r>
+      <w:r>
+        <w:rPr>
+          <w:noProof/>
+        </w:rPr>
+        <w:t>Testamos o degrade de diversos tipos, com mais de tres cores usando:</w:t>
+      </w:r>
+    </w:p>
+    <w:p>
+      <w:pPr>
+        <w:pStyle w:val="PargrafodaLista"/>
+        <w:numPr>
+          <w:ilvl w:val="0"/>
+          <w:numId w:val="1"/>
+        </w:numPr>
+        <w:rPr>
+          <w:noProof/>
+        </w:rPr>
+      </w:pPr>
+      <w:r>
+        <w:rPr>
+          <w:noProof/>
+        </w:rPr>
+        <w:t>Background: linear-gradient(red, orange, blue, black);</w:t>
+      </w:r>
+    </w:p>
+    <w:p>
+      <w:pPr>
+        <w:pStyle w:val="PargrafodaLista"/>
+        <w:numPr>
+          <w:ilvl w:val="0"/>
+          <w:numId w:val="1"/>
+        </w:numPr>
+        <w:rPr>
+          <w:noProof/>
+        </w:rPr>
+      </w:pPr>
+      <w:r>
+        <w:rPr>
+          <w:noProof/>
+        </w:rPr>
+        <w:t>Colocamos em graus(45deg, red, orange, blue, black);</w:t>
+      </w:r>
+    </w:p>
+    <w:p>
+      <w:pPr>
+        <w:pStyle w:val="PargrafodaLista"/>
+        <w:numPr>
+          <w:ilvl w:val="0"/>
+          <w:numId w:val="1"/>
+        </w:numPr>
+        <w:rPr>
+          <w:noProof/>
+        </w:rPr>
+      </w:pPr>
+      <w:r>
+        <w:rPr>
+          <w:noProof/>
+        </w:rPr>
+        <w:t>Utilizamos porcentagem para cada cor, exemplo(orange 50%, red, blue, black)</w:t>
+      </w:r>
+    </w:p>
+    <w:p>
+      <w:pPr>
+        <w:pStyle w:val="PargrafodaLista"/>
+        <w:numPr>
+          <w:ilvl w:val="0"/>
+          <w:numId w:val="1"/>
+        </w:numPr>
+        <w:rPr>
+          <w:noProof/>
+        </w:rPr>
+      </w:pPr>
+      <w:r>
+        <w:rPr>
+          <w:noProof/>
+        </w:rPr>
+        <w:t>E também podemos utilizar o degrade em circulos: background:radial-gradient();</w:t>
+      </w:r>
+    </w:p>
+    <w:p>
+      <w:pPr>
+        <w:rPr>
+          <w:b/>
+          <w:noProof/>
+        </w:rPr>
+      </w:pPr>
+      <w:r>
+        <w:rPr>
+          <w:noProof/>
+        </w:rPr>
+        <w:t xml:space="preserve">115 </w:t>
+      </w:r>
+      <w:r>
+        <w:rPr>
+          <w:noProof/>
+        </w:rPr>
+        <w:t>–</w:t>
+      </w:r>
+      <w:r>
+        <w:rPr>
+          <w:noProof/>
+        </w:rPr>
+        <w:t xml:space="preserve"> </w:t>
+      </w:r>
+      <w:r>
+        <w:rPr>
+          <w:b/>
+          <w:noProof/>
+        </w:rPr>
+        <w:t>Opacidade e Sombra</w:t>
+      </w:r>
+    </w:p>
+    <w:p>
+      <w:pPr>
+        <w:rPr>
+          <w:noProof/>
+        </w:rPr>
+      </w:pPr>
+      <w:r>
+        <w:rPr>
+          <w:noProof/>
+        </w:rPr>
+        <w:t>O que é opacidade?</w:t>
+      </w:r>
+    </w:p>
+    <w:p>
+      <w:pPr>
+        <w:rPr>
+          <w:noProof/>
+        </w:rPr>
+      </w:pPr>
+      <w:r>
+        <w:rPr>
+          <w:noProof/>
+        </w:rPr>
+        <w:t>É uma camada a mais que coloca em cima do elemento.</w:t>
+      </w:r>
+    </w:p>
+    <w:p>
+      <w:pPr>
+        <w:rPr>
+          <w:noProof/>
+        </w:rPr>
+      </w:pPr>
+      <w:r>
+        <w:rPr>
+          <w:noProof/>
+        </w:rPr>
+        <w:t>Essa camada ajuda a luz a passar ou não como por exemplo um tipo de insulfilme de um carro que ao ser aplicada ajuda a luz do lado de fora a não passar completamente.</w:t>
+      </w:r>
+    </w:p>
+    <w:p>
+      <w:pPr>
+        <w:rPr>
+          <w:noProof/>
+        </w:rPr>
+      </w:pPr>
+      <w:r>
+        <w:rPr>
+          <w:noProof/>
+        </w:rPr>
+        <w:t xml:space="preserve">Na class imagem-beneficios colocamos “opacity:1;” </w:t>
+      </w:r>
+    </w:p>
+    <w:p>
+      <w:pPr>
+        <w:rPr>
+          <w:noProof/>
+        </w:rPr>
+      </w:pPr>
+      <w:r>
+        <w:rPr>
+          <w:noProof/>
+        </w:rPr>
+        <w:t>Obs: opacity vai de 1 a 0.</w:t>
+      </w:r>
+    </w:p>
+    <w:p>
+      <w:pPr>
+        <w:rPr>
+          <w:noProof/>
+        </w:rPr>
+      </w:pPr>
+      <w:r>
+        <w:rPr>
+          <w:noProof/>
+        </w:rPr>
+        <w:t xml:space="preserve">0 – Exibe nada; </w:t>
+      </w:r>
+    </w:p>
+    <w:p>
+      <w:pPr>
+        <w:rPr>
+          <w:noProof/>
+        </w:rPr>
+      </w:pPr>
+      <w:r>
+        <w:rPr>
+          <w:noProof/>
+        </w:rPr>
+        <w:t>1 – Exibe o elemento inteiro.</w:t>
+      </w:r>
+    </w:p>
+    <w:p>
+      <w:pPr>
+        <w:rPr>
+          <w:noProof/>
+        </w:rPr>
+      </w:pPr>
+      <w:r>
+        <w:rPr>
+          <w:noProof/>
+        </w:rPr>
+        <w:t>Então colocamos 0.3 que exibe 30% ou 0.7 que exibe 70%.</w:t>
+      </w:r>
+    </w:p>
+    <w:p>
+      <w:pPr>
+        <w:rPr>
+          <w:noProof/>
+        </w:rPr>
+      </w:pPr>
+      <w:r>
+        <w:rPr>
+          <w:noProof/>
+        </w:rPr>
+        <w:t xml:space="preserve">116 </w:t>
+      </w:r>
+      <w:r>
+        <w:rPr>
+          <w:noProof/>
+        </w:rPr>
+        <w:t>–</w:t>
+      </w:r>
+      <w:r>
+        <w:rPr>
+          <w:noProof/>
+        </w:rPr>
+        <w:t xml:space="preserve"> </w:t>
+      </w:r>
+      <w:r>
+        <w:rPr>
+          <w:noProof/>
+        </w:rPr>
+        <w:t>Aplicamos opacidade no nosso site utilizando o efeito hover que ao passar o mouse na imagem beneficios ele fica com apenas 30% de visibilidade e também adicionamos um transition para que ocorra um tempo para essa passagem ao utilizar o hover.</w:t>
+      </w:r>
+    </w:p>
+    <w:p>
+      <w:pPr>
+        <w:rPr>
+          <w:noProof/>
+        </w:rPr>
+      </w:pPr>
+      <w:r>
+        <w:rPr>
+          <w:noProof/>
+        </w:rPr>
+        <w:drawing>
+          <wp:inline distT="0" distB="0" distL="0" distR="0" wp14:anchorId="1F5D23A2" wp14:editId="1A75B23C">
+            <wp:extent cx="2028825" cy="1507910"/>
+            <wp:effectExtent l="0" t="0" r="0" b="0"/>
+            <wp:docPr id="202" name="Imagem 202"/>
+            <wp:cNvGraphicFramePr>
+              <a:graphicFrameLocks xmlns:a="http://schemas.openxmlformats.org/drawingml/2006/main" noChangeAspect="1"/>
+            </wp:cNvGraphicFramePr>
+            <a:graphic xmlns:a="http://schemas.openxmlformats.org/drawingml/2006/main">
+              <a:graphicData uri="http://schemas.openxmlformats.org/drawingml/2006/picture">
+                <pic:pic xmlns:pic="http://schemas.openxmlformats.org/drawingml/2006/picture">
+                  <pic:nvPicPr>
+                    <pic:cNvPr id="1" name=""/>
+                    <pic:cNvPicPr/>
+                  </pic:nvPicPr>
+                  <pic:blipFill>
+                    <a:blip r:embed="rId185"/>
+                    <a:stretch>
+                      <a:fillRect/>
+                    </a:stretch>
+                  </pic:blipFill>
+                  <pic:spPr>
+                    <a:xfrm>
+                      <a:off x="0" y="0"/>
+                      <a:ext cx="2029673" cy="1508540"/>
+                    </a:xfrm>
+                    <a:prstGeom prst="rect">
+                      <a:avLst/>
+                    </a:prstGeom>
+                  </pic:spPr>
+                </pic:pic>
+              </a:graphicData>
+            </a:graphic>
+          </wp:inline>
+        </w:drawing>
+      </w:r>
+    </w:p>
+    <w:p>
+      <w:pPr>
+        <w:rPr>
+          <w:noProof/>
+        </w:rPr>
+      </w:pPr>
+      <w:r>
+        <w:rPr>
+          <w:noProof/>
+        </w:rPr>
+        <w:lastRenderedPageBreak/>
+        <w:t xml:space="preserve">117 – </w:t>
+      </w:r>
+      <w:r>
+        <w:rPr>
+          <w:b/>
+          <w:noProof/>
+        </w:rPr>
+        <w:t>Sombra nos elementos.</w:t>
+      </w:r>
+    </w:p>
+    <w:p>
+      <w:pPr>
+        <w:rPr>
+          <w:noProof/>
+        </w:rPr>
+      </w:pPr>
+      <w:r>
+        <w:rPr>
+          <w:noProof/>
+        </w:rPr>
+        <w:t>Como funciona a sombra? É como se coloca-se uma luz em cima do elemento que vai refletir a sombra em baixo.</w:t>
+      </w:r>
+    </w:p>
+    <w:p>
+      <w:pPr>
+        <w:rPr>
+          <w:noProof/>
+        </w:rPr>
+      </w:pPr>
+      <w:r>
+        <w:rPr>
+          <w:noProof/>
+        </w:rPr>
+        <w:t xml:space="preserve">Na class </w:t>
+      </w:r>
+      <w:r>
+        <w:rPr>
+          <w:noProof/>
+        </w:rPr>
+        <w:t>“</w:t>
+      </w:r>
+      <w:r>
+        <w:rPr>
+          <w:noProof/>
+        </w:rPr>
+        <w:t>imagem</w:t>
+      </w:r>
+      <w:r>
+        <w:rPr>
+          <w:noProof/>
+        </w:rPr>
+        <w:t>-</w:t>
+      </w:r>
+      <w:r>
+        <w:rPr>
+          <w:noProof/>
+        </w:rPr>
+        <w:t>beneficios</w:t>
+      </w:r>
+      <w:r>
+        <w:rPr>
+          <w:noProof/>
+        </w:rPr>
+        <w:t>”</w:t>
+      </w:r>
+      <w:r>
+        <w:rPr>
+          <w:noProof/>
+        </w:rPr>
+        <w:t xml:space="preserve"> vamos colocar </w:t>
+      </w:r>
+      <w:r>
+        <w:rPr>
+          <w:noProof/>
+        </w:rPr>
+        <w:t>“</w:t>
+      </w:r>
+      <w:r>
+        <w:rPr>
+          <w:noProof/>
+        </w:rPr>
+        <w:t>box-shadow</w:t>
+      </w:r>
+      <w:r>
+        <w:rPr>
+          <w:noProof/>
+        </w:rPr>
+        <w:t>”</w:t>
+      </w:r>
+      <w:r>
+        <w:rPr>
+          <w:noProof/>
+        </w:rPr>
+        <w:t xml:space="preserve"> que significa sombra em caixa</w:t>
+      </w:r>
+      <w:r>
+        <w:rPr>
+          <w:noProof/>
+        </w:rPr>
+        <w:t>, que possui a propriedade do eixo x e y, parecido com exemplo a baixo.</w:t>
+      </w:r>
+    </w:p>
+    <w:p>
+      <w:pPr>
+        <w:rPr>
+          <w:noProof/>
+        </w:rPr>
+      </w:pPr>
+      <w:r>
+        <w:rPr>
+          <w:noProof/>
+        </w:rPr>
+        <w:drawing>
+          <wp:inline distT="0" distB="0" distL="0" distR="0" wp14:anchorId="7563AD9B" wp14:editId="28D0C928">
+            <wp:extent cx="2610214" cy="1257475"/>
+            <wp:effectExtent l="0" t="0" r="0" b="0"/>
+            <wp:docPr id="203" name="Imagem 203"/>
+            <wp:cNvGraphicFramePr>
+              <a:graphicFrameLocks xmlns:a="http://schemas.openxmlformats.org/drawingml/2006/main" noChangeAspect="1"/>
+            </wp:cNvGraphicFramePr>
+            <a:graphic xmlns:a="http://schemas.openxmlformats.org/drawingml/2006/main">
+              <a:graphicData uri="http://schemas.openxmlformats.org/drawingml/2006/picture">
+                <pic:pic xmlns:pic="http://schemas.openxmlformats.org/drawingml/2006/picture">
+                  <pic:nvPicPr>
+                    <pic:cNvPr id="1" name=""/>
+                    <pic:cNvPicPr/>
+                  </pic:nvPicPr>
+                  <pic:blipFill>
+                    <a:blip r:embed="rId186"/>
+                    <a:stretch>
+                      <a:fillRect/>
+                    </a:stretch>
+                  </pic:blipFill>
+                  <pic:spPr>
+                    <a:xfrm>
+                      <a:off x="0" y="0"/>
+                      <a:ext cx="2610214" cy="1257475"/>
+                    </a:xfrm>
+                    <a:prstGeom prst="rect">
+                      <a:avLst/>
+                    </a:prstGeom>
+                  </pic:spPr>
+                </pic:pic>
+              </a:graphicData>
+            </a:graphic>
+          </wp:inline>
+        </w:drawing>
+      </w:r>
+    </w:p>
+    <w:p>
+      <w:pPr>
+        <w:rPr>
+          <w:noProof/>
+        </w:rPr>
+      </w:pPr>
+      <w:r>
+        <w:rPr>
+          <w:noProof/>
+        </w:rPr>
+        <mc:AlternateContent>
+          <mc:Choice Requires="wps">
+            <w:drawing>
+              <wp:anchor distT="0" distB="0" distL="114300" distR="114300" simplePos="0" relativeHeight="251689984" behindDoc="0" locked="0" layoutInCell="1" allowOverlap="1">
+                <wp:simplePos x="0" y="0"/>
+                <wp:positionH relativeFrom="column">
+                  <wp:posOffset>1786890</wp:posOffset>
+                </wp:positionH>
+                <wp:positionV relativeFrom="paragraph">
+                  <wp:posOffset>227330</wp:posOffset>
+                </wp:positionV>
+                <wp:extent cx="47625" cy="1562100"/>
+                <wp:effectExtent l="38100" t="0" r="66675" b="57150"/>
+                <wp:wrapNone/>
+                <wp:docPr id="206" name="Conector de Seta Reta 206"/>
+                <wp:cNvGraphicFramePr/>
+                <a:graphic xmlns:a="http://schemas.openxmlformats.org/drawingml/2006/main">
+                  <a:graphicData uri="http://schemas.microsoft.com/office/word/2010/wordprocessingShape">
+                    <wps:wsp>
+                      <wps:cNvCnPr/>
+                      <wps:spPr>
+                        <a:xfrm>
+                          <a:off x="0" y="0"/>
+                          <a:ext cx="47625" cy="1562100"/>
+                        </a:xfrm>
+                        <a:prstGeom prst="straightConnector1">
+                          <a:avLst/>
+                        </a:prstGeom>
+                        <a:ln>
+                          <a:solidFill>
+                            <a:srgbClr val="FF0000"/>
+                          </a:solidFill>
+                          <a:tailEnd type="triangle"/>
+                        </a:ln>
+                      </wps:spPr>
+                      <wps:style>
+                        <a:lnRef idx="1">
+                          <a:schemeClr val="accent1"/>
+                        </a:lnRef>
+                        <a:fillRef idx="0">
+                          <a:schemeClr val="accent1"/>
+                        </a:fillRef>
+                        <a:effectRef idx="0">
+                          <a:schemeClr val="accent1"/>
+                        </a:effectRef>
+                        <a:fontRef idx="minor">
+                          <a:schemeClr val="tx1"/>
+                        </a:fontRef>
+                      </wps:style>
+                      <wps:bodyPr/>
+                    </wps:wsp>
+                  </a:graphicData>
+                </a:graphic>
+              </wp:anchor>
+            </w:drawing>
+          </mc:Choice>
+          <mc:Fallback>
+            <w:pict>
+              <v:shapetype w14:anchorId="66BE17B7" id="_x0000_t32" coordsize="21600,21600" o:spt="32" o:oned="t" path="m,l21600,21600e" filled="f">
+                <v:path arrowok="t" fillok="f" o:connecttype="none"/>
+                <o:lock v:ext="edit" shapetype="t"/>
+              </v:shapetype>
+              <v:shape id="Conector de Seta Reta 206" o:spid="_x0000_s1026" type="#_x0000_t32" style="position:absolute;margin-left:140.7pt;margin-top:17.9pt;width:3.75pt;height:123pt;z-index:251689984;visibility:visible;mso-wrap-style:square;mso-wrap-distance-left:9pt;mso-wrap-distance-top:0;mso-wrap-distance-right:9pt;mso-wrap-distance-bottom:0;mso-position-horizontal:absolute;mso-position-horizontal-relative:text;mso-position-vertical:absolute;mso-position-vertical-relative:text" o:gfxdata="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" strokecolor="red" strokeweight=".5pt">
+                <v:stroke endarrow="block" joinstyle="miter"/>
+              </v:shape>
+            </w:pict>
+          </mc:Fallback>
+        </mc:AlternateContent>
+      </w:r>
+      <w:r>
+        <w:rPr>
+          <w:noProof/>
+        </w:rPr>
+        <w:t>118 – Para espalhar a sombra utilizamos mais um valor chamado</w:t>
+      </w:r>
+      <w:r>
+        <w:rPr>
+          <w:b/>
+          <w:noProof/>
+        </w:rPr>
+        <w:t xml:space="preserve"> blur</w:t>
+      </w:r>
+      <w:r>
+        <w:rPr>
+          <w:noProof/>
+        </w:rPr>
+        <w:t>.</w:t>
+      </w:r>
+    </w:p>
+    <w:p>
+      <w:pPr>
+        <w:rPr>
+          <w:noProof/>
+        </w:rPr>
+      </w:pPr>
+      <w:r>
+        <w:rPr>
+          <w:noProof/>
+        </w:rPr>
+        <w:drawing>
+          <wp:inline distT="0" distB="0" distL="0" distR="0" wp14:anchorId="1B3D5465" wp14:editId="6B55BE58">
+            <wp:extent cx="2533650" cy="1034143"/>
+            <wp:effectExtent l="0" t="0" r="0" b="0"/>
+            <wp:docPr id="204" name="Imagem 204"/>
+            <wp:cNvGraphicFramePr>
+              <a:graphicFrameLocks xmlns:a="http://schemas.openxmlformats.org/drawingml/2006/main" noChangeAspect="1"/>
+            </wp:cNvGraphicFramePr>
+            <a:graphic xmlns:a="http://schemas.openxmlformats.org/drawingml/2006/main">
+              <a:graphicData uri="http://schemas.openxmlformats.org/drawingml/2006/picture">
+                <pic:pic xmlns:pic="http://schemas.openxmlformats.org/drawingml/2006/picture">
+                  <pic:nvPicPr>
+                    <pic:cNvPr id="1" name=""/>
+                    <pic:cNvPicPr/>
+                  </pic:nvPicPr>
+                  <pic:blipFill>
+                    <a:blip r:embed="rId187"/>
+                    <a:stretch>
+                      <a:fillRect/>
+                    </a:stretch>
+                  </pic:blipFill>
+                  <pic:spPr>
+                    <a:xfrm>
+                      <a:off x="0" y="0"/>
+                      <a:ext cx="2547441" cy="1039772"/>
+                    </a:xfrm>
+                    <a:prstGeom prst="rect">
+                      <a:avLst/>
+                    </a:prstGeom>
+                  </pic:spPr>
+                </pic:pic>
+              </a:graphicData>
+            </a:graphic>
+          </wp:inline>
+        </w:drawing>
+      </w:r>
+      <w:r>
+        <w:rPr>
+          <w:noProof/>
+        </w:rPr>
+        <w:drawing>
+          <wp:inline distT="0" distB="0" distL="0" distR="0" wp14:anchorId="27302141" wp14:editId="379966B0">
+            <wp:extent cx="2796162" cy="1895475"/>
+            <wp:effectExtent l="0" t="0" r="4445" b="0"/>
+            <wp:docPr id="205" name="Imagem 205"/>
+            <wp:cNvGraphicFramePr>
+              <a:graphicFrameLocks xmlns:a="http://schemas.openxmlformats.org/drawingml/2006/main" noChangeAspect="1"/>
+            </wp:cNvGraphicFramePr>
+            <a:graphic xmlns:a="http://schemas.openxmlformats.org/drawingml/2006/main">
+              <a:graphicData uri="http://schemas.openxmlformats.org/drawingml/2006/picture">
+                <pic:pic xmlns:pic="http://schemas.openxmlformats.org/drawingml/2006/picture">
+                  <pic:nvPicPr>
+                    <pic:cNvPr id="1" name=""/>
+                    <pic:cNvPicPr/>
+                  </pic:nvPicPr>
+                  <pic:blipFill>
+                    <a:blip r:embed="rId188"/>
+                    <a:stretch>
+                      <a:fillRect/>
+                    </a:stretch>
+                  </pic:blipFill>
+                  <pic:spPr>
+                    <a:xfrm>
+                      <a:off x="0" y="0"/>
+                      <a:ext cx="2813782" cy="1907419"/>
+                    </a:xfrm>
+                    <a:prstGeom prst="rect">
+                      <a:avLst/>
+                    </a:prstGeom>
+                  </pic:spPr>
+                </pic:pic>
+              </a:graphicData>
+            </a:graphic>
+          </wp:inline>
+        </w:drawing>
+      </w:r>
+    </w:p>
+    <w:p>
+      <w:pPr>
+        <w:rPr>
+          <w:noProof/>
+        </w:rPr>
+      </w:pPr>
+      <w:r>
+        <w:rPr>
+          <w:noProof/>
+        </w:rPr>
+        <w:t xml:space="preserve">119 – No “box-shadow” existe um quarto valor </w:t>
+      </w:r>
+      <w:r>
+        <w:rPr>
+          <w:noProof/>
+        </w:rPr>
+        <w:t>que seria a propriedade que configura a intensidade da sombra a partir do tamanho do elemento, isso é, o tamanho da sombra projetada neste caso inserimos 20px.</w:t>
+      </w:r>
+    </w:p>
+    <w:p>
+      <w:pPr>
+        <w:rPr>
+          <w:noProof/>
+        </w:rPr>
+      </w:pPr>
+      <w:r>
+        <w:rPr>
+          <w:noProof/>
+        </w:rPr>
+        <mc:AlternateContent>
+          <mc:Choice Requires="wps">
+            <w:drawing>
+              <wp:anchor distT="0" distB="0" distL="114300" distR="114300" simplePos="0" relativeHeight="251691008" behindDoc="0" locked="0" layoutInCell="1" allowOverlap="1">
+                <wp:simplePos x="0" y="0"/>
+                <wp:positionH relativeFrom="column">
+                  <wp:posOffset>1920240</wp:posOffset>
+                </wp:positionH>
+                <wp:positionV relativeFrom="paragraph">
+                  <wp:posOffset>1270</wp:posOffset>
+                </wp:positionV>
+                <wp:extent cx="104775" cy="600075"/>
+                <wp:effectExtent l="0" t="0" r="85725" b="47625"/>
+                <wp:wrapNone/>
+                <wp:docPr id="208" name="Conector de Seta Reta 208"/>
+                <wp:cNvGraphicFramePr/>
+                <a:graphic xmlns:a="http://schemas.openxmlformats.org/drawingml/2006/main">
+                  <a:graphicData uri="http://schemas.microsoft.com/office/word/2010/wordprocessingShape">
+                    <wps:wsp>
+                      <wps:cNvCnPr/>
+                      <wps:spPr>
+                        <a:xfrm>
+                          <a:off x="0" y="0"/>
+                          <a:ext cx="104775" cy="600075"/>
+                        </a:xfrm>
+                        <a:prstGeom prst="straightConnector1">
+                          <a:avLst/>
+                        </a:prstGeom>
+                        <a:ln>
+                          <a:solidFill>
+                            <a:srgbClr val="FF0000"/>
+                          </a:solidFill>
+                          <a:tailEnd type="triangle"/>
+                        </a:ln>
+                      </wps:spPr>
+                      <wps:style>
+                        <a:lnRef idx="1">
+                          <a:schemeClr val="accent1"/>
+                        </a:lnRef>
+                        <a:fillRef idx="0">
+                          <a:schemeClr val="accent1"/>
+                        </a:fillRef>
+                        <a:effectRef idx="0">
+                          <a:schemeClr val="accent1"/>
+                        </a:effectRef>
+                        <a:fontRef idx="minor">
+                          <a:schemeClr val="tx1"/>
+                        </a:fontRef>
+                      </wps:style>
+                      <wps:bodyPr/>
+                    </wps:wsp>
+                  </a:graphicData>
+                </a:graphic>
+              </wp:anchor>
+            </w:drawing>
+          </mc:Choice>
+          <mc:Fallback>
+            <w:pict>
+              <v:shape w14:anchorId="73799C5C" id="Conector de Seta Reta 208" o:spid="_x0000_s1026" type="#_x0000_t32" style="position:absolute;margin-left:151.2pt;margin-top:.1pt;width:8.25pt;height:47.25pt;z-index:251691008;visibility:visible;mso-wrap-style:square;mso-wrap-distance-left:9pt;mso-wrap-distance-top:0;mso-wrap-distance-right:9pt;mso-wrap-distance-bottom:0;mso-position-horizontal:absolute;mso-position-horizontal-relative:text;mso-position-vertical:absolute;mso-position-vertical-relative:text" o:gfxdata="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" strokecolor="red" strokeweight=".5pt">
+                <v:stroke endarrow="block" joinstyle="miter"/>
+              </v:shape>
+            </w:pict>
+          </mc:Fallback>
+        </mc:AlternateContent>
+      </w:r>
+      <w:r>
+        <w:rPr>
+          <w:noProof/>
+        </w:rPr>
+        <w:drawing>
+          <wp:inline distT="0" distB="0" distL="0" distR="0" wp14:anchorId="6CC2FC8E" wp14:editId="7E1A25EA">
+            <wp:extent cx="2800350" cy="983014"/>
+            <wp:effectExtent l="0" t="0" r="0" b="7620"/>
+            <wp:docPr id="207" name="Imagem 207"/>
+            <wp:cNvGraphicFramePr>
+              <a:graphicFrameLocks xmlns:a="http://schemas.openxmlformats.org/drawingml/2006/main" noChangeAspect="1"/>
+            </wp:cNvGraphicFramePr>
+            <a:graphic xmlns:a="http://schemas.openxmlformats.org/drawingml/2006/main">
+              <a:graphicData uri="http://schemas.openxmlformats.org/drawingml/2006/picture">
+                <pic:pic xmlns:pic="http://schemas.openxmlformats.org/drawingml/2006/picture">
+                  <pic:nvPicPr>
+                    <pic:cNvPr id="1" name=""/>
+                    <pic:cNvPicPr/>
+                  </pic:nvPicPr>
+                  <pic:blipFill>
+                    <a:blip r:embed="rId189"/>
+                    <a:stretch>
+                      <a:fillRect/>
+                    </a:stretch>
+                  </pic:blipFill>
+                  <pic:spPr>
+                    <a:xfrm>
+                      <a:off x="0" y="0"/>
+                      <a:ext cx="2827064" cy="992391"/>
+                    </a:xfrm>
+                    <a:prstGeom prst="rect">
+                      <a:avLst/>
+                    </a:prstGeom>
+                  </pic:spPr>
+                </pic:pic>
+              </a:graphicData>
+            </a:graphic>
+          </wp:inline>
+        </w:drawing>
+      </w:r>
+    </w:p>
+    <w:p>
+      <w:pPr>
+        <w:rPr>
+          <w:noProof/>
+        </w:rPr>
+      </w:pPr>
+      <w:r>
+        <w:rPr>
+          <w:noProof/>
+        </w:rPr>
+        <w:t xml:space="preserve">120 - </w:t>
       </w:r>
       <w:bookmarkStart w:id="0" w:name="_GoBack"/>
       <w:bookmarkEnd w:id="0"/>
-    </w:p>
-    <w:p>
-      <w:pPr>
-        <w:rPr>
-          <w:noProof/>
-        </w:rPr>
-      </w:pPr>
-    </w:p>
-    <w:p>
-      <w:pPr>
-        <w:rPr>
-          <w:noProof/>
-        </w:rPr>
-      </w:pPr>
     </w:p>
     <w:sectPr>
       <w:pgSz w:w="11906" w:h="16838"/>
@@ -15124,7 +15909,7 @@
 </file>
 
 <file path=customXml/itemProps1.xml><?xml version="1.0" encoding="utf-8"?>
-<ds:datastoreItem xmlns:ds="http://schemas.openxmlformats.org/officeDocument/2006/customXml" ds:itemID="{8BEE509B-C613-4BB7-9EAE-AA54FDAD6CAE}">
+<ds:datastoreItem xmlns:ds="http://schemas.openxmlformats.org/officeDocument/2006/customXml" ds:itemID="{4CBD653F-E89F-4F62-BD5F-B6B21450A305}">
   <ds:schemaRefs>
     <ds:schemaRef ds:uri="http://schemas.openxmlformats.org/officeDocument/2006/bibliography"/>
   </ds:schemaRefs>

</xml_diff>

<commit_message>
deixamos a pagina responsiva para celular
</commit_message>
<xml_diff>
--- a/Apostila/Projeto Space For Men.docx
+++ b/Apostila/Projeto Space For Men.docx
@@ -14633,8 +14633,8 @@
         </w:rPr>
         <w:drawing>
           <wp:inline distT="0" distB="0" distL="0" distR="0" wp14:anchorId="7563AD9B" wp14:editId="28D0C928">
-            <wp:extent cx="2610214" cy="1257475"/>
-            <wp:effectExtent l="0" t="0" r="0" b="0"/>
+            <wp:extent cx="3400714" cy="1638300"/>
+            <wp:effectExtent l="0" t="0" r="9525" b="0"/>
             <wp:docPr id="203" name="Imagem 203"/>
             <wp:cNvGraphicFramePr>
               <a:graphicFrameLocks xmlns:a="http://schemas.openxmlformats.org/drawingml/2006/main" noChangeAspect="1"/>
@@ -14655,7 +14655,7 @@
                   <pic:spPr>
                     <a:xfrm>
                       <a:off x="0" y="0"/>
-                      <a:ext cx="2610214" cy="1257475"/>
+                      <a:ext cx="3426340" cy="1650645"/>
                     </a:xfrm>
                     <a:prstGeom prst="rect">
                       <a:avLst/>
@@ -14684,13 +14684,13 @@
               <wp:anchor distT="0" distB="0" distL="114300" distR="114300" simplePos="0" relativeHeight="251689984" behindDoc="0" locked="0" layoutInCell="1" allowOverlap="1">
                 <wp:simplePos x="0" y="0"/>
                 <wp:positionH relativeFrom="column">
-                  <wp:posOffset>1786890</wp:posOffset>
+                  <wp:posOffset>1741171</wp:posOffset>
                 </wp:positionH>
                 <wp:positionV relativeFrom="paragraph">
                   <wp:posOffset>227330</wp:posOffset>
                 </wp:positionV>
-                <wp:extent cx="47625" cy="1562100"/>
-                <wp:effectExtent l="38100" t="0" r="66675" b="57150"/>
+                <wp:extent cx="45719" cy="742950"/>
+                <wp:effectExtent l="76200" t="0" r="50165" b="57150"/>
                 <wp:wrapNone/>
                 <wp:docPr id="206" name="Conector de Seta Reta 206"/>
                 <wp:cNvGraphicFramePr/>
@@ -14699,9 +14699,9 @@
                     <wps:wsp>
                       <wps:cNvCnPr/>
                       <wps:spPr>
-                        <a:xfrm>
+                        <a:xfrm flipH="1">
                           <a:off x="0" y="0"/>
-                          <a:ext cx="47625" cy="1562100"/>
+                          <a:ext cx="45719" cy="742950"/>
                         </a:xfrm>
                         <a:prstGeom prst="straightConnector1">
                           <a:avLst/>
@@ -14731,16 +14731,22 @@
                     </wps:wsp>
                   </a:graphicData>
                 </a:graphic>
+                <wp14:sizeRelH relativeFrom="margin">
+                  <wp14:pctWidth>0</wp14:pctWidth>
+                </wp14:sizeRelH>
+                <wp14:sizeRelV relativeFrom="margin">
+                  <wp14:pctHeight>0</wp14:pctHeight>
+                </wp14:sizeRelV>
               </wp:anchor>
             </w:drawing>
           </mc:Choice>
           <mc:Fallback>
             <w:pict>
-              <v:shapetype w14:anchorId="66BE17B7" id="_x0000_t32" coordsize="21600,21600" o:spt="32" o:oned="t" path="m,l21600,21600e" filled="f">
+              <v:shapetype w14:anchorId="5285D196" id="_x0000_t32" coordsize="21600,21600" o:spt="32" o:oned="t" path="m,l21600,21600e" filled="f">
                 <v:path arrowok="t" fillok="f" o:connecttype="none"/>
                 <o:lock v:ext="edit" shapetype="t"/>
               </v:shapetype>
-              <v:shape id="Conector de Seta Reta 206" o:spid="_x0000_s1026" type="#_x0000_t32" style="position:absolute;margin-left:140.7pt;margin-top:17.9pt;width:3.75pt;height:123pt;z-index:251689984;visibility:visible;mso-wrap-style:square;mso-wrap-distance-left:9pt;mso-wrap-distance-top:0;mso-wrap-distance-right:9pt;mso-wrap-distance-bottom:0;mso-position-horizontal:absolute;mso-position-horizontal-relative:text;mso-position-vertical:absolute;mso-position-vertical-relative:text" o:gfxdata="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" strokecolor="red" strokeweight=".5pt">
+              <v:shape id="Conector de Seta Reta 206" o:spid="_x0000_s1026" type="#_x0000_t32" style="position:absolute;margin-left:137.1pt;margin-top:17.9pt;width:3.6pt;height:58.5pt;flip:x;z-index:251689984;visibility:visible;mso-wrap-style:square;mso-width-percent:0;mso-height-percent:0;mso-wrap-distance-left:9pt;mso-wrap-distance-top:0;mso-wrap-distance-right:9pt;mso-wrap-distance-bottom:0;mso-position-horizontal:absolute;mso-position-horizontal-relative:text;mso-position-vertical:absolute;mso-position-vertical-relative:text;mso-width-percent:0;mso-height-percent:0;mso-width-relative:margin;mso-height-relative:margin" o:gfxdata="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" strokecolor="red" strokeweight=".5pt">
                 <v:stroke endarrow="block" joinstyle="miter"/>
               </v:shape>
             </w:pict>
@@ -14819,8 +14825,8 @@
         </w:rPr>
         <w:drawing>
           <wp:inline distT="0" distB="0" distL="0" distR="0" wp14:anchorId="27302141" wp14:editId="379966B0">
-            <wp:extent cx="2796162" cy="1895475"/>
-            <wp:effectExtent l="0" t="0" r="4445" b="0"/>
+            <wp:extent cx="3189593" cy="2162175"/>
+            <wp:effectExtent l="0" t="0" r="0" b="0"/>
             <wp:docPr id="205" name="Imagem 205"/>
             <wp:cNvGraphicFramePr>
               <a:graphicFrameLocks xmlns:a="http://schemas.openxmlformats.org/drawingml/2006/main" noChangeAspect="1"/>
@@ -14841,7 +14847,7 @@
                   <pic:spPr>
                     <a:xfrm>
                       <a:off x="0" y="0"/>
-                      <a:ext cx="2813782" cy="1907419"/>
+                      <a:ext cx="3222727" cy="2184636"/>
                     </a:xfrm>
                     <a:prstGeom prst="rect">
                       <a:avLst/>
@@ -14889,10 +14895,10 @@
               <wp:anchor distT="0" distB="0" distL="114300" distR="114300" simplePos="0" relativeHeight="251691008" behindDoc="0" locked="0" layoutInCell="1" allowOverlap="1">
                 <wp:simplePos x="0" y="0"/>
                 <wp:positionH relativeFrom="column">
-                  <wp:posOffset>1920240</wp:posOffset>
+                  <wp:posOffset>2910840</wp:posOffset>
                 </wp:positionH>
                 <wp:positionV relativeFrom="paragraph">
-                  <wp:posOffset>1270</wp:posOffset>
+                  <wp:posOffset>201295</wp:posOffset>
                 </wp:positionV>
                 <wp:extent cx="104775" cy="600075"/>
                 <wp:effectExtent l="0" t="0" r="85725" b="47625"/>
@@ -14941,7 +14947,7 @@
           </mc:Choice>
           <mc:Fallback>
             <w:pict>
-              <v:shape w14:anchorId="73799C5C" id="Conector de Seta Reta 208" o:spid="_x0000_s1026" type="#_x0000_t32" style="position:absolute;margin-left:151.2pt;margin-top:.1pt;width:8.25pt;height:47.25pt;z-index:251691008;visibility:visible;mso-wrap-style:square;mso-wrap-distance-left:9pt;mso-wrap-distance-top:0;mso-wrap-distance-right:9pt;mso-wrap-distance-bottom:0;mso-position-horizontal:absolute;mso-position-horizontal-relative:text;mso-position-vertical:absolute;mso-position-vertical-relative:text" o:gfxdata="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" strokecolor="red" strokeweight=".5pt">
+              <v:shape w14:anchorId="649F91AE" id="Conector de Seta Reta 208" o:spid="_x0000_s1026" type="#_x0000_t32" style="position:absolute;margin-left:229.2pt;margin-top:15.85pt;width:8.25pt;height:47.25pt;z-index:251691008;visibility:visible;mso-wrap-style:square;mso-wrap-distance-left:9pt;mso-wrap-distance-top:0;mso-wrap-distance-right:9pt;mso-wrap-distance-bottom:0;mso-position-horizontal:absolute;mso-position-horizontal-relative:text;mso-position-vertical:absolute;mso-position-vertical-relative:text" o:gfxdata="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" strokecolor="red" strokeweight=".5pt">
                 <v:stroke endarrow="block" joinstyle="miter"/>
               </v:shape>
             </w:pict>
@@ -14954,55 +14960,1056 @@
         </w:rPr>
         <w:drawing>
           <wp:inline distT="0" distB="0" distL="0" distR="0" wp14:anchorId="6CC2FC8E" wp14:editId="7E1A25EA">
-            <wp:extent cx="2800350" cy="983014"/>
+            <wp:extent cx="4070140" cy="1428750"/>
+            <wp:effectExtent l="0" t="0" r="6985" b="0"/>
+            <wp:docPr id="207" name="Imagem 207"/>
+            <wp:cNvGraphicFramePr>
+              <a:graphicFrameLocks xmlns:a="http://schemas.openxmlformats.org/drawingml/2006/main" noChangeAspect="1"/>
+            </wp:cNvGraphicFramePr>
+            <a:graphic xmlns:a="http://schemas.openxmlformats.org/drawingml/2006/main">
+              <a:graphicData uri="http://schemas.openxmlformats.org/drawingml/2006/picture">
+                <pic:pic xmlns:pic="http://schemas.openxmlformats.org/drawingml/2006/picture">
+                  <pic:nvPicPr>
+                    <pic:cNvPr id="1" name=""/>
+                    <pic:cNvPicPr/>
+                  </pic:nvPicPr>
+                  <pic:blipFill>
+                    <a:blip r:embed="rId189"/>
+                    <a:stretch>
+                      <a:fillRect/>
+                    </a:stretch>
+                  </pic:blipFill>
+                  <pic:spPr>
+                    <a:xfrm>
+                      <a:off x="0" y="0"/>
+                      <a:ext cx="4130582" cy="1449967"/>
+                    </a:xfrm>
+                    <a:prstGeom prst="rect">
+                      <a:avLst/>
+                    </a:prstGeom>
+                  </pic:spPr>
+                </pic:pic>
+              </a:graphicData>
+            </a:graphic>
+          </wp:inline>
+        </w:drawing>
+      </w:r>
+    </w:p>
+    <w:p>
+      <w:pPr>
+        <w:rPr>
+          <w:b/>
+          <w:noProof/>
+        </w:rPr>
+      </w:pPr>
+      <w:r>
+        <w:rPr>
+          <w:noProof/>
+        </w:rPr>
+        <w:lastRenderedPageBreak/>
+        <w:t xml:space="preserve">120 </w:t>
+      </w:r>
+      <w:r>
+        <w:rPr>
+          <w:noProof/>
+        </w:rPr>
+        <w:t>–</w:t>
+      </w:r>
+      <w:r>
+        <w:rPr>
+          <w:noProof/>
+        </w:rPr>
+        <w:t xml:space="preserve"> </w:t>
+      </w:r>
+      <w:r>
+        <w:rPr>
+          <w:b/>
+          <w:noProof/>
+        </w:rPr>
+        <w:t>Desi</w:t>
+      </w:r>
+      <w:r>
+        <w:rPr>
+          <w:b/>
+          <w:noProof/>
+        </w:rPr>
+        <w:t>gn</w:t>
+      </w:r>
+      <w:r>
+        <w:rPr>
+          <w:b/>
+          <w:noProof/>
+        </w:rPr>
+        <w:t xml:space="preserve"> Responsivo</w:t>
+      </w:r>
+    </w:p>
+    <w:p>
+      <w:pPr>
+        <w:rPr>
+          <w:noProof/>
+        </w:rPr>
+      </w:pPr>
+      <w:r>
+        <w:rPr>
+          <w:noProof/>
+        </w:rPr>
+        <w:t xml:space="preserve">O que podemos fazer para saber se a nossa página </w:t>
+      </w:r>
+      <w:r>
+        <w:rPr>
+          <w:noProof/>
+        </w:rPr>
+        <w:t>esta adaptada para uso do celular?</w:t>
+      </w:r>
+    </w:p>
+    <w:p>
+      <w:pPr>
+        <w:rPr>
+          <w:noProof/>
+        </w:rPr>
+      </w:pPr>
+      <w:r>
+        <w:rPr>
+          <w:noProof/>
+        </w:rPr>
+        <w:t>Tem duas formas de abrir e para verificar a ferramenta do desenvolvimento onde podemos verificar.</w:t>
+      </w:r>
+    </w:p>
+    <w:p>
+      <w:pPr>
+        <w:rPr>
+          <w:noProof/>
+        </w:rPr>
+      </w:pPr>
+      <w:r>
+        <w:rPr>
+          <w:noProof/>
+        </w:rPr>
+        <mc:AlternateContent>
+          <mc:Choice Requires="wps">
+            <w:drawing>
+              <wp:anchor distT="0" distB="0" distL="114300" distR="114300" simplePos="0" relativeHeight="251692032" behindDoc="0" locked="0" layoutInCell="1" allowOverlap="1">
+                <wp:simplePos x="0" y="0"/>
+                <wp:positionH relativeFrom="column">
+                  <wp:posOffset>3806190</wp:posOffset>
+                </wp:positionH>
+                <wp:positionV relativeFrom="paragraph">
+                  <wp:posOffset>173990</wp:posOffset>
+                </wp:positionV>
+                <wp:extent cx="38100" cy="542925"/>
+                <wp:effectExtent l="76200" t="0" r="57150" b="47625"/>
+                <wp:wrapNone/>
+                <wp:docPr id="210" name="Conector de Seta Reta 210"/>
+                <wp:cNvGraphicFramePr/>
+                <a:graphic xmlns:a="http://schemas.openxmlformats.org/drawingml/2006/main">
+                  <a:graphicData uri="http://schemas.microsoft.com/office/word/2010/wordprocessingShape">
+                    <wps:wsp>
+                      <wps:cNvCnPr/>
+                      <wps:spPr>
+                        <a:xfrm flipH="1">
+                          <a:off x="0" y="0"/>
+                          <a:ext cx="38100" cy="542925"/>
+                        </a:xfrm>
+                        <a:prstGeom prst="straightConnector1">
+                          <a:avLst/>
+                        </a:prstGeom>
+                        <a:ln>
+                          <a:solidFill>
+                            <a:srgbClr val="FF0000"/>
+                          </a:solidFill>
+                          <a:tailEnd type="triangle"/>
+                        </a:ln>
+                      </wps:spPr>
+                      <wps:style>
+                        <a:lnRef idx="1">
+                          <a:schemeClr val="accent1"/>
+                        </a:lnRef>
+                        <a:fillRef idx="0">
+                          <a:schemeClr val="accent1"/>
+                        </a:fillRef>
+                        <a:effectRef idx="0">
+                          <a:schemeClr val="accent1"/>
+                        </a:effectRef>
+                        <a:fontRef idx="minor">
+                          <a:schemeClr val="tx1"/>
+                        </a:fontRef>
+                      </wps:style>
+                      <wps:bodyPr/>
+                    </wps:wsp>
+                  </a:graphicData>
+                </a:graphic>
+              </wp:anchor>
+            </w:drawing>
+          </mc:Choice>
+          <mc:Fallback>
+            <w:pict>
+              <v:shape w14:anchorId="4FE267E1" id="Conector de Seta Reta 210" o:spid="_x0000_s1026" type="#_x0000_t32" style="position:absolute;margin-left:299.7pt;margin-top:13.7pt;width:3pt;height:42.75pt;flip:x;z-index:251692032;visibility:visible;mso-wrap-style:square;mso-wrap-distance-left:9pt;mso-wrap-distance-top:0;mso-wrap-distance-right:9pt;mso-wrap-distance-bottom:0;mso-position-horizontal:absolute;mso-position-horizontal-relative:text;mso-position-vertical:absolute;mso-position-vertical-relative:text" o:gfxdata="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" strokecolor="red" strokeweight=".5pt">
+                <v:stroke endarrow="block" joinstyle="miter"/>
+              </v:shape>
+            </w:pict>
+          </mc:Fallback>
+        </mc:AlternateContent>
+      </w:r>
+      <w:r>
+        <w:rPr>
+          <w:noProof/>
+        </w:rPr>
+        <w:t>1 – ctrl + shift + i</w:t>
+      </w:r>
+    </w:p>
+    <w:p>
+      <w:pPr>
+        <w:rPr>
+          <w:noProof/>
+        </w:rPr>
+      </w:pPr>
+      <w:r>
+        <w:rPr>
+          <w:noProof/>
+        </w:rPr>
+        <w:t>2 – f12</w:t>
+      </w:r>
+    </w:p>
+    <w:p>
+      <w:pPr>
+        <w:rPr>
+          <w:noProof/>
+        </w:rPr>
+      </w:pPr>
+      <w:r>
+        <w:rPr>
+          <w:noProof/>
+        </w:rPr>
+        <w:drawing>
+          <wp:inline distT="0" distB="0" distL="0" distR="0" wp14:anchorId="4D68C9DD" wp14:editId="1509EAC2">
+            <wp:extent cx="6083201" cy="3019425"/>
+            <wp:effectExtent l="0" t="0" r="0" b="0"/>
+            <wp:docPr id="209" name="Imagem 209"/>
+            <wp:cNvGraphicFramePr>
+              <a:graphicFrameLocks xmlns:a="http://schemas.openxmlformats.org/drawingml/2006/main" noChangeAspect="1"/>
+            </wp:cNvGraphicFramePr>
+            <a:graphic xmlns:a="http://schemas.openxmlformats.org/drawingml/2006/main">
+              <a:graphicData uri="http://schemas.openxmlformats.org/drawingml/2006/picture">
+                <pic:pic xmlns:pic="http://schemas.openxmlformats.org/drawingml/2006/picture">
+                  <pic:nvPicPr>
+                    <pic:cNvPr id="1" name=""/>
+                    <pic:cNvPicPr/>
+                  </pic:nvPicPr>
+                  <pic:blipFill>
+                    <a:blip r:embed="rId190"/>
+                    <a:stretch>
+                      <a:fillRect/>
+                    </a:stretch>
+                  </pic:blipFill>
+                  <pic:spPr>
+                    <a:xfrm>
+                      <a:off x="0" y="0"/>
+                      <a:ext cx="6179077" cy="3067014"/>
+                    </a:xfrm>
+                    <a:prstGeom prst="rect">
+                      <a:avLst/>
+                    </a:prstGeom>
+                  </pic:spPr>
+                </pic:pic>
+              </a:graphicData>
+            </a:graphic>
+          </wp:inline>
+        </w:drawing>
+      </w:r>
+    </w:p>
+    <w:p>
+      <w:pPr>
+        <w:rPr>
+          <w:noProof/>
+        </w:rPr>
+      </w:pPr>
+      <w:r>
+        <w:rPr>
+          <w:noProof/>
+        </w:rPr>
+        <w:t>Ao clicar no botão congitme desenho acima podemos ver o nosso site como ele se comporta no formato celular.</w:t>
+      </w:r>
+    </w:p>
+    <w:p>
+      <w:pPr>
+        <w:rPr>
+          <w:noProof/>
+        </w:rPr>
+      </w:pPr>
+      <w:r>
+        <w:rPr>
+          <w:noProof/>
+        </w:rPr>
+        <w:t>121 – Precisamos compreender quantos pixels existem na tela para trabalharmos em uma melhor exibição. Atualmente, nossa tela esta adaptada ao tamanho disponibilizados pelo navegador de 940px mínimo.</w:t>
+      </w:r>
+    </w:p>
+    <w:p>
+      <w:pPr>
+        <w:rPr>
+          <w:noProof/>
+        </w:rPr>
+      </w:pPr>
+      <w:r>
+        <w:rPr>
+          <w:noProof/>
+        </w:rPr>
+        <w:t>No caso de celulares o panorâma é diferente mesmo que a resolução do dispositivo de celulares seja de 2000px, a quantidade de pixels na tela sempre será diferente da quantidade de pixels na tela. Esses valores são chamados de DPI que é “densidade de pixels por polegada”.</w:t>
+      </w:r>
+    </w:p>
+    <w:p>
+      <w:pPr>
+        <w:rPr>
+          <w:noProof/>
+        </w:rPr>
+      </w:pPr>
+      <w:r>
+        <w:rPr>
+          <w:noProof/>
+        </w:rPr>
+        <w:t>Geralmente, os celulares possuem 320px de largura de tela, alguns maiores 350px a 480px.</w:t>
+      </w:r>
+    </w:p>
+    <w:p>
+      <w:pPr>
+        <w:rPr>
+          <w:b/>
+          <w:noProof/>
+        </w:rPr>
+      </w:pPr>
+      <w:r>
+        <w:rPr>
+          <w:b/>
+          <w:noProof/>
+        </w:rPr>
+        <w:t>Para saber a quantidade de pixels o navegador utiliza uma tag do html (ou seja, para saber o tamanho da tela que esta sendo renderizado o site).</w:t>
+      </w:r>
+    </w:p>
+    <w:p>
+      <w:pPr>
+        <w:rPr>
+          <w:b/>
+          <w:noProof/>
+        </w:rPr>
+      </w:pPr>
+      <w:r>
+        <w:rPr>
+          <w:b/>
+          <w:noProof/>
+        </w:rPr>
+        <w:drawing>
+          <wp:inline distT="0" distB="0" distL="0" distR="0" wp14:anchorId="3E98490A" wp14:editId="03BE2899">
+            <wp:extent cx="5201376" cy="200053"/>
+            <wp:effectExtent l="0" t="0" r="0" b="9525"/>
+            <wp:docPr id="211" name="Imagem 211"/>
+            <wp:cNvGraphicFramePr>
+              <a:graphicFrameLocks xmlns:a="http://schemas.openxmlformats.org/drawingml/2006/main" noChangeAspect="1"/>
+            </wp:cNvGraphicFramePr>
+            <a:graphic xmlns:a="http://schemas.openxmlformats.org/drawingml/2006/main">
+              <a:graphicData uri="http://schemas.openxmlformats.org/drawingml/2006/picture">
+                <pic:pic xmlns:pic="http://schemas.openxmlformats.org/drawingml/2006/picture">
+                  <pic:nvPicPr>
+                    <pic:cNvPr id="1" name=""/>
+                    <pic:cNvPicPr/>
+                  </pic:nvPicPr>
+                  <pic:blipFill>
+                    <a:blip r:embed="rId191"/>
+                    <a:stretch>
+                      <a:fillRect/>
+                    </a:stretch>
+                  </pic:blipFill>
+                  <pic:spPr>
+                    <a:xfrm>
+                      <a:off x="0" y="0"/>
+                      <a:ext cx="5201376" cy="200053"/>
+                    </a:xfrm>
+                    <a:prstGeom prst="rect">
+                      <a:avLst/>
+                    </a:prstGeom>
+                  </pic:spPr>
+                </pic:pic>
+              </a:graphicData>
+            </a:graphic>
+          </wp:inline>
+        </w:drawing>
+      </w:r>
+    </w:p>
+    <w:p>
+      <w:pPr>
+        <w:rPr>
+          <w:noProof/>
+        </w:rPr>
+      </w:pPr>
+      <w:r>
+        <w:rPr>
+          <w:noProof/>
+        </w:rPr>
+        <w:t>122 – Estamos informando ao navegador ao fazer uma pesquisa onde possui uma tela que a largura máxima seja 480px precisar entregar as seguintes configurações.</w:t>
+      </w:r>
+    </w:p>
+    <w:p>
+      <w:pPr>
+        <w:rPr>
+          <w:noProof/>
+        </w:rPr>
+      </w:pPr>
+      <w:r>
+        <w:rPr>
+          <w:noProof/>
+        </w:rPr>
+        <w:drawing>
+          <wp:inline distT="0" distB="0" distL="0" distR="0" wp14:anchorId="3463C425" wp14:editId="5B1CECBE">
+            <wp:extent cx="2895600" cy="594719"/>
+            <wp:effectExtent l="0" t="0" r="0" b="0"/>
+            <wp:docPr id="212" name="Imagem 212"/>
+            <wp:cNvGraphicFramePr>
+              <a:graphicFrameLocks xmlns:a="http://schemas.openxmlformats.org/drawingml/2006/main" noChangeAspect="1"/>
+            </wp:cNvGraphicFramePr>
+            <a:graphic xmlns:a="http://schemas.openxmlformats.org/drawingml/2006/main">
+              <a:graphicData uri="http://schemas.openxmlformats.org/drawingml/2006/picture">
+                <pic:pic xmlns:pic="http://schemas.openxmlformats.org/drawingml/2006/picture">
+                  <pic:nvPicPr>
+                    <pic:cNvPr id="1" name=""/>
+                    <pic:cNvPicPr/>
+                  </pic:nvPicPr>
+                  <pic:blipFill>
+                    <a:blip r:embed="rId192"/>
+                    <a:stretch>
+                      <a:fillRect/>
+                    </a:stretch>
+                  </pic:blipFill>
+                  <pic:spPr>
+                    <a:xfrm>
+                      <a:off x="0" y="0"/>
+                      <a:ext cx="2899775" cy="595577"/>
+                    </a:xfrm>
+                    <a:prstGeom prst="rect">
+                      <a:avLst/>
+                    </a:prstGeom>
+                  </pic:spPr>
+                </pic:pic>
+              </a:graphicData>
+            </a:graphic>
+          </wp:inline>
+        </w:drawing>
+      </w:r>
+    </w:p>
+    <w:p>
+      <w:pPr>
+        <w:rPr>
+          <w:noProof/>
+        </w:rPr>
+      </w:pPr>
+      <w:r>
+        <w:rPr>
+          <w:noProof/>
+        </w:rPr>
+        <w:lastRenderedPageBreak/>
+        <w:t xml:space="preserve">123 </w:t>
+      </w:r>
+      <w:r>
+        <w:rPr>
+          <w:noProof/>
+        </w:rPr>
+        <w:t>–</w:t>
+      </w:r>
+      <w:r>
+        <w:rPr>
+          <w:noProof/>
+        </w:rPr>
+        <w:t xml:space="preserve"> </w:t>
+      </w:r>
+      <w:r>
+        <w:rPr>
+          <w:noProof/>
+        </w:rPr>
+        <w:t>A principal tática para não perder muito tempo criando um lay</w:t>
+      </w:r>
+      <w:r>
+        <w:rPr>
+          <w:noProof/>
+        </w:rPr>
+        <w:t>out responsivo é usar medidas proporcionais para TUDO ao criar um site com layout  que se adapte sempre.</w:t>
+      </w:r>
+    </w:p>
+    <w:p>
+      <w:pPr>
+        <w:rPr>
+          <w:noProof/>
+        </w:rPr>
+      </w:pPr>
+      <w:r>
+        <w:rPr>
+          <w:noProof/>
+        </w:rPr>
+        <w:t>Ou seja, ao observamos o código a baixo podemos deduzir que a nossa página index.html esta bem estruturada com várias medidas como por exemplo.</w:t>
+      </w:r>
+    </w:p>
+    <w:p>
+      <w:pPr>
+        <w:rPr>
+          <w:noProof/>
+        </w:rPr>
+      </w:pPr>
+      <w:r>
+        <w:rPr>
+          <w:noProof/>
+        </w:rPr>
+        <w:t>.caixa(div menu com tamanho de 940px)</w:t>
+      </w:r>
+    </w:p>
+    <w:p>
+      <w:pPr>
+        <w:rPr>
+          <w:noProof/>
+        </w:rPr>
+      </w:pPr>
+      <w:r>
+        <w:rPr>
+          <w:noProof/>
+        </w:rPr>
+        <w:t>.principal(section da parte pricipal da página com medida de 940px)</w:t>
+      </w:r>
+    </w:p>
+    <w:p>
+      <w:pPr>
+        <w:rPr>
+          <w:noProof/>
+        </w:rPr>
+      </w:pPr>
+      <w:r>
+        <w:rPr>
+          <w:noProof/>
+        </w:rPr>
+        <w:t>.mapa(section do mapa com medida de 940px)</w:t>
+      </w:r>
+    </w:p>
+    <w:p>
+      <w:pPr>
+        <w:rPr>
+          <w:noProof/>
+        </w:rPr>
+      </w:pPr>
+      <w:r>
+        <w:rPr>
+          <w:noProof/>
+        </w:rPr>
+        <w:t>Colocamos uma medida para toda divisão da nossa página tornando fácil para a página ficar responsiva.</w:t>
+      </w:r>
+    </w:p>
+    <w:p>
+      <w:pPr>
+        <w:rPr>
+          <w:noProof/>
+        </w:rPr>
+      </w:pPr>
+      <w:r>
+        <w:rPr>
+          <w:noProof/>
+        </w:rPr>
+        <w:drawing>
+          <wp:inline distT="0" distB="0" distL="0" distR="0" wp14:anchorId="4F7E332F" wp14:editId="1906B69A">
+            <wp:extent cx="5400040" cy="718820"/>
+            <wp:effectExtent l="0" t="0" r="0" b="5080"/>
+            <wp:docPr id="213" name="Imagem 213"/>
+            <wp:cNvGraphicFramePr>
+              <a:graphicFrameLocks xmlns:a="http://schemas.openxmlformats.org/drawingml/2006/main" noChangeAspect="1"/>
+            </wp:cNvGraphicFramePr>
+            <a:graphic xmlns:a="http://schemas.openxmlformats.org/drawingml/2006/main">
+              <a:graphicData uri="http://schemas.openxmlformats.org/drawingml/2006/picture">
+                <pic:pic xmlns:pic="http://schemas.openxmlformats.org/drawingml/2006/picture">
+                  <pic:nvPicPr>
+                    <pic:cNvPr id="1" name=""/>
+                    <pic:cNvPicPr/>
+                  </pic:nvPicPr>
+                  <pic:blipFill>
+                    <a:blip r:embed="rId193"/>
+                    <a:stretch>
+                      <a:fillRect/>
+                    </a:stretch>
+                  </pic:blipFill>
+                  <pic:spPr>
+                    <a:xfrm>
+                      <a:off x="0" y="0"/>
+                      <a:ext cx="5400040" cy="718820"/>
+                    </a:xfrm>
+                    <a:prstGeom prst="rect">
+                      <a:avLst/>
+                    </a:prstGeom>
+                  </pic:spPr>
+                </pic:pic>
+              </a:graphicData>
+            </a:graphic>
+          </wp:inline>
+        </w:drawing>
+      </w:r>
+    </w:p>
+    <w:p>
+      <w:pPr>
+        <w:rPr>
+          <w:noProof/>
+        </w:rPr>
+      </w:pPr>
+      <w:r>
+        <w:rPr>
+          <w:noProof/>
+        </w:rPr>
+        <mc:AlternateContent>
+          <mc:Choice Requires="wps">
+            <w:drawing>
+              <wp:anchor distT="0" distB="0" distL="114300" distR="114300" simplePos="0" relativeHeight="251693056" behindDoc="0" locked="0" layoutInCell="1" allowOverlap="1">
+                <wp:simplePos x="0" y="0"/>
+                <wp:positionH relativeFrom="column">
+                  <wp:posOffset>1043940</wp:posOffset>
+                </wp:positionH>
+                <wp:positionV relativeFrom="paragraph">
+                  <wp:posOffset>328930</wp:posOffset>
+                </wp:positionV>
+                <wp:extent cx="647700" cy="142875"/>
+                <wp:effectExtent l="38100" t="0" r="19050" b="85725"/>
+                <wp:wrapNone/>
+                <wp:docPr id="215" name="Conector de Seta Reta 215"/>
+                <wp:cNvGraphicFramePr/>
+                <a:graphic xmlns:a="http://schemas.openxmlformats.org/drawingml/2006/main">
+                  <a:graphicData uri="http://schemas.microsoft.com/office/word/2010/wordprocessingShape">
+                    <wps:wsp>
+                      <wps:cNvCnPr/>
+                      <wps:spPr>
+                        <a:xfrm flipH="1">
+                          <a:off x="0" y="0"/>
+                          <a:ext cx="647700" cy="142875"/>
+                        </a:xfrm>
+                        <a:prstGeom prst="straightConnector1">
+                          <a:avLst/>
+                        </a:prstGeom>
+                        <a:ln>
+                          <a:solidFill>
+                            <a:srgbClr val="FF0000"/>
+                          </a:solidFill>
+                          <a:tailEnd type="triangle"/>
+                        </a:ln>
+                      </wps:spPr>
+                      <wps:style>
+                        <a:lnRef idx="1">
+                          <a:schemeClr val="accent1"/>
+                        </a:lnRef>
+                        <a:fillRef idx="0">
+                          <a:schemeClr val="accent1"/>
+                        </a:fillRef>
+                        <a:effectRef idx="0">
+                          <a:schemeClr val="accent1"/>
+                        </a:effectRef>
+                        <a:fontRef idx="minor">
+                          <a:schemeClr val="tx1"/>
+                        </a:fontRef>
+                      </wps:style>
+                      <wps:bodyPr/>
+                    </wps:wsp>
+                  </a:graphicData>
+                </a:graphic>
+              </wp:anchor>
+            </w:drawing>
+          </mc:Choice>
+          <mc:Fallback>
+            <w:pict>
+              <v:shape w14:anchorId="22543D11" id="Conector de Seta Reta 215" o:spid="_x0000_s1026" type="#_x0000_t32" style="position:absolute;margin-left:82.2pt;margin-top:25.9pt;width:51pt;height:11.25pt;flip:x;z-index:251693056;visibility:visible;mso-wrap-style:square;mso-wrap-distance-left:9pt;mso-wrap-distance-top:0;mso-wrap-distance-right:9pt;mso-wrap-distance-bottom:0;mso-position-horizontal:absolute;mso-position-horizontal-relative:text;mso-position-vertical:absolute;mso-position-vertical-relative:text" o:gfxdata="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" strokecolor="red" strokeweight=".5pt">
+                <v:stroke endarrow="block" joinstyle="miter"/>
+              </v:shape>
+            </w:pict>
+          </mc:Fallback>
+        </mc:AlternateContent>
+      </w:r>
+      <w:r>
+        <w:rPr>
+          <w:noProof/>
+        </w:rPr>
+        <w:t>124 – O vídeo estava com uma largura fixa no html, trocamos o valor para width:100% e o vídeo ficou ajustado para o tamnho de tela do celular.</w:t>
+      </w:r>
+    </w:p>
+    <w:p>
+      <w:pPr>
+        <w:rPr>
+          <w:noProof/>
+        </w:rPr>
+      </w:pPr>
+      <w:r>
+        <w:rPr>
+          <w:noProof/>
+        </w:rPr>
+        <w:drawing>
+          <wp:inline distT="0" distB="0" distL="0" distR="0" wp14:anchorId="398EC39F" wp14:editId="0CDFD0F9">
+            <wp:extent cx="5400040" cy="200025"/>
+            <wp:effectExtent l="0" t="0" r="0" b="9525"/>
+            <wp:docPr id="214" name="Imagem 214"/>
+            <wp:cNvGraphicFramePr>
+              <a:graphicFrameLocks xmlns:a="http://schemas.openxmlformats.org/drawingml/2006/main" noChangeAspect="1"/>
+            </wp:cNvGraphicFramePr>
+            <a:graphic xmlns:a="http://schemas.openxmlformats.org/drawingml/2006/main">
+              <a:graphicData uri="http://schemas.openxmlformats.org/drawingml/2006/picture">
+                <pic:pic xmlns:pic="http://schemas.openxmlformats.org/drawingml/2006/picture">
+                  <pic:nvPicPr>
+                    <pic:cNvPr id="1" name=""/>
+                    <pic:cNvPicPr/>
+                  </pic:nvPicPr>
+                  <pic:blipFill>
+                    <a:blip r:embed="rId194"/>
+                    <a:stretch>
+                      <a:fillRect/>
+                    </a:stretch>
+                  </pic:blipFill>
+                  <pic:spPr>
+                    <a:xfrm>
+                      <a:off x="0" y="0"/>
+                      <a:ext cx="5408949" cy="200355"/>
+                    </a:xfrm>
+                    <a:prstGeom prst="rect">
+                      <a:avLst/>
+                    </a:prstGeom>
+                  </pic:spPr>
+                </pic:pic>
+              </a:graphicData>
+            </a:graphic>
+          </wp:inline>
+        </w:drawing>
+      </w:r>
+    </w:p>
+    <w:p>
+      <w:pPr>
+        <w:rPr>
+          <w:noProof/>
+        </w:rPr>
+      </w:pPr>
+      <w:r>
+        <w:rPr>
+          <w:noProof/>
+        </w:rPr>
+        <w:t>125 – Para centralizar o logo que esta dentro do h1, utilizamos o seguinte comando:</w:t>
+      </w:r>
+    </w:p>
+    <w:p>
+      <w:pPr>
+        <w:rPr>
+          <w:noProof/>
+        </w:rPr>
+      </w:pPr>
+      <w:r>
+        <w:rPr>
+          <w:noProof/>
+        </w:rPr>
+        <mc:AlternateContent>
+          <mc:Choice Requires="wps">
+            <w:drawing>
+              <wp:anchor distT="0" distB="0" distL="114300" distR="114300" simplePos="0" relativeHeight="251695104" behindDoc="0" locked="0" layoutInCell="1" allowOverlap="1">
+                <wp:simplePos x="0" y="0"/>
+                <wp:positionH relativeFrom="column">
+                  <wp:posOffset>1282065</wp:posOffset>
+                </wp:positionH>
+                <wp:positionV relativeFrom="paragraph">
+                  <wp:posOffset>1154430</wp:posOffset>
+                </wp:positionV>
+                <wp:extent cx="371475" cy="190500"/>
+                <wp:effectExtent l="38100" t="0" r="28575" b="57150"/>
+                <wp:wrapNone/>
+                <wp:docPr id="220" name="Conector de Seta Reta 220"/>
+                <wp:cNvGraphicFramePr/>
+                <a:graphic xmlns:a="http://schemas.openxmlformats.org/drawingml/2006/main">
+                  <a:graphicData uri="http://schemas.microsoft.com/office/word/2010/wordprocessingShape">
+                    <wps:wsp>
+                      <wps:cNvCnPr/>
+                      <wps:spPr>
+                        <a:xfrm flipH="1">
+                          <a:off x="0" y="0"/>
+                          <a:ext cx="371475" cy="190500"/>
+                        </a:xfrm>
+                        <a:prstGeom prst="straightConnector1">
+                          <a:avLst/>
+                        </a:prstGeom>
+                        <a:ln>
+                          <a:solidFill>
+                            <a:srgbClr val="FF0000"/>
+                          </a:solidFill>
+                          <a:tailEnd type="triangle"/>
+                        </a:ln>
+                      </wps:spPr>
+                      <wps:style>
+                        <a:lnRef idx="1">
+                          <a:schemeClr val="accent1"/>
+                        </a:lnRef>
+                        <a:fillRef idx="0">
+                          <a:schemeClr val="accent1"/>
+                        </a:fillRef>
+                        <a:effectRef idx="0">
+                          <a:schemeClr val="accent1"/>
+                        </a:effectRef>
+                        <a:fontRef idx="minor">
+                          <a:schemeClr val="tx1"/>
+                        </a:fontRef>
+                      </wps:style>
+                      <wps:bodyPr/>
+                    </wps:wsp>
+                  </a:graphicData>
+                </a:graphic>
+              </wp:anchor>
+            </w:drawing>
+          </mc:Choice>
+          <mc:Fallback>
+            <w:pict>
+              <v:shape w14:anchorId="24C995F9" id="Conector de Seta Reta 220" o:spid="_x0000_s1026" type="#_x0000_t32" style="position:absolute;margin-left:100.95pt;margin-top:90.9pt;width:29.25pt;height:15pt;flip:x;z-index:251695104;visibility:visible;mso-wrap-style:square;mso-wrap-distance-left:9pt;mso-wrap-distance-top:0;mso-wrap-distance-right:9pt;mso-wrap-distance-bottom:0;mso-position-horizontal:absolute;mso-position-horizontal-relative:text;mso-position-vertical:absolute;mso-position-vertical-relative:text" o:gfxdata="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" strokecolor="red" strokeweight=".5pt">
+                <v:stroke endarrow="block" joinstyle="miter"/>
+              </v:shape>
+            </w:pict>
+          </mc:Fallback>
+        </mc:AlternateContent>
+      </w:r>
+      <w:r>
+        <w:rPr>
+          <w:noProof/>
+        </w:rPr>
+        <w:drawing>
+          <wp:inline distT="0" distB="0" distL="0" distR="0" wp14:anchorId="0C36F3DD" wp14:editId="3B559A0D">
+            <wp:extent cx="1740067" cy="1695450"/>
+            <wp:effectExtent l="0" t="0" r="0" b="0"/>
+            <wp:docPr id="216" name="Imagem 216"/>
+            <wp:cNvGraphicFramePr>
+              <a:graphicFrameLocks xmlns:a="http://schemas.openxmlformats.org/drawingml/2006/main" noChangeAspect="1"/>
+            </wp:cNvGraphicFramePr>
+            <a:graphic xmlns:a="http://schemas.openxmlformats.org/drawingml/2006/main">
+              <a:graphicData uri="http://schemas.openxmlformats.org/drawingml/2006/picture">
+                <pic:pic xmlns:pic="http://schemas.openxmlformats.org/drawingml/2006/picture">
+                  <pic:nvPicPr>
+                    <pic:cNvPr id="1" name=""/>
+                    <pic:cNvPicPr/>
+                  </pic:nvPicPr>
+                  <pic:blipFill>
+                    <a:blip r:embed="rId195"/>
+                    <a:stretch>
+                      <a:fillRect/>
+                    </a:stretch>
+                  </pic:blipFill>
+                  <pic:spPr>
+                    <a:xfrm>
+                      <a:off x="0" y="0"/>
+                      <a:ext cx="1757504" cy="1712440"/>
+                    </a:xfrm>
+                    <a:prstGeom prst="rect">
+                      <a:avLst/>
+                    </a:prstGeom>
+                  </pic:spPr>
+                </pic:pic>
+              </a:graphicData>
+            </a:graphic>
+          </wp:inline>
+        </w:drawing>
+      </w:r>
+      <w:r>
+        <w:rPr>
+          <w:noProof/>
+        </w:rPr>
+        <w:drawing>
+          <wp:inline distT="0" distB="0" distL="0" distR="0" wp14:anchorId="5F76848F" wp14:editId="2EB47FDC">
+            <wp:extent cx="781050" cy="1692848"/>
+            <wp:effectExtent l="0" t="0" r="0" b="3175"/>
+            <wp:docPr id="217" name="Imagem 217"/>
+            <wp:cNvGraphicFramePr>
+              <a:graphicFrameLocks xmlns:a="http://schemas.openxmlformats.org/drawingml/2006/main" noChangeAspect="1"/>
+            </wp:cNvGraphicFramePr>
+            <a:graphic xmlns:a="http://schemas.openxmlformats.org/drawingml/2006/main">
+              <a:graphicData uri="http://schemas.openxmlformats.org/drawingml/2006/picture">
+                <pic:pic xmlns:pic="http://schemas.openxmlformats.org/drawingml/2006/picture">
+                  <pic:nvPicPr>
+                    <pic:cNvPr id="1" name=""/>
+                    <pic:cNvPicPr/>
+                  </pic:nvPicPr>
+                  <pic:blipFill>
+                    <a:blip r:embed="rId196"/>
+                    <a:stretch>
+                      <a:fillRect/>
+                    </a:stretch>
+                  </pic:blipFill>
+                  <pic:spPr>
+                    <a:xfrm>
+                      <a:off x="0" y="0"/>
+                      <a:ext cx="826391" cy="1791120"/>
+                    </a:xfrm>
+                    <a:prstGeom prst="rect">
+                      <a:avLst/>
+                    </a:prstGeom>
+                  </pic:spPr>
+                </pic:pic>
+              </a:graphicData>
+            </a:graphic>
+          </wp:inline>
+        </w:drawing>
+      </w:r>
+    </w:p>
+    <w:p>
+      <w:pPr>
+        <w:rPr>
+          <w:noProof/>
+        </w:rPr>
+      </w:pPr>
+      <w:r>
+        <w:rPr>
+          <w:noProof/>
+        </w:rPr>
+        <w:t xml:space="preserve">126 </w:t>
+      </w:r>
+      <w:r>
+        <w:rPr>
+          <w:noProof/>
+        </w:rPr>
+        <w:t>–</w:t>
+      </w:r>
+      <w:r>
+        <w:rPr>
+          <w:noProof/>
+        </w:rPr>
+        <w:t xml:space="preserve"> </w:t>
+      </w:r>
+      <w:r>
+        <w:rPr>
+          <w:noProof/>
+        </w:rPr>
+        <w:t>Para ajustar o menu utilizamos o “position:static” onde queriamos que ele ficasse em baixo do logo conforme está no html com isso substítuimos o “position: absolute”.</w:t>
+      </w:r>
+    </w:p>
+    <w:p>
+      <w:pPr>
+        <w:rPr>
+          <w:noProof/>
+        </w:rPr>
+      </w:pPr>
+      <w:r>
+        <w:rPr>
+          <w:noProof/>
+        </w:rPr>
+        <mc:AlternateContent>
+          <mc:Choice Requires="wps">
+            <w:drawing>
+              <wp:anchor distT="0" distB="0" distL="114300" distR="114300" simplePos="0" relativeHeight="251694080" behindDoc="0" locked="0" layoutInCell="1" allowOverlap="1">
+                <wp:simplePos x="0" y="0"/>
+                <wp:positionH relativeFrom="column">
+                  <wp:posOffset>1358265</wp:posOffset>
+                </wp:positionH>
+                <wp:positionV relativeFrom="paragraph">
+                  <wp:posOffset>2007870</wp:posOffset>
+                </wp:positionV>
+                <wp:extent cx="523875" cy="66675"/>
+                <wp:effectExtent l="38100" t="19050" r="28575" b="85725"/>
+                <wp:wrapNone/>
+                <wp:docPr id="219" name="Conector de Seta Reta 219"/>
+                <wp:cNvGraphicFramePr/>
+                <a:graphic xmlns:a="http://schemas.openxmlformats.org/drawingml/2006/main">
+                  <a:graphicData uri="http://schemas.microsoft.com/office/word/2010/wordprocessingShape">
+                    <wps:wsp>
+                      <wps:cNvCnPr/>
+                      <wps:spPr>
+                        <a:xfrm flipH="1">
+                          <a:off x="0" y="0"/>
+                          <a:ext cx="523875" cy="66675"/>
+                        </a:xfrm>
+                        <a:prstGeom prst="straightConnector1">
+                          <a:avLst/>
+                        </a:prstGeom>
+                        <a:ln>
+                          <a:solidFill>
+                            <a:srgbClr val="FF0000"/>
+                          </a:solidFill>
+                          <a:tailEnd type="triangle"/>
+                        </a:ln>
+                      </wps:spPr>
+                      <wps:style>
+                        <a:lnRef idx="1">
+                          <a:schemeClr val="accent1"/>
+                        </a:lnRef>
+                        <a:fillRef idx="0">
+                          <a:schemeClr val="accent1"/>
+                        </a:fillRef>
+                        <a:effectRef idx="0">
+                          <a:schemeClr val="accent1"/>
+                        </a:effectRef>
+                        <a:fontRef idx="minor">
+                          <a:schemeClr val="tx1"/>
+                        </a:fontRef>
+                      </wps:style>
+                      <wps:bodyPr/>
+                    </wps:wsp>
+                  </a:graphicData>
+                </a:graphic>
+              </wp:anchor>
+            </w:drawing>
+          </mc:Choice>
+          <mc:Fallback>
+            <w:pict>
+              <v:shape w14:anchorId="5B927131" id="Conector de Seta Reta 219" o:spid="_x0000_s1026" type="#_x0000_t32" style="position:absolute;margin-left:106.95pt;margin-top:158.1pt;width:41.25pt;height:5.25pt;flip:x;z-index:251694080;visibility:visible;mso-wrap-style:square;mso-wrap-distance-left:9pt;mso-wrap-distance-top:0;mso-wrap-distance-right:9pt;mso-wrap-distance-bottom:0;mso-position-horizontal:absolute;mso-position-horizontal-relative:text;mso-position-vertical:absolute;mso-position-vertical-relative:text" o:gfxdata="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" strokecolor="red" strokeweight=".5pt">
+                <v:stroke endarrow="block" joinstyle="miter"/>
+              </v:shape>
+            </w:pict>
+          </mc:Fallback>
+        </mc:AlternateContent>
+      </w:r>
+      <w:r>
+        <w:rPr>
+          <w:noProof/>
+        </w:rPr>
+        <w:drawing>
+          <wp:inline distT="0" distB="0" distL="0" distR="0" wp14:anchorId="2B79ECAF" wp14:editId="7A319F90">
+            <wp:extent cx="1914525" cy="2411804"/>
             <wp:effectExtent l="0" t="0" r="0" b="7620"/>
-            <wp:docPr id="207" name="Imagem 207"/>
-            <wp:cNvGraphicFramePr>
-              <a:graphicFrameLocks xmlns:a="http://schemas.openxmlformats.org/drawingml/2006/main" noChangeAspect="1"/>
-            </wp:cNvGraphicFramePr>
-            <a:graphic xmlns:a="http://schemas.openxmlformats.org/drawingml/2006/main">
-              <a:graphicData uri="http://schemas.openxmlformats.org/drawingml/2006/picture">
-                <pic:pic xmlns:pic="http://schemas.openxmlformats.org/drawingml/2006/picture">
-                  <pic:nvPicPr>
-                    <pic:cNvPr id="1" name=""/>
-                    <pic:cNvPicPr/>
-                  </pic:nvPicPr>
-                  <pic:blipFill>
-                    <a:blip r:embed="rId189"/>
-                    <a:stretch>
-                      <a:fillRect/>
-                    </a:stretch>
-                  </pic:blipFill>
-                  <pic:spPr>
-                    <a:xfrm>
-                      <a:off x="0" y="0"/>
-                      <a:ext cx="2827064" cy="992391"/>
-                    </a:xfrm>
-                    <a:prstGeom prst="rect">
-                      <a:avLst/>
-                    </a:prstGeom>
-                  </pic:spPr>
-                </pic:pic>
-              </a:graphicData>
-            </a:graphic>
-          </wp:inline>
-        </w:drawing>
-      </w:r>
-    </w:p>
-    <w:p>
-      <w:pPr>
-        <w:rPr>
-          <w:noProof/>
-        </w:rPr>
-      </w:pPr>
-      <w:r>
-        <w:rPr>
-          <w:noProof/>
-        </w:rPr>
-        <w:t xml:space="preserve">120 - </w:t>
+            <wp:docPr id="218" name="Imagem 218"/>
+            <wp:cNvGraphicFramePr>
+              <a:graphicFrameLocks xmlns:a="http://schemas.openxmlformats.org/drawingml/2006/main" noChangeAspect="1"/>
+            </wp:cNvGraphicFramePr>
+            <a:graphic xmlns:a="http://schemas.openxmlformats.org/drawingml/2006/main">
+              <a:graphicData uri="http://schemas.openxmlformats.org/drawingml/2006/picture">
+                <pic:pic xmlns:pic="http://schemas.openxmlformats.org/drawingml/2006/picture">
+                  <pic:nvPicPr>
+                    <pic:cNvPr id="1" name=""/>
+                    <pic:cNvPicPr/>
+                  </pic:nvPicPr>
+                  <pic:blipFill>
+                    <a:blip r:embed="rId197"/>
+                    <a:stretch>
+                      <a:fillRect/>
+                    </a:stretch>
+                  </pic:blipFill>
+                  <pic:spPr>
+                    <a:xfrm>
+                      <a:off x="0" y="0"/>
+                      <a:ext cx="1931118" cy="2432707"/>
+                    </a:xfrm>
+                    <a:prstGeom prst="rect">
+                      <a:avLst/>
+                    </a:prstGeom>
+                  </pic:spPr>
+                </pic:pic>
+              </a:graphicData>
+            </a:graphic>
+          </wp:inline>
+        </w:drawing>
+      </w:r>
+    </w:p>
+    <w:p>
+      <w:pPr>
+        <w:rPr>
+          <w:noProof/>
+        </w:rPr>
+      </w:pPr>
+      <w:r>
+        <w:rPr>
+          <w:noProof/>
+        </w:rPr>
+        <w:lastRenderedPageBreak/>
+        <w:t xml:space="preserve">127 - </w:t>
       </w:r>
       <w:bookmarkStart w:id="0" w:name="_GoBack"/>
       <w:bookmarkEnd w:id="0"/>
+    </w:p>
+    <w:p>
+      <w:pPr>
+        <w:rPr>
+          <w:noProof/>
+        </w:rPr>
+      </w:pPr>
     </w:p>
     <w:sectPr>
       <w:pgSz w:w="11906" w:h="16838"/>
@@ -15129,8 +16136,100 @@
       </w:rPr>
     </w:lvl>
   </w:abstractNum>
+  <w:abstractNum w:abstractNumId="1" w15:restartNumberingAfterBreak="0">
+    <w:nsid w:val="5AEC58CA"/>
+    <w:multiLevelType w:val="hybridMultilevel"/>
+    <w:tmpl w:val="BD2816AA"/>
+    <w:lvl w:ilvl="0" w:tplc="0416000F">
+      <w:start w:val="1"/>
+      <w:numFmt w:val="decimal"/>
+      <w:lvlText w:val="%1."/>
+      <w:lvlJc w:val="left"/>
+      <w:pPr>
+        <w:ind w:left="720" w:hanging="360"/>
+      </w:pPr>
+      <w:rPr>
+        <w:rFonts w:hint="default"/>
+      </w:rPr>
+    </w:lvl>
+    <w:lvl w:ilvl="1" w:tplc="04160019" w:tentative="1">
+      <w:start w:val="1"/>
+      <w:numFmt w:val="lowerLetter"/>
+      <w:lvlText w:val="%2."/>
+      <w:lvlJc w:val="left"/>
+      <w:pPr>
+        <w:ind w:left="1440" w:hanging="360"/>
+      </w:pPr>
+    </w:lvl>
+    <w:lvl w:ilvl="2" w:tplc="0416001B" w:tentative="1">
+      <w:start w:val="1"/>
+      <w:numFmt w:val="lowerRoman"/>
+      <w:lvlText w:val="%3."/>
+      <w:lvlJc w:val="right"/>
+      <w:pPr>
+        <w:ind w:left="2160" w:hanging="180"/>
+      </w:pPr>
+    </w:lvl>
+    <w:lvl w:ilvl="3" w:tplc="0416000F" w:tentative="1">
+      <w:start w:val="1"/>
+      <w:numFmt w:val="decimal"/>
+      <w:lvlText w:val="%4."/>
+      <w:lvlJc w:val="left"/>
+      <w:pPr>
+        <w:ind w:left="2880" w:hanging="360"/>
+      </w:pPr>
+    </w:lvl>
+    <w:lvl w:ilvl="4" w:tplc="04160019" w:tentative="1">
+      <w:start w:val="1"/>
+      <w:numFmt w:val="lowerLetter"/>
+      <w:lvlText w:val="%5."/>
+      <w:lvlJc w:val="left"/>
+      <w:pPr>
+        <w:ind w:left="3600" w:hanging="360"/>
+      </w:pPr>
+    </w:lvl>
+    <w:lvl w:ilvl="5" w:tplc="0416001B" w:tentative="1">
+      <w:start w:val="1"/>
+      <w:numFmt w:val="lowerRoman"/>
+      <w:lvlText w:val="%6."/>
+      <w:lvlJc w:val="right"/>
+      <w:pPr>
+        <w:ind w:left="4320" w:hanging="180"/>
+      </w:pPr>
+    </w:lvl>
+    <w:lvl w:ilvl="6" w:tplc="0416000F" w:tentative="1">
+      <w:start w:val="1"/>
+      <w:numFmt w:val="decimal"/>
+      <w:lvlText w:val="%7."/>
+      <w:lvlJc w:val="left"/>
+      <w:pPr>
+        <w:ind w:left="5040" w:hanging="360"/>
+      </w:pPr>
+    </w:lvl>
+    <w:lvl w:ilvl="7" w:tplc="04160019" w:tentative="1">
+      <w:start w:val="1"/>
+      <w:numFmt w:val="lowerLetter"/>
+      <w:lvlText w:val="%8."/>
+      <w:lvlJc w:val="left"/>
+      <w:pPr>
+        <w:ind w:left="5760" w:hanging="360"/>
+      </w:pPr>
+    </w:lvl>
+    <w:lvl w:ilvl="8" w:tplc="0416001B" w:tentative="1">
+      <w:start w:val="1"/>
+      <w:numFmt w:val="lowerRoman"/>
+      <w:lvlText w:val="%9."/>
+      <w:lvlJc w:val="right"/>
+      <w:pPr>
+        <w:ind w:left="6480" w:hanging="180"/>
+      </w:pPr>
+    </w:lvl>
+  </w:abstractNum>
   <w:num w:numId="1">
     <w:abstractNumId w:val="0"/>
+  </w:num>
+  <w:num w:numId="2">
+    <w:abstractNumId w:val="1"/>
   </w:num>
 </w:numbering>
 </file>
@@ -15909,7 +17008,7 @@
 </file>
 
 <file path=customXml/itemProps1.xml><?xml version="1.0" encoding="utf-8"?>
-<ds:datastoreItem xmlns:ds="http://schemas.openxmlformats.org/officeDocument/2006/customXml" ds:itemID="{4CBD653F-E89F-4F62-BD5F-B6B21450A305}">
+<ds:datastoreItem xmlns:ds="http://schemas.openxmlformats.org/officeDocument/2006/customXml" ds:itemID="{3366DA2F-2A8F-4846-AC74-60F11A2B4713}">
   <ds:schemaRefs>
     <ds:schemaRef ds:uri="http://schemas.openxmlformats.org/officeDocument/2006/bibliography"/>
   </ds:schemaRefs>

</xml_diff>

<commit_message>
finalizamos o site da barbearia tanto para pc quanto para celular
</commit_message>
<xml_diff>
--- a/Apostila/Projeto Space For Men.docx
+++ b/Apostila/Projeto Space For Men.docx
@@ -15999,7 +15999,431 @@
           <w:noProof/>
         </w:rPr>
         <w:lastRenderedPageBreak/>
-        <w:t xml:space="preserve">127 - </w:t>
+        <w:t xml:space="preserve">127 </w:t>
+      </w:r>
+      <w:r>
+        <w:rPr>
+          <w:noProof/>
+        </w:rPr>
+        <w:t>–</w:t>
+      </w:r>
+      <w:r>
+        <w:rPr>
+          <w:noProof/>
+        </w:rPr>
+        <w:t xml:space="preserve"> </w:t>
+      </w:r>
+      <w:r>
+        <w:rPr>
+          <w:noProof/>
+        </w:rPr>
+        <w:t xml:space="preserve">Para melhorar a visualização </w:t>
+      </w:r>
+      <w:r>
+        <w:rPr>
+          <w:noProof/>
+        </w:rPr>
+        <w:t xml:space="preserve">no celular </w:t>
+      </w:r>
+      <w:r>
+        <w:rPr>
+          <w:noProof/>
+        </w:rPr>
+        <w:t xml:space="preserve">da lista beneficios e da imagem no colocamos </w:t>
+      </w:r>
+      <w:r>
+        <w:rPr>
+          <w:noProof/>
+        </w:rPr>
+        <w:t>uma em baixo da outra utilizando o seguinte comando:</w:t>
+      </w:r>
+    </w:p>
+    <w:p>
+      <w:pPr>
+        <w:rPr>
+          <w:noProof/>
+        </w:rPr>
+      </w:pPr>
+      <w:r>
+        <w:rPr>
+          <w:noProof/>
+        </w:rPr>
+        <w:drawing>
+          <wp:inline distT="0" distB="0" distL="0" distR="0" wp14:anchorId="2DA7B3D6" wp14:editId="02D76462">
+            <wp:extent cx="1866900" cy="938783"/>
+            <wp:effectExtent l="0" t="0" r="0" b="0"/>
+            <wp:docPr id="221" name="Imagem 221"/>
+            <wp:cNvGraphicFramePr>
+              <a:graphicFrameLocks xmlns:a="http://schemas.openxmlformats.org/drawingml/2006/main" noChangeAspect="1"/>
+            </wp:cNvGraphicFramePr>
+            <a:graphic xmlns:a="http://schemas.openxmlformats.org/drawingml/2006/main">
+              <a:graphicData uri="http://schemas.openxmlformats.org/drawingml/2006/picture">
+                <pic:pic xmlns:pic="http://schemas.openxmlformats.org/drawingml/2006/picture">
+                  <pic:nvPicPr>
+                    <pic:cNvPr id="1" name=""/>
+                    <pic:cNvPicPr/>
+                  </pic:nvPicPr>
+                  <pic:blipFill>
+                    <a:blip r:embed="rId198"/>
+                    <a:stretch>
+                      <a:fillRect/>
+                    </a:stretch>
+                  </pic:blipFill>
+                  <pic:spPr>
+                    <a:xfrm>
+                      <a:off x="0" y="0"/>
+                      <a:ext cx="1880410" cy="945577"/>
+                    </a:xfrm>
+                    <a:prstGeom prst="rect">
+                      <a:avLst/>
+                    </a:prstGeom>
+                  </pic:spPr>
+                </pic:pic>
+              </a:graphicData>
+            </a:graphic>
+          </wp:inline>
+        </w:drawing>
+      </w:r>
+    </w:p>
+    <w:p>
+      <w:pPr>
+        <w:rPr>
+          <w:noProof/>
+        </w:rPr>
+      </w:pPr>
+      <w:r>
+        <w:rPr>
+          <w:noProof/>
+        </w:rPr>
+        <w:t xml:space="preserve">128 </w:t>
+      </w:r>
+      <w:r>
+        <w:rPr>
+          <w:noProof/>
+        </w:rPr>
+        <w:t>–</w:t>
+      </w:r>
+      <w:r>
+        <w:rPr>
+          <w:noProof/>
+        </w:rPr>
+        <w:t xml:space="preserve"> </w:t>
+      </w:r>
+      <w:r>
+        <w:rPr>
+          <w:noProof/>
+        </w:rPr>
+        <w:t>Deixando a nossa página do produto responsiva para celular no arquivo “produto.css” no final colocamos o seguinte código para começar a deixar a página pronta para ser visualizada pelo celular.</w:t>
+      </w:r>
+    </w:p>
+    <w:p>
+      <w:pPr>
+        <w:rPr>
+          <w:noProof/>
+        </w:rPr>
+      </w:pPr>
+      <w:r>
+        <w:rPr>
+          <w:noProof/>
+        </w:rPr>
+        <w:drawing>
+          <wp:inline distT="0" distB="0" distL="0" distR="0" wp14:anchorId="401EF6D8" wp14:editId="704A14C8">
+            <wp:extent cx="3077289" cy="1304925"/>
+            <wp:effectExtent l="0" t="0" r="8890" b="0"/>
+            <wp:docPr id="222" name="Imagem 222"/>
+            <wp:cNvGraphicFramePr>
+              <a:graphicFrameLocks xmlns:a="http://schemas.openxmlformats.org/drawingml/2006/main" noChangeAspect="1"/>
+            </wp:cNvGraphicFramePr>
+            <a:graphic xmlns:a="http://schemas.openxmlformats.org/drawingml/2006/main">
+              <a:graphicData uri="http://schemas.openxmlformats.org/drawingml/2006/picture">
+                <pic:pic xmlns:pic="http://schemas.openxmlformats.org/drawingml/2006/picture">
+                  <pic:nvPicPr>
+                    <pic:cNvPr id="1" name=""/>
+                    <pic:cNvPicPr/>
+                  </pic:nvPicPr>
+                  <pic:blipFill>
+                    <a:blip r:embed="rId199"/>
+                    <a:stretch>
+                      <a:fillRect/>
+                    </a:stretch>
+                  </pic:blipFill>
+                  <pic:spPr>
+                    <a:xfrm>
+                      <a:off x="0" y="0"/>
+                      <a:ext cx="3099134" cy="1314188"/>
+                    </a:xfrm>
+                    <a:prstGeom prst="rect">
+                      <a:avLst/>
+                    </a:prstGeom>
+                  </pic:spPr>
+                </pic:pic>
+              </a:graphicData>
+            </a:graphic>
+          </wp:inline>
+        </w:drawing>
+      </w:r>
+    </w:p>
+    <w:p>
+      <w:pPr>
+        <w:rPr>
+          <w:noProof/>
+        </w:rPr>
+      </w:pPr>
+      <w:r>
+        <w:rPr>
+          <w:noProof/>
+        </w:rPr>
+        <w:t xml:space="preserve">129 </w:t>
+      </w:r>
+      <w:r>
+        <w:rPr>
+          <w:noProof/>
+        </w:rPr>
+        <w:t>–</w:t>
+      </w:r>
+      <w:r>
+        <w:rPr>
+          <w:noProof/>
+        </w:rPr>
+        <w:t xml:space="preserve"> </w:t>
+      </w:r>
+      <w:r>
+        <w:rPr>
+          <w:noProof/>
+        </w:rPr>
+        <w:t xml:space="preserve">Centralizamos o logo utilizando </w:t>
+      </w:r>
+      <w:r>
+        <w:rPr>
+          <w:noProof/>
+        </w:rPr>
+        <w:t>o código a baixo:</w:t>
+      </w:r>
+    </w:p>
+    <w:p>
+      <w:pPr>
+        <w:rPr>
+          <w:noProof/>
+        </w:rPr>
+      </w:pPr>
+      <w:r>
+        <w:rPr>
+          <w:noProof/>
+        </w:rPr>
+        <w:drawing>
+          <wp:inline distT="0" distB="0" distL="0" distR="0" wp14:anchorId="68745BE8" wp14:editId="1387039C">
+            <wp:extent cx="3095625" cy="1890249"/>
+            <wp:effectExtent l="0" t="0" r="0" b="0"/>
+            <wp:docPr id="223" name="Imagem 223"/>
+            <wp:cNvGraphicFramePr>
+              <a:graphicFrameLocks xmlns:a="http://schemas.openxmlformats.org/drawingml/2006/main" noChangeAspect="1"/>
+            </wp:cNvGraphicFramePr>
+            <a:graphic xmlns:a="http://schemas.openxmlformats.org/drawingml/2006/main">
+              <a:graphicData uri="http://schemas.openxmlformats.org/drawingml/2006/picture">
+                <pic:pic xmlns:pic="http://schemas.openxmlformats.org/drawingml/2006/picture">
+                  <pic:nvPicPr>
+                    <pic:cNvPr id="1" name=""/>
+                    <pic:cNvPicPr/>
+                  </pic:nvPicPr>
+                  <pic:blipFill>
+                    <a:blip r:embed="rId200"/>
+                    <a:stretch>
+                      <a:fillRect/>
+                    </a:stretch>
+                  </pic:blipFill>
+                  <pic:spPr>
+                    <a:xfrm>
+                      <a:off x="0" y="0"/>
+                      <a:ext cx="3142322" cy="1918763"/>
+                    </a:xfrm>
+                    <a:prstGeom prst="rect">
+                      <a:avLst/>
+                    </a:prstGeom>
+                  </pic:spPr>
+                </pic:pic>
+              </a:graphicData>
+            </a:graphic>
+          </wp:inline>
+        </w:drawing>
+      </w:r>
+    </w:p>
+    <w:p>
+      <w:pPr>
+        <w:rPr>
+          <w:noProof/>
+        </w:rPr>
+      </w:pPr>
+      <w:r>
+        <w:rPr>
+          <w:noProof/>
+        </w:rPr>
+        <w:t>130 – Para colocar o menu a baixo do logo utilizamos o código a baixo:</w:t>
+      </w:r>
+    </w:p>
+    <w:p>
+      <w:pPr>
+        <w:rPr>
+          <w:noProof/>
+        </w:rPr>
+      </w:pPr>
+      <w:r>
+        <w:rPr>
+          <w:noProof/>
+        </w:rPr>
+        <w:drawing>
+          <wp:inline distT="0" distB="0" distL="0" distR="0" wp14:anchorId="355AE55F" wp14:editId="7545A080">
+            <wp:extent cx="2562225" cy="2446136"/>
+            <wp:effectExtent l="0" t="0" r="0" b="0"/>
+            <wp:docPr id="224" name="Imagem 224"/>
+            <wp:cNvGraphicFramePr>
+              <a:graphicFrameLocks xmlns:a="http://schemas.openxmlformats.org/drawingml/2006/main" noChangeAspect="1"/>
+            </wp:cNvGraphicFramePr>
+            <a:graphic xmlns:a="http://schemas.openxmlformats.org/drawingml/2006/main">
+              <a:graphicData uri="http://schemas.openxmlformats.org/drawingml/2006/picture">
+                <pic:pic xmlns:pic="http://schemas.openxmlformats.org/drawingml/2006/picture">
+                  <pic:nvPicPr>
+                    <pic:cNvPr id="1" name=""/>
+                    <pic:cNvPicPr/>
+                  </pic:nvPicPr>
+                  <pic:blipFill>
+                    <a:blip r:embed="rId201"/>
+                    <a:stretch>
+                      <a:fillRect/>
+                    </a:stretch>
+                  </pic:blipFill>
+                  <pic:spPr>
+                    <a:xfrm>
+                      <a:off x="0" y="0"/>
+                      <a:ext cx="2594160" cy="2476624"/>
+                    </a:xfrm>
+                    <a:prstGeom prst="rect">
+                      <a:avLst/>
+                    </a:prstGeom>
+                  </pic:spPr>
+                </pic:pic>
+              </a:graphicData>
+            </a:graphic>
+          </wp:inline>
+        </w:drawing>
+      </w:r>
+      <w:r>
+        <w:rPr>
+          <w:noProof/>
+        </w:rPr>
+        <w:drawing>
+          <wp:inline distT="0" distB="0" distL="0" distR="0" wp14:anchorId="403A5D44" wp14:editId="02148407">
+            <wp:extent cx="2314898" cy="1543265"/>
+            <wp:effectExtent l="0" t="0" r="9525" b="0"/>
+            <wp:docPr id="225" name="Imagem 225"/>
+            <wp:cNvGraphicFramePr>
+              <a:graphicFrameLocks xmlns:a="http://schemas.openxmlformats.org/drawingml/2006/main" noChangeAspect="1"/>
+            </wp:cNvGraphicFramePr>
+            <a:graphic xmlns:a="http://schemas.openxmlformats.org/drawingml/2006/main">
+              <a:graphicData uri="http://schemas.openxmlformats.org/drawingml/2006/picture">
+                <pic:pic xmlns:pic="http://schemas.openxmlformats.org/drawingml/2006/picture">
+                  <pic:nvPicPr>
+                    <pic:cNvPr id="1" name=""/>
+                    <pic:cNvPicPr/>
+                  </pic:nvPicPr>
+                  <pic:blipFill>
+                    <a:blip r:embed="rId202"/>
+                    <a:stretch>
+                      <a:fillRect/>
+                    </a:stretch>
+                  </pic:blipFill>
+                  <pic:spPr>
+                    <a:xfrm>
+                      <a:off x="0" y="0"/>
+                      <a:ext cx="2314898" cy="1543265"/>
+                    </a:xfrm>
+                    <a:prstGeom prst="rect">
+                      <a:avLst/>
+                    </a:prstGeom>
+                  </pic:spPr>
+                </pic:pic>
+              </a:graphicData>
+            </a:graphic>
+          </wp:inline>
+        </w:drawing>
+      </w:r>
+    </w:p>
+    <w:p>
+      <w:pPr>
+        <w:rPr>
+          <w:noProof/>
+        </w:rPr>
+      </w:pPr>
+      <w:r>
+        <w:rPr>
+          <w:noProof/>
+        </w:rPr>
+        <w:lastRenderedPageBreak/>
+        <w:t xml:space="preserve">131 </w:t>
+      </w:r>
+      <w:r>
+        <w:rPr>
+          <w:noProof/>
+        </w:rPr>
+        <w:t>–</w:t>
+      </w:r>
+      <w:r>
+        <w:rPr>
+          <w:noProof/>
+        </w:rPr>
+        <w:t xml:space="preserve"> </w:t>
+      </w:r>
+      <w:r>
+        <w:rPr>
+          <w:noProof/>
+        </w:rPr>
+        <w:t>Para deixar os itens do produto responsivos utilizamos os seguintes códigos:</w:t>
+      </w:r>
+    </w:p>
+    <w:p>
+      <w:pPr>
+        <w:rPr>
+          <w:noProof/>
+        </w:rPr>
+      </w:pPr>
+      <w:r>
+        <w:rPr>
+          <w:noProof/>
+        </w:rPr>
+        <w:drawing>
+          <wp:inline distT="0" distB="0" distL="0" distR="0" wp14:anchorId="7FC11CC9" wp14:editId="30E0F653">
+            <wp:extent cx="1838325" cy="2830266"/>
+            <wp:effectExtent l="0" t="0" r="0" b="8255"/>
+            <wp:docPr id="226" name="Imagem 226"/>
+            <wp:cNvGraphicFramePr>
+              <a:graphicFrameLocks xmlns:a="http://schemas.openxmlformats.org/drawingml/2006/main" noChangeAspect="1"/>
+            </wp:cNvGraphicFramePr>
+            <a:graphic xmlns:a="http://schemas.openxmlformats.org/drawingml/2006/main">
+              <a:graphicData uri="http://schemas.openxmlformats.org/drawingml/2006/picture">
+                <pic:pic xmlns:pic="http://schemas.openxmlformats.org/drawingml/2006/picture">
+                  <pic:nvPicPr>
+                    <pic:cNvPr id="1" name=""/>
+                    <pic:cNvPicPr/>
+                  </pic:nvPicPr>
+                  <pic:blipFill>
+                    <a:blip r:embed="rId203"/>
+                    <a:stretch>
+                      <a:fillRect/>
+                    </a:stretch>
+                  </pic:blipFill>
+                  <pic:spPr>
+                    <a:xfrm>
+                      <a:off x="0" y="0"/>
+                      <a:ext cx="1846479" cy="2842819"/>
+                    </a:xfrm>
+                    <a:prstGeom prst="rect">
+                      <a:avLst/>
+                    </a:prstGeom>
+                  </pic:spPr>
+                </pic:pic>
+              </a:graphicData>
+            </a:graphic>
+          </wp:inline>
+        </w:drawing>
       </w:r>
       <w:bookmarkStart w:id="0" w:name="_GoBack"/>
       <w:bookmarkEnd w:id="0"/>
@@ -17008,7 +17432,7 @@
 </file>
 
 <file path=customXml/itemProps1.xml><?xml version="1.0" encoding="utf-8"?>
-<ds:datastoreItem xmlns:ds="http://schemas.openxmlformats.org/officeDocument/2006/customXml" ds:itemID="{3366DA2F-2A8F-4846-AC74-60F11A2B4713}">
+<ds:datastoreItem xmlns:ds="http://schemas.openxmlformats.org/officeDocument/2006/customXml" ds:itemID="{92FB153D-CB1F-404B-8752-903B1D7C0B0D}">
   <ds:schemaRefs>
     <ds:schemaRef ds:uri="http://schemas.openxmlformats.org/officeDocument/2006/bibliography"/>
   </ds:schemaRefs>

</xml_diff>